<commit_message>
done with RE SV
</commit_message>
<xml_diff>
--- a/temp.docx
+++ b/temp.docx
@@ -1676,36 +1676,96 @@
                 <w:dropDownList>
                   <w:listItem w:displayText="Не назначено" w:value=""/>
                   <w:listItem w:displayText="──────── Сигналы РЗиА ────────" w:value="INPUTS_HEADER" w:disabled="true"/>
+                  <w:listItem w:displayText="KA1 Отключен" w:value="KA1 Отключен"/>
+                  <w:listItem w:displayText="KA2 Отключен" w:value="KA2 Отключен"/>
+                  <w:listItem w:displayText="KA3 Отключен" w:value="KA3 Отключен"/>
+                  <w:listItem w:displayText="KA4 Отключен" w:value="KA4 Отключен"/>
+                  <w:listItem w:displayText="KA5 Отключен" w:value="KA5 Отключен"/>
+                  <w:listItem w:displayText="Аварийный уровень изоляции В" w:value="Аварийный уровень изоляции В"/>
                   <w:listItem w:displayText="Блокировка ВНР" w:value="Блокировка ВНР"/>
                   <w:listItem w:displayText="Блокировка ЛЗШ 1" w:value="Блокировка ЛЗШ 1"/>
                   <w:listItem w:displayText="Блокировка ЛЗШ 2" w:value="Блокировка ЛЗШ 2"/>
                   <w:listItem w:displayText="ВВ 1 секции шин отключен" w:value="ВВ 1 секции шин отключен"/>
                   <w:listItem w:displayText="ВВ 2 секции шин отключен" w:value="ВВ 2 секции шин отключен"/>
+                  <w:listItem w:displayText="Включить В от пульта управления" w:value="Включить В от пульта управления"/>
+                  <w:listItem w:displayText="Включить В от телеуправления" w:value="Включить В от телеуправления"/>
                   <w:listItem w:displayText="Включить СВ от ВВ 1 секции шин" w:value="Включить СВ от ВВ 1 секции шин"/>
                   <w:listItem w:displayText="Включить СВ от ВВ 2 секции шин" w:value="Включить СВ от ВВ 2 секции шин"/>
                   <w:listItem w:displayText="Внешний запрет АВР1" w:value="Внешний запрет АВР1"/>
                   <w:listItem w:displayText="Внешний запрет АВР2" w:value="Внешний запрет АВР2"/>
+                  <w:listItem w:displayText="Внешняя блокировка управления В" w:value="Внешняя блокировка управления В"/>
+                  <w:listItem w:displayText="Выключатель включен (блок контакт)" w:value="Выключатель включен (блок контакт)"/>
+                  <w:listItem w:displayText="Выключатель отключен (блок контакт)" w:value="Выключатель отключен (блок контакт)"/>
+                  <w:listItem w:displayText="Заземляющий нож включен (блок контакт)" w:value="Заземляющий нож включен (блок контакт)"/>
+                  <w:listItem w:displayText="Заземляющий нож отключен (блок контакт)" w:value="Заземляющий нож отключен (блок контакт)"/>
+                  <w:listItem w:displayText="Ключ М/Д привода В" w:value="Ключ М/Д привода В"/>
                   <w:listItem w:displayText="Контроль автоматов ТН 1 секции шин" w:value="Контроль автоматов ТН 1 секции шин"/>
                   <w:listItem w:displayText="Контроль автоматов ТН 2 секции шин" w:value="Контроль автоматов ТН 2 секции шин"/>
+                  <w:listItem w:displayText="Контроль оперативного тока ЭМО1, ЭМВ" w:value="Контроль оперативного тока ЭМО1, ЭМВ"/>
+                  <w:listItem w:displayText="Контроль оперативного тока ЭМО2" w:value="Контроль оперативного тока ЭМО2"/>
+                  <w:listItem w:displayText="Контроль оперативного тока цепей ОБР 1" w:value="Контроль оперативного тока цепей ОБР 1"/>
+                  <w:listItem w:displayText="Контроль оперативного тока цепей ОБР 2" w:value="Контроль оперативного тока цепей ОБР 2"/>
+                  <w:listItem w:displayText="Контроль оперативного тока цепей ЭМО1, ЭМВ" w:value="Контроль оперативного тока цепей ЭМО1, ЭМВ"/>
+                  <w:listItem w:displayText="Контроль оперативного тока цепей ЭМО2" w:value="Контроль оперативного тока цепей ЭМО2"/>
+                  <w:listItem w:displayText="Контроль оперативного тока цепей сигнализации В" w:value="Контроль оперативного тока цепей сигнализации В"/>
                   <w:listItem w:displayText="Контроль тока ЗДЗ" w:value="Контроль тока ЗДЗ"/>
+                  <w:listItem w:displayText="Контроль цепи ЭМВ" w:value="Контроль цепи ЭМВ"/>
                   <w:listItem w:displayText="Контроль цепи ЭМО1" w:value="Контроль цепи ЭМО1"/>
                   <w:listItem w:displayText="Контроль цепи ЭМО2" w:value="Контроль цепи ЭМО2"/>
+                  <w:listItem w:displayText="Контроль шлейфа управления ячейкой ВЭ1" w:value="Контроль шлейфа управления ячейкой ВЭ1"/>
+                  <w:listItem w:displayText="Контроль шлейфа управления ячейкой ВЭ2" w:value="Контроль шлейфа управления ячейкой ВЭ2"/>
+                  <w:listItem w:displayText="Контрольное положение ВЭ1" w:value="Контрольное положение ВЭ1"/>
+                  <w:listItem w:displayText="Контрольное положение ВЭ2" w:value="Контрольное положение ВЭ2"/>
                   <w:listItem w:displayText="Наличие напряжения на 1 секции шин" w:value="Наличие напряжения на 1 секции шин"/>
                   <w:listItem w:displayText="Наличие напряжения на 2 секции шин" w:value="Наличие напряжения на 2 секции шин"/>
                   <w:listItem w:displayText="Неисправность ТН 2 секции шин" w:value="Неисправность ТН 2 секции шин"/>
                   <w:listItem w:displayText="Неисправность ТН секции шин" w:value="Неисправность ТН секции шин"/>
+                  <w:listItem w:displayText="Неисправность опер. тока цепей ОБР 1" w:value="Неисправность опер. тока цепей ОБР 1"/>
+                  <w:listItem w:displayText="Неисправность опер. тока цепей ОБР 2" w:value="Неисправность опер. тока цепей ОБР 2"/>
+                  <w:listItem w:displayText="Неисправность опер. тока цепей сигнализации выключателя" w:value="Неисправность опер. тока цепей сигнализации выключателя"/>
+                  <w:listItem w:displayText="Низкий уровень изоляции В" w:value="Низкий уровень изоляции В"/>
+                  <w:listItem w:displayText="Оперативно включить В" w:value="Оперативно включить В"/>
+                  <w:listItem w:displayText="Оперативно отключить В" w:value="Оперативно отключить В"/>
                   <w:listItem w:displayText="Оперативное отключение ВВ 1 секции шин" w:value="Оперативное отключение ВВ 1 секции шин"/>
                   <w:listItem w:displayText="Оперативное отключение ВВ 2 секции шин" w:value="Оперативное отключение ВВ 2 секции шин"/>
                   <w:listItem w:displayText="Отключение внешнее 1" w:value="Отключение внешнее 1"/>
                   <w:listItem w:displayText="Отключение внешнее 2" w:value="Отключение внешнее 2"/>
                   <w:listItem w:displayText="Отключение внешнее 3" w:value="Отключение внешнее 3"/>
                   <w:listItem w:displayText="Отключение внешнее 4" w:value="Отключение внешнее 4"/>
+                  <w:listItem w:displayText="Отключение от кнопки" w:value="Отключение от кнопки"/>
                   <w:listItem w:displayText="Отключить В оперативно" w:value="Отключить В оперативно"/>
+                  <w:listItem w:displayText="Отключить В от пульта управления" w:value="Отключить В от пульта управления"/>
+                  <w:listItem w:displayText="Отключить В от телеуправления" w:value="Отключить В от телеуправления"/>
                   <w:listItem w:displayText="Отсутствие напряжения на 1 секции шин" w:value="Отсутствие напряжения на 1 секции шин"/>
                   <w:listItem w:displayText="Отсутствие напряжения на 2 секции шин" w:value="Отсутствие напряжения на 2 секции шин"/>
+                  <w:listItem w:displayText="Положение ВЭ1 «Вкачен»" w:value="Положение ВЭ1 «Вкачен»"/>
+                  <w:listItem w:displayText="Положение ВЭ1 «Выкачен»" w:value="Положение ВЭ1 «Выкачен»"/>
+                  <w:listItem w:displayText="Положение ВЭ2 «Вкачен»" w:value="Положение ВЭ2 «Вкачен»"/>
+                  <w:listItem w:displayText="Положение ВЭ2 «Выкачен»" w:value="Положение ВЭ2 «Выкачен»"/>
+                  <w:listItem w:displayText="Положение двери шкафа/отсека" w:value="Положение двери шкафа/отсека"/>
+                  <w:listItem w:displayText="Положение испытательного блока SG1" w:value="Положение испытательного блока SG1"/>
+                  <w:listItem w:displayText="Положение испытательного блока SG2" w:value="Положение испытательного блока SG2"/>
+                  <w:listItem w:displayText="Положение испытательного блока SG3" w:value="Положение испытательного блока SG3"/>
+                  <w:listItem w:displayText="Положение переключателя SA1 цепей управления" w:value="Положение переключателя SA1 цепей управления"/>
+                  <w:listItem w:displayText="Положение переключателя SA2 цепей управления" w:value="Положение переключателя SA2 цепей управления"/>
+                  <w:listItem w:displayText="Положение переключателя SA3 цепей управления" w:value="Положение переключателя SA3 цепей управления"/>
+                  <w:listItem w:displayText="Положение переключателя SA4 цепей управления" w:value="Положение переключателя SA4 цепей управления"/>
+                  <w:listItem w:displayText="Положение переключателя аварийной деблокировки 1" w:value="Положение переключателя аварийной деблокировки 1"/>
+                  <w:listItem w:displayText="Положение переключателя аварийной деблокировки 2" w:value="Положение переключателя аварийной деблокировки 2"/>
+                  <w:listItem w:displayText="Положение переключателя аварийной деблокировки ячейки" w:value="Положение переключателя аварийной деблокировки ячейки"/>
+                  <w:listItem w:displayText="Пружина не заведена" w:value="Пружина не заведена"/>
                   <w:listItem w:displayText="Пуск КНН до ввода 1 секции шин" w:value="Пуск КНН до ввода 1 секции шин"/>
                   <w:listItem w:displayText="Пуск КНН до ввода 2 секции шин" w:value="Пуск КНН до ввода 2 секции шин"/>
                   <w:listItem w:displayText="Пуск УРОВ внешний" w:value="Пуск УРОВ внешний"/>
+                  <w:listItem w:displayText="Работа ЭМВ" w:value="Работа ЭМВ"/>
+                  <w:listItem w:displayText="Работа ЭМО1" w:value="Работа ЭМО1"/>
+                  <w:listItem w:displayText="Работа ЭМО2" w:value="Работа ЭМО2"/>
+                  <w:listItem w:displayText="Рабочее положение ВЭ1" w:value="Рабочее положение ВЭ1"/>
+                  <w:listItem w:displayText="Рабочее положение ВЭ2" w:value="Рабочее положение ВЭ2"/>
+                  <w:listItem w:displayText="Сигнал внешний 1" w:value="Сигнал внешний 1"/>
+                  <w:listItem w:displayText="Сигнал внешний 2" w:value="Сигнал внешний 2"/>
+                  <w:listItem w:displayText="Сигнал внешний 3" w:value="Сигнал внешний 3"/>
+                  <w:listItem w:displayText="Сигнал внешний 4" w:value="Сигнал внешний 4"/>
                   <w:listItem w:displayText="Сигнал отключения от ВНР" w:value="Сигнал отключения от ВНР"/>
                   <w:listItem w:displayText="Срабатывание ЗДЗ 1 секции шин" w:value="Срабатывание ЗДЗ 1 секции шин"/>
                   <w:listItem w:displayText="Срабатывание ЗДЗ 2 секции шин" w:value="Срабатывание ЗДЗ 2 секции шин"/>
@@ -1733,16 +1793,21 @@
                   <w:listItem w:displayText="Оперативный вывод функции ДЗ" w:value="Оперативный вывод функции ДЗ"/>
                   <w:listItem w:displayText="Оперативный вывод функции ЗДЗ" w:value="Оперативный вывод функции ЗДЗ"/>
                   <w:listItem w:displayText="Оперативный вывод функции ЗОП" w:value="Оперативный вывод функции ЗОП"/>
+                  <w:listItem w:displayText="Оперативный вывод функции КА" w:value="Оперативный вывод функции КА"/>
                   <w:listItem w:displayText="Оперативный вывод функции КНН 1 секции шин" w:value="Оперативный вывод функции КНН 1 секции шин"/>
                   <w:listItem w:displayText="Оперативный вывод функции КНН 2 секции шин" w:value="Оперативный вывод функции КНН 2 секции шин"/>
                   <w:listItem w:displayText="Оперативный вывод функции КОН 1 секции шин" w:value="Оперативный вывод функции КОН 1 секции шин"/>
                   <w:listItem w:displayText="Оперативный вывод функции КОН 2 секции шин" w:value="Оперативный вывод функции КОН 2 секции шин"/>
+                  <w:listItem w:displayText="Оперативный вывод функции КП" w:value="Оперативный вывод функции КП"/>
                   <w:listItem w:displayText="Оперативный вывод функции КС" w:value="Оперативный вывод функции КС"/>
+                  <w:listItem w:displayText="Оперативный вывод функции КСВ" w:value="Оперативный вывод функции КСВ"/>
                   <w:listItem w:displayText="Оперативный вывод функции ЛЗШ" w:value="Оперативный вывод функции ЛЗШ"/>
                   <w:listItem w:displayText="Оперативный вывод функции ЛО" w:value="Оперативный вывод функции ЛО"/>
                   <w:listItem w:displayText="Оперативный вывод функции МТЗ" w:value="Оперативный вывод функции МТЗ"/>
+                  <w:listItem w:displayText="Оперативный вывод функции ПДС НКУ" w:value="Оперативный вывод функции ПДС НКУ"/>
                   <w:listItem w:displayText="Оперативный вывод функции ТЗНП" w:value="Оперативный вывод функции ТЗНП"/>
                   <w:listItem w:displayText="Оперативный вывод функции ТК ЗДЗ" w:value="Оперативный вывод функции ТК ЗДЗ"/>
+                  <w:listItem w:displayText="Оперативный вывод функции УВ" w:value="Оперативный вывод функции УВ"/>
                   <w:listItem w:displayText="Оперативный вывод функции УРОВ" w:value="Оперативный вывод функции УРОВ"/>
                   <w:listItem w:displayText="Перевод 1 ступени ДЗ-фф на сигнал" w:value="Перевод 1 ступени ДЗ-фф на сигнал"/>
                   <w:listItem w:displayText="Перевод 2 ступени ДЗ-фф на сигнал" w:value="Перевод 2 ступени ДЗ-фф на сигнал"/>
@@ -1759,7 +1824,12 @@
                   <w:listItem w:displayText="Перевод ТЗНП 2 ступени на сигнал" w:value="Перевод ТЗНП 2 ступени на сигнал"/>
                   <w:listItem w:displayText="Перевод ТЗНП 3 ступени на сигнал" w:value="Перевод ТЗНП 3 ступени на сигнал"/>
                   <w:listItem w:displayText="Перевод ТЗНП 4 ступени на сигнал" w:value="Перевод ТЗНП 4 ступени на сигнал"/>
+                  <w:listItem w:displayText="Программная деблокировка управления вторым выкатным элементом" w:value="Программная деблокировка управления вторым выкатным элементом"/>
+                  <w:listItem w:displayText="Программная деблокировка управления заземляющим ножом" w:value="Программная деблокировка управления заземляющим ножом"/>
+                  <w:listItem w:displayText="Программная деблокировка управления первым выкатным элементом" w:value="Программная деблокировка управления первым выкатным элементом"/>
                   <w:listItem w:displayText="Режим работы ЧС" w:value="Режим работы ЧС"/>
+                  <w:listItem w:displayText="Сброс" w:value="Сброс"/>
+                  <w:listItem w:displayText="Сброс счетчиков ресурса выключателя" w:value="Сброс счетчиков ресурса выключателя"/>
                   <w:listItem w:displayText="Сигнал ввода оперативного ускорения ДЗ" w:value="Сигнал ввода оперативного ускорения ДЗ"/>
                   <w:listItem w:displayText="Сигнал ввода оперативного ускорения МТЗ" w:value="Сигнал ввода оперативного ускорения МТЗ"/>
                   <w:listItem w:displayText="Сигнал ввода оперативного ускорения ТЗНП" w:value="Сигнал ввода оперативного ускорения ТЗНП"/>
@@ -2117,6 +2187,38 @@
                   <w:listItem w:displayText="ЗОП / ЗОП: Срабатывание на сигнал" w:value="ЗОП / ЗОП: Срабатывание на сигнал"/>
                   <w:listItem w:displayText="ЗОП / ЗОП: Функция введена в работу" w:value="ЗОП / ЗОП: Функция введена в работу"/>
                   <w:listItem w:displayText="ЗОП / ЗОП: Функция оперативно выведена из работы" w:value="ЗОП / ЗОП: Функция оперативно выведена из работы"/>
+                  <w:listItem w:displayText="КА / В: Выключатель включен" w:value="КА / В: Выключатель включен"/>
+                  <w:listItem w:displayText="КА / В: Выключатель отключен" w:value="КА / В: Выключатель отключен"/>
+                  <w:listItem w:displayText="КА / В: Команда «включить» выключатель через выходное реле" w:value="КА / В: Команда «включить» выключатель через выходное реле"/>
+                  <w:listItem w:displayText="КА / В: Команда «отключить» выключатель через выходное реле" w:value="КА / В: Команда «отключить» выключатель через выходное реле"/>
+                  <w:listItem w:displayText="КА / В: Неисправное положение выключателя" w:value="КА / В: Неисправное положение выключателя"/>
+                  <w:listItem w:displayText="КА / В: Промежуточное положение выключателя" w:value="КА / В: Промежуточное положение выключателя"/>
+                  <w:listItem w:displayText="КА / В: Функция введена в работу" w:value="КА / В: Функция введена в работу"/>
+                  <w:listItem w:displayText="КА / ВЭ1: Команда «вкатить» выкатной элемент через выходное реле" w:value="КА / ВЭ1: Команда «вкатить» выкатной элемент через выходное реле"/>
+                  <w:listItem w:displayText="КА / ВЭ1: Команда «выкатить» выкатной элемент через выходное реле" w:value="КА / ВЭ1: Команда «выкатить» выкатной элемент через выходное реле"/>
+                  <w:listItem w:displayText="КА / ВЭ1: Неисправное положение выкатного элемента" w:value="КА / ВЭ1: Неисправное положение выкатного элемента"/>
+                  <w:listItem w:displayText="КА / ВЭ1: Положение выкатного элемента «Вкачен»" w:value="КА / ВЭ1: Положение выкатного элемента «Вкачен»"/>
+                  <w:listItem w:displayText="КА / ВЭ1: Положение выкатного элемента «Выкачен»" w:value="КА / ВЭ1: Положение выкатного элемента «Выкачен»"/>
+                  <w:listItem w:displayText="КА / ВЭ1: Промежуточное положение выкатного элемента" w:value="КА / ВЭ1: Промежуточное положение выкатного элемента"/>
+                  <w:listItem w:displayText="КА / ВЭ1: Ремонтное положение выкатного элемента" w:value="КА / ВЭ1: Ремонтное положение выкатного элемента"/>
+                  <w:listItem w:displayText="КА / ВЭ1: Функция введена в работу" w:value="КА / ВЭ1: Функция введена в работу"/>
+                  <w:listItem w:displayText="КА / ВЭ2: Команда «вкатить» выкатной элемент через выходное реле" w:value="КА / ВЭ2: Команда «вкатить» выкатной элемент через выходное реле"/>
+                  <w:listItem w:displayText="КА / ВЭ2: Команда «выкатить» выкатной элемент через выходное реле" w:value="КА / ВЭ2: Команда «выкатить» выкатной элемент через выходное реле"/>
+                  <w:listItem w:displayText="КА / ВЭ2: Неисправное положение выкатного элемента" w:value="КА / ВЭ2: Неисправное положение выкатного элемента"/>
+                  <w:listItem w:displayText="КА / ВЭ2: Положение выкатного элемента «Вкачен»" w:value="КА / ВЭ2: Положение выкатного элемента «Вкачен»"/>
+                  <w:listItem w:displayText="КА / ВЭ2: Положение выкатного элемента «Выкачен»" w:value="КА / ВЭ2: Положение выкатного элемента «Выкачен»"/>
+                  <w:listItem w:displayText="КА / ВЭ2: Промежуточное положение выкатного элемента" w:value="КА / ВЭ2: Промежуточное положение выкатного элемента"/>
+                  <w:listItem w:displayText="КА / ВЭ2: Ремонтное положение выкатного элемента" w:value="КА / ВЭ2: Ремонтное положение выкатного элемента"/>
+                  <w:listItem w:displayText="КА / ВЭ2: Функция введена в работу" w:value="КА / ВЭ2: Функция введена в работу"/>
+                  <w:listItem w:displayText="КА / ЗН: Заземляющий нож включен" w:value="КА / ЗН: Заземляющий нож включен"/>
+                  <w:listItem w:displayText="КА / ЗН: Заземляющий нож отключен" w:value="КА / ЗН: Заземляющий нож отключен"/>
+                  <w:listItem w:displayText="КА / ЗН: Команда «включить» заземляющий нож через выходное реле" w:value="КА / ЗН: Команда «включить» заземляющий нож через выходное реле"/>
+                  <w:listItem w:displayText="КА / ЗН: Команда «отключить» заземляющий нож через выходное реле" w:value="КА / ЗН: Команда «отключить» заземляющий нож через выходное реле"/>
+                  <w:listItem w:displayText="КА / ЗН: Неисправное положение заземляющего ножа" w:value="КА / ЗН: Неисправное положение заземляющего ножа"/>
+                  <w:listItem w:displayText="КА / ЗН: Промежуточное положение заземляющего ножа" w:value="КА / ЗН: Промежуточное положение заземляющего ножа"/>
+                  <w:listItem w:displayText="КА / ЗН: Функция введена в работу" w:value="КА / ЗН: Функция введена в работу"/>
+                  <w:listItem w:displayText="КА / КА: Функция введена в работу" w:value="КА / КА: Функция введена в работу"/>
+                  <w:listItem w:displayText="КА / КА: Функция оперативно выведена из работы" w:value="КА / КА: Функция оперативно выведена из работы"/>
                   <w:listItem w:displayText="КНН 1сш / КНН 1сш: Пуск" w:value="КНН 1сш / КНН 1сш: Пуск"/>
                   <w:listItem w:displayText="КНН 1сш / КНН 1сш: Пуск ИО напряжения" w:value="КНН 1сш / КНН 1сш: Пуск ИО напряжения"/>
                   <w:listItem w:displayText="КНН 1сш / КНН 1сш: Пуск ИО напряжения ОП" w:value="КНН 1сш / КНН 1сш: Пуск ИО напряжения ОП"/>
@@ -2137,6 +2239,68 @@
                   <w:listItem w:displayText="КОН 2сш / КОН 2сш: Пуск ИО напряжения ОП" w:value="КОН 2сш / КОН 2сш: Пуск ИО напряжения ОП"/>
                   <w:listItem w:displayText="КОН 2сш / КОН 2сш: Функция введена в работу" w:value="КОН 2сш / КОН 2сш: Функция введена в работу"/>
                   <w:listItem w:displayText="КОН 2сш / КОН 2сш: Функция оперативно выведена из работы" w:value="КОН 2сш / КОН 2сш: Функция оперативно выведена из работы"/>
+                  <w:listItem w:displayText="КП / КП: Идет переключение" w:value="КП / КП: Идет переключение"/>
+                  <w:listItem w:displayText="КП / КП: Функция введена в работу" w:value="КП / КП: Функция введена в работу"/>
+                  <w:listItem w:displayText="КП / КП: Функция оперативно выведена из работы" w:value="КП / КП: Функция оперативно выведена из работы"/>
+                  <w:listItem w:displayText="КП / ОБР В: Блокировка включения" w:value="КП / ОБР В: Блокировка включения"/>
+                  <w:listItem w:displayText="КП / ОБР В: Разрешить включение" w:value="КП / ОБР В: Разрешить включение"/>
+                  <w:listItem w:displayText="КП / ОБР ВЭ1: Разрешение управления первым выкатным элементом" w:value="КП / ОБР ВЭ1: Разрешение управления первым выкатным элементом"/>
+                  <w:listItem w:displayText="КП / ОБР ВЭ2: Разрешение управления вторым выкатным элементом" w:value="КП / ОБР ВЭ2: Разрешение управления вторым выкатным элементом"/>
+                  <w:listItem w:displayText="КП / ОБР ЗН: Разрешение управления заземляющим ножом" w:value="КП / ОБР ЗН: Разрешение управления заземляющим ножом"/>
+                  <w:listItem w:displayText="КП / УВ: Включение с контролем синхронизма" w:value="КП / УВ: Включение с контролем синхронизма"/>
+                  <w:listItem w:displayText="КП / УВ: Включить выключатель" w:value="КП / УВ: Включить выключатель"/>
+                  <w:listItem w:displayText="КП / УВ: Задержка включения с контролем синхронизма" w:value="КП / УВ: Задержка включения с контролем синхронизма"/>
+                  <w:listItem w:displayText="КП / УВ: Идет переключение" w:value="КП / УВ: Идет переключение"/>
+                  <w:listItem w:displayText="КП / УВ: Отключить выключатель" w:value="КП / УВ: Отключить выключатель"/>
+                  <w:listItem w:displayText="КП / УВ: Поведение местного управления" w:value="КП / УВ: Поведение местного управления"/>
+                  <w:listItem w:displayText="КП / УВ: Положение В (Включено)" w:value="КП / УВ: Положение В (Включено)"/>
+                  <w:listItem w:displayText="КП / УВ: Положение В (Не определено)" w:value="КП / УВ: Положение В (Не определено)"/>
+                  <w:listItem w:displayText="КП / УВ: Положение В (Неисправность)" w:value="КП / УВ: Положение В (Неисправность)"/>
+                  <w:listItem w:displayText="КП / УВ: Положение В (Отключено)" w:value="КП / УВ: Положение В (Отключено)"/>
+                  <w:listItem w:displayText="КП / УВ: Положение ключа режима управления" w:value="КП / УВ: Положение ключа режима управления"/>
+                  <w:listItem w:displayText="КП / УВ: Право переключения на уровне станции" w:value="КП / УВ: Право переключения на уровне станции"/>
+                  <w:listItem w:displayText="КП / УВ: Сигнал превышения допустимого времени переключения" w:value="КП / УВ: Сигнал превышения допустимого времени переключения"/>
+                  <w:listItem w:displayText="КП / УВ: Функция введена в работу" w:value="КП / УВ: Функция введена в работу"/>
+                  <w:listItem w:displayText="КП / УВЭ1: Вкатить первый выкатной элемент" w:value="КП / УВЭ1: Вкатить первый выкатной элемент"/>
+                  <w:listItem w:displayText="КП / УВЭ1: Выкатить первый выкатной элемент" w:value="КП / УВЭ1: Выкатить первый выкатной элемент"/>
+                  <w:listItem w:displayText="КП / УВЭ1: Идет переключение" w:value="КП / УВЭ1: Идет переключение"/>
+                  <w:listItem w:displayText="КП / УВЭ1: Поведение местного управления" w:value="КП / УВЭ1: Поведение местного управления"/>
+                  <w:listItem w:displayText="КП / УВЭ1: Положение ВЭ1 (Вкачен)" w:value="КП / УВЭ1: Положение ВЭ1 (Вкачен)"/>
+                  <w:listItem w:displayText="КП / УВЭ1: Положение ВЭ1 (Выкачен)" w:value="КП / УВЭ1: Положение ВЭ1 (Выкачен)"/>
+                  <w:listItem w:displayText="КП / УВЭ1: Положение ВЭ1 (Не определено)" w:value="КП / УВЭ1: Положение ВЭ1 (Не определено)"/>
+                  <w:listItem w:displayText="КП / УВЭ1: Положение ВЭ1 (Неисправность)" w:value="КП / УВЭ1: Положение ВЭ1 (Неисправность)"/>
+                  <w:listItem w:displayText="КП / УВЭ1: Положение ключа режима управления" w:value="КП / УВЭ1: Положение ключа режима управления"/>
+                  <w:listItem w:displayText="КП / УВЭ1: Право переключения на уровне станции" w:value="КП / УВЭ1: Право переключения на уровне станции"/>
+                  <w:listItem w:displayText="КП / УВЭ1: Сигнал превышения допустимого времени переключения" w:value="КП / УВЭ1: Сигнал превышения допустимого времени переключения"/>
+                  <w:listItem w:displayText="КП / УВЭ1: Функция введена в работу" w:value="КП / УВЭ1: Функция введена в работу"/>
+                  <w:listItem w:displayText="КП / УВЭ2: Вкатить второй выкатной элемент" w:value="КП / УВЭ2: Вкатить второй выкатной элемент"/>
+                  <w:listItem w:displayText="КП / УВЭ2: Выкатить второй выкатной элемент" w:value="КП / УВЭ2: Выкатить второй выкатной элемент"/>
+                  <w:listItem w:displayText="КП / УВЭ2: Идет переключение" w:value="КП / УВЭ2: Идет переключение"/>
+                  <w:listItem w:displayText="КП / УВЭ2: Поведение местного управления" w:value="КП / УВЭ2: Поведение местного управления"/>
+                  <w:listItem w:displayText="КП / УВЭ2: Положение ВЭ2 (Вкачен)" w:value="КП / УВЭ2: Положение ВЭ2 (Вкачен)"/>
+                  <w:listItem w:displayText="КП / УВЭ2: Положение ВЭ2 (Выкачен)" w:value="КП / УВЭ2: Положение ВЭ2 (Выкачен)"/>
+                  <w:listItem w:displayText="КП / УВЭ2: Положение ВЭ2 (Не определено)" w:value="КП / УВЭ2: Положение ВЭ2 (Не определено)"/>
+                  <w:listItem w:displayText="КП / УВЭ2: Положение ВЭ2 (Неисправность)" w:value="КП / УВЭ2: Положение ВЭ2 (Неисправность)"/>
+                  <w:listItem w:displayText="КП / УВЭ2: Положение ключа режима управления" w:value="КП / УВЭ2: Положение ключа режима управления"/>
+                  <w:listItem w:displayText="КП / УВЭ2: Право переключения на уровне станции" w:value="КП / УВЭ2: Право переключения на уровне станции"/>
+                  <w:listItem w:displayText="КП / УВЭ2: Сигнал превышения допустимого времени переключения" w:value="КП / УВЭ2: Сигнал превышения допустимого времени переключения"/>
+                  <w:listItem w:displayText="КП / УВЭ2: Функция введена в работу" w:value="КП / УВЭ2: Функция введена в работу"/>
+                  <w:listItem w:displayText="КП / УЗН: Включить заземляющий нож" w:value="КП / УЗН: Включить заземляющий нож"/>
+                  <w:listItem w:displayText="КП / УЗН: Идет переключение" w:value="КП / УЗН: Идет переключение"/>
+                  <w:listItem w:displayText="КП / УЗН: Отключить заземляющий нож" w:value="КП / УЗН: Отключить заземляющий нож"/>
+                  <w:listItem w:displayText="КП / УЗН: Поведение местного управления" w:value="КП / УЗН: Поведение местного управления"/>
+                  <w:listItem w:displayText="КП / УЗН: Положение ЗН (Включено)" w:value="КП / УЗН: Положение ЗН (Включено)"/>
+                  <w:listItem w:displayText="КП / УЗН: Положение ЗН (Не определено)" w:value="КП / УЗН: Положение ЗН (Не определено)"/>
+                  <w:listItem w:displayText="КП / УЗН: Положение ЗН (Неисправность)" w:value="КП / УЗН: Положение ЗН (Неисправность)"/>
+                  <w:listItem w:displayText="КП / УЗН: Положение ЗН (Отключено)" w:value="КП / УЗН: Положение ЗН (Отключено)"/>
+                  <w:listItem w:displayText="КП / УЗН: Положение ключа режима управления" w:value="КП / УЗН: Положение ключа режима управления"/>
+                  <w:listItem w:displayText="КП / УЗН: Право переключения на уровне станции" w:value="КП / УЗН: Право переключения на уровне станции"/>
+                  <w:listItem w:displayText="КП / УЗН: Сигнал превышения допустимого времени переключения" w:value="КП / УЗН: Сигнал превышения допустимого времени переключения"/>
+                  <w:listItem w:displayText="КП / УЗН: Функция введена в работу" w:value="КП / УЗН: Функция введена в работу"/>
+                  <w:listItem w:displayText="КРВ / КРВ: Превышен коммутационный ресурс выключателя" w:value="КРВ / КРВ: Превышен коммутационный ресурс выключателя"/>
+                  <w:listItem w:displayText="КРВ / КРВ: Превышен механический ресурс выключателя" w:value="КРВ / КРВ: Превышен механический ресурс выключателя"/>
+                  <w:listItem w:displayText="КРВ / КРВ: Превышен ресурс выключателя" w:value="КРВ / КРВ: Превышен ресурс выключателя"/>
+                  <w:listItem w:displayText="КРВ / КРВ: Функция введена в работу" w:value="КРВ / КРВ: Функция введена в работу"/>
                   <w:listItem w:displayText="КС / КС: Блокировка по скорости изменения частоты" w:value="КС / КС: Блокировка по скорости изменения частоты"/>
                   <w:listItem w:displayText="КС / КС: Нет условий по напряжению" w:value="КС / КС: Нет условий по напряжению"/>
                   <w:listItem w:displayText="КС / КС: Нет условий по углу" w:value="КС / КС: Нет условий по углу"/>
@@ -2149,6 +2313,18 @@
                   <w:listItem w:displayText="КС / КС: Разрешение оперативного включения" w:value="КС / КС: Разрешение оперативного включения"/>
                   <w:listItem w:displayText="КС / КС: Функция введена в работу" w:value="КС / КС: Функция введена в работу"/>
                   <w:listItem w:displayText="КС / КС: Функция оперативно выведена из работы" w:value="КС / КС: Функция оперативно выведена из работы"/>
+                  <w:listItem w:displayText="КСВ / КСВ: Блокировка включения В" w:value="КСВ / КСВ: Блокировка включения В"/>
+                  <w:listItem w:displayText="КСВ / КСВ: Блокировка отключения В" w:value="КСВ / КСВ: Блокировка отключения В"/>
+                  <w:listItem w:displayText="КСВ / КСВ: В аварийно отключен" w:value="КСВ / КСВ: В аварийно отключен"/>
+                  <w:listItem w:displayText="КСВ / КСВ: В самопроизвольно отключен" w:value="КСВ / КСВ: В самопроизвольно отключен"/>
+                  <w:listItem w:displayText="КСВ / КСВ: Защита ЭМВ" w:value="КСВ / КСВ: Защита ЭМВ"/>
+                  <w:listItem w:displayText="КСВ / КСВ: Защита ЭМО1" w:value="КСВ / КСВ: Защита ЭМО1"/>
+                  <w:listItem w:displayText="КСВ / КСВ: Защита ЭМО2" w:value="КСВ / КСВ: Защита ЭМО2"/>
+                  <w:listItem w:displayText="КСВ / КСВ: Неисправность В" w:value="КСВ / КСВ: Неисправность В"/>
+                  <w:listItem w:displayText="КСВ / КСВ: Неисправность цепей ЭМУ" w:value="КСВ / КСВ: Неисправность цепей ЭМУ"/>
+                  <w:listItem w:displayText="КСВ / КСВ: Реле фиксации команды" w:value="КСВ / КСВ: Реле фиксации команды"/>
+                  <w:listItem w:displayText="КСВ / КСВ: Функция введена в работу" w:value="КСВ / КСВ: Функция введена в работу"/>
+                  <w:listItem w:displayText="КСВ / КСВ: Функция оперативно выведена из работы" w:value="КСВ / КСВ: Функция оперативно выведена из работы"/>
                   <w:listItem w:displayText="ЛЗШ / ЛЗШ: Обнаружение неисправности" w:value="ЛЗШ / ЛЗШ: Обнаружение неисправности"/>
                   <w:listItem w:displayText="ЛЗШ / ЛЗШ: Пуск" w:value="ЛЗШ / ЛЗШ: Пуск"/>
                   <w:listItem w:displayText="ЛЗШ / ЛЗШ: Пуск ИО тока по фазе B" w:value="ЛЗШ / ЛЗШ: Пуск ИО тока по фазе B"/>
@@ -2241,6 +2417,57 @@
                   <w:listItem w:displayText="МТЗ / ОНМ: Пуск по фазе C" w:value="МТЗ / ОНМ: Пуск по фазе C"/>
                   <w:listItem w:displayText="МТЗ / ОНМ: Пуск по фазе А" w:value="МТЗ / ОНМ: Пуск по фазе А"/>
                   <w:listItem w:displayText="МТЗ / ОУ МТЗ: Срабатывание" w:value="МТЗ / ОУ МТЗ: Срабатывание"/>
+                  <w:listItem w:displayText="ПДС / В: Поведение местного управления" w:value="ПДС / В: Поведение местного управления"/>
+                  <w:listItem w:displayText="ПДС / В: Положение ключа режима управления" w:value="ПДС / В: Положение ключа режима управления"/>
+                  <w:listItem w:displayText="ПДС / В: Положение ключа режима управления привода В" w:value="ПДС / В: Положение ключа режима управления привода В"/>
+                  <w:listItem w:displayText="ПДС / В: Право переключения на уровне станции" w:value="ПДС / В: Право переключения на уровне станции"/>
+                  <w:listItem w:displayText="ПДС / ВЭ1: Поведение местного управления" w:value="ПДС / ВЭ1: Поведение местного управления"/>
+                  <w:listItem w:displayText="ПДС / ВЭ1: Положение ключа режима управления" w:value="ПДС / ВЭ1: Положение ключа режима управления"/>
+                  <w:listItem w:displayText="ПДС / ВЭ1: Право переключения на уровне станции" w:value="ПДС / ВЭ1: Право переключения на уровне станции"/>
+                  <w:listItem w:displayText="ПДС / ВЭ1: Ремонтное положение коммутационного аппарата" w:value="ПДС / ВЭ1: Ремонтное положение коммутационного аппарата"/>
+                  <w:listItem w:displayText="ПДС / ВЭ2: Поведение местного управления" w:value="ПДС / ВЭ2: Поведение местного управления"/>
+                  <w:listItem w:displayText="ПДС / ВЭ2: Положение ключа режима управления" w:value="ПДС / ВЭ2: Положение ключа режима управления"/>
+                  <w:listItem w:displayText="ПДС / ВЭ2: Право переключения на уровне станции" w:value="ПДС / ВЭ2: Право переключения на уровне станции"/>
+                  <w:listItem w:displayText="ПДС / ВЭ2: Ремонтное положение коммутационного аппарата" w:value="ПДС / ВЭ2: Ремонтное положение коммутационного аппарата"/>
+                  <w:listItem w:displayText="ПДС / ЗН: Поведение местного управления" w:value="ПДС / ЗН: Поведение местного управления"/>
+                  <w:listItem w:displayText="ПДС / ЗН: Положение ключа режима управления" w:value="ПДС / ЗН: Положение ключа режима управления"/>
+                  <w:listItem w:displayText="ПДС / ЗН: Право переключения на уровне станции" w:value="ПДС / ЗН: Право переключения на уровне станции"/>
+                  <w:listItem w:displayText="ПДС / КИ: Аварийный уровень изоляции" w:value="ПДС / КИ: Аварийный уровень изоляции"/>
+                  <w:listItem w:displayText="ПДС / КИ: Низкий уровень изоляции" w:value="ПДС / КИ: Низкий уровень изоляции"/>
+                  <w:listItem w:displayText="ПДС / КПруж: Пружина не заведена" w:value="ПДС / КПруж: Пружина не заведена"/>
+                  <w:listItem w:displayText="ПДС / КЦВ: Контроль цепи ЭМВ" w:value="ПДС / КЦВ: Контроль цепи ЭМВ"/>
+                  <w:listItem w:displayText="ПДС / КЦВ: Контроль цепи ЭМО1" w:value="ПДС / КЦВ: Контроль цепи ЭМО1"/>
+                  <w:listItem w:displayText="ПДС / КЦВ: Контроль цепи ЭМО2" w:value="ПДС / КЦВ: Контроль цепи ЭМО2"/>
+                  <w:listItem w:displayText="ПДС / КЦВ: Работа ЭМВ" w:value="ПДС / КЦВ: Работа ЭМВ"/>
+                  <w:listItem w:displayText="ПДС / КЦВ: Работа ЭМО1" w:value="ПДС / КЦВ: Работа ЭМО1"/>
+                  <w:listItem w:displayText="ПДС / КЦВ: Работа ЭМО2" w:value="ПДС / КЦВ: Работа ЭМО2"/>
+                  <w:listItem w:displayText="ПДС / ПДС: Функция введена в работу" w:value="ПДС / ПДС: Функция введена в работу"/>
+                  <w:listItem w:displayText="ПДС / ПДС: Функция оперативно выведена из работы" w:value="ПДС / ПДС: Функция оперативно выведена из работы"/>
+                  <w:listItem w:displayText="ПДС НКУ / SA1: Цепь управления введена" w:value="ПДС НКУ / SA1: Цепь управления введена"/>
+                  <w:listItem w:displayText="ПДС НКУ / SA2: Цепь управления введена" w:value="ПДС НКУ / SA2: Цепь управления введена"/>
+                  <w:listItem w:displayText="ПДС НКУ / SA3: Цепь управления введена" w:value="ПДС НКУ / SA3: Цепь управления введена"/>
+                  <w:listItem w:displayText="ПДС НКУ / SA4: Цепь управления введена" w:value="ПДС НКУ / SA4: Цепь управления введена"/>
+                  <w:listItem w:displayText="ПДС НКУ / SG1: Рабочее положение испытательного блока" w:value="ПДС НКУ / SG1: Рабочее положение испытательного блока"/>
+                  <w:listItem w:displayText="ПДС НКУ / SG2: Рабочее положение испытательного блока" w:value="ПДС НКУ / SG2: Рабочее положение испытательного блока"/>
+                  <w:listItem w:displayText="ПДС НКУ / SG3: Рабочее положение испытательного блока" w:value="ПДС НКУ / SG3: Рабочее положение испытательного блока"/>
+                  <w:listItem w:displayText="ПДС НКУ / Дверь: Дверь отсека/ шкафа закрыта" w:value="ПДС НКУ / Дверь: Дверь отсека/ шкафа закрыта"/>
+                  <w:listItem w:displayText="ПДС НКУ / Дверь: Дверь отсека/ шкафа открыта" w:value="ПДС НКУ / Дверь: Дверь отсека/ шкафа открыта"/>
+                  <w:listItem w:displayText="ПДС НКУ / ОТ ОБР 1: Неисправность оперативного тока цепей ОБР 1" w:value="ПДС НКУ / ОТ ОБР 1: Неисправность оперативного тока цепей ОБР 1"/>
+                  <w:listItem w:displayText="ПДС НКУ / ОТ ОБР 2: Неисправность оперативного тока цепей ОБР 2" w:value="ПДС НКУ / ОТ ОБР 2: Неисправность оперативного тока цепей ОБР 2"/>
+                  <w:listItem w:displayText="ПДС НКУ / ОТ ЦСВ: Неисправность ОТ цепей сигнализации В" w:value="ПДС НКУ / ОТ ЦСВ: Неисправность ОТ цепей сигнализации В"/>
+                  <w:listItem w:displayText="ПДС НКУ / ОТ ЭМО1, ЭМВ: Неисправность оперативного тока цепей ЭМВ, ЭМО1" w:value="ПДС НКУ / ОТ ЭМО1, ЭМВ: Неисправность оперативного тока цепей ЭМВ, ЭМО1"/>
+                  <w:listItem w:displayText="ПДС НКУ / ОТ ЭМО2: Неисправность оперативного тока цепей ЭМО2" w:value="ПДС НКУ / ОТ ЭМО2: Неисправность оперативного тока цепей ЭМО2"/>
+                  <w:listItem w:displayText="ПДС НКУ / ПДС НКУ: Функция введена в работу" w:value="ПДС НКУ / ПДС НКУ: Функция введена в работу"/>
+                  <w:listItem w:displayText="ПДС НКУ / ПДС НКУ: Функция оперативно выведена из работы" w:value="ПДС НКУ / ПДС НКУ: Функция оперативно выведена из работы"/>
+                  <w:listItem w:displayText="ПДС НКУ / Пер.ав.дебл.см.яч.: Цепи аварийной деблокировки ячейки выведены" w:value="ПДС НКУ / Пер.ав.дебл.см.яч.: Цепи аварийной деблокировки ячейки выведены"/>
+                  <w:listItem w:displayText="ПС / ПС: Пуск предупредительной сигнализации" w:value="ПС / ПС: Пуск предупредительной сигнализации"/>
+                  <w:listItem w:displayText="ПС / ПС: Пуск предупредительной сигнализации (импульс)" w:value="ПС / ПС: Пуск предупредительной сигнализации (импульс)"/>
+                  <w:listItem w:displayText="СС / СС: БИ выведены" w:value="СС / СС: БИ выведены"/>
+                  <w:listItem w:displayText="СС / СС: Выходные цепи разобраны" w:value="СС / СС: Выходные цепи разобраны"/>
+                  <w:listItem w:displayText="СС / СС: Неисправность КА" w:value="СС / СС: Неисправность КА"/>
+                  <w:listItem w:displayText="СС / СС: Общий внешний сигнал" w:value="СС / СС: Общий внешний сигнал"/>
+                  <w:listItem w:displayText="СС / СС: Превышение времени переключения КА" w:value="СС / СС: Превышение времени переключения КА"/>
+                  <w:listItem w:displayText="СС / СС: Сигнализация цепей опер.тока" w:value="СС / СС: Сигнализация цепей опер.тока"/>
                   <w:listItem w:displayText="ТЗНП / АУ ТЗНП: Пуск автоматического ускорения ТЗНП" w:value="ТЗНП / АУ ТЗНП: Пуск автоматического ускорения ТЗНП"/>
                   <w:listItem w:displayText="ТЗНП / БНТ НП: Пуск БНТ НП" w:value="ТЗНП / БНТ НП: Пуск БНТ НП"/>
                   <w:listItem w:displayText="ТЗНП / БЧС: Блокировка чувствительных ступеней" w:value="ТЗНП / БЧС: Блокировка чувствительных ступеней"/>
@@ -2280,6 +2507,11 @@
                   <w:listItem w:displayText="ТК ЗДЗ / ТК ЗДЗ: Пуск ИО тока" w:value="ТК ЗДЗ / ТК ЗДЗ: Пуск ИО тока"/>
                   <w:listItem w:displayText="ТК ЗДЗ / ТК ЗДЗ: Функция введена в работу" w:value="ТК ЗДЗ / ТК ЗДЗ: Функция введена в работу"/>
                   <w:listItem w:displayText="ТК ЗДЗ / ТК ЗДЗ: Функция оперативно выведена из работы" w:value="ТК ЗДЗ / ТК ЗДЗ: Функция оперативно выведена из работы"/>
+                  <w:listItem w:displayText="УВ / УВ: Включение с контролем синхронизма" w:value="УВ / УВ: Включение с контролем синхронизма"/>
+                  <w:listItem w:displayText="УВ / УВ: Включить выключатель" w:value="УВ / УВ: Включить выключатель"/>
+                  <w:listItem w:displayText="УВ / УВ: Задержка включения с контролем синхронизма" w:value="УВ / УВ: Задержка включения с контролем синхронизма"/>
+                  <w:listItem w:displayText="УВ / УВ: Функция введена в работу" w:value="УВ / УВ: Функция введена в работу"/>
+                  <w:listItem w:displayText="УВ / УВ: Функция оперативно выведена из работы" w:value="УВ / УВ: Функция оперативно выведена из работы"/>
                   <w:listItem w:displayText="УРОВ / УРОВ: Пуск" w:value="УРОВ / УРОВ: Пуск"/>
                   <w:listItem w:displayText="УРОВ / УРОВ: Пуск ИО максимального тока" w:value="УРОВ / УРОВ: Пуск ИО максимального тока"/>
                   <w:listItem w:displayText="УРОВ / УРОВ: Срабатывание" w:value="УРОВ / УРОВ: Срабатывание"/>
@@ -2422,6 +2654,38 @@
                   <w:listItem w:displayText="ЗОП / ЗОП: Срабатывание на сигнал" w:value="ЗОП / ЗОП: Срабатывание на сигнал"/>
                   <w:listItem w:displayText="ЗОП / ЗОП: Функция введена в работу" w:value="ЗОП / ЗОП: Функция введена в работу"/>
                   <w:listItem w:displayText="ЗОП / ЗОП: Функция оперативно выведена из работы" w:value="ЗОП / ЗОП: Функция оперативно выведена из работы"/>
+                  <w:listItem w:displayText="КА / В: Выключатель включен" w:value="КА / В: Выключатель включен"/>
+                  <w:listItem w:displayText="КА / В: Выключатель отключен" w:value="КА / В: Выключатель отключен"/>
+                  <w:listItem w:displayText="КА / В: Команда «включить» выключатель через выходное реле" w:value="КА / В: Команда «включить» выключатель через выходное реле"/>
+                  <w:listItem w:displayText="КА / В: Команда «отключить» выключатель через выходное реле" w:value="КА / В: Команда «отключить» выключатель через выходное реле"/>
+                  <w:listItem w:displayText="КА / В: Неисправное положение выключателя" w:value="КА / В: Неисправное положение выключателя"/>
+                  <w:listItem w:displayText="КА / В: Промежуточное положение выключателя" w:value="КА / В: Промежуточное положение выключателя"/>
+                  <w:listItem w:displayText="КА / В: Функция введена в работу" w:value="КА / В: Функция введена в работу"/>
+                  <w:listItem w:displayText="КА / ВЭ1: Команда «вкатить» выкатной элемент через выходное реле" w:value="КА / ВЭ1: Команда «вкатить» выкатной элемент через выходное реле"/>
+                  <w:listItem w:displayText="КА / ВЭ1: Команда «выкатить» выкатной элемент через выходное реле" w:value="КА / ВЭ1: Команда «выкатить» выкатной элемент через выходное реле"/>
+                  <w:listItem w:displayText="КА / ВЭ1: Неисправное положение выкатного элемента" w:value="КА / ВЭ1: Неисправное положение выкатного элемента"/>
+                  <w:listItem w:displayText="КА / ВЭ1: Положение выкатного элемента «Вкачен»" w:value="КА / ВЭ1: Положение выкатного элемента «Вкачен»"/>
+                  <w:listItem w:displayText="КА / ВЭ1: Положение выкатного элемента «Выкачен»" w:value="КА / ВЭ1: Положение выкатного элемента «Выкачен»"/>
+                  <w:listItem w:displayText="КА / ВЭ1: Промежуточное положение выкатного элемента" w:value="КА / ВЭ1: Промежуточное положение выкатного элемента"/>
+                  <w:listItem w:displayText="КА / ВЭ1: Ремонтное положение выкатного элемента" w:value="КА / ВЭ1: Ремонтное положение выкатного элемента"/>
+                  <w:listItem w:displayText="КА / ВЭ1: Функция введена в работу" w:value="КА / ВЭ1: Функция введена в работу"/>
+                  <w:listItem w:displayText="КА / ВЭ2: Команда «вкатить» выкатной элемент через выходное реле" w:value="КА / ВЭ2: Команда «вкатить» выкатной элемент через выходное реле"/>
+                  <w:listItem w:displayText="КА / ВЭ2: Команда «выкатить» выкатной элемент через выходное реле" w:value="КА / ВЭ2: Команда «выкатить» выкатной элемент через выходное реле"/>
+                  <w:listItem w:displayText="КА / ВЭ2: Неисправное положение выкатного элемента" w:value="КА / ВЭ2: Неисправное положение выкатного элемента"/>
+                  <w:listItem w:displayText="КА / ВЭ2: Положение выкатного элемента «Вкачен»" w:value="КА / ВЭ2: Положение выкатного элемента «Вкачен»"/>
+                  <w:listItem w:displayText="КА / ВЭ2: Положение выкатного элемента «Выкачен»" w:value="КА / ВЭ2: Положение выкатного элемента «Выкачен»"/>
+                  <w:listItem w:displayText="КА / ВЭ2: Промежуточное положение выкатного элемента" w:value="КА / ВЭ2: Промежуточное положение выкатного элемента"/>
+                  <w:listItem w:displayText="КА / ВЭ2: Ремонтное положение выкатного элемента" w:value="КА / ВЭ2: Ремонтное положение выкатного элемента"/>
+                  <w:listItem w:displayText="КА / ВЭ2: Функция введена в работу" w:value="КА / ВЭ2: Функция введена в работу"/>
+                  <w:listItem w:displayText="КА / ЗН: Заземляющий нож включен" w:value="КА / ЗН: Заземляющий нож включен"/>
+                  <w:listItem w:displayText="КА / ЗН: Заземляющий нож отключен" w:value="КА / ЗН: Заземляющий нож отключен"/>
+                  <w:listItem w:displayText="КА / ЗН: Команда «включить» заземляющий нож через выходное реле" w:value="КА / ЗН: Команда «включить» заземляющий нож через выходное реле"/>
+                  <w:listItem w:displayText="КА / ЗН: Команда «отключить» заземляющий нож через выходное реле" w:value="КА / ЗН: Команда «отключить» заземляющий нож через выходное реле"/>
+                  <w:listItem w:displayText="КА / ЗН: Неисправное положение заземляющего ножа" w:value="КА / ЗН: Неисправное положение заземляющего ножа"/>
+                  <w:listItem w:displayText="КА / ЗН: Промежуточное положение заземляющего ножа" w:value="КА / ЗН: Промежуточное положение заземляющего ножа"/>
+                  <w:listItem w:displayText="КА / ЗН: Функция введена в работу" w:value="КА / ЗН: Функция введена в работу"/>
+                  <w:listItem w:displayText="КА / КА: Функция введена в работу" w:value="КА / КА: Функция введена в работу"/>
+                  <w:listItem w:displayText="КА / КА: Функция оперативно выведена из работы" w:value="КА / КА: Функция оперативно выведена из работы"/>
                   <w:listItem w:displayText="КНН 1сш / КНН 1сш: Пуск" w:value="КНН 1сш / КНН 1сш: Пуск"/>
                   <w:listItem w:displayText="КНН 1сш / КНН 1сш: Пуск ИО напряжения" w:value="КНН 1сш / КНН 1сш: Пуск ИО напряжения"/>
                   <w:listItem w:displayText="КНН 1сш / КНН 1сш: Пуск ИО напряжения ОП" w:value="КНН 1сш / КНН 1сш: Пуск ИО напряжения ОП"/>
@@ -2442,6 +2706,68 @@
                   <w:listItem w:displayText="КОН 2сш / КОН 2сш: Пуск ИО напряжения ОП" w:value="КОН 2сш / КОН 2сш: Пуск ИО напряжения ОП"/>
                   <w:listItem w:displayText="КОН 2сш / КОН 2сш: Функция введена в работу" w:value="КОН 2сш / КОН 2сш: Функция введена в работу"/>
                   <w:listItem w:displayText="КОН 2сш / КОН 2сш: Функция оперативно выведена из работы" w:value="КОН 2сш / КОН 2сш: Функция оперативно выведена из работы"/>
+                  <w:listItem w:displayText="КП / КП: Идет переключение" w:value="КП / КП: Идет переключение"/>
+                  <w:listItem w:displayText="КП / КП: Функция введена в работу" w:value="КП / КП: Функция введена в работу"/>
+                  <w:listItem w:displayText="КП / КП: Функция оперативно выведена из работы" w:value="КП / КП: Функция оперативно выведена из работы"/>
+                  <w:listItem w:displayText="КП / ОБР В: Блокировка включения" w:value="КП / ОБР В: Блокировка включения"/>
+                  <w:listItem w:displayText="КП / ОБР В: Разрешить включение" w:value="КП / ОБР В: Разрешить включение"/>
+                  <w:listItem w:displayText="КП / ОБР ВЭ1: Разрешение управления первым выкатным элементом" w:value="КП / ОБР ВЭ1: Разрешение управления первым выкатным элементом"/>
+                  <w:listItem w:displayText="КП / ОБР ВЭ2: Разрешение управления вторым выкатным элементом" w:value="КП / ОБР ВЭ2: Разрешение управления вторым выкатным элементом"/>
+                  <w:listItem w:displayText="КП / ОБР ЗН: Разрешение управления заземляющим ножом" w:value="КП / ОБР ЗН: Разрешение управления заземляющим ножом"/>
+                  <w:listItem w:displayText="КП / УВ: Включение с контролем синхронизма" w:value="КП / УВ: Включение с контролем синхронизма"/>
+                  <w:listItem w:displayText="КП / УВ: Включить выключатель" w:value="КП / УВ: Включить выключатель"/>
+                  <w:listItem w:displayText="КП / УВ: Задержка включения с контролем синхронизма" w:value="КП / УВ: Задержка включения с контролем синхронизма"/>
+                  <w:listItem w:displayText="КП / УВ: Идет переключение" w:value="КП / УВ: Идет переключение"/>
+                  <w:listItem w:displayText="КП / УВ: Отключить выключатель" w:value="КП / УВ: Отключить выключатель"/>
+                  <w:listItem w:displayText="КП / УВ: Поведение местного управления" w:value="КП / УВ: Поведение местного управления"/>
+                  <w:listItem w:displayText="КП / УВ: Положение В (Включено)" w:value="КП / УВ: Положение В (Включено)"/>
+                  <w:listItem w:displayText="КП / УВ: Положение В (Не определено)" w:value="КП / УВ: Положение В (Не определено)"/>
+                  <w:listItem w:displayText="КП / УВ: Положение В (Неисправность)" w:value="КП / УВ: Положение В (Неисправность)"/>
+                  <w:listItem w:displayText="КП / УВ: Положение В (Отключено)" w:value="КП / УВ: Положение В (Отключено)"/>
+                  <w:listItem w:displayText="КП / УВ: Положение ключа режима управления" w:value="КП / УВ: Положение ключа режима управления"/>
+                  <w:listItem w:displayText="КП / УВ: Право переключения на уровне станции" w:value="КП / УВ: Право переключения на уровне станции"/>
+                  <w:listItem w:displayText="КП / УВ: Сигнал превышения допустимого времени переключения" w:value="КП / УВ: Сигнал превышения допустимого времени переключения"/>
+                  <w:listItem w:displayText="КП / УВ: Функция введена в работу" w:value="КП / УВ: Функция введена в работу"/>
+                  <w:listItem w:displayText="КП / УВЭ1: Вкатить первый выкатной элемент" w:value="КП / УВЭ1: Вкатить первый выкатной элемент"/>
+                  <w:listItem w:displayText="КП / УВЭ1: Выкатить первый выкатной элемент" w:value="КП / УВЭ1: Выкатить первый выкатной элемент"/>
+                  <w:listItem w:displayText="КП / УВЭ1: Идет переключение" w:value="КП / УВЭ1: Идет переключение"/>
+                  <w:listItem w:displayText="КП / УВЭ1: Поведение местного управления" w:value="КП / УВЭ1: Поведение местного управления"/>
+                  <w:listItem w:displayText="КП / УВЭ1: Положение ВЭ1 (Вкачен)" w:value="КП / УВЭ1: Положение ВЭ1 (Вкачен)"/>
+                  <w:listItem w:displayText="КП / УВЭ1: Положение ВЭ1 (Выкачен)" w:value="КП / УВЭ1: Положение ВЭ1 (Выкачен)"/>
+                  <w:listItem w:displayText="КП / УВЭ1: Положение ВЭ1 (Не определено)" w:value="КП / УВЭ1: Положение ВЭ1 (Не определено)"/>
+                  <w:listItem w:displayText="КП / УВЭ1: Положение ВЭ1 (Неисправность)" w:value="КП / УВЭ1: Положение ВЭ1 (Неисправность)"/>
+                  <w:listItem w:displayText="КП / УВЭ1: Положение ключа режима управления" w:value="КП / УВЭ1: Положение ключа режима управления"/>
+                  <w:listItem w:displayText="КП / УВЭ1: Право переключения на уровне станции" w:value="КП / УВЭ1: Право переключения на уровне станции"/>
+                  <w:listItem w:displayText="КП / УВЭ1: Сигнал превышения допустимого времени переключения" w:value="КП / УВЭ1: Сигнал превышения допустимого времени переключения"/>
+                  <w:listItem w:displayText="КП / УВЭ1: Функция введена в работу" w:value="КП / УВЭ1: Функция введена в работу"/>
+                  <w:listItem w:displayText="КП / УВЭ2: Вкатить второй выкатной элемент" w:value="КП / УВЭ2: Вкатить второй выкатной элемент"/>
+                  <w:listItem w:displayText="КП / УВЭ2: Выкатить второй выкатной элемент" w:value="КП / УВЭ2: Выкатить второй выкатной элемент"/>
+                  <w:listItem w:displayText="КП / УВЭ2: Идет переключение" w:value="КП / УВЭ2: Идет переключение"/>
+                  <w:listItem w:displayText="КП / УВЭ2: Поведение местного управления" w:value="КП / УВЭ2: Поведение местного управления"/>
+                  <w:listItem w:displayText="КП / УВЭ2: Положение ВЭ2 (Вкачен)" w:value="КП / УВЭ2: Положение ВЭ2 (Вкачен)"/>
+                  <w:listItem w:displayText="КП / УВЭ2: Положение ВЭ2 (Выкачен)" w:value="КП / УВЭ2: Положение ВЭ2 (Выкачен)"/>
+                  <w:listItem w:displayText="КП / УВЭ2: Положение ВЭ2 (Не определено)" w:value="КП / УВЭ2: Положение ВЭ2 (Не определено)"/>
+                  <w:listItem w:displayText="КП / УВЭ2: Положение ВЭ2 (Неисправность)" w:value="КП / УВЭ2: Положение ВЭ2 (Неисправность)"/>
+                  <w:listItem w:displayText="КП / УВЭ2: Положение ключа режима управления" w:value="КП / УВЭ2: Положение ключа режима управления"/>
+                  <w:listItem w:displayText="КП / УВЭ2: Право переключения на уровне станции" w:value="КП / УВЭ2: Право переключения на уровне станции"/>
+                  <w:listItem w:displayText="КП / УВЭ2: Сигнал превышения допустимого времени переключения" w:value="КП / УВЭ2: Сигнал превышения допустимого времени переключения"/>
+                  <w:listItem w:displayText="КП / УВЭ2: Функция введена в работу" w:value="КП / УВЭ2: Функция введена в работу"/>
+                  <w:listItem w:displayText="КП / УЗН: Включить заземляющий нож" w:value="КП / УЗН: Включить заземляющий нож"/>
+                  <w:listItem w:displayText="КП / УЗН: Идет переключение" w:value="КП / УЗН: Идет переключение"/>
+                  <w:listItem w:displayText="КП / УЗН: Отключить заземляющий нож" w:value="КП / УЗН: Отключить заземляющий нож"/>
+                  <w:listItem w:displayText="КП / УЗН: Поведение местного управления" w:value="КП / УЗН: Поведение местного управления"/>
+                  <w:listItem w:displayText="КП / УЗН: Положение ЗН (Включено)" w:value="КП / УЗН: Положение ЗН (Включено)"/>
+                  <w:listItem w:displayText="КП / УЗН: Положение ЗН (Не определено)" w:value="КП / УЗН: Положение ЗН (Не определено)"/>
+                  <w:listItem w:displayText="КП / УЗН: Положение ЗН (Неисправность)" w:value="КП / УЗН: Положение ЗН (Неисправность)"/>
+                  <w:listItem w:displayText="КП / УЗН: Положение ЗН (Отключено)" w:value="КП / УЗН: Положение ЗН (Отключено)"/>
+                  <w:listItem w:displayText="КП / УЗН: Положение ключа режима управления" w:value="КП / УЗН: Положение ключа режима управления"/>
+                  <w:listItem w:displayText="КП / УЗН: Право переключения на уровне станции" w:value="КП / УЗН: Право переключения на уровне станции"/>
+                  <w:listItem w:displayText="КП / УЗН: Сигнал превышения допустимого времени переключения" w:value="КП / УЗН: Сигнал превышения допустимого времени переключения"/>
+                  <w:listItem w:displayText="КП / УЗН: Функция введена в работу" w:value="КП / УЗН: Функция введена в работу"/>
+                  <w:listItem w:displayText="КРВ / КРВ: Превышен коммутационный ресурс выключателя" w:value="КРВ / КРВ: Превышен коммутационный ресурс выключателя"/>
+                  <w:listItem w:displayText="КРВ / КРВ: Превышен механический ресурс выключателя" w:value="КРВ / КРВ: Превышен механический ресурс выключателя"/>
+                  <w:listItem w:displayText="КРВ / КРВ: Превышен ресурс выключателя" w:value="КРВ / КРВ: Превышен ресурс выключателя"/>
+                  <w:listItem w:displayText="КРВ / КРВ: Функция введена в работу" w:value="КРВ / КРВ: Функция введена в работу"/>
                   <w:listItem w:displayText="КС / КС: Блокировка по скорости изменения частоты" w:value="КС / КС: Блокировка по скорости изменения частоты"/>
                   <w:listItem w:displayText="КС / КС: Нет условий по напряжению" w:value="КС / КС: Нет условий по напряжению"/>
                   <w:listItem w:displayText="КС / КС: Нет условий по углу" w:value="КС / КС: Нет условий по углу"/>
@@ -2454,6 +2780,18 @@
                   <w:listItem w:displayText="КС / КС: Разрешение оперативного включения" w:value="КС / КС: Разрешение оперативного включения"/>
                   <w:listItem w:displayText="КС / КС: Функция введена в работу" w:value="КС / КС: Функция введена в работу"/>
                   <w:listItem w:displayText="КС / КС: Функция оперативно выведена из работы" w:value="КС / КС: Функция оперативно выведена из работы"/>
+                  <w:listItem w:displayText="КСВ / КСВ: Блокировка включения В" w:value="КСВ / КСВ: Блокировка включения В"/>
+                  <w:listItem w:displayText="КСВ / КСВ: Блокировка отключения В" w:value="КСВ / КСВ: Блокировка отключения В"/>
+                  <w:listItem w:displayText="КСВ / КСВ: В аварийно отключен" w:value="КСВ / КСВ: В аварийно отключен"/>
+                  <w:listItem w:displayText="КСВ / КСВ: В самопроизвольно отключен" w:value="КСВ / КСВ: В самопроизвольно отключен"/>
+                  <w:listItem w:displayText="КСВ / КСВ: Защита ЭМВ" w:value="КСВ / КСВ: Защита ЭМВ"/>
+                  <w:listItem w:displayText="КСВ / КСВ: Защита ЭМО1" w:value="КСВ / КСВ: Защита ЭМО1"/>
+                  <w:listItem w:displayText="КСВ / КСВ: Защита ЭМО2" w:value="КСВ / КСВ: Защита ЭМО2"/>
+                  <w:listItem w:displayText="КСВ / КСВ: Неисправность В" w:value="КСВ / КСВ: Неисправность В"/>
+                  <w:listItem w:displayText="КСВ / КСВ: Неисправность цепей ЭМУ" w:value="КСВ / КСВ: Неисправность цепей ЭМУ"/>
+                  <w:listItem w:displayText="КСВ / КСВ: Реле фиксации команды" w:value="КСВ / КСВ: Реле фиксации команды"/>
+                  <w:listItem w:displayText="КСВ / КСВ: Функция введена в работу" w:value="КСВ / КСВ: Функция введена в работу"/>
+                  <w:listItem w:displayText="КСВ / КСВ: Функция оперативно выведена из работы" w:value="КСВ / КСВ: Функция оперативно выведена из работы"/>
                   <w:listItem w:displayText="ЛЗШ / ЛЗШ: Обнаружение неисправности" w:value="ЛЗШ / ЛЗШ: Обнаружение неисправности"/>
                   <w:listItem w:displayText="ЛЗШ / ЛЗШ: Пуск" w:value="ЛЗШ / ЛЗШ: Пуск"/>
                   <w:listItem w:displayText="ЛЗШ / ЛЗШ: Пуск ИО тока по фазе B" w:value="ЛЗШ / ЛЗШ: Пуск ИО тока по фазе B"/>
@@ -2546,6 +2884,57 @@
                   <w:listItem w:displayText="МТЗ / ОНМ: Пуск по фазе C" w:value="МТЗ / ОНМ: Пуск по фазе C"/>
                   <w:listItem w:displayText="МТЗ / ОНМ: Пуск по фазе А" w:value="МТЗ / ОНМ: Пуск по фазе А"/>
                   <w:listItem w:displayText="МТЗ / ОУ МТЗ: Срабатывание" w:value="МТЗ / ОУ МТЗ: Срабатывание"/>
+                  <w:listItem w:displayText="ПДС / В: Поведение местного управления" w:value="ПДС / В: Поведение местного управления"/>
+                  <w:listItem w:displayText="ПДС / В: Положение ключа режима управления" w:value="ПДС / В: Положение ключа режима управления"/>
+                  <w:listItem w:displayText="ПДС / В: Положение ключа режима управления привода В" w:value="ПДС / В: Положение ключа режима управления привода В"/>
+                  <w:listItem w:displayText="ПДС / В: Право переключения на уровне станции" w:value="ПДС / В: Право переключения на уровне станции"/>
+                  <w:listItem w:displayText="ПДС / ВЭ1: Поведение местного управления" w:value="ПДС / ВЭ1: Поведение местного управления"/>
+                  <w:listItem w:displayText="ПДС / ВЭ1: Положение ключа режима управления" w:value="ПДС / ВЭ1: Положение ключа режима управления"/>
+                  <w:listItem w:displayText="ПДС / ВЭ1: Право переключения на уровне станции" w:value="ПДС / ВЭ1: Право переключения на уровне станции"/>
+                  <w:listItem w:displayText="ПДС / ВЭ1: Ремонтное положение коммутационного аппарата" w:value="ПДС / ВЭ1: Ремонтное положение коммутационного аппарата"/>
+                  <w:listItem w:displayText="ПДС / ВЭ2: Поведение местного управления" w:value="ПДС / ВЭ2: Поведение местного управления"/>
+                  <w:listItem w:displayText="ПДС / ВЭ2: Положение ключа режима управления" w:value="ПДС / ВЭ2: Положение ключа режима управления"/>
+                  <w:listItem w:displayText="ПДС / ВЭ2: Право переключения на уровне станции" w:value="ПДС / ВЭ2: Право переключения на уровне станции"/>
+                  <w:listItem w:displayText="ПДС / ВЭ2: Ремонтное положение коммутационного аппарата" w:value="ПДС / ВЭ2: Ремонтное положение коммутационного аппарата"/>
+                  <w:listItem w:displayText="ПДС / ЗН: Поведение местного управления" w:value="ПДС / ЗН: Поведение местного управления"/>
+                  <w:listItem w:displayText="ПДС / ЗН: Положение ключа режима управления" w:value="ПДС / ЗН: Положение ключа режима управления"/>
+                  <w:listItem w:displayText="ПДС / ЗН: Право переключения на уровне станции" w:value="ПДС / ЗН: Право переключения на уровне станции"/>
+                  <w:listItem w:displayText="ПДС / КИ: Аварийный уровень изоляции" w:value="ПДС / КИ: Аварийный уровень изоляции"/>
+                  <w:listItem w:displayText="ПДС / КИ: Низкий уровень изоляции" w:value="ПДС / КИ: Низкий уровень изоляции"/>
+                  <w:listItem w:displayText="ПДС / КПруж: Пружина не заведена" w:value="ПДС / КПруж: Пружина не заведена"/>
+                  <w:listItem w:displayText="ПДС / КЦВ: Контроль цепи ЭМВ" w:value="ПДС / КЦВ: Контроль цепи ЭМВ"/>
+                  <w:listItem w:displayText="ПДС / КЦВ: Контроль цепи ЭМО1" w:value="ПДС / КЦВ: Контроль цепи ЭМО1"/>
+                  <w:listItem w:displayText="ПДС / КЦВ: Контроль цепи ЭМО2" w:value="ПДС / КЦВ: Контроль цепи ЭМО2"/>
+                  <w:listItem w:displayText="ПДС / КЦВ: Работа ЭМВ" w:value="ПДС / КЦВ: Работа ЭМВ"/>
+                  <w:listItem w:displayText="ПДС / КЦВ: Работа ЭМО1" w:value="ПДС / КЦВ: Работа ЭМО1"/>
+                  <w:listItem w:displayText="ПДС / КЦВ: Работа ЭМО2" w:value="ПДС / КЦВ: Работа ЭМО2"/>
+                  <w:listItem w:displayText="ПДС / ПДС: Функция введена в работу" w:value="ПДС / ПДС: Функция введена в работу"/>
+                  <w:listItem w:displayText="ПДС / ПДС: Функция оперативно выведена из работы" w:value="ПДС / ПДС: Функция оперативно выведена из работы"/>
+                  <w:listItem w:displayText="ПДС НКУ / SA1: Цепь управления введена" w:value="ПДС НКУ / SA1: Цепь управления введена"/>
+                  <w:listItem w:displayText="ПДС НКУ / SA2: Цепь управления введена" w:value="ПДС НКУ / SA2: Цепь управления введена"/>
+                  <w:listItem w:displayText="ПДС НКУ / SA3: Цепь управления введена" w:value="ПДС НКУ / SA3: Цепь управления введена"/>
+                  <w:listItem w:displayText="ПДС НКУ / SA4: Цепь управления введена" w:value="ПДС НКУ / SA4: Цепь управления введена"/>
+                  <w:listItem w:displayText="ПДС НКУ / SG1: Рабочее положение испытательного блока" w:value="ПДС НКУ / SG1: Рабочее положение испытательного блока"/>
+                  <w:listItem w:displayText="ПДС НКУ / SG2: Рабочее положение испытательного блока" w:value="ПДС НКУ / SG2: Рабочее положение испытательного блока"/>
+                  <w:listItem w:displayText="ПДС НКУ / SG3: Рабочее положение испытательного блока" w:value="ПДС НКУ / SG3: Рабочее положение испытательного блока"/>
+                  <w:listItem w:displayText="ПДС НКУ / Дверь: Дверь отсека/ шкафа закрыта" w:value="ПДС НКУ / Дверь: Дверь отсека/ шкафа закрыта"/>
+                  <w:listItem w:displayText="ПДС НКУ / Дверь: Дверь отсека/ шкафа открыта" w:value="ПДС НКУ / Дверь: Дверь отсека/ шкафа открыта"/>
+                  <w:listItem w:displayText="ПДС НКУ / ОТ ОБР 1: Неисправность оперативного тока цепей ОБР 1" w:value="ПДС НКУ / ОТ ОБР 1: Неисправность оперативного тока цепей ОБР 1"/>
+                  <w:listItem w:displayText="ПДС НКУ / ОТ ОБР 2: Неисправность оперативного тока цепей ОБР 2" w:value="ПДС НКУ / ОТ ОБР 2: Неисправность оперативного тока цепей ОБР 2"/>
+                  <w:listItem w:displayText="ПДС НКУ / ОТ ЦСВ: Неисправность ОТ цепей сигнализации В" w:value="ПДС НКУ / ОТ ЦСВ: Неисправность ОТ цепей сигнализации В"/>
+                  <w:listItem w:displayText="ПДС НКУ / ОТ ЭМО1, ЭМВ: Неисправность оперативного тока цепей ЭМВ, ЭМО1" w:value="ПДС НКУ / ОТ ЭМО1, ЭМВ: Неисправность оперативного тока цепей ЭМВ, ЭМО1"/>
+                  <w:listItem w:displayText="ПДС НКУ / ОТ ЭМО2: Неисправность оперативного тока цепей ЭМО2" w:value="ПДС НКУ / ОТ ЭМО2: Неисправность оперативного тока цепей ЭМО2"/>
+                  <w:listItem w:displayText="ПДС НКУ / ПДС НКУ: Функция введена в работу" w:value="ПДС НКУ / ПДС НКУ: Функция введена в работу"/>
+                  <w:listItem w:displayText="ПДС НКУ / ПДС НКУ: Функция оперативно выведена из работы" w:value="ПДС НКУ / ПДС НКУ: Функция оперативно выведена из работы"/>
+                  <w:listItem w:displayText="ПДС НКУ / Пер.ав.дебл.см.яч.: Цепи аварийной деблокировки ячейки выведены" w:value="ПДС НКУ / Пер.ав.дебл.см.яч.: Цепи аварийной деблокировки ячейки выведены"/>
+                  <w:listItem w:displayText="ПС / ПС: Пуск предупредительной сигнализации" w:value="ПС / ПС: Пуск предупредительной сигнализации"/>
+                  <w:listItem w:displayText="ПС / ПС: Пуск предупредительной сигнализации (импульс)" w:value="ПС / ПС: Пуск предупредительной сигнализации (импульс)"/>
+                  <w:listItem w:displayText="СС / СС: БИ выведены" w:value="СС / СС: БИ выведены"/>
+                  <w:listItem w:displayText="СС / СС: Выходные цепи разобраны" w:value="СС / СС: Выходные цепи разобраны"/>
+                  <w:listItem w:displayText="СС / СС: Неисправность КА" w:value="СС / СС: Неисправность КА"/>
+                  <w:listItem w:displayText="СС / СС: Общий внешний сигнал" w:value="СС / СС: Общий внешний сигнал"/>
+                  <w:listItem w:displayText="СС / СС: Превышение времени переключения КА" w:value="СС / СС: Превышение времени переключения КА"/>
+                  <w:listItem w:displayText="СС / СС: Сигнализация цепей опер.тока" w:value="СС / СС: Сигнализация цепей опер.тока"/>
                   <w:listItem w:displayText="ТЗНП / АУ ТЗНП: Пуск автоматического ускорения ТЗНП" w:value="ТЗНП / АУ ТЗНП: Пуск автоматического ускорения ТЗНП"/>
                   <w:listItem w:displayText="ТЗНП / БНТ НП: Пуск БНТ НП" w:value="ТЗНП / БНТ НП: Пуск БНТ НП"/>
                   <w:listItem w:displayText="ТЗНП / БЧС: Блокировка чувствительных ступеней" w:value="ТЗНП / БЧС: Блокировка чувствительных ступеней"/>
@@ -2585,6 +2974,11 @@
                   <w:listItem w:displayText="ТК ЗДЗ / ТК ЗДЗ: Пуск ИО тока" w:value="ТК ЗДЗ / ТК ЗДЗ: Пуск ИО тока"/>
                   <w:listItem w:displayText="ТК ЗДЗ / ТК ЗДЗ: Функция введена в работу" w:value="ТК ЗДЗ / ТК ЗДЗ: Функция введена в работу"/>
                   <w:listItem w:displayText="ТК ЗДЗ / ТК ЗДЗ: Функция оперативно выведена из работы" w:value="ТК ЗДЗ / ТК ЗДЗ: Функция оперативно выведена из работы"/>
+                  <w:listItem w:displayText="УВ / УВ: Включение с контролем синхронизма" w:value="УВ / УВ: Включение с контролем синхронизма"/>
+                  <w:listItem w:displayText="УВ / УВ: Включить выключатель" w:value="УВ / УВ: Включить выключатель"/>
+                  <w:listItem w:displayText="УВ / УВ: Задержка включения с контролем синхронизма" w:value="УВ / УВ: Задержка включения с контролем синхронизма"/>
+                  <w:listItem w:displayText="УВ / УВ: Функция введена в работу" w:value="УВ / УВ: Функция введена в работу"/>
+                  <w:listItem w:displayText="УВ / УВ: Функция оперативно выведена из работы" w:value="УВ / УВ: Функция оперативно выведена из работы"/>
                   <w:listItem w:displayText="УРОВ / УРОВ: Пуск" w:value="УРОВ / УРОВ: Пуск"/>
                   <w:listItem w:displayText="УРОВ / УРОВ: Пуск ИО максимального тока" w:value="УРОВ / УРОВ: Пуск ИО максимального тока"/>
                   <w:listItem w:displayText="УРОВ / УРОВ: Срабатывание" w:value="УРОВ / УРОВ: Срабатывание"/>
@@ -2730,6 +3124,38 @@
                   <w:listItem w:displayText="ЗОП / ЗОП: Срабатывание на сигнал" w:value="ЗОП / ЗОП: Срабатывание на сигнал"/>
                   <w:listItem w:displayText="ЗОП / ЗОП: Функция введена в работу" w:value="ЗОП / ЗОП: Функция введена в работу"/>
                   <w:listItem w:displayText="ЗОП / ЗОП: Функция оперативно выведена из работы" w:value="ЗОП / ЗОП: Функция оперативно выведена из работы"/>
+                  <w:listItem w:displayText="КА / В: Выключатель включен" w:value="КА / В: Выключатель включен"/>
+                  <w:listItem w:displayText="КА / В: Выключатель отключен" w:value="КА / В: Выключатель отключен"/>
+                  <w:listItem w:displayText="КА / В: Команда «включить» выключатель через выходное реле" w:value="КА / В: Команда «включить» выключатель через выходное реле"/>
+                  <w:listItem w:displayText="КА / В: Команда «отключить» выключатель через выходное реле" w:value="КА / В: Команда «отключить» выключатель через выходное реле"/>
+                  <w:listItem w:displayText="КА / В: Неисправное положение выключателя" w:value="КА / В: Неисправное положение выключателя"/>
+                  <w:listItem w:displayText="КА / В: Промежуточное положение выключателя" w:value="КА / В: Промежуточное положение выключателя"/>
+                  <w:listItem w:displayText="КА / В: Функция введена в работу" w:value="КА / В: Функция введена в работу"/>
+                  <w:listItem w:displayText="КА / ВЭ1: Команда «вкатить» выкатной элемент через выходное реле" w:value="КА / ВЭ1: Команда «вкатить» выкатной элемент через выходное реле"/>
+                  <w:listItem w:displayText="КА / ВЭ1: Команда «выкатить» выкатной элемент через выходное реле" w:value="КА / ВЭ1: Команда «выкатить» выкатной элемент через выходное реле"/>
+                  <w:listItem w:displayText="КА / ВЭ1: Неисправное положение выкатного элемента" w:value="КА / ВЭ1: Неисправное положение выкатного элемента"/>
+                  <w:listItem w:displayText="КА / ВЭ1: Положение выкатного элемента «Вкачен»" w:value="КА / ВЭ1: Положение выкатного элемента «Вкачен»"/>
+                  <w:listItem w:displayText="КА / ВЭ1: Положение выкатного элемента «Выкачен»" w:value="КА / ВЭ1: Положение выкатного элемента «Выкачен»"/>
+                  <w:listItem w:displayText="КА / ВЭ1: Промежуточное положение выкатного элемента" w:value="КА / ВЭ1: Промежуточное положение выкатного элемента"/>
+                  <w:listItem w:displayText="КА / ВЭ1: Ремонтное положение выкатного элемента" w:value="КА / ВЭ1: Ремонтное положение выкатного элемента"/>
+                  <w:listItem w:displayText="КА / ВЭ1: Функция введена в работу" w:value="КА / ВЭ1: Функция введена в работу"/>
+                  <w:listItem w:displayText="КА / ВЭ2: Команда «вкатить» выкатной элемент через выходное реле" w:value="КА / ВЭ2: Команда «вкатить» выкатной элемент через выходное реле"/>
+                  <w:listItem w:displayText="КА / ВЭ2: Команда «выкатить» выкатной элемент через выходное реле" w:value="КА / ВЭ2: Команда «выкатить» выкатной элемент через выходное реле"/>
+                  <w:listItem w:displayText="КА / ВЭ2: Неисправное положение выкатного элемента" w:value="КА / ВЭ2: Неисправное положение выкатного элемента"/>
+                  <w:listItem w:displayText="КА / ВЭ2: Положение выкатного элемента «Вкачен»" w:value="КА / ВЭ2: Положение выкатного элемента «Вкачен»"/>
+                  <w:listItem w:displayText="КА / ВЭ2: Положение выкатного элемента «Выкачен»" w:value="КА / ВЭ2: Положение выкатного элемента «Выкачен»"/>
+                  <w:listItem w:displayText="КА / ВЭ2: Промежуточное положение выкатного элемента" w:value="КА / ВЭ2: Промежуточное положение выкатного элемента"/>
+                  <w:listItem w:displayText="КА / ВЭ2: Ремонтное положение выкатного элемента" w:value="КА / ВЭ2: Ремонтное положение выкатного элемента"/>
+                  <w:listItem w:displayText="КА / ВЭ2: Функция введена в работу" w:value="КА / ВЭ2: Функция введена в работу"/>
+                  <w:listItem w:displayText="КА / ЗН: Заземляющий нож включен" w:value="КА / ЗН: Заземляющий нож включен"/>
+                  <w:listItem w:displayText="КА / ЗН: Заземляющий нож отключен" w:value="КА / ЗН: Заземляющий нож отключен"/>
+                  <w:listItem w:displayText="КА / ЗН: Команда «включить» заземляющий нож через выходное реле" w:value="КА / ЗН: Команда «включить» заземляющий нож через выходное реле"/>
+                  <w:listItem w:displayText="КА / ЗН: Команда «отключить» заземляющий нож через выходное реле" w:value="КА / ЗН: Команда «отключить» заземляющий нож через выходное реле"/>
+                  <w:listItem w:displayText="КА / ЗН: Неисправное положение заземляющего ножа" w:value="КА / ЗН: Неисправное положение заземляющего ножа"/>
+                  <w:listItem w:displayText="КА / ЗН: Промежуточное положение заземляющего ножа" w:value="КА / ЗН: Промежуточное положение заземляющего ножа"/>
+                  <w:listItem w:displayText="КА / ЗН: Функция введена в работу" w:value="КА / ЗН: Функция введена в работу"/>
+                  <w:listItem w:displayText="КА / КА: Функция введена в работу" w:value="КА / КА: Функция введена в работу"/>
+                  <w:listItem w:displayText="КА / КА: Функция оперативно выведена из работы" w:value="КА / КА: Функция оперативно выведена из работы"/>
                   <w:listItem w:displayText="КНН 1сш / КНН 1сш: Пуск" w:value="КНН 1сш / КНН 1сш: Пуск"/>
                   <w:listItem w:displayText="КНН 1сш / КНН 1сш: Пуск ИО напряжения" w:value="КНН 1сш / КНН 1сш: Пуск ИО напряжения"/>
                   <w:listItem w:displayText="КНН 1сш / КНН 1сш: Пуск ИО напряжения ОП" w:value="КНН 1сш / КНН 1сш: Пуск ИО напряжения ОП"/>
@@ -2750,6 +3176,68 @@
                   <w:listItem w:displayText="КОН 2сш / КОН 2сш: Пуск ИО напряжения ОП" w:value="КОН 2сш / КОН 2сш: Пуск ИО напряжения ОП"/>
                   <w:listItem w:displayText="КОН 2сш / КОН 2сш: Функция введена в работу" w:value="КОН 2сш / КОН 2сш: Функция введена в работу"/>
                   <w:listItem w:displayText="КОН 2сш / КОН 2сш: Функция оперативно выведена из работы" w:value="КОН 2сш / КОН 2сш: Функция оперативно выведена из работы"/>
+                  <w:listItem w:displayText="КП / КП: Идет переключение" w:value="КП / КП: Идет переключение"/>
+                  <w:listItem w:displayText="КП / КП: Функция введена в работу" w:value="КП / КП: Функция введена в работу"/>
+                  <w:listItem w:displayText="КП / КП: Функция оперативно выведена из работы" w:value="КП / КП: Функция оперативно выведена из работы"/>
+                  <w:listItem w:displayText="КП / ОБР В: Блокировка включения" w:value="КП / ОБР В: Блокировка включения"/>
+                  <w:listItem w:displayText="КП / ОБР В: Разрешить включение" w:value="КП / ОБР В: Разрешить включение"/>
+                  <w:listItem w:displayText="КП / ОБР ВЭ1: Разрешение управления первым выкатным элементом" w:value="КП / ОБР ВЭ1: Разрешение управления первым выкатным элементом"/>
+                  <w:listItem w:displayText="КП / ОБР ВЭ2: Разрешение управления вторым выкатным элементом" w:value="КП / ОБР ВЭ2: Разрешение управления вторым выкатным элементом"/>
+                  <w:listItem w:displayText="КП / ОБР ЗН: Разрешение управления заземляющим ножом" w:value="КП / ОБР ЗН: Разрешение управления заземляющим ножом"/>
+                  <w:listItem w:displayText="КП / УВ: Включение с контролем синхронизма" w:value="КП / УВ: Включение с контролем синхронизма"/>
+                  <w:listItem w:displayText="КП / УВ: Включить выключатель" w:value="КП / УВ: Включить выключатель"/>
+                  <w:listItem w:displayText="КП / УВ: Задержка включения с контролем синхронизма" w:value="КП / УВ: Задержка включения с контролем синхронизма"/>
+                  <w:listItem w:displayText="КП / УВ: Идет переключение" w:value="КП / УВ: Идет переключение"/>
+                  <w:listItem w:displayText="КП / УВ: Отключить выключатель" w:value="КП / УВ: Отключить выключатель"/>
+                  <w:listItem w:displayText="КП / УВ: Поведение местного управления" w:value="КП / УВ: Поведение местного управления"/>
+                  <w:listItem w:displayText="КП / УВ: Положение В (Включено)" w:value="КП / УВ: Положение В (Включено)"/>
+                  <w:listItem w:displayText="КП / УВ: Положение В (Не определено)" w:value="КП / УВ: Положение В (Не определено)"/>
+                  <w:listItem w:displayText="КП / УВ: Положение В (Неисправность)" w:value="КП / УВ: Положение В (Неисправность)"/>
+                  <w:listItem w:displayText="КП / УВ: Положение В (Отключено)" w:value="КП / УВ: Положение В (Отключено)"/>
+                  <w:listItem w:displayText="КП / УВ: Положение ключа режима управления" w:value="КП / УВ: Положение ключа режима управления"/>
+                  <w:listItem w:displayText="КП / УВ: Право переключения на уровне станции" w:value="КП / УВ: Право переключения на уровне станции"/>
+                  <w:listItem w:displayText="КП / УВ: Сигнал превышения допустимого времени переключения" w:value="КП / УВ: Сигнал превышения допустимого времени переключения"/>
+                  <w:listItem w:displayText="КП / УВ: Функция введена в работу" w:value="КП / УВ: Функция введена в работу"/>
+                  <w:listItem w:displayText="КП / УВЭ1: Вкатить первый выкатной элемент" w:value="КП / УВЭ1: Вкатить первый выкатной элемент"/>
+                  <w:listItem w:displayText="КП / УВЭ1: Выкатить первый выкатной элемент" w:value="КП / УВЭ1: Выкатить первый выкатной элемент"/>
+                  <w:listItem w:displayText="КП / УВЭ1: Идет переключение" w:value="КП / УВЭ1: Идет переключение"/>
+                  <w:listItem w:displayText="КП / УВЭ1: Поведение местного управления" w:value="КП / УВЭ1: Поведение местного управления"/>
+                  <w:listItem w:displayText="КП / УВЭ1: Положение ВЭ1 (Вкачен)" w:value="КП / УВЭ1: Положение ВЭ1 (Вкачен)"/>
+                  <w:listItem w:displayText="КП / УВЭ1: Положение ВЭ1 (Выкачен)" w:value="КП / УВЭ1: Положение ВЭ1 (Выкачен)"/>
+                  <w:listItem w:displayText="КП / УВЭ1: Положение ВЭ1 (Не определено)" w:value="КП / УВЭ1: Положение ВЭ1 (Не определено)"/>
+                  <w:listItem w:displayText="КП / УВЭ1: Положение ВЭ1 (Неисправность)" w:value="КП / УВЭ1: Положение ВЭ1 (Неисправность)"/>
+                  <w:listItem w:displayText="КП / УВЭ1: Положение ключа режима управления" w:value="КП / УВЭ1: Положение ключа режима управления"/>
+                  <w:listItem w:displayText="КП / УВЭ1: Право переключения на уровне станции" w:value="КП / УВЭ1: Право переключения на уровне станции"/>
+                  <w:listItem w:displayText="КП / УВЭ1: Сигнал превышения допустимого времени переключения" w:value="КП / УВЭ1: Сигнал превышения допустимого времени переключения"/>
+                  <w:listItem w:displayText="КП / УВЭ1: Функция введена в работу" w:value="КП / УВЭ1: Функция введена в работу"/>
+                  <w:listItem w:displayText="КП / УВЭ2: Вкатить второй выкатной элемент" w:value="КП / УВЭ2: Вкатить второй выкатной элемент"/>
+                  <w:listItem w:displayText="КП / УВЭ2: Выкатить второй выкатной элемент" w:value="КП / УВЭ2: Выкатить второй выкатной элемент"/>
+                  <w:listItem w:displayText="КП / УВЭ2: Идет переключение" w:value="КП / УВЭ2: Идет переключение"/>
+                  <w:listItem w:displayText="КП / УВЭ2: Поведение местного управления" w:value="КП / УВЭ2: Поведение местного управления"/>
+                  <w:listItem w:displayText="КП / УВЭ2: Положение ВЭ2 (Вкачен)" w:value="КП / УВЭ2: Положение ВЭ2 (Вкачен)"/>
+                  <w:listItem w:displayText="КП / УВЭ2: Положение ВЭ2 (Выкачен)" w:value="КП / УВЭ2: Положение ВЭ2 (Выкачен)"/>
+                  <w:listItem w:displayText="КП / УВЭ2: Положение ВЭ2 (Не определено)" w:value="КП / УВЭ2: Положение ВЭ2 (Не определено)"/>
+                  <w:listItem w:displayText="КП / УВЭ2: Положение ВЭ2 (Неисправность)" w:value="КП / УВЭ2: Положение ВЭ2 (Неисправность)"/>
+                  <w:listItem w:displayText="КП / УВЭ2: Положение ключа режима управления" w:value="КП / УВЭ2: Положение ключа режима управления"/>
+                  <w:listItem w:displayText="КП / УВЭ2: Право переключения на уровне станции" w:value="КП / УВЭ2: Право переключения на уровне станции"/>
+                  <w:listItem w:displayText="КП / УВЭ2: Сигнал превышения допустимого времени переключения" w:value="КП / УВЭ2: Сигнал превышения допустимого времени переключения"/>
+                  <w:listItem w:displayText="КП / УВЭ2: Функция введена в работу" w:value="КП / УВЭ2: Функция введена в работу"/>
+                  <w:listItem w:displayText="КП / УЗН: Включить заземляющий нож" w:value="КП / УЗН: Включить заземляющий нож"/>
+                  <w:listItem w:displayText="КП / УЗН: Идет переключение" w:value="КП / УЗН: Идет переключение"/>
+                  <w:listItem w:displayText="КП / УЗН: Отключить заземляющий нож" w:value="КП / УЗН: Отключить заземляющий нож"/>
+                  <w:listItem w:displayText="КП / УЗН: Поведение местного управления" w:value="КП / УЗН: Поведение местного управления"/>
+                  <w:listItem w:displayText="КП / УЗН: Положение ЗН (Включено)" w:value="КП / УЗН: Положение ЗН (Включено)"/>
+                  <w:listItem w:displayText="КП / УЗН: Положение ЗН (Не определено)" w:value="КП / УЗН: Положение ЗН (Не определено)"/>
+                  <w:listItem w:displayText="КП / УЗН: Положение ЗН (Неисправность)" w:value="КП / УЗН: Положение ЗН (Неисправность)"/>
+                  <w:listItem w:displayText="КП / УЗН: Положение ЗН (Отключено)" w:value="КП / УЗН: Положение ЗН (Отключено)"/>
+                  <w:listItem w:displayText="КП / УЗН: Положение ключа режима управления" w:value="КП / УЗН: Положение ключа режима управления"/>
+                  <w:listItem w:displayText="КП / УЗН: Право переключения на уровне станции" w:value="КП / УЗН: Право переключения на уровне станции"/>
+                  <w:listItem w:displayText="КП / УЗН: Сигнал превышения допустимого времени переключения" w:value="КП / УЗН: Сигнал превышения допустимого времени переключения"/>
+                  <w:listItem w:displayText="КП / УЗН: Функция введена в работу" w:value="КП / УЗН: Функция введена в работу"/>
+                  <w:listItem w:displayText="КРВ / КРВ: Превышен коммутационный ресурс выключателя" w:value="КРВ / КРВ: Превышен коммутационный ресурс выключателя"/>
+                  <w:listItem w:displayText="КРВ / КРВ: Превышен механический ресурс выключателя" w:value="КРВ / КРВ: Превышен механический ресурс выключателя"/>
+                  <w:listItem w:displayText="КРВ / КРВ: Превышен ресурс выключателя" w:value="КРВ / КРВ: Превышен ресурс выключателя"/>
+                  <w:listItem w:displayText="КРВ / КРВ: Функция введена в работу" w:value="КРВ / КРВ: Функция введена в работу"/>
                   <w:listItem w:displayText="КС / КС: Блокировка по скорости изменения частоты" w:value="КС / КС: Блокировка по скорости изменения частоты"/>
                   <w:listItem w:displayText="КС / КС: Нет условий по напряжению" w:value="КС / КС: Нет условий по напряжению"/>
                   <w:listItem w:displayText="КС / КС: Нет условий по углу" w:value="КС / КС: Нет условий по углу"/>
@@ -2762,6 +3250,18 @@
                   <w:listItem w:displayText="КС / КС: Разрешение оперативного включения" w:value="КС / КС: Разрешение оперативного включения"/>
                   <w:listItem w:displayText="КС / КС: Функция введена в работу" w:value="КС / КС: Функция введена в работу"/>
                   <w:listItem w:displayText="КС / КС: Функция оперативно выведена из работы" w:value="КС / КС: Функция оперативно выведена из работы"/>
+                  <w:listItem w:displayText="КСВ / КСВ: Блокировка включения В" w:value="КСВ / КСВ: Блокировка включения В"/>
+                  <w:listItem w:displayText="КСВ / КСВ: Блокировка отключения В" w:value="КСВ / КСВ: Блокировка отключения В"/>
+                  <w:listItem w:displayText="КСВ / КСВ: В аварийно отключен" w:value="КСВ / КСВ: В аварийно отключен"/>
+                  <w:listItem w:displayText="КСВ / КСВ: В самопроизвольно отключен" w:value="КСВ / КСВ: В самопроизвольно отключен"/>
+                  <w:listItem w:displayText="КСВ / КСВ: Защита ЭМВ" w:value="КСВ / КСВ: Защита ЭМВ"/>
+                  <w:listItem w:displayText="КСВ / КСВ: Защита ЭМО1" w:value="КСВ / КСВ: Защита ЭМО1"/>
+                  <w:listItem w:displayText="КСВ / КСВ: Защита ЭМО2" w:value="КСВ / КСВ: Защита ЭМО2"/>
+                  <w:listItem w:displayText="КСВ / КСВ: Неисправность В" w:value="КСВ / КСВ: Неисправность В"/>
+                  <w:listItem w:displayText="КСВ / КСВ: Неисправность цепей ЭМУ" w:value="КСВ / КСВ: Неисправность цепей ЭМУ"/>
+                  <w:listItem w:displayText="КСВ / КСВ: Реле фиксации команды" w:value="КСВ / КСВ: Реле фиксации команды"/>
+                  <w:listItem w:displayText="КСВ / КСВ: Функция введена в работу" w:value="КСВ / КСВ: Функция введена в работу"/>
+                  <w:listItem w:displayText="КСВ / КСВ: Функция оперативно выведена из работы" w:value="КСВ / КСВ: Функция оперативно выведена из работы"/>
                   <w:listItem w:displayText="ЛЗШ / ЛЗШ: Обнаружение неисправности" w:value="ЛЗШ / ЛЗШ: Обнаружение неисправности"/>
                   <w:listItem w:displayText="ЛЗШ / ЛЗШ: Пуск" w:value="ЛЗШ / ЛЗШ: Пуск"/>
                   <w:listItem w:displayText="ЛЗШ / ЛЗШ: Пуск ИО тока по фазе B" w:value="ЛЗШ / ЛЗШ: Пуск ИО тока по фазе B"/>
@@ -2854,6 +3354,57 @@
                   <w:listItem w:displayText="МТЗ / ОНМ: Пуск по фазе C" w:value="МТЗ / ОНМ: Пуск по фазе C"/>
                   <w:listItem w:displayText="МТЗ / ОНМ: Пуск по фазе А" w:value="МТЗ / ОНМ: Пуск по фазе А"/>
                   <w:listItem w:displayText="МТЗ / ОУ МТЗ: Срабатывание" w:value="МТЗ / ОУ МТЗ: Срабатывание"/>
+                  <w:listItem w:displayText="ПДС / В: Поведение местного управления" w:value="ПДС / В: Поведение местного управления"/>
+                  <w:listItem w:displayText="ПДС / В: Положение ключа режима управления" w:value="ПДС / В: Положение ключа режима управления"/>
+                  <w:listItem w:displayText="ПДС / В: Положение ключа режима управления привода В" w:value="ПДС / В: Положение ключа режима управления привода В"/>
+                  <w:listItem w:displayText="ПДС / В: Право переключения на уровне станции" w:value="ПДС / В: Право переключения на уровне станции"/>
+                  <w:listItem w:displayText="ПДС / ВЭ1: Поведение местного управления" w:value="ПДС / ВЭ1: Поведение местного управления"/>
+                  <w:listItem w:displayText="ПДС / ВЭ1: Положение ключа режима управления" w:value="ПДС / ВЭ1: Положение ключа режима управления"/>
+                  <w:listItem w:displayText="ПДС / ВЭ1: Право переключения на уровне станции" w:value="ПДС / ВЭ1: Право переключения на уровне станции"/>
+                  <w:listItem w:displayText="ПДС / ВЭ1: Ремонтное положение коммутационного аппарата" w:value="ПДС / ВЭ1: Ремонтное положение коммутационного аппарата"/>
+                  <w:listItem w:displayText="ПДС / ВЭ2: Поведение местного управления" w:value="ПДС / ВЭ2: Поведение местного управления"/>
+                  <w:listItem w:displayText="ПДС / ВЭ2: Положение ключа режима управления" w:value="ПДС / ВЭ2: Положение ключа режима управления"/>
+                  <w:listItem w:displayText="ПДС / ВЭ2: Право переключения на уровне станции" w:value="ПДС / ВЭ2: Право переключения на уровне станции"/>
+                  <w:listItem w:displayText="ПДС / ВЭ2: Ремонтное положение коммутационного аппарата" w:value="ПДС / ВЭ2: Ремонтное положение коммутационного аппарата"/>
+                  <w:listItem w:displayText="ПДС / ЗН: Поведение местного управления" w:value="ПДС / ЗН: Поведение местного управления"/>
+                  <w:listItem w:displayText="ПДС / ЗН: Положение ключа режима управления" w:value="ПДС / ЗН: Положение ключа режима управления"/>
+                  <w:listItem w:displayText="ПДС / ЗН: Право переключения на уровне станции" w:value="ПДС / ЗН: Право переключения на уровне станции"/>
+                  <w:listItem w:displayText="ПДС / КИ: Аварийный уровень изоляции" w:value="ПДС / КИ: Аварийный уровень изоляции"/>
+                  <w:listItem w:displayText="ПДС / КИ: Низкий уровень изоляции" w:value="ПДС / КИ: Низкий уровень изоляции"/>
+                  <w:listItem w:displayText="ПДС / КПруж: Пружина не заведена" w:value="ПДС / КПруж: Пружина не заведена"/>
+                  <w:listItem w:displayText="ПДС / КЦВ: Контроль цепи ЭМВ" w:value="ПДС / КЦВ: Контроль цепи ЭМВ"/>
+                  <w:listItem w:displayText="ПДС / КЦВ: Контроль цепи ЭМО1" w:value="ПДС / КЦВ: Контроль цепи ЭМО1"/>
+                  <w:listItem w:displayText="ПДС / КЦВ: Контроль цепи ЭМО2" w:value="ПДС / КЦВ: Контроль цепи ЭМО2"/>
+                  <w:listItem w:displayText="ПДС / КЦВ: Работа ЭМВ" w:value="ПДС / КЦВ: Работа ЭМВ"/>
+                  <w:listItem w:displayText="ПДС / КЦВ: Работа ЭМО1" w:value="ПДС / КЦВ: Работа ЭМО1"/>
+                  <w:listItem w:displayText="ПДС / КЦВ: Работа ЭМО2" w:value="ПДС / КЦВ: Работа ЭМО2"/>
+                  <w:listItem w:displayText="ПДС / ПДС: Функция введена в работу" w:value="ПДС / ПДС: Функция введена в работу"/>
+                  <w:listItem w:displayText="ПДС / ПДС: Функция оперативно выведена из работы" w:value="ПДС / ПДС: Функция оперативно выведена из работы"/>
+                  <w:listItem w:displayText="ПДС НКУ / SA1: Цепь управления введена" w:value="ПДС НКУ / SA1: Цепь управления введена"/>
+                  <w:listItem w:displayText="ПДС НКУ / SA2: Цепь управления введена" w:value="ПДС НКУ / SA2: Цепь управления введена"/>
+                  <w:listItem w:displayText="ПДС НКУ / SA3: Цепь управления введена" w:value="ПДС НКУ / SA3: Цепь управления введена"/>
+                  <w:listItem w:displayText="ПДС НКУ / SA4: Цепь управления введена" w:value="ПДС НКУ / SA4: Цепь управления введена"/>
+                  <w:listItem w:displayText="ПДС НКУ / SG1: Рабочее положение испытательного блока" w:value="ПДС НКУ / SG1: Рабочее положение испытательного блока"/>
+                  <w:listItem w:displayText="ПДС НКУ / SG2: Рабочее положение испытательного блока" w:value="ПДС НКУ / SG2: Рабочее положение испытательного блока"/>
+                  <w:listItem w:displayText="ПДС НКУ / SG3: Рабочее положение испытательного блока" w:value="ПДС НКУ / SG3: Рабочее положение испытательного блока"/>
+                  <w:listItem w:displayText="ПДС НКУ / Дверь: Дверь отсека/ шкафа закрыта" w:value="ПДС НКУ / Дверь: Дверь отсека/ шкафа закрыта"/>
+                  <w:listItem w:displayText="ПДС НКУ / Дверь: Дверь отсека/ шкафа открыта" w:value="ПДС НКУ / Дверь: Дверь отсека/ шкафа открыта"/>
+                  <w:listItem w:displayText="ПДС НКУ / ОТ ОБР 1: Неисправность оперативного тока цепей ОБР 1" w:value="ПДС НКУ / ОТ ОБР 1: Неисправность оперативного тока цепей ОБР 1"/>
+                  <w:listItem w:displayText="ПДС НКУ / ОТ ОБР 2: Неисправность оперативного тока цепей ОБР 2" w:value="ПДС НКУ / ОТ ОБР 2: Неисправность оперативного тока цепей ОБР 2"/>
+                  <w:listItem w:displayText="ПДС НКУ / ОТ ЦСВ: Неисправность ОТ цепей сигнализации В" w:value="ПДС НКУ / ОТ ЦСВ: Неисправность ОТ цепей сигнализации В"/>
+                  <w:listItem w:displayText="ПДС НКУ / ОТ ЭМО1, ЭМВ: Неисправность оперативного тока цепей ЭМВ, ЭМО1" w:value="ПДС НКУ / ОТ ЭМО1, ЭМВ: Неисправность оперативного тока цепей ЭМВ, ЭМО1"/>
+                  <w:listItem w:displayText="ПДС НКУ / ОТ ЭМО2: Неисправность оперативного тока цепей ЭМО2" w:value="ПДС НКУ / ОТ ЭМО2: Неисправность оперативного тока цепей ЭМО2"/>
+                  <w:listItem w:displayText="ПДС НКУ / ПДС НКУ: Функция введена в работу" w:value="ПДС НКУ / ПДС НКУ: Функция введена в работу"/>
+                  <w:listItem w:displayText="ПДС НКУ / ПДС НКУ: Функция оперативно выведена из работы" w:value="ПДС НКУ / ПДС НКУ: Функция оперативно выведена из работы"/>
+                  <w:listItem w:displayText="ПДС НКУ / Пер.ав.дебл.см.яч.: Цепи аварийной деблокировки ячейки выведены" w:value="ПДС НКУ / Пер.ав.дебл.см.яч.: Цепи аварийной деблокировки ячейки выведены"/>
+                  <w:listItem w:displayText="ПС / ПС: Пуск предупредительной сигнализации" w:value="ПС / ПС: Пуск предупредительной сигнализации"/>
+                  <w:listItem w:displayText="ПС / ПС: Пуск предупредительной сигнализации (импульс)" w:value="ПС / ПС: Пуск предупредительной сигнализации (импульс)"/>
+                  <w:listItem w:displayText="СС / СС: БИ выведены" w:value="СС / СС: БИ выведены"/>
+                  <w:listItem w:displayText="СС / СС: Выходные цепи разобраны" w:value="СС / СС: Выходные цепи разобраны"/>
+                  <w:listItem w:displayText="СС / СС: Неисправность КА" w:value="СС / СС: Неисправность КА"/>
+                  <w:listItem w:displayText="СС / СС: Общий внешний сигнал" w:value="СС / СС: Общий внешний сигнал"/>
+                  <w:listItem w:displayText="СС / СС: Превышение времени переключения КА" w:value="СС / СС: Превышение времени переключения КА"/>
+                  <w:listItem w:displayText="СС / СС: Сигнализация цепей опер.тока" w:value="СС / СС: Сигнализация цепей опер.тока"/>
                   <w:listItem w:displayText="ТЗНП / АУ ТЗНП: Пуск автоматического ускорения ТЗНП" w:value="ТЗНП / АУ ТЗНП: Пуск автоматического ускорения ТЗНП"/>
                   <w:listItem w:displayText="ТЗНП / БНТ НП: Пуск БНТ НП" w:value="ТЗНП / БНТ НП: Пуск БНТ НП"/>
                   <w:listItem w:displayText="ТЗНП / БЧС: Блокировка чувствительных ступеней" w:value="ТЗНП / БЧС: Блокировка чувствительных ступеней"/>
@@ -2893,6 +3444,11 @@
                   <w:listItem w:displayText="ТК ЗДЗ / ТК ЗДЗ: Пуск ИО тока" w:value="ТК ЗДЗ / ТК ЗДЗ: Пуск ИО тока"/>
                   <w:listItem w:displayText="ТК ЗДЗ / ТК ЗДЗ: Функция введена в работу" w:value="ТК ЗДЗ / ТК ЗДЗ: Функция введена в работу"/>
                   <w:listItem w:displayText="ТК ЗДЗ / ТК ЗДЗ: Функция оперативно выведена из работы" w:value="ТК ЗДЗ / ТК ЗДЗ: Функция оперативно выведена из работы"/>
+                  <w:listItem w:displayText="УВ / УВ: Включение с контролем синхронизма" w:value="УВ / УВ: Включение с контролем синхронизма"/>
+                  <w:listItem w:displayText="УВ / УВ: Включить выключатель" w:value="УВ / УВ: Включить выключатель"/>
+                  <w:listItem w:displayText="УВ / УВ: Задержка включения с контролем синхронизма" w:value="УВ / УВ: Задержка включения с контролем синхронизма"/>
+                  <w:listItem w:displayText="УВ / УВ: Функция введена в работу" w:value="УВ / УВ: Функция введена в работу"/>
+                  <w:listItem w:displayText="УВ / УВ: Функция оперативно выведена из работы" w:value="УВ / УВ: Функция оперативно выведена из работы"/>
                   <w:listItem w:displayText="УРОВ / УРОВ: Пуск" w:value="УРОВ / УРОВ: Пуск"/>
                   <w:listItem w:displayText="УРОВ / УРОВ: Пуск ИО максимального тока" w:value="УРОВ / УРОВ: Пуск ИО максимального тока"/>
                   <w:listItem w:displayText="УРОВ / УРОВ: Срабатывание" w:value="УРОВ / УРОВ: Срабатывание"/>
@@ -3038,6 +3594,38 @@
                   <w:listItem w:displayText="ЗОП / ЗОП: Срабатывание на сигнал" w:value="ЗОП / ЗОП: Срабатывание на сигнал"/>
                   <w:listItem w:displayText="ЗОП / ЗОП: Функция введена в работу" w:value="ЗОП / ЗОП: Функция введена в работу"/>
                   <w:listItem w:displayText="ЗОП / ЗОП: Функция оперативно выведена из работы" w:value="ЗОП / ЗОП: Функция оперативно выведена из работы"/>
+                  <w:listItem w:displayText="КА / В: Выключатель включен" w:value="КА / В: Выключатель включен"/>
+                  <w:listItem w:displayText="КА / В: Выключатель отключен" w:value="КА / В: Выключатель отключен"/>
+                  <w:listItem w:displayText="КА / В: Команда «включить» выключатель через выходное реле" w:value="КА / В: Команда «включить» выключатель через выходное реле"/>
+                  <w:listItem w:displayText="КА / В: Команда «отключить» выключатель через выходное реле" w:value="КА / В: Команда «отключить» выключатель через выходное реле"/>
+                  <w:listItem w:displayText="КА / В: Неисправное положение выключателя" w:value="КА / В: Неисправное положение выключателя"/>
+                  <w:listItem w:displayText="КА / В: Промежуточное положение выключателя" w:value="КА / В: Промежуточное положение выключателя"/>
+                  <w:listItem w:displayText="КА / В: Функция введена в работу" w:value="КА / В: Функция введена в работу"/>
+                  <w:listItem w:displayText="КА / ВЭ1: Команда «вкатить» выкатной элемент через выходное реле" w:value="КА / ВЭ1: Команда «вкатить» выкатной элемент через выходное реле"/>
+                  <w:listItem w:displayText="КА / ВЭ1: Команда «выкатить» выкатной элемент через выходное реле" w:value="КА / ВЭ1: Команда «выкатить» выкатной элемент через выходное реле"/>
+                  <w:listItem w:displayText="КА / ВЭ1: Неисправное положение выкатного элемента" w:value="КА / ВЭ1: Неисправное положение выкатного элемента"/>
+                  <w:listItem w:displayText="КА / ВЭ1: Положение выкатного элемента «Вкачен»" w:value="КА / ВЭ1: Положение выкатного элемента «Вкачен»"/>
+                  <w:listItem w:displayText="КА / ВЭ1: Положение выкатного элемента «Выкачен»" w:value="КА / ВЭ1: Положение выкатного элемента «Выкачен»"/>
+                  <w:listItem w:displayText="КА / ВЭ1: Промежуточное положение выкатного элемента" w:value="КА / ВЭ1: Промежуточное положение выкатного элемента"/>
+                  <w:listItem w:displayText="КА / ВЭ1: Ремонтное положение выкатного элемента" w:value="КА / ВЭ1: Ремонтное положение выкатного элемента"/>
+                  <w:listItem w:displayText="КА / ВЭ1: Функция введена в работу" w:value="КА / ВЭ1: Функция введена в работу"/>
+                  <w:listItem w:displayText="КА / ВЭ2: Команда «вкатить» выкатной элемент через выходное реле" w:value="КА / ВЭ2: Команда «вкатить» выкатной элемент через выходное реле"/>
+                  <w:listItem w:displayText="КА / ВЭ2: Команда «выкатить» выкатной элемент через выходное реле" w:value="КА / ВЭ2: Команда «выкатить» выкатной элемент через выходное реле"/>
+                  <w:listItem w:displayText="КА / ВЭ2: Неисправное положение выкатного элемента" w:value="КА / ВЭ2: Неисправное положение выкатного элемента"/>
+                  <w:listItem w:displayText="КА / ВЭ2: Положение выкатного элемента «Вкачен»" w:value="КА / ВЭ2: Положение выкатного элемента «Вкачен»"/>
+                  <w:listItem w:displayText="КА / ВЭ2: Положение выкатного элемента «Выкачен»" w:value="КА / ВЭ2: Положение выкатного элемента «Выкачен»"/>
+                  <w:listItem w:displayText="КА / ВЭ2: Промежуточное положение выкатного элемента" w:value="КА / ВЭ2: Промежуточное положение выкатного элемента"/>
+                  <w:listItem w:displayText="КА / ВЭ2: Ремонтное положение выкатного элемента" w:value="КА / ВЭ2: Ремонтное положение выкатного элемента"/>
+                  <w:listItem w:displayText="КА / ВЭ2: Функция введена в работу" w:value="КА / ВЭ2: Функция введена в работу"/>
+                  <w:listItem w:displayText="КА / ЗН: Заземляющий нож включен" w:value="КА / ЗН: Заземляющий нож включен"/>
+                  <w:listItem w:displayText="КА / ЗН: Заземляющий нож отключен" w:value="КА / ЗН: Заземляющий нож отключен"/>
+                  <w:listItem w:displayText="КА / ЗН: Команда «включить» заземляющий нож через выходное реле" w:value="КА / ЗН: Команда «включить» заземляющий нож через выходное реле"/>
+                  <w:listItem w:displayText="КА / ЗН: Команда «отключить» заземляющий нож через выходное реле" w:value="КА / ЗН: Команда «отключить» заземляющий нож через выходное реле"/>
+                  <w:listItem w:displayText="КА / ЗН: Неисправное положение заземляющего ножа" w:value="КА / ЗН: Неисправное положение заземляющего ножа"/>
+                  <w:listItem w:displayText="КА / ЗН: Промежуточное положение заземляющего ножа" w:value="КА / ЗН: Промежуточное положение заземляющего ножа"/>
+                  <w:listItem w:displayText="КА / ЗН: Функция введена в работу" w:value="КА / ЗН: Функция введена в работу"/>
+                  <w:listItem w:displayText="КА / КА: Функция введена в работу" w:value="КА / КА: Функция введена в работу"/>
+                  <w:listItem w:displayText="КА / КА: Функция оперативно выведена из работы" w:value="КА / КА: Функция оперативно выведена из работы"/>
                   <w:listItem w:displayText="КНН 1сш / КНН 1сш: Пуск" w:value="КНН 1сш / КНН 1сш: Пуск"/>
                   <w:listItem w:displayText="КНН 1сш / КНН 1сш: Пуск ИО напряжения" w:value="КНН 1сш / КНН 1сш: Пуск ИО напряжения"/>
                   <w:listItem w:displayText="КНН 1сш / КНН 1сш: Пуск ИО напряжения ОП" w:value="КНН 1сш / КНН 1сш: Пуск ИО напряжения ОП"/>
@@ -3058,6 +3646,68 @@
                   <w:listItem w:displayText="КОН 2сш / КОН 2сш: Пуск ИО напряжения ОП" w:value="КОН 2сш / КОН 2сш: Пуск ИО напряжения ОП"/>
                   <w:listItem w:displayText="КОН 2сш / КОН 2сш: Функция введена в работу" w:value="КОН 2сш / КОН 2сш: Функция введена в работу"/>
                   <w:listItem w:displayText="КОН 2сш / КОН 2сш: Функция оперативно выведена из работы" w:value="КОН 2сш / КОН 2сш: Функция оперативно выведена из работы"/>
+                  <w:listItem w:displayText="КП / КП: Идет переключение" w:value="КП / КП: Идет переключение"/>
+                  <w:listItem w:displayText="КП / КП: Функция введена в работу" w:value="КП / КП: Функция введена в работу"/>
+                  <w:listItem w:displayText="КП / КП: Функция оперативно выведена из работы" w:value="КП / КП: Функция оперативно выведена из работы"/>
+                  <w:listItem w:displayText="КП / ОБР В: Блокировка включения" w:value="КП / ОБР В: Блокировка включения"/>
+                  <w:listItem w:displayText="КП / ОБР В: Разрешить включение" w:value="КП / ОБР В: Разрешить включение"/>
+                  <w:listItem w:displayText="КП / ОБР ВЭ1: Разрешение управления первым выкатным элементом" w:value="КП / ОБР ВЭ1: Разрешение управления первым выкатным элементом"/>
+                  <w:listItem w:displayText="КП / ОБР ВЭ2: Разрешение управления вторым выкатным элементом" w:value="КП / ОБР ВЭ2: Разрешение управления вторым выкатным элементом"/>
+                  <w:listItem w:displayText="КП / ОБР ЗН: Разрешение управления заземляющим ножом" w:value="КП / ОБР ЗН: Разрешение управления заземляющим ножом"/>
+                  <w:listItem w:displayText="КП / УВ: Включение с контролем синхронизма" w:value="КП / УВ: Включение с контролем синхронизма"/>
+                  <w:listItem w:displayText="КП / УВ: Включить выключатель" w:value="КП / УВ: Включить выключатель"/>
+                  <w:listItem w:displayText="КП / УВ: Задержка включения с контролем синхронизма" w:value="КП / УВ: Задержка включения с контролем синхронизма"/>
+                  <w:listItem w:displayText="КП / УВ: Идет переключение" w:value="КП / УВ: Идет переключение"/>
+                  <w:listItem w:displayText="КП / УВ: Отключить выключатель" w:value="КП / УВ: Отключить выключатель"/>
+                  <w:listItem w:displayText="КП / УВ: Поведение местного управления" w:value="КП / УВ: Поведение местного управления"/>
+                  <w:listItem w:displayText="КП / УВ: Положение В (Включено)" w:value="КП / УВ: Положение В (Включено)"/>
+                  <w:listItem w:displayText="КП / УВ: Положение В (Не определено)" w:value="КП / УВ: Положение В (Не определено)"/>
+                  <w:listItem w:displayText="КП / УВ: Положение В (Неисправность)" w:value="КП / УВ: Положение В (Неисправность)"/>
+                  <w:listItem w:displayText="КП / УВ: Положение В (Отключено)" w:value="КП / УВ: Положение В (Отключено)"/>
+                  <w:listItem w:displayText="КП / УВ: Положение ключа режима управления" w:value="КП / УВ: Положение ключа режима управления"/>
+                  <w:listItem w:displayText="КП / УВ: Право переключения на уровне станции" w:value="КП / УВ: Право переключения на уровне станции"/>
+                  <w:listItem w:displayText="КП / УВ: Сигнал превышения допустимого времени переключения" w:value="КП / УВ: Сигнал превышения допустимого времени переключения"/>
+                  <w:listItem w:displayText="КП / УВ: Функция введена в работу" w:value="КП / УВ: Функция введена в работу"/>
+                  <w:listItem w:displayText="КП / УВЭ1: Вкатить первый выкатной элемент" w:value="КП / УВЭ1: Вкатить первый выкатной элемент"/>
+                  <w:listItem w:displayText="КП / УВЭ1: Выкатить первый выкатной элемент" w:value="КП / УВЭ1: Выкатить первый выкатной элемент"/>
+                  <w:listItem w:displayText="КП / УВЭ1: Идет переключение" w:value="КП / УВЭ1: Идет переключение"/>
+                  <w:listItem w:displayText="КП / УВЭ1: Поведение местного управления" w:value="КП / УВЭ1: Поведение местного управления"/>
+                  <w:listItem w:displayText="КП / УВЭ1: Положение ВЭ1 (Вкачен)" w:value="КП / УВЭ1: Положение ВЭ1 (Вкачен)"/>
+                  <w:listItem w:displayText="КП / УВЭ1: Положение ВЭ1 (Выкачен)" w:value="КП / УВЭ1: Положение ВЭ1 (Выкачен)"/>
+                  <w:listItem w:displayText="КП / УВЭ1: Положение ВЭ1 (Не определено)" w:value="КП / УВЭ1: Положение ВЭ1 (Не определено)"/>
+                  <w:listItem w:displayText="КП / УВЭ1: Положение ВЭ1 (Неисправность)" w:value="КП / УВЭ1: Положение ВЭ1 (Неисправность)"/>
+                  <w:listItem w:displayText="КП / УВЭ1: Положение ключа режима управления" w:value="КП / УВЭ1: Положение ключа режима управления"/>
+                  <w:listItem w:displayText="КП / УВЭ1: Право переключения на уровне станции" w:value="КП / УВЭ1: Право переключения на уровне станции"/>
+                  <w:listItem w:displayText="КП / УВЭ1: Сигнал превышения допустимого времени переключения" w:value="КП / УВЭ1: Сигнал превышения допустимого времени переключения"/>
+                  <w:listItem w:displayText="КП / УВЭ1: Функция введена в работу" w:value="КП / УВЭ1: Функция введена в работу"/>
+                  <w:listItem w:displayText="КП / УВЭ2: Вкатить второй выкатной элемент" w:value="КП / УВЭ2: Вкатить второй выкатной элемент"/>
+                  <w:listItem w:displayText="КП / УВЭ2: Выкатить второй выкатной элемент" w:value="КП / УВЭ2: Выкатить второй выкатной элемент"/>
+                  <w:listItem w:displayText="КП / УВЭ2: Идет переключение" w:value="КП / УВЭ2: Идет переключение"/>
+                  <w:listItem w:displayText="КП / УВЭ2: Поведение местного управления" w:value="КП / УВЭ2: Поведение местного управления"/>
+                  <w:listItem w:displayText="КП / УВЭ2: Положение ВЭ2 (Вкачен)" w:value="КП / УВЭ2: Положение ВЭ2 (Вкачен)"/>
+                  <w:listItem w:displayText="КП / УВЭ2: Положение ВЭ2 (Выкачен)" w:value="КП / УВЭ2: Положение ВЭ2 (Выкачен)"/>
+                  <w:listItem w:displayText="КП / УВЭ2: Положение ВЭ2 (Не определено)" w:value="КП / УВЭ2: Положение ВЭ2 (Не определено)"/>
+                  <w:listItem w:displayText="КП / УВЭ2: Положение ВЭ2 (Неисправность)" w:value="КП / УВЭ2: Положение ВЭ2 (Неисправность)"/>
+                  <w:listItem w:displayText="КП / УВЭ2: Положение ключа режима управления" w:value="КП / УВЭ2: Положение ключа режима управления"/>
+                  <w:listItem w:displayText="КП / УВЭ2: Право переключения на уровне станции" w:value="КП / УВЭ2: Право переключения на уровне станции"/>
+                  <w:listItem w:displayText="КП / УВЭ2: Сигнал превышения допустимого времени переключения" w:value="КП / УВЭ2: Сигнал превышения допустимого времени переключения"/>
+                  <w:listItem w:displayText="КП / УВЭ2: Функция введена в работу" w:value="КП / УВЭ2: Функция введена в работу"/>
+                  <w:listItem w:displayText="КП / УЗН: Включить заземляющий нож" w:value="КП / УЗН: Включить заземляющий нож"/>
+                  <w:listItem w:displayText="КП / УЗН: Идет переключение" w:value="КП / УЗН: Идет переключение"/>
+                  <w:listItem w:displayText="КП / УЗН: Отключить заземляющий нож" w:value="КП / УЗН: Отключить заземляющий нож"/>
+                  <w:listItem w:displayText="КП / УЗН: Поведение местного управления" w:value="КП / УЗН: Поведение местного управления"/>
+                  <w:listItem w:displayText="КП / УЗН: Положение ЗН (Включено)" w:value="КП / УЗН: Положение ЗН (Включено)"/>
+                  <w:listItem w:displayText="КП / УЗН: Положение ЗН (Не определено)" w:value="КП / УЗН: Положение ЗН (Не определено)"/>
+                  <w:listItem w:displayText="КП / УЗН: Положение ЗН (Неисправность)" w:value="КП / УЗН: Положение ЗН (Неисправность)"/>
+                  <w:listItem w:displayText="КП / УЗН: Положение ЗН (Отключено)" w:value="КП / УЗН: Положение ЗН (Отключено)"/>
+                  <w:listItem w:displayText="КП / УЗН: Положение ключа режима управления" w:value="КП / УЗН: Положение ключа режима управления"/>
+                  <w:listItem w:displayText="КП / УЗН: Право переключения на уровне станции" w:value="КП / УЗН: Право переключения на уровне станции"/>
+                  <w:listItem w:displayText="КП / УЗН: Сигнал превышения допустимого времени переключения" w:value="КП / УЗН: Сигнал превышения допустимого времени переключения"/>
+                  <w:listItem w:displayText="КП / УЗН: Функция введена в работу" w:value="КП / УЗН: Функция введена в работу"/>
+                  <w:listItem w:displayText="КРВ / КРВ: Превышен коммутационный ресурс выключателя" w:value="КРВ / КРВ: Превышен коммутационный ресурс выключателя"/>
+                  <w:listItem w:displayText="КРВ / КРВ: Превышен механический ресурс выключателя" w:value="КРВ / КРВ: Превышен механический ресурс выключателя"/>
+                  <w:listItem w:displayText="КРВ / КРВ: Превышен ресурс выключателя" w:value="КРВ / КРВ: Превышен ресурс выключателя"/>
+                  <w:listItem w:displayText="КРВ / КРВ: Функция введена в работу" w:value="КРВ / КРВ: Функция введена в работу"/>
                   <w:listItem w:displayText="КС / КС: Блокировка по скорости изменения частоты" w:value="КС / КС: Блокировка по скорости изменения частоты"/>
                   <w:listItem w:displayText="КС / КС: Нет условий по напряжению" w:value="КС / КС: Нет условий по напряжению"/>
                   <w:listItem w:displayText="КС / КС: Нет условий по углу" w:value="КС / КС: Нет условий по углу"/>
@@ -3070,6 +3720,18 @@
                   <w:listItem w:displayText="КС / КС: Разрешение оперативного включения" w:value="КС / КС: Разрешение оперативного включения"/>
                   <w:listItem w:displayText="КС / КС: Функция введена в работу" w:value="КС / КС: Функция введена в работу"/>
                   <w:listItem w:displayText="КС / КС: Функция оперативно выведена из работы" w:value="КС / КС: Функция оперативно выведена из работы"/>
+                  <w:listItem w:displayText="КСВ / КСВ: Блокировка включения В" w:value="КСВ / КСВ: Блокировка включения В"/>
+                  <w:listItem w:displayText="КСВ / КСВ: Блокировка отключения В" w:value="КСВ / КСВ: Блокировка отключения В"/>
+                  <w:listItem w:displayText="КСВ / КСВ: В аварийно отключен" w:value="КСВ / КСВ: В аварийно отключен"/>
+                  <w:listItem w:displayText="КСВ / КСВ: В самопроизвольно отключен" w:value="КСВ / КСВ: В самопроизвольно отключен"/>
+                  <w:listItem w:displayText="КСВ / КСВ: Защита ЭМВ" w:value="КСВ / КСВ: Защита ЭМВ"/>
+                  <w:listItem w:displayText="КСВ / КСВ: Защита ЭМО1" w:value="КСВ / КСВ: Защита ЭМО1"/>
+                  <w:listItem w:displayText="КСВ / КСВ: Защита ЭМО2" w:value="КСВ / КСВ: Защита ЭМО2"/>
+                  <w:listItem w:displayText="КСВ / КСВ: Неисправность В" w:value="КСВ / КСВ: Неисправность В"/>
+                  <w:listItem w:displayText="КСВ / КСВ: Неисправность цепей ЭМУ" w:value="КСВ / КСВ: Неисправность цепей ЭМУ"/>
+                  <w:listItem w:displayText="КСВ / КСВ: Реле фиксации команды" w:value="КСВ / КСВ: Реле фиксации команды"/>
+                  <w:listItem w:displayText="КСВ / КСВ: Функция введена в работу" w:value="КСВ / КСВ: Функция введена в работу"/>
+                  <w:listItem w:displayText="КСВ / КСВ: Функция оперативно выведена из работы" w:value="КСВ / КСВ: Функция оперативно выведена из работы"/>
                   <w:listItem w:displayText="ЛЗШ / ЛЗШ: Обнаружение неисправности" w:value="ЛЗШ / ЛЗШ: Обнаружение неисправности"/>
                   <w:listItem w:displayText="ЛЗШ / ЛЗШ: Пуск" w:value="ЛЗШ / ЛЗШ: Пуск"/>
                   <w:listItem w:displayText="ЛЗШ / ЛЗШ: Пуск ИО тока по фазе B" w:value="ЛЗШ / ЛЗШ: Пуск ИО тока по фазе B"/>
@@ -3162,6 +3824,57 @@
                   <w:listItem w:displayText="МТЗ / ОНМ: Пуск по фазе C" w:value="МТЗ / ОНМ: Пуск по фазе C"/>
                   <w:listItem w:displayText="МТЗ / ОНМ: Пуск по фазе А" w:value="МТЗ / ОНМ: Пуск по фазе А"/>
                   <w:listItem w:displayText="МТЗ / ОУ МТЗ: Срабатывание" w:value="МТЗ / ОУ МТЗ: Срабатывание"/>
+                  <w:listItem w:displayText="ПДС / В: Поведение местного управления" w:value="ПДС / В: Поведение местного управления"/>
+                  <w:listItem w:displayText="ПДС / В: Положение ключа режима управления" w:value="ПДС / В: Положение ключа режима управления"/>
+                  <w:listItem w:displayText="ПДС / В: Положение ключа режима управления привода В" w:value="ПДС / В: Положение ключа режима управления привода В"/>
+                  <w:listItem w:displayText="ПДС / В: Право переключения на уровне станции" w:value="ПДС / В: Право переключения на уровне станции"/>
+                  <w:listItem w:displayText="ПДС / ВЭ1: Поведение местного управления" w:value="ПДС / ВЭ1: Поведение местного управления"/>
+                  <w:listItem w:displayText="ПДС / ВЭ1: Положение ключа режима управления" w:value="ПДС / ВЭ1: Положение ключа режима управления"/>
+                  <w:listItem w:displayText="ПДС / ВЭ1: Право переключения на уровне станции" w:value="ПДС / ВЭ1: Право переключения на уровне станции"/>
+                  <w:listItem w:displayText="ПДС / ВЭ1: Ремонтное положение коммутационного аппарата" w:value="ПДС / ВЭ1: Ремонтное положение коммутационного аппарата"/>
+                  <w:listItem w:displayText="ПДС / ВЭ2: Поведение местного управления" w:value="ПДС / ВЭ2: Поведение местного управления"/>
+                  <w:listItem w:displayText="ПДС / ВЭ2: Положение ключа режима управления" w:value="ПДС / ВЭ2: Положение ключа режима управления"/>
+                  <w:listItem w:displayText="ПДС / ВЭ2: Право переключения на уровне станции" w:value="ПДС / ВЭ2: Право переключения на уровне станции"/>
+                  <w:listItem w:displayText="ПДС / ВЭ2: Ремонтное положение коммутационного аппарата" w:value="ПДС / ВЭ2: Ремонтное положение коммутационного аппарата"/>
+                  <w:listItem w:displayText="ПДС / ЗН: Поведение местного управления" w:value="ПДС / ЗН: Поведение местного управления"/>
+                  <w:listItem w:displayText="ПДС / ЗН: Положение ключа режима управления" w:value="ПДС / ЗН: Положение ключа режима управления"/>
+                  <w:listItem w:displayText="ПДС / ЗН: Право переключения на уровне станции" w:value="ПДС / ЗН: Право переключения на уровне станции"/>
+                  <w:listItem w:displayText="ПДС / КИ: Аварийный уровень изоляции" w:value="ПДС / КИ: Аварийный уровень изоляции"/>
+                  <w:listItem w:displayText="ПДС / КИ: Низкий уровень изоляции" w:value="ПДС / КИ: Низкий уровень изоляции"/>
+                  <w:listItem w:displayText="ПДС / КПруж: Пружина не заведена" w:value="ПДС / КПруж: Пружина не заведена"/>
+                  <w:listItem w:displayText="ПДС / КЦВ: Контроль цепи ЭМВ" w:value="ПДС / КЦВ: Контроль цепи ЭМВ"/>
+                  <w:listItem w:displayText="ПДС / КЦВ: Контроль цепи ЭМО1" w:value="ПДС / КЦВ: Контроль цепи ЭМО1"/>
+                  <w:listItem w:displayText="ПДС / КЦВ: Контроль цепи ЭМО2" w:value="ПДС / КЦВ: Контроль цепи ЭМО2"/>
+                  <w:listItem w:displayText="ПДС / КЦВ: Работа ЭМВ" w:value="ПДС / КЦВ: Работа ЭМВ"/>
+                  <w:listItem w:displayText="ПДС / КЦВ: Работа ЭМО1" w:value="ПДС / КЦВ: Работа ЭМО1"/>
+                  <w:listItem w:displayText="ПДС / КЦВ: Работа ЭМО2" w:value="ПДС / КЦВ: Работа ЭМО2"/>
+                  <w:listItem w:displayText="ПДС / ПДС: Функция введена в работу" w:value="ПДС / ПДС: Функция введена в работу"/>
+                  <w:listItem w:displayText="ПДС / ПДС: Функция оперативно выведена из работы" w:value="ПДС / ПДС: Функция оперативно выведена из работы"/>
+                  <w:listItem w:displayText="ПДС НКУ / SA1: Цепь управления введена" w:value="ПДС НКУ / SA1: Цепь управления введена"/>
+                  <w:listItem w:displayText="ПДС НКУ / SA2: Цепь управления введена" w:value="ПДС НКУ / SA2: Цепь управления введена"/>
+                  <w:listItem w:displayText="ПДС НКУ / SA3: Цепь управления введена" w:value="ПДС НКУ / SA3: Цепь управления введена"/>
+                  <w:listItem w:displayText="ПДС НКУ / SA4: Цепь управления введена" w:value="ПДС НКУ / SA4: Цепь управления введена"/>
+                  <w:listItem w:displayText="ПДС НКУ / SG1: Рабочее положение испытательного блока" w:value="ПДС НКУ / SG1: Рабочее положение испытательного блока"/>
+                  <w:listItem w:displayText="ПДС НКУ / SG2: Рабочее положение испытательного блока" w:value="ПДС НКУ / SG2: Рабочее положение испытательного блока"/>
+                  <w:listItem w:displayText="ПДС НКУ / SG3: Рабочее положение испытательного блока" w:value="ПДС НКУ / SG3: Рабочее положение испытательного блока"/>
+                  <w:listItem w:displayText="ПДС НКУ / Дверь: Дверь отсека/ шкафа закрыта" w:value="ПДС НКУ / Дверь: Дверь отсека/ шкафа закрыта"/>
+                  <w:listItem w:displayText="ПДС НКУ / Дверь: Дверь отсека/ шкафа открыта" w:value="ПДС НКУ / Дверь: Дверь отсека/ шкафа открыта"/>
+                  <w:listItem w:displayText="ПДС НКУ / ОТ ОБР 1: Неисправность оперативного тока цепей ОБР 1" w:value="ПДС НКУ / ОТ ОБР 1: Неисправность оперативного тока цепей ОБР 1"/>
+                  <w:listItem w:displayText="ПДС НКУ / ОТ ОБР 2: Неисправность оперативного тока цепей ОБР 2" w:value="ПДС НКУ / ОТ ОБР 2: Неисправность оперативного тока цепей ОБР 2"/>
+                  <w:listItem w:displayText="ПДС НКУ / ОТ ЦСВ: Неисправность ОТ цепей сигнализации В" w:value="ПДС НКУ / ОТ ЦСВ: Неисправность ОТ цепей сигнализации В"/>
+                  <w:listItem w:displayText="ПДС НКУ / ОТ ЭМО1, ЭМВ: Неисправность оперативного тока цепей ЭМВ, ЭМО1" w:value="ПДС НКУ / ОТ ЭМО1, ЭМВ: Неисправность оперативного тока цепей ЭМВ, ЭМО1"/>
+                  <w:listItem w:displayText="ПДС НКУ / ОТ ЭМО2: Неисправность оперативного тока цепей ЭМО2" w:value="ПДС НКУ / ОТ ЭМО2: Неисправность оперативного тока цепей ЭМО2"/>
+                  <w:listItem w:displayText="ПДС НКУ / ПДС НКУ: Функция введена в работу" w:value="ПДС НКУ / ПДС НКУ: Функция введена в работу"/>
+                  <w:listItem w:displayText="ПДС НКУ / ПДС НКУ: Функция оперативно выведена из работы" w:value="ПДС НКУ / ПДС НКУ: Функция оперативно выведена из работы"/>
+                  <w:listItem w:displayText="ПДС НКУ / Пер.ав.дебл.см.яч.: Цепи аварийной деблокировки ячейки выведены" w:value="ПДС НКУ / Пер.ав.дебл.см.яч.: Цепи аварийной деблокировки ячейки выведены"/>
+                  <w:listItem w:displayText="ПС / ПС: Пуск предупредительной сигнализации" w:value="ПС / ПС: Пуск предупредительной сигнализации"/>
+                  <w:listItem w:displayText="ПС / ПС: Пуск предупредительной сигнализации (импульс)" w:value="ПС / ПС: Пуск предупредительной сигнализации (импульс)"/>
+                  <w:listItem w:displayText="СС / СС: БИ выведены" w:value="СС / СС: БИ выведены"/>
+                  <w:listItem w:displayText="СС / СС: Выходные цепи разобраны" w:value="СС / СС: Выходные цепи разобраны"/>
+                  <w:listItem w:displayText="СС / СС: Неисправность КА" w:value="СС / СС: Неисправность КА"/>
+                  <w:listItem w:displayText="СС / СС: Общий внешний сигнал" w:value="СС / СС: Общий внешний сигнал"/>
+                  <w:listItem w:displayText="СС / СС: Превышение времени переключения КА" w:value="СС / СС: Превышение времени переключения КА"/>
+                  <w:listItem w:displayText="СС / СС: Сигнализация цепей опер.тока" w:value="СС / СС: Сигнализация цепей опер.тока"/>
                   <w:listItem w:displayText="ТЗНП / АУ ТЗНП: Пуск автоматического ускорения ТЗНП" w:value="ТЗНП / АУ ТЗНП: Пуск автоматического ускорения ТЗНП"/>
                   <w:listItem w:displayText="ТЗНП / БНТ НП: Пуск БНТ НП" w:value="ТЗНП / БНТ НП: Пуск БНТ НП"/>
                   <w:listItem w:displayText="ТЗНП / БЧС: Блокировка чувствительных ступеней" w:value="ТЗНП / БЧС: Блокировка чувствительных ступеней"/>
@@ -3201,6 +3914,11 @@
                   <w:listItem w:displayText="ТК ЗДЗ / ТК ЗДЗ: Пуск ИО тока" w:value="ТК ЗДЗ / ТК ЗДЗ: Пуск ИО тока"/>
                   <w:listItem w:displayText="ТК ЗДЗ / ТК ЗДЗ: Функция введена в работу" w:value="ТК ЗДЗ / ТК ЗДЗ: Функция введена в работу"/>
                   <w:listItem w:displayText="ТК ЗДЗ / ТК ЗДЗ: Функция оперативно выведена из работы" w:value="ТК ЗДЗ / ТК ЗДЗ: Функция оперативно выведена из работы"/>
+                  <w:listItem w:displayText="УВ / УВ: Включение с контролем синхронизма" w:value="УВ / УВ: Включение с контролем синхронизма"/>
+                  <w:listItem w:displayText="УВ / УВ: Включить выключатель" w:value="УВ / УВ: Включить выключатель"/>
+                  <w:listItem w:displayText="УВ / УВ: Задержка включения с контролем синхронизма" w:value="УВ / УВ: Задержка включения с контролем синхронизма"/>
+                  <w:listItem w:displayText="УВ / УВ: Функция введена в работу" w:value="УВ / УВ: Функция введена в работу"/>
+                  <w:listItem w:displayText="УВ / УВ: Функция оперативно выведена из работы" w:value="УВ / УВ: Функция оперативно выведена из работы"/>
                   <w:listItem w:displayText="УРОВ / УРОВ: Пуск" w:value="УРОВ / УРОВ: Пуск"/>
                   <w:listItem w:displayText="УРОВ / УРОВ: Пуск ИО максимального тока" w:value="УРОВ / УРОВ: Пуск ИО максимального тока"/>
                   <w:listItem w:displayText="УРОВ / УРОВ: Срабатывание" w:value="УРОВ / УРОВ: Срабатывание"/>
@@ -3346,6 +4064,38 @@
                   <w:listItem w:displayText="ЗОП / ЗОП: Срабатывание на сигнал" w:value="ЗОП / ЗОП: Срабатывание на сигнал"/>
                   <w:listItem w:displayText="ЗОП / ЗОП: Функция введена в работу" w:value="ЗОП / ЗОП: Функция введена в работу"/>
                   <w:listItem w:displayText="ЗОП / ЗОП: Функция оперативно выведена из работы" w:value="ЗОП / ЗОП: Функция оперативно выведена из работы"/>
+                  <w:listItem w:displayText="КА / В: Выключатель включен" w:value="КА / В: Выключатель включен"/>
+                  <w:listItem w:displayText="КА / В: Выключатель отключен" w:value="КА / В: Выключатель отключен"/>
+                  <w:listItem w:displayText="КА / В: Команда «включить» выключатель через выходное реле" w:value="КА / В: Команда «включить» выключатель через выходное реле"/>
+                  <w:listItem w:displayText="КА / В: Команда «отключить» выключатель через выходное реле" w:value="КА / В: Команда «отключить» выключатель через выходное реле"/>
+                  <w:listItem w:displayText="КА / В: Неисправное положение выключателя" w:value="КА / В: Неисправное положение выключателя"/>
+                  <w:listItem w:displayText="КА / В: Промежуточное положение выключателя" w:value="КА / В: Промежуточное положение выключателя"/>
+                  <w:listItem w:displayText="КА / В: Функция введена в работу" w:value="КА / В: Функция введена в работу"/>
+                  <w:listItem w:displayText="КА / ВЭ1: Команда «вкатить» выкатной элемент через выходное реле" w:value="КА / ВЭ1: Команда «вкатить» выкатной элемент через выходное реле"/>
+                  <w:listItem w:displayText="КА / ВЭ1: Команда «выкатить» выкатной элемент через выходное реле" w:value="КА / ВЭ1: Команда «выкатить» выкатной элемент через выходное реле"/>
+                  <w:listItem w:displayText="КА / ВЭ1: Неисправное положение выкатного элемента" w:value="КА / ВЭ1: Неисправное положение выкатного элемента"/>
+                  <w:listItem w:displayText="КА / ВЭ1: Положение выкатного элемента «Вкачен»" w:value="КА / ВЭ1: Положение выкатного элемента «Вкачен»"/>
+                  <w:listItem w:displayText="КА / ВЭ1: Положение выкатного элемента «Выкачен»" w:value="КА / ВЭ1: Положение выкатного элемента «Выкачен»"/>
+                  <w:listItem w:displayText="КА / ВЭ1: Промежуточное положение выкатного элемента" w:value="КА / ВЭ1: Промежуточное положение выкатного элемента"/>
+                  <w:listItem w:displayText="КА / ВЭ1: Ремонтное положение выкатного элемента" w:value="КА / ВЭ1: Ремонтное положение выкатного элемента"/>
+                  <w:listItem w:displayText="КА / ВЭ1: Функция введена в работу" w:value="КА / ВЭ1: Функция введена в работу"/>
+                  <w:listItem w:displayText="КА / ВЭ2: Команда «вкатить» выкатной элемент через выходное реле" w:value="КА / ВЭ2: Команда «вкатить» выкатной элемент через выходное реле"/>
+                  <w:listItem w:displayText="КА / ВЭ2: Команда «выкатить» выкатной элемент через выходное реле" w:value="КА / ВЭ2: Команда «выкатить» выкатной элемент через выходное реле"/>
+                  <w:listItem w:displayText="КА / ВЭ2: Неисправное положение выкатного элемента" w:value="КА / ВЭ2: Неисправное положение выкатного элемента"/>
+                  <w:listItem w:displayText="КА / ВЭ2: Положение выкатного элемента «Вкачен»" w:value="КА / ВЭ2: Положение выкатного элемента «Вкачен»"/>
+                  <w:listItem w:displayText="КА / ВЭ2: Положение выкатного элемента «Выкачен»" w:value="КА / ВЭ2: Положение выкатного элемента «Выкачен»"/>
+                  <w:listItem w:displayText="КА / ВЭ2: Промежуточное положение выкатного элемента" w:value="КА / ВЭ2: Промежуточное положение выкатного элемента"/>
+                  <w:listItem w:displayText="КА / ВЭ2: Ремонтное положение выкатного элемента" w:value="КА / ВЭ2: Ремонтное положение выкатного элемента"/>
+                  <w:listItem w:displayText="КА / ВЭ2: Функция введена в работу" w:value="КА / ВЭ2: Функция введена в работу"/>
+                  <w:listItem w:displayText="КА / ЗН: Заземляющий нож включен" w:value="КА / ЗН: Заземляющий нож включен"/>
+                  <w:listItem w:displayText="КА / ЗН: Заземляющий нож отключен" w:value="КА / ЗН: Заземляющий нож отключен"/>
+                  <w:listItem w:displayText="КА / ЗН: Команда «включить» заземляющий нож через выходное реле" w:value="КА / ЗН: Команда «включить» заземляющий нож через выходное реле"/>
+                  <w:listItem w:displayText="КА / ЗН: Команда «отключить» заземляющий нож через выходное реле" w:value="КА / ЗН: Команда «отключить» заземляющий нож через выходное реле"/>
+                  <w:listItem w:displayText="КА / ЗН: Неисправное положение заземляющего ножа" w:value="КА / ЗН: Неисправное положение заземляющего ножа"/>
+                  <w:listItem w:displayText="КА / ЗН: Промежуточное положение заземляющего ножа" w:value="КА / ЗН: Промежуточное положение заземляющего ножа"/>
+                  <w:listItem w:displayText="КА / ЗН: Функция введена в работу" w:value="КА / ЗН: Функция введена в работу"/>
+                  <w:listItem w:displayText="КА / КА: Функция введена в работу" w:value="КА / КА: Функция введена в работу"/>
+                  <w:listItem w:displayText="КА / КА: Функция оперативно выведена из работы" w:value="КА / КА: Функция оперативно выведена из работы"/>
                   <w:listItem w:displayText="КНН 1сш / КНН 1сш: Пуск" w:value="КНН 1сш / КНН 1сш: Пуск"/>
                   <w:listItem w:displayText="КНН 1сш / КНН 1сш: Пуск ИО напряжения" w:value="КНН 1сш / КНН 1сш: Пуск ИО напряжения"/>
                   <w:listItem w:displayText="КНН 1сш / КНН 1сш: Пуск ИО напряжения ОП" w:value="КНН 1сш / КНН 1сш: Пуск ИО напряжения ОП"/>
@@ -3366,6 +4116,68 @@
                   <w:listItem w:displayText="КОН 2сш / КОН 2сш: Пуск ИО напряжения ОП" w:value="КОН 2сш / КОН 2сш: Пуск ИО напряжения ОП"/>
                   <w:listItem w:displayText="КОН 2сш / КОН 2сш: Функция введена в работу" w:value="КОН 2сш / КОН 2сш: Функция введена в работу"/>
                   <w:listItem w:displayText="КОН 2сш / КОН 2сш: Функция оперативно выведена из работы" w:value="КОН 2сш / КОН 2сш: Функция оперативно выведена из работы"/>
+                  <w:listItem w:displayText="КП / КП: Идет переключение" w:value="КП / КП: Идет переключение"/>
+                  <w:listItem w:displayText="КП / КП: Функция введена в работу" w:value="КП / КП: Функция введена в работу"/>
+                  <w:listItem w:displayText="КП / КП: Функция оперативно выведена из работы" w:value="КП / КП: Функция оперативно выведена из работы"/>
+                  <w:listItem w:displayText="КП / ОБР В: Блокировка включения" w:value="КП / ОБР В: Блокировка включения"/>
+                  <w:listItem w:displayText="КП / ОБР В: Разрешить включение" w:value="КП / ОБР В: Разрешить включение"/>
+                  <w:listItem w:displayText="КП / ОБР ВЭ1: Разрешение управления первым выкатным элементом" w:value="КП / ОБР ВЭ1: Разрешение управления первым выкатным элементом"/>
+                  <w:listItem w:displayText="КП / ОБР ВЭ2: Разрешение управления вторым выкатным элементом" w:value="КП / ОБР ВЭ2: Разрешение управления вторым выкатным элементом"/>
+                  <w:listItem w:displayText="КП / ОБР ЗН: Разрешение управления заземляющим ножом" w:value="КП / ОБР ЗН: Разрешение управления заземляющим ножом"/>
+                  <w:listItem w:displayText="КП / УВ: Включение с контролем синхронизма" w:value="КП / УВ: Включение с контролем синхронизма"/>
+                  <w:listItem w:displayText="КП / УВ: Включить выключатель" w:value="КП / УВ: Включить выключатель"/>
+                  <w:listItem w:displayText="КП / УВ: Задержка включения с контролем синхронизма" w:value="КП / УВ: Задержка включения с контролем синхронизма"/>
+                  <w:listItem w:displayText="КП / УВ: Идет переключение" w:value="КП / УВ: Идет переключение"/>
+                  <w:listItem w:displayText="КП / УВ: Отключить выключатель" w:value="КП / УВ: Отключить выключатель"/>
+                  <w:listItem w:displayText="КП / УВ: Поведение местного управления" w:value="КП / УВ: Поведение местного управления"/>
+                  <w:listItem w:displayText="КП / УВ: Положение В (Включено)" w:value="КП / УВ: Положение В (Включено)"/>
+                  <w:listItem w:displayText="КП / УВ: Положение В (Не определено)" w:value="КП / УВ: Положение В (Не определено)"/>
+                  <w:listItem w:displayText="КП / УВ: Положение В (Неисправность)" w:value="КП / УВ: Положение В (Неисправность)"/>
+                  <w:listItem w:displayText="КП / УВ: Положение В (Отключено)" w:value="КП / УВ: Положение В (Отключено)"/>
+                  <w:listItem w:displayText="КП / УВ: Положение ключа режима управления" w:value="КП / УВ: Положение ключа режима управления"/>
+                  <w:listItem w:displayText="КП / УВ: Право переключения на уровне станции" w:value="КП / УВ: Право переключения на уровне станции"/>
+                  <w:listItem w:displayText="КП / УВ: Сигнал превышения допустимого времени переключения" w:value="КП / УВ: Сигнал превышения допустимого времени переключения"/>
+                  <w:listItem w:displayText="КП / УВ: Функция введена в работу" w:value="КП / УВ: Функция введена в работу"/>
+                  <w:listItem w:displayText="КП / УВЭ1: Вкатить первый выкатной элемент" w:value="КП / УВЭ1: Вкатить первый выкатной элемент"/>
+                  <w:listItem w:displayText="КП / УВЭ1: Выкатить первый выкатной элемент" w:value="КП / УВЭ1: Выкатить первый выкатной элемент"/>
+                  <w:listItem w:displayText="КП / УВЭ1: Идет переключение" w:value="КП / УВЭ1: Идет переключение"/>
+                  <w:listItem w:displayText="КП / УВЭ1: Поведение местного управления" w:value="КП / УВЭ1: Поведение местного управления"/>
+                  <w:listItem w:displayText="КП / УВЭ1: Положение ВЭ1 (Вкачен)" w:value="КП / УВЭ1: Положение ВЭ1 (Вкачен)"/>
+                  <w:listItem w:displayText="КП / УВЭ1: Положение ВЭ1 (Выкачен)" w:value="КП / УВЭ1: Положение ВЭ1 (Выкачен)"/>
+                  <w:listItem w:displayText="КП / УВЭ1: Положение ВЭ1 (Не определено)" w:value="КП / УВЭ1: Положение ВЭ1 (Не определено)"/>
+                  <w:listItem w:displayText="КП / УВЭ1: Положение ВЭ1 (Неисправность)" w:value="КП / УВЭ1: Положение ВЭ1 (Неисправность)"/>
+                  <w:listItem w:displayText="КП / УВЭ1: Положение ключа режима управления" w:value="КП / УВЭ1: Положение ключа режима управления"/>
+                  <w:listItem w:displayText="КП / УВЭ1: Право переключения на уровне станции" w:value="КП / УВЭ1: Право переключения на уровне станции"/>
+                  <w:listItem w:displayText="КП / УВЭ1: Сигнал превышения допустимого времени переключения" w:value="КП / УВЭ1: Сигнал превышения допустимого времени переключения"/>
+                  <w:listItem w:displayText="КП / УВЭ1: Функция введена в работу" w:value="КП / УВЭ1: Функция введена в работу"/>
+                  <w:listItem w:displayText="КП / УВЭ2: Вкатить второй выкатной элемент" w:value="КП / УВЭ2: Вкатить второй выкатной элемент"/>
+                  <w:listItem w:displayText="КП / УВЭ2: Выкатить второй выкатной элемент" w:value="КП / УВЭ2: Выкатить второй выкатной элемент"/>
+                  <w:listItem w:displayText="КП / УВЭ2: Идет переключение" w:value="КП / УВЭ2: Идет переключение"/>
+                  <w:listItem w:displayText="КП / УВЭ2: Поведение местного управления" w:value="КП / УВЭ2: Поведение местного управления"/>
+                  <w:listItem w:displayText="КП / УВЭ2: Положение ВЭ2 (Вкачен)" w:value="КП / УВЭ2: Положение ВЭ2 (Вкачен)"/>
+                  <w:listItem w:displayText="КП / УВЭ2: Положение ВЭ2 (Выкачен)" w:value="КП / УВЭ2: Положение ВЭ2 (Выкачен)"/>
+                  <w:listItem w:displayText="КП / УВЭ2: Положение ВЭ2 (Не определено)" w:value="КП / УВЭ2: Положение ВЭ2 (Не определено)"/>
+                  <w:listItem w:displayText="КП / УВЭ2: Положение ВЭ2 (Неисправность)" w:value="КП / УВЭ2: Положение ВЭ2 (Неисправность)"/>
+                  <w:listItem w:displayText="КП / УВЭ2: Положение ключа режима управления" w:value="КП / УВЭ2: Положение ключа режима управления"/>
+                  <w:listItem w:displayText="КП / УВЭ2: Право переключения на уровне станции" w:value="КП / УВЭ2: Право переключения на уровне станции"/>
+                  <w:listItem w:displayText="КП / УВЭ2: Сигнал превышения допустимого времени переключения" w:value="КП / УВЭ2: Сигнал превышения допустимого времени переключения"/>
+                  <w:listItem w:displayText="КП / УВЭ2: Функция введена в работу" w:value="КП / УВЭ2: Функция введена в работу"/>
+                  <w:listItem w:displayText="КП / УЗН: Включить заземляющий нож" w:value="КП / УЗН: Включить заземляющий нож"/>
+                  <w:listItem w:displayText="КП / УЗН: Идет переключение" w:value="КП / УЗН: Идет переключение"/>
+                  <w:listItem w:displayText="КП / УЗН: Отключить заземляющий нож" w:value="КП / УЗН: Отключить заземляющий нож"/>
+                  <w:listItem w:displayText="КП / УЗН: Поведение местного управления" w:value="КП / УЗН: Поведение местного управления"/>
+                  <w:listItem w:displayText="КП / УЗН: Положение ЗН (Включено)" w:value="КП / УЗН: Положение ЗН (Включено)"/>
+                  <w:listItem w:displayText="КП / УЗН: Положение ЗН (Не определено)" w:value="КП / УЗН: Положение ЗН (Не определено)"/>
+                  <w:listItem w:displayText="КП / УЗН: Положение ЗН (Неисправность)" w:value="КП / УЗН: Положение ЗН (Неисправность)"/>
+                  <w:listItem w:displayText="КП / УЗН: Положение ЗН (Отключено)" w:value="КП / УЗН: Положение ЗН (Отключено)"/>
+                  <w:listItem w:displayText="КП / УЗН: Положение ключа режима управления" w:value="КП / УЗН: Положение ключа режима управления"/>
+                  <w:listItem w:displayText="КП / УЗН: Право переключения на уровне станции" w:value="КП / УЗН: Право переключения на уровне станции"/>
+                  <w:listItem w:displayText="КП / УЗН: Сигнал превышения допустимого времени переключения" w:value="КП / УЗН: Сигнал превышения допустимого времени переключения"/>
+                  <w:listItem w:displayText="КП / УЗН: Функция введена в работу" w:value="КП / УЗН: Функция введена в работу"/>
+                  <w:listItem w:displayText="КРВ / КРВ: Превышен коммутационный ресурс выключателя" w:value="КРВ / КРВ: Превышен коммутационный ресурс выключателя"/>
+                  <w:listItem w:displayText="КРВ / КРВ: Превышен механический ресурс выключателя" w:value="КРВ / КРВ: Превышен механический ресурс выключателя"/>
+                  <w:listItem w:displayText="КРВ / КРВ: Превышен ресурс выключателя" w:value="КРВ / КРВ: Превышен ресурс выключателя"/>
+                  <w:listItem w:displayText="КРВ / КРВ: Функция введена в работу" w:value="КРВ / КРВ: Функция введена в работу"/>
                   <w:listItem w:displayText="КС / КС: Блокировка по скорости изменения частоты" w:value="КС / КС: Блокировка по скорости изменения частоты"/>
                   <w:listItem w:displayText="КС / КС: Нет условий по напряжению" w:value="КС / КС: Нет условий по напряжению"/>
                   <w:listItem w:displayText="КС / КС: Нет условий по углу" w:value="КС / КС: Нет условий по углу"/>
@@ -3378,6 +4190,18 @@
                   <w:listItem w:displayText="КС / КС: Разрешение оперативного включения" w:value="КС / КС: Разрешение оперативного включения"/>
                   <w:listItem w:displayText="КС / КС: Функция введена в работу" w:value="КС / КС: Функция введена в работу"/>
                   <w:listItem w:displayText="КС / КС: Функция оперативно выведена из работы" w:value="КС / КС: Функция оперативно выведена из работы"/>
+                  <w:listItem w:displayText="КСВ / КСВ: Блокировка включения В" w:value="КСВ / КСВ: Блокировка включения В"/>
+                  <w:listItem w:displayText="КСВ / КСВ: Блокировка отключения В" w:value="КСВ / КСВ: Блокировка отключения В"/>
+                  <w:listItem w:displayText="КСВ / КСВ: В аварийно отключен" w:value="КСВ / КСВ: В аварийно отключен"/>
+                  <w:listItem w:displayText="КСВ / КСВ: В самопроизвольно отключен" w:value="КСВ / КСВ: В самопроизвольно отключен"/>
+                  <w:listItem w:displayText="КСВ / КСВ: Защита ЭМВ" w:value="КСВ / КСВ: Защита ЭМВ"/>
+                  <w:listItem w:displayText="КСВ / КСВ: Защита ЭМО1" w:value="КСВ / КСВ: Защита ЭМО1"/>
+                  <w:listItem w:displayText="КСВ / КСВ: Защита ЭМО2" w:value="КСВ / КСВ: Защита ЭМО2"/>
+                  <w:listItem w:displayText="КСВ / КСВ: Неисправность В" w:value="КСВ / КСВ: Неисправность В"/>
+                  <w:listItem w:displayText="КСВ / КСВ: Неисправность цепей ЭМУ" w:value="КСВ / КСВ: Неисправность цепей ЭМУ"/>
+                  <w:listItem w:displayText="КСВ / КСВ: Реле фиксации команды" w:value="КСВ / КСВ: Реле фиксации команды"/>
+                  <w:listItem w:displayText="КСВ / КСВ: Функция введена в работу" w:value="КСВ / КСВ: Функция введена в работу"/>
+                  <w:listItem w:displayText="КСВ / КСВ: Функция оперативно выведена из работы" w:value="КСВ / КСВ: Функция оперативно выведена из работы"/>
                   <w:listItem w:displayText="ЛЗШ / ЛЗШ: Обнаружение неисправности" w:value="ЛЗШ / ЛЗШ: Обнаружение неисправности"/>
                   <w:listItem w:displayText="ЛЗШ / ЛЗШ: Пуск" w:value="ЛЗШ / ЛЗШ: Пуск"/>
                   <w:listItem w:displayText="ЛЗШ / ЛЗШ: Пуск ИО тока по фазе B" w:value="ЛЗШ / ЛЗШ: Пуск ИО тока по фазе B"/>
@@ -3470,6 +4294,57 @@
                   <w:listItem w:displayText="МТЗ / ОНМ: Пуск по фазе C" w:value="МТЗ / ОНМ: Пуск по фазе C"/>
                   <w:listItem w:displayText="МТЗ / ОНМ: Пуск по фазе А" w:value="МТЗ / ОНМ: Пуск по фазе А"/>
                   <w:listItem w:displayText="МТЗ / ОУ МТЗ: Срабатывание" w:value="МТЗ / ОУ МТЗ: Срабатывание"/>
+                  <w:listItem w:displayText="ПДС / В: Поведение местного управления" w:value="ПДС / В: Поведение местного управления"/>
+                  <w:listItem w:displayText="ПДС / В: Положение ключа режима управления" w:value="ПДС / В: Положение ключа режима управления"/>
+                  <w:listItem w:displayText="ПДС / В: Положение ключа режима управления привода В" w:value="ПДС / В: Положение ключа режима управления привода В"/>
+                  <w:listItem w:displayText="ПДС / В: Право переключения на уровне станции" w:value="ПДС / В: Право переключения на уровне станции"/>
+                  <w:listItem w:displayText="ПДС / ВЭ1: Поведение местного управления" w:value="ПДС / ВЭ1: Поведение местного управления"/>
+                  <w:listItem w:displayText="ПДС / ВЭ1: Положение ключа режима управления" w:value="ПДС / ВЭ1: Положение ключа режима управления"/>
+                  <w:listItem w:displayText="ПДС / ВЭ1: Право переключения на уровне станции" w:value="ПДС / ВЭ1: Право переключения на уровне станции"/>
+                  <w:listItem w:displayText="ПДС / ВЭ1: Ремонтное положение коммутационного аппарата" w:value="ПДС / ВЭ1: Ремонтное положение коммутационного аппарата"/>
+                  <w:listItem w:displayText="ПДС / ВЭ2: Поведение местного управления" w:value="ПДС / ВЭ2: Поведение местного управления"/>
+                  <w:listItem w:displayText="ПДС / ВЭ2: Положение ключа режима управления" w:value="ПДС / ВЭ2: Положение ключа режима управления"/>
+                  <w:listItem w:displayText="ПДС / ВЭ2: Право переключения на уровне станции" w:value="ПДС / ВЭ2: Право переключения на уровне станции"/>
+                  <w:listItem w:displayText="ПДС / ВЭ2: Ремонтное положение коммутационного аппарата" w:value="ПДС / ВЭ2: Ремонтное положение коммутационного аппарата"/>
+                  <w:listItem w:displayText="ПДС / ЗН: Поведение местного управления" w:value="ПДС / ЗН: Поведение местного управления"/>
+                  <w:listItem w:displayText="ПДС / ЗН: Положение ключа режима управления" w:value="ПДС / ЗН: Положение ключа режима управления"/>
+                  <w:listItem w:displayText="ПДС / ЗН: Право переключения на уровне станции" w:value="ПДС / ЗН: Право переключения на уровне станции"/>
+                  <w:listItem w:displayText="ПДС / КИ: Аварийный уровень изоляции" w:value="ПДС / КИ: Аварийный уровень изоляции"/>
+                  <w:listItem w:displayText="ПДС / КИ: Низкий уровень изоляции" w:value="ПДС / КИ: Низкий уровень изоляции"/>
+                  <w:listItem w:displayText="ПДС / КПруж: Пружина не заведена" w:value="ПДС / КПруж: Пружина не заведена"/>
+                  <w:listItem w:displayText="ПДС / КЦВ: Контроль цепи ЭМВ" w:value="ПДС / КЦВ: Контроль цепи ЭМВ"/>
+                  <w:listItem w:displayText="ПДС / КЦВ: Контроль цепи ЭМО1" w:value="ПДС / КЦВ: Контроль цепи ЭМО1"/>
+                  <w:listItem w:displayText="ПДС / КЦВ: Контроль цепи ЭМО2" w:value="ПДС / КЦВ: Контроль цепи ЭМО2"/>
+                  <w:listItem w:displayText="ПДС / КЦВ: Работа ЭМВ" w:value="ПДС / КЦВ: Работа ЭМВ"/>
+                  <w:listItem w:displayText="ПДС / КЦВ: Работа ЭМО1" w:value="ПДС / КЦВ: Работа ЭМО1"/>
+                  <w:listItem w:displayText="ПДС / КЦВ: Работа ЭМО2" w:value="ПДС / КЦВ: Работа ЭМО2"/>
+                  <w:listItem w:displayText="ПДС / ПДС: Функция введена в работу" w:value="ПДС / ПДС: Функция введена в работу"/>
+                  <w:listItem w:displayText="ПДС / ПДС: Функция оперативно выведена из работы" w:value="ПДС / ПДС: Функция оперативно выведена из работы"/>
+                  <w:listItem w:displayText="ПДС НКУ / SA1: Цепь управления введена" w:value="ПДС НКУ / SA1: Цепь управления введена"/>
+                  <w:listItem w:displayText="ПДС НКУ / SA2: Цепь управления введена" w:value="ПДС НКУ / SA2: Цепь управления введена"/>
+                  <w:listItem w:displayText="ПДС НКУ / SA3: Цепь управления введена" w:value="ПДС НКУ / SA3: Цепь управления введена"/>
+                  <w:listItem w:displayText="ПДС НКУ / SA4: Цепь управления введена" w:value="ПДС НКУ / SA4: Цепь управления введена"/>
+                  <w:listItem w:displayText="ПДС НКУ / SG1: Рабочее положение испытательного блока" w:value="ПДС НКУ / SG1: Рабочее положение испытательного блока"/>
+                  <w:listItem w:displayText="ПДС НКУ / SG2: Рабочее положение испытательного блока" w:value="ПДС НКУ / SG2: Рабочее положение испытательного блока"/>
+                  <w:listItem w:displayText="ПДС НКУ / SG3: Рабочее положение испытательного блока" w:value="ПДС НКУ / SG3: Рабочее положение испытательного блока"/>
+                  <w:listItem w:displayText="ПДС НКУ / Дверь: Дверь отсека/ шкафа закрыта" w:value="ПДС НКУ / Дверь: Дверь отсека/ шкафа закрыта"/>
+                  <w:listItem w:displayText="ПДС НКУ / Дверь: Дверь отсека/ шкафа открыта" w:value="ПДС НКУ / Дверь: Дверь отсека/ шкафа открыта"/>
+                  <w:listItem w:displayText="ПДС НКУ / ОТ ОБР 1: Неисправность оперативного тока цепей ОБР 1" w:value="ПДС НКУ / ОТ ОБР 1: Неисправность оперативного тока цепей ОБР 1"/>
+                  <w:listItem w:displayText="ПДС НКУ / ОТ ОБР 2: Неисправность оперативного тока цепей ОБР 2" w:value="ПДС НКУ / ОТ ОБР 2: Неисправность оперативного тока цепей ОБР 2"/>
+                  <w:listItem w:displayText="ПДС НКУ / ОТ ЦСВ: Неисправность ОТ цепей сигнализации В" w:value="ПДС НКУ / ОТ ЦСВ: Неисправность ОТ цепей сигнализации В"/>
+                  <w:listItem w:displayText="ПДС НКУ / ОТ ЭМО1, ЭМВ: Неисправность оперативного тока цепей ЭМВ, ЭМО1" w:value="ПДС НКУ / ОТ ЭМО1, ЭМВ: Неисправность оперативного тока цепей ЭМВ, ЭМО1"/>
+                  <w:listItem w:displayText="ПДС НКУ / ОТ ЭМО2: Неисправность оперативного тока цепей ЭМО2" w:value="ПДС НКУ / ОТ ЭМО2: Неисправность оперативного тока цепей ЭМО2"/>
+                  <w:listItem w:displayText="ПДС НКУ / ПДС НКУ: Функция введена в работу" w:value="ПДС НКУ / ПДС НКУ: Функция введена в работу"/>
+                  <w:listItem w:displayText="ПДС НКУ / ПДС НКУ: Функция оперативно выведена из работы" w:value="ПДС НКУ / ПДС НКУ: Функция оперативно выведена из работы"/>
+                  <w:listItem w:displayText="ПДС НКУ / Пер.ав.дебл.см.яч.: Цепи аварийной деблокировки ячейки выведены" w:value="ПДС НКУ / Пер.ав.дебл.см.яч.: Цепи аварийной деблокировки ячейки выведены"/>
+                  <w:listItem w:displayText="ПС / ПС: Пуск предупредительной сигнализации" w:value="ПС / ПС: Пуск предупредительной сигнализации"/>
+                  <w:listItem w:displayText="ПС / ПС: Пуск предупредительной сигнализации (импульс)" w:value="ПС / ПС: Пуск предупредительной сигнализации (импульс)"/>
+                  <w:listItem w:displayText="СС / СС: БИ выведены" w:value="СС / СС: БИ выведены"/>
+                  <w:listItem w:displayText="СС / СС: Выходные цепи разобраны" w:value="СС / СС: Выходные цепи разобраны"/>
+                  <w:listItem w:displayText="СС / СС: Неисправность КА" w:value="СС / СС: Неисправность КА"/>
+                  <w:listItem w:displayText="СС / СС: Общий внешний сигнал" w:value="СС / СС: Общий внешний сигнал"/>
+                  <w:listItem w:displayText="СС / СС: Превышение времени переключения КА" w:value="СС / СС: Превышение времени переключения КА"/>
+                  <w:listItem w:displayText="СС / СС: Сигнализация цепей опер.тока" w:value="СС / СС: Сигнализация цепей опер.тока"/>
                   <w:listItem w:displayText="ТЗНП / АУ ТЗНП: Пуск автоматического ускорения ТЗНП" w:value="ТЗНП / АУ ТЗНП: Пуск автоматического ускорения ТЗНП"/>
                   <w:listItem w:displayText="ТЗНП / БНТ НП: Пуск БНТ НП" w:value="ТЗНП / БНТ НП: Пуск БНТ НП"/>
                   <w:listItem w:displayText="ТЗНП / БЧС: Блокировка чувствительных ступеней" w:value="ТЗНП / БЧС: Блокировка чувствительных ступеней"/>
@@ -3509,6 +4384,11 @@
                   <w:listItem w:displayText="ТК ЗДЗ / ТК ЗДЗ: Пуск ИО тока" w:value="ТК ЗДЗ / ТК ЗДЗ: Пуск ИО тока"/>
                   <w:listItem w:displayText="ТК ЗДЗ / ТК ЗДЗ: Функция введена в работу" w:value="ТК ЗДЗ / ТК ЗДЗ: Функция введена в работу"/>
                   <w:listItem w:displayText="ТК ЗДЗ / ТК ЗДЗ: Функция оперативно выведена из работы" w:value="ТК ЗДЗ / ТК ЗДЗ: Функция оперативно выведена из работы"/>
+                  <w:listItem w:displayText="УВ / УВ: Включение с контролем синхронизма" w:value="УВ / УВ: Включение с контролем синхронизма"/>
+                  <w:listItem w:displayText="УВ / УВ: Включить выключатель" w:value="УВ / УВ: Включить выключатель"/>
+                  <w:listItem w:displayText="УВ / УВ: Задержка включения с контролем синхронизма" w:value="УВ / УВ: Задержка включения с контролем синхронизма"/>
+                  <w:listItem w:displayText="УВ / УВ: Функция введена в работу" w:value="УВ / УВ: Функция введена в работу"/>
+                  <w:listItem w:displayText="УВ / УВ: Функция оперативно выведена из работы" w:value="УВ / УВ: Функция оперативно выведена из работы"/>
                   <w:listItem w:displayText="УРОВ / УРОВ: Пуск" w:value="УРОВ / УРОВ: Пуск"/>
                   <w:listItem w:displayText="УРОВ / УРОВ: Пуск ИО максимального тока" w:value="УРОВ / УРОВ: Пуск ИО максимального тока"/>
                   <w:listItem w:displayText="УРОВ / УРОВ: Срабатывание" w:value="УРОВ / УРОВ: Срабатывание"/>
@@ -3958,6 +4838,38 @@
                   <w:listItem w:displayText="ЗОП / ЗОП: Срабатывание на сигнал" w:value="ЗОП / ЗОП: Срабатывание на сигнал"/>
                   <w:listItem w:displayText="ЗОП / ЗОП: Функция введена в работу" w:value="ЗОП / ЗОП: Функция введена в работу"/>
                   <w:listItem w:displayText="ЗОП / ЗОП: Функция оперативно выведена из работы" w:value="ЗОП / ЗОП: Функция оперативно выведена из работы"/>
+                  <w:listItem w:displayText="КА / В: Выключатель включен" w:value="КА / В: Выключатель включен"/>
+                  <w:listItem w:displayText="КА / В: Выключатель отключен" w:value="КА / В: Выключатель отключен"/>
+                  <w:listItem w:displayText="КА / В: Команда «включить» выключатель через выходное реле" w:value="КА / В: Команда «включить» выключатель через выходное реле"/>
+                  <w:listItem w:displayText="КА / В: Команда «отключить» выключатель через выходное реле" w:value="КА / В: Команда «отключить» выключатель через выходное реле"/>
+                  <w:listItem w:displayText="КА / В: Неисправное положение выключателя" w:value="КА / В: Неисправное положение выключателя"/>
+                  <w:listItem w:displayText="КА / В: Промежуточное положение выключателя" w:value="КА / В: Промежуточное положение выключателя"/>
+                  <w:listItem w:displayText="КА / В: Функция введена в работу" w:value="КА / В: Функция введена в работу"/>
+                  <w:listItem w:displayText="КА / ВЭ1: Команда «вкатить» выкатной элемент через выходное реле" w:value="КА / ВЭ1: Команда «вкатить» выкатной элемент через выходное реле"/>
+                  <w:listItem w:displayText="КА / ВЭ1: Команда «выкатить» выкатной элемент через выходное реле" w:value="КА / ВЭ1: Команда «выкатить» выкатной элемент через выходное реле"/>
+                  <w:listItem w:displayText="КА / ВЭ1: Неисправное положение выкатного элемента" w:value="КА / ВЭ1: Неисправное положение выкатного элемента"/>
+                  <w:listItem w:displayText="КА / ВЭ1: Положение выкатного элемента «Вкачен»" w:value="КА / ВЭ1: Положение выкатного элемента «Вкачен»"/>
+                  <w:listItem w:displayText="КА / ВЭ1: Положение выкатного элемента «Выкачен»" w:value="КА / ВЭ1: Положение выкатного элемента «Выкачен»"/>
+                  <w:listItem w:displayText="КА / ВЭ1: Промежуточное положение выкатного элемента" w:value="КА / ВЭ1: Промежуточное положение выкатного элемента"/>
+                  <w:listItem w:displayText="КА / ВЭ1: Ремонтное положение выкатного элемента" w:value="КА / ВЭ1: Ремонтное положение выкатного элемента"/>
+                  <w:listItem w:displayText="КА / ВЭ1: Функция введена в работу" w:value="КА / ВЭ1: Функция введена в работу"/>
+                  <w:listItem w:displayText="КА / ВЭ2: Команда «вкатить» выкатной элемент через выходное реле" w:value="КА / ВЭ2: Команда «вкатить» выкатной элемент через выходное реле"/>
+                  <w:listItem w:displayText="КА / ВЭ2: Команда «выкатить» выкатной элемент через выходное реле" w:value="КА / ВЭ2: Команда «выкатить» выкатной элемент через выходное реле"/>
+                  <w:listItem w:displayText="КА / ВЭ2: Неисправное положение выкатного элемента" w:value="КА / ВЭ2: Неисправное положение выкатного элемента"/>
+                  <w:listItem w:displayText="КА / ВЭ2: Положение выкатного элемента «Вкачен»" w:value="КА / ВЭ2: Положение выкатного элемента «Вкачен»"/>
+                  <w:listItem w:displayText="КА / ВЭ2: Положение выкатного элемента «Выкачен»" w:value="КА / ВЭ2: Положение выкатного элемента «Выкачен»"/>
+                  <w:listItem w:displayText="КА / ВЭ2: Промежуточное положение выкатного элемента" w:value="КА / ВЭ2: Промежуточное положение выкатного элемента"/>
+                  <w:listItem w:displayText="КА / ВЭ2: Ремонтное положение выкатного элемента" w:value="КА / ВЭ2: Ремонтное положение выкатного элемента"/>
+                  <w:listItem w:displayText="КА / ВЭ2: Функция введена в работу" w:value="КА / ВЭ2: Функция введена в работу"/>
+                  <w:listItem w:displayText="КА / ЗН: Заземляющий нож включен" w:value="КА / ЗН: Заземляющий нож включен"/>
+                  <w:listItem w:displayText="КА / ЗН: Заземляющий нож отключен" w:value="КА / ЗН: Заземляющий нож отключен"/>
+                  <w:listItem w:displayText="КА / ЗН: Команда «включить» заземляющий нож через выходное реле" w:value="КА / ЗН: Команда «включить» заземляющий нож через выходное реле"/>
+                  <w:listItem w:displayText="КА / ЗН: Команда «отключить» заземляющий нож через выходное реле" w:value="КА / ЗН: Команда «отключить» заземляющий нож через выходное реле"/>
+                  <w:listItem w:displayText="КА / ЗН: Неисправное положение заземляющего ножа" w:value="КА / ЗН: Неисправное положение заземляющего ножа"/>
+                  <w:listItem w:displayText="КА / ЗН: Промежуточное положение заземляющего ножа" w:value="КА / ЗН: Промежуточное положение заземляющего ножа"/>
+                  <w:listItem w:displayText="КА / ЗН: Функция введена в работу" w:value="КА / ЗН: Функция введена в работу"/>
+                  <w:listItem w:displayText="КА / КА: Функция введена в работу" w:value="КА / КА: Функция введена в работу"/>
+                  <w:listItem w:displayText="КА / КА: Функция оперативно выведена из работы" w:value="КА / КА: Функция оперативно выведена из работы"/>
                   <w:listItem w:displayText="КНН 1сш / КНН 1сш: Пуск" w:value="КНН 1сш / КНН 1сш: Пуск"/>
                   <w:listItem w:displayText="КНН 1сш / КНН 1сш: Пуск ИО напряжения" w:value="КНН 1сш / КНН 1сш: Пуск ИО напряжения"/>
                   <w:listItem w:displayText="КНН 1сш / КНН 1сш: Пуск ИО напряжения ОП" w:value="КНН 1сш / КНН 1сш: Пуск ИО напряжения ОП"/>
@@ -3978,6 +4890,68 @@
                   <w:listItem w:displayText="КОН 2сш / КОН 2сш: Пуск ИО напряжения ОП" w:value="КОН 2сш / КОН 2сш: Пуск ИО напряжения ОП"/>
                   <w:listItem w:displayText="КОН 2сш / КОН 2сш: Функция введена в работу" w:value="КОН 2сш / КОН 2сш: Функция введена в работу"/>
                   <w:listItem w:displayText="КОН 2сш / КОН 2сш: Функция оперативно выведена из работы" w:value="КОН 2сш / КОН 2сш: Функция оперативно выведена из работы"/>
+                  <w:listItem w:displayText="КП / КП: Идет переключение" w:value="КП / КП: Идет переключение"/>
+                  <w:listItem w:displayText="КП / КП: Функция введена в работу" w:value="КП / КП: Функция введена в работу"/>
+                  <w:listItem w:displayText="КП / КП: Функция оперативно выведена из работы" w:value="КП / КП: Функция оперативно выведена из работы"/>
+                  <w:listItem w:displayText="КП / ОБР В: Блокировка включения" w:value="КП / ОБР В: Блокировка включения"/>
+                  <w:listItem w:displayText="КП / ОБР В: Разрешить включение" w:value="КП / ОБР В: Разрешить включение"/>
+                  <w:listItem w:displayText="КП / ОБР ВЭ1: Разрешение управления первым выкатным элементом" w:value="КП / ОБР ВЭ1: Разрешение управления первым выкатным элементом"/>
+                  <w:listItem w:displayText="КП / ОБР ВЭ2: Разрешение управления вторым выкатным элементом" w:value="КП / ОБР ВЭ2: Разрешение управления вторым выкатным элементом"/>
+                  <w:listItem w:displayText="КП / ОБР ЗН: Разрешение управления заземляющим ножом" w:value="КП / ОБР ЗН: Разрешение управления заземляющим ножом"/>
+                  <w:listItem w:displayText="КП / УВ: Включение с контролем синхронизма" w:value="КП / УВ: Включение с контролем синхронизма"/>
+                  <w:listItem w:displayText="КП / УВ: Включить выключатель" w:value="КП / УВ: Включить выключатель"/>
+                  <w:listItem w:displayText="КП / УВ: Задержка включения с контролем синхронизма" w:value="КП / УВ: Задержка включения с контролем синхронизма"/>
+                  <w:listItem w:displayText="КП / УВ: Идет переключение" w:value="КП / УВ: Идет переключение"/>
+                  <w:listItem w:displayText="КП / УВ: Отключить выключатель" w:value="КП / УВ: Отключить выключатель"/>
+                  <w:listItem w:displayText="КП / УВ: Поведение местного управления" w:value="КП / УВ: Поведение местного управления"/>
+                  <w:listItem w:displayText="КП / УВ: Положение В (Включено)" w:value="КП / УВ: Положение В (Включено)"/>
+                  <w:listItem w:displayText="КП / УВ: Положение В (Не определено)" w:value="КП / УВ: Положение В (Не определено)"/>
+                  <w:listItem w:displayText="КП / УВ: Положение В (Неисправность)" w:value="КП / УВ: Положение В (Неисправность)"/>
+                  <w:listItem w:displayText="КП / УВ: Положение В (Отключено)" w:value="КП / УВ: Положение В (Отключено)"/>
+                  <w:listItem w:displayText="КП / УВ: Положение ключа режима управления" w:value="КП / УВ: Положение ключа режима управления"/>
+                  <w:listItem w:displayText="КП / УВ: Право переключения на уровне станции" w:value="КП / УВ: Право переключения на уровне станции"/>
+                  <w:listItem w:displayText="КП / УВ: Сигнал превышения допустимого времени переключения" w:value="КП / УВ: Сигнал превышения допустимого времени переключения"/>
+                  <w:listItem w:displayText="КП / УВ: Функция введена в работу" w:value="КП / УВ: Функция введена в работу"/>
+                  <w:listItem w:displayText="КП / УВЭ1: Вкатить первый выкатной элемент" w:value="КП / УВЭ1: Вкатить первый выкатной элемент"/>
+                  <w:listItem w:displayText="КП / УВЭ1: Выкатить первый выкатной элемент" w:value="КП / УВЭ1: Выкатить первый выкатной элемент"/>
+                  <w:listItem w:displayText="КП / УВЭ1: Идет переключение" w:value="КП / УВЭ1: Идет переключение"/>
+                  <w:listItem w:displayText="КП / УВЭ1: Поведение местного управления" w:value="КП / УВЭ1: Поведение местного управления"/>
+                  <w:listItem w:displayText="КП / УВЭ1: Положение ВЭ1 (Вкачен)" w:value="КП / УВЭ1: Положение ВЭ1 (Вкачен)"/>
+                  <w:listItem w:displayText="КП / УВЭ1: Положение ВЭ1 (Выкачен)" w:value="КП / УВЭ1: Положение ВЭ1 (Выкачен)"/>
+                  <w:listItem w:displayText="КП / УВЭ1: Положение ВЭ1 (Не определено)" w:value="КП / УВЭ1: Положение ВЭ1 (Не определено)"/>
+                  <w:listItem w:displayText="КП / УВЭ1: Положение ВЭ1 (Неисправность)" w:value="КП / УВЭ1: Положение ВЭ1 (Неисправность)"/>
+                  <w:listItem w:displayText="КП / УВЭ1: Положение ключа режима управления" w:value="КП / УВЭ1: Положение ключа режима управления"/>
+                  <w:listItem w:displayText="КП / УВЭ1: Право переключения на уровне станции" w:value="КП / УВЭ1: Право переключения на уровне станции"/>
+                  <w:listItem w:displayText="КП / УВЭ1: Сигнал превышения допустимого времени переключения" w:value="КП / УВЭ1: Сигнал превышения допустимого времени переключения"/>
+                  <w:listItem w:displayText="КП / УВЭ1: Функция введена в работу" w:value="КП / УВЭ1: Функция введена в работу"/>
+                  <w:listItem w:displayText="КП / УВЭ2: Вкатить второй выкатной элемент" w:value="КП / УВЭ2: Вкатить второй выкатной элемент"/>
+                  <w:listItem w:displayText="КП / УВЭ2: Выкатить второй выкатной элемент" w:value="КП / УВЭ2: Выкатить второй выкатной элемент"/>
+                  <w:listItem w:displayText="КП / УВЭ2: Идет переключение" w:value="КП / УВЭ2: Идет переключение"/>
+                  <w:listItem w:displayText="КП / УВЭ2: Поведение местного управления" w:value="КП / УВЭ2: Поведение местного управления"/>
+                  <w:listItem w:displayText="КП / УВЭ2: Положение ВЭ2 (Вкачен)" w:value="КП / УВЭ2: Положение ВЭ2 (Вкачен)"/>
+                  <w:listItem w:displayText="КП / УВЭ2: Положение ВЭ2 (Выкачен)" w:value="КП / УВЭ2: Положение ВЭ2 (Выкачен)"/>
+                  <w:listItem w:displayText="КП / УВЭ2: Положение ВЭ2 (Не определено)" w:value="КП / УВЭ2: Положение ВЭ2 (Не определено)"/>
+                  <w:listItem w:displayText="КП / УВЭ2: Положение ВЭ2 (Неисправность)" w:value="КП / УВЭ2: Положение ВЭ2 (Неисправность)"/>
+                  <w:listItem w:displayText="КП / УВЭ2: Положение ключа режима управления" w:value="КП / УВЭ2: Положение ключа режима управления"/>
+                  <w:listItem w:displayText="КП / УВЭ2: Право переключения на уровне станции" w:value="КП / УВЭ2: Право переключения на уровне станции"/>
+                  <w:listItem w:displayText="КП / УВЭ2: Сигнал превышения допустимого времени переключения" w:value="КП / УВЭ2: Сигнал превышения допустимого времени переключения"/>
+                  <w:listItem w:displayText="КП / УВЭ2: Функция введена в работу" w:value="КП / УВЭ2: Функция введена в работу"/>
+                  <w:listItem w:displayText="КП / УЗН: Включить заземляющий нож" w:value="КП / УЗН: Включить заземляющий нож"/>
+                  <w:listItem w:displayText="КП / УЗН: Идет переключение" w:value="КП / УЗН: Идет переключение"/>
+                  <w:listItem w:displayText="КП / УЗН: Отключить заземляющий нож" w:value="КП / УЗН: Отключить заземляющий нож"/>
+                  <w:listItem w:displayText="КП / УЗН: Поведение местного управления" w:value="КП / УЗН: Поведение местного управления"/>
+                  <w:listItem w:displayText="КП / УЗН: Положение ЗН (Включено)" w:value="КП / УЗН: Положение ЗН (Включено)"/>
+                  <w:listItem w:displayText="КП / УЗН: Положение ЗН (Не определено)" w:value="КП / УЗН: Положение ЗН (Не определено)"/>
+                  <w:listItem w:displayText="КП / УЗН: Положение ЗН (Неисправность)" w:value="КП / УЗН: Положение ЗН (Неисправность)"/>
+                  <w:listItem w:displayText="КП / УЗН: Положение ЗН (Отключено)" w:value="КП / УЗН: Положение ЗН (Отключено)"/>
+                  <w:listItem w:displayText="КП / УЗН: Положение ключа режима управления" w:value="КП / УЗН: Положение ключа режима управления"/>
+                  <w:listItem w:displayText="КП / УЗН: Право переключения на уровне станции" w:value="КП / УЗН: Право переключения на уровне станции"/>
+                  <w:listItem w:displayText="КП / УЗН: Сигнал превышения допустимого времени переключения" w:value="КП / УЗН: Сигнал превышения допустимого времени переключения"/>
+                  <w:listItem w:displayText="КП / УЗН: Функция введена в работу" w:value="КП / УЗН: Функция введена в работу"/>
+                  <w:listItem w:displayText="КРВ / КРВ: Превышен коммутационный ресурс выключателя" w:value="КРВ / КРВ: Превышен коммутационный ресурс выключателя"/>
+                  <w:listItem w:displayText="КРВ / КРВ: Превышен механический ресурс выключателя" w:value="КРВ / КРВ: Превышен механический ресурс выключателя"/>
+                  <w:listItem w:displayText="КРВ / КРВ: Превышен ресурс выключателя" w:value="КРВ / КРВ: Превышен ресурс выключателя"/>
+                  <w:listItem w:displayText="КРВ / КРВ: Функция введена в работу" w:value="КРВ / КРВ: Функция введена в работу"/>
                   <w:listItem w:displayText="КС / КС: Блокировка по скорости изменения частоты" w:value="КС / КС: Блокировка по скорости изменения частоты"/>
                   <w:listItem w:displayText="КС / КС: Нет условий по напряжению" w:value="КС / КС: Нет условий по напряжению"/>
                   <w:listItem w:displayText="КС / КС: Нет условий по углу" w:value="КС / КС: Нет условий по углу"/>
@@ -3990,6 +4964,18 @@
                   <w:listItem w:displayText="КС / КС: Разрешение оперативного включения" w:value="КС / КС: Разрешение оперативного включения"/>
                   <w:listItem w:displayText="КС / КС: Функция введена в работу" w:value="КС / КС: Функция введена в работу"/>
                   <w:listItem w:displayText="КС / КС: Функция оперативно выведена из работы" w:value="КС / КС: Функция оперативно выведена из работы"/>
+                  <w:listItem w:displayText="КСВ / КСВ: Блокировка включения В" w:value="КСВ / КСВ: Блокировка включения В"/>
+                  <w:listItem w:displayText="КСВ / КСВ: Блокировка отключения В" w:value="КСВ / КСВ: Блокировка отключения В"/>
+                  <w:listItem w:displayText="КСВ / КСВ: В аварийно отключен" w:value="КСВ / КСВ: В аварийно отключен"/>
+                  <w:listItem w:displayText="КСВ / КСВ: В самопроизвольно отключен" w:value="КСВ / КСВ: В самопроизвольно отключен"/>
+                  <w:listItem w:displayText="КСВ / КСВ: Защита ЭМВ" w:value="КСВ / КСВ: Защита ЭМВ"/>
+                  <w:listItem w:displayText="КСВ / КСВ: Защита ЭМО1" w:value="КСВ / КСВ: Защита ЭМО1"/>
+                  <w:listItem w:displayText="КСВ / КСВ: Защита ЭМО2" w:value="КСВ / КСВ: Защита ЭМО2"/>
+                  <w:listItem w:displayText="КСВ / КСВ: Неисправность В" w:value="КСВ / КСВ: Неисправность В"/>
+                  <w:listItem w:displayText="КСВ / КСВ: Неисправность цепей ЭМУ" w:value="КСВ / КСВ: Неисправность цепей ЭМУ"/>
+                  <w:listItem w:displayText="КСВ / КСВ: Реле фиксации команды" w:value="КСВ / КСВ: Реле фиксации команды"/>
+                  <w:listItem w:displayText="КСВ / КСВ: Функция введена в работу" w:value="КСВ / КСВ: Функция введена в работу"/>
+                  <w:listItem w:displayText="КСВ / КСВ: Функция оперативно выведена из работы" w:value="КСВ / КСВ: Функция оперативно выведена из работы"/>
                   <w:listItem w:displayText="ЛЗШ / ЛЗШ: Обнаружение неисправности" w:value="ЛЗШ / ЛЗШ: Обнаружение неисправности"/>
                   <w:listItem w:displayText="ЛЗШ / ЛЗШ: Пуск" w:value="ЛЗШ / ЛЗШ: Пуск"/>
                   <w:listItem w:displayText="ЛЗШ / ЛЗШ: Пуск ИО тока по фазе B" w:value="ЛЗШ / ЛЗШ: Пуск ИО тока по фазе B"/>
@@ -4082,6 +5068,57 @@
                   <w:listItem w:displayText="МТЗ / ОНМ: Пуск по фазе C" w:value="МТЗ / ОНМ: Пуск по фазе C"/>
                   <w:listItem w:displayText="МТЗ / ОНМ: Пуск по фазе А" w:value="МТЗ / ОНМ: Пуск по фазе А"/>
                   <w:listItem w:displayText="МТЗ / ОУ МТЗ: Срабатывание" w:value="МТЗ / ОУ МТЗ: Срабатывание"/>
+                  <w:listItem w:displayText="ПДС / В: Поведение местного управления" w:value="ПДС / В: Поведение местного управления"/>
+                  <w:listItem w:displayText="ПДС / В: Положение ключа режима управления" w:value="ПДС / В: Положение ключа режима управления"/>
+                  <w:listItem w:displayText="ПДС / В: Положение ключа режима управления привода В" w:value="ПДС / В: Положение ключа режима управления привода В"/>
+                  <w:listItem w:displayText="ПДС / В: Право переключения на уровне станции" w:value="ПДС / В: Право переключения на уровне станции"/>
+                  <w:listItem w:displayText="ПДС / ВЭ1: Поведение местного управления" w:value="ПДС / ВЭ1: Поведение местного управления"/>
+                  <w:listItem w:displayText="ПДС / ВЭ1: Положение ключа режима управления" w:value="ПДС / ВЭ1: Положение ключа режима управления"/>
+                  <w:listItem w:displayText="ПДС / ВЭ1: Право переключения на уровне станции" w:value="ПДС / ВЭ1: Право переключения на уровне станции"/>
+                  <w:listItem w:displayText="ПДС / ВЭ1: Ремонтное положение коммутационного аппарата" w:value="ПДС / ВЭ1: Ремонтное положение коммутационного аппарата"/>
+                  <w:listItem w:displayText="ПДС / ВЭ2: Поведение местного управления" w:value="ПДС / ВЭ2: Поведение местного управления"/>
+                  <w:listItem w:displayText="ПДС / ВЭ2: Положение ключа режима управления" w:value="ПДС / ВЭ2: Положение ключа режима управления"/>
+                  <w:listItem w:displayText="ПДС / ВЭ2: Право переключения на уровне станции" w:value="ПДС / ВЭ2: Право переключения на уровне станции"/>
+                  <w:listItem w:displayText="ПДС / ВЭ2: Ремонтное положение коммутационного аппарата" w:value="ПДС / ВЭ2: Ремонтное положение коммутационного аппарата"/>
+                  <w:listItem w:displayText="ПДС / ЗН: Поведение местного управления" w:value="ПДС / ЗН: Поведение местного управления"/>
+                  <w:listItem w:displayText="ПДС / ЗН: Положение ключа режима управления" w:value="ПДС / ЗН: Положение ключа режима управления"/>
+                  <w:listItem w:displayText="ПДС / ЗН: Право переключения на уровне станции" w:value="ПДС / ЗН: Право переключения на уровне станции"/>
+                  <w:listItem w:displayText="ПДС / КИ: Аварийный уровень изоляции" w:value="ПДС / КИ: Аварийный уровень изоляции"/>
+                  <w:listItem w:displayText="ПДС / КИ: Низкий уровень изоляции" w:value="ПДС / КИ: Низкий уровень изоляции"/>
+                  <w:listItem w:displayText="ПДС / КПруж: Пружина не заведена" w:value="ПДС / КПруж: Пружина не заведена"/>
+                  <w:listItem w:displayText="ПДС / КЦВ: Контроль цепи ЭМВ" w:value="ПДС / КЦВ: Контроль цепи ЭМВ"/>
+                  <w:listItem w:displayText="ПДС / КЦВ: Контроль цепи ЭМО1" w:value="ПДС / КЦВ: Контроль цепи ЭМО1"/>
+                  <w:listItem w:displayText="ПДС / КЦВ: Контроль цепи ЭМО2" w:value="ПДС / КЦВ: Контроль цепи ЭМО2"/>
+                  <w:listItem w:displayText="ПДС / КЦВ: Работа ЭМВ" w:value="ПДС / КЦВ: Работа ЭМВ"/>
+                  <w:listItem w:displayText="ПДС / КЦВ: Работа ЭМО1" w:value="ПДС / КЦВ: Работа ЭМО1"/>
+                  <w:listItem w:displayText="ПДС / КЦВ: Работа ЭМО2" w:value="ПДС / КЦВ: Работа ЭМО2"/>
+                  <w:listItem w:displayText="ПДС / ПДС: Функция введена в работу" w:value="ПДС / ПДС: Функция введена в работу"/>
+                  <w:listItem w:displayText="ПДС / ПДС: Функция оперативно выведена из работы" w:value="ПДС / ПДС: Функция оперативно выведена из работы"/>
+                  <w:listItem w:displayText="ПДС НКУ / SA1: Цепь управления введена" w:value="ПДС НКУ / SA1: Цепь управления введена"/>
+                  <w:listItem w:displayText="ПДС НКУ / SA2: Цепь управления введена" w:value="ПДС НКУ / SA2: Цепь управления введена"/>
+                  <w:listItem w:displayText="ПДС НКУ / SA3: Цепь управления введена" w:value="ПДС НКУ / SA3: Цепь управления введена"/>
+                  <w:listItem w:displayText="ПДС НКУ / SA4: Цепь управления введена" w:value="ПДС НКУ / SA4: Цепь управления введена"/>
+                  <w:listItem w:displayText="ПДС НКУ / SG1: Рабочее положение испытательного блока" w:value="ПДС НКУ / SG1: Рабочее положение испытательного блока"/>
+                  <w:listItem w:displayText="ПДС НКУ / SG2: Рабочее положение испытательного блока" w:value="ПДС НКУ / SG2: Рабочее положение испытательного блока"/>
+                  <w:listItem w:displayText="ПДС НКУ / SG3: Рабочее положение испытательного блока" w:value="ПДС НКУ / SG3: Рабочее положение испытательного блока"/>
+                  <w:listItem w:displayText="ПДС НКУ / Дверь: Дверь отсека/ шкафа закрыта" w:value="ПДС НКУ / Дверь: Дверь отсека/ шкафа закрыта"/>
+                  <w:listItem w:displayText="ПДС НКУ / Дверь: Дверь отсека/ шкафа открыта" w:value="ПДС НКУ / Дверь: Дверь отсека/ шкафа открыта"/>
+                  <w:listItem w:displayText="ПДС НКУ / ОТ ОБР 1: Неисправность оперативного тока цепей ОБР 1" w:value="ПДС НКУ / ОТ ОБР 1: Неисправность оперативного тока цепей ОБР 1"/>
+                  <w:listItem w:displayText="ПДС НКУ / ОТ ОБР 2: Неисправность оперативного тока цепей ОБР 2" w:value="ПДС НКУ / ОТ ОБР 2: Неисправность оперативного тока цепей ОБР 2"/>
+                  <w:listItem w:displayText="ПДС НКУ / ОТ ЦСВ: Неисправность ОТ цепей сигнализации В" w:value="ПДС НКУ / ОТ ЦСВ: Неисправность ОТ цепей сигнализации В"/>
+                  <w:listItem w:displayText="ПДС НКУ / ОТ ЭМО1, ЭМВ: Неисправность оперативного тока цепей ЭМВ, ЭМО1" w:value="ПДС НКУ / ОТ ЭМО1, ЭМВ: Неисправность оперативного тока цепей ЭМВ, ЭМО1"/>
+                  <w:listItem w:displayText="ПДС НКУ / ОТ ЭМО2: Неисправность оперативного тока цепей ЭМО2" w:value="ПДС НКУ / ОТ ЭМО2: Неисправность оперативного тока цепей ЭМО2"/>
+                  <w:listItem w:displayText="ПДС НКУ / ПДС НКУ: Функция введена в работу" w:value="ПДС НКУ / ПДС НКУ: Функция введена в работу"/>
+                  <w:listItem w:displayText="ПДС НКУ / ПДС НКУ: Функция оперативно выведена из работы" w:value="ПДС НКУ / ПДС НКУ: Функция оперативно выведена из работы"/>
+                  <w:listItem w:displayText="ПДС НКУ / Пер.ав.дебл.см.яч.: Цепи аварийной деблокировки ячейки выведены" w:value="ПДС НКУ / Пер.ав.дебл.см.яч.: Цепи аварийной деблокировки ячейки выведены"/>
+                  <w:listItem w:displayText="ПС / ПС: Пуск предупредительной сигнализации" w:value="ПС / ПС: Пуск предупредительной сигнализации"/>
+                  <w:listItem w:displayText="ПС / ПС: Пуск предупредительной сигнализации (импульс)" w:value="ПС / ПС: Пуск предупредительной сигнализации (импульс)"/>
+                  <w:listItem w:displayText="СС / СС: БИ выведены" w:value="СС / СС: БИ выведены"/>
+                  <w:listItem w:displayText="СС / СС: Выходные цепи разобраны" w:value="СС / СС: Выходные цепи разобраны"/>
+                  <w:listItem w:displayText="СС / СС: Неисправность КА" w:value="СС / СС: Неисправность КА"/>
+                  <w:listItem w:displayText="СС / СС: Общий внешний сигнал" w:value="СС / СС: Общий внешний сигнал"/>
+                  <w:listItem w:displayText="СС / СС: Превышение времени переключения КА" w:value="СС / СС: Превышение времени переключения КА"/>
+                  <w:listItem w:displayText="СС / СС: Сигнализация цепей опер.тока" w:value="СС / СС: Сигнализация цепей опер.тока"/>
                   <w:listItem w:displayText="ТЗНП / АУ ТЗНП: Пуск автоматического ускорения ТЗНП" w:value="ТЗНП / АУ ТЗНП: Пуск автоматического ускорения ТЗНП"/>
                   <w:listItem w:displayText="ТЗНП / БНТ НП: Пуск БНТ НП" w:value="ТЗНП / БНТ НП: Пуск БНТ НП"/>
                   <w:listItem w:displayText="ТЗНП / БЧС: Блокировка чувствительных ступеней" w:value="ТЗНП / БЧС: Блокировка чувствительных ступеней"/>
@@ -4121,6 +5158,11 @@
                   <w:listItem w:displayText="ТК ЗДЗ / ТК ЗДЗ: Пуск ИО тока" w:value="ТК ЗДЗ / ТК ЗДЗ: Пуск ИО тока"/>
                   <w:listItem w:displayText="ТК ЗДЗ / ТК ЗДЗ: Функция введена в работу" w:value="ТК ЗДЗ / ТК ЗДЗ: Функция введена в работу"/>
                   <w:listItem w:displayText="ТК ЗДЗ / ТК ЗДЗ: Функция оперативно выведена из работы" w:value="ТК ЗДЗ / ТК ЗДЗ: Функция оперативно выведена из работы"/>
+                  <w:listItem w:displayText="УВ / УВ: Включение с контролем синхронизма" w:value="УВ / УВ: Включение с контролем синхронизма"/>
+                  <w:listItem w:displayText="УВ / УВ: Включить выключатель" w:value="УВ / УВ: Включить выключатель"/>
+                  <w:listItem w:displayText="УВ / УВ: Задержка включения с контролем синхронизма" w:value="УВ / УВ: Задержка включения с контролем синхронизма"/>
+                  <w:listItem w:displayText="УВ / УВ: Функция введена в работу" w:value="УВ / УВ: Функция введена в работу"/>
+                  <w:listItem w:displayText="УВ / УВ: Функция оперативно выведена из работы" w:value="УВ / УВ: Функция оперативно выведена из работы"/>
                   <w:listItem w:displayText="УРОВ / УРОВ: Пуск" w:value="УРОВ / УРОВ: Пуск"/>
                   <w:listItem w:displayText="УРОВ / УРОВ: Пуск ИО максимального тока" w:value="УРОВ / УРОВ: Пуск ИО максимального тока"/>
                   <w:listItem w:displayText="УРОВ / УРОВ: Срабатывание" w:value="УРОВ / УРОВ: Срабатывание"/>
@@ -4436,6 +5478,38 @@
                   <w:listItem w:displayText="ЗОП / ЗОП: Срабатывание на сигнал" w:value="ЗОП / ЗОП: Срабатывание на сигнал"/>
                   <w:listItem w:displayText="ЗОП / ЗОП: Функция введена в работу" w:value="ЗОП / ЗОП: Функция введена в работу"/>
                   <w:listItem w:displayText="ЗОП / ЗОП: Функция оперативно выведена из работы" w:value="ЗОП / ЗОП: Функция оперативно выведена из работы"/>
+                  <w:listItem w:displayText="КА / В: Выключатель включен" w:value="КА / В: Выключатель включен"/>
+                  <w:listItem w:displayText="КА / В: Выключатель отключен" w:value="КА / В: Выключатель отключен"/>
+                  <w:listItem w:displayText="КА / В: Команда «включить» выключатель через выходное реле" w:value="КА / В: Команда «включить» выключатель через выходное реле"/>
+                  <w:listItem w:displayText="КА / В: Команда «отключить» выключатель через выходное реле" w:value="КА / В: Команда «отключить» выключатель через выходное реле"/>
+                  <w:listItem w:displayText="КА / В: Неисправное положение выключателя" w:value="КА / В: Неисправное положение выключателя"/>
+                  <w:listItem w:displayText="КА / В: Промежуточное положение выключателя" w:value="КА / В: Промежуточное положение выключателя"/>
+                  <w:listItem w:displayText="КА / В: Функция введена в работу" w:value="КА / В: Функция введена в работу"/>
+                  <w:listItem w:displayText="КА / ВЭ1: Команда «вкатить» выкатной элемент через выходное реле" w:value="КА / ВЭ1: Команда «вкатить» выкатной элемент через выходное реле"/>
+                  <w:listItem w:displayText="КА / ВЭ1: Команда «выкатить» выкатной элемент через выходное реле" w:value="КА / ВЭ1: Команда «выкатить» выкатной элемент через выходное реле"/>
+                  <w:listItem w:displayText="КА / ВЭ1: Неисправное положение выкатного элемента" w:value="КА / ВЭ1: Неисправное положение выкатного элемента"/>
+                  <w:listItem w:displayText="КА / ВЭ1: Положение выкатного элемента «Вкачен»" w:value="КА / ВЭ1: Положение выкатного элемента «Вкачен»"/>
+                  <w:listItem w:displayText="КА / ВЭ1: Положение выкатного элемента «Выкачен»" w:value="КА / ВЭ1: Положение выкатного элемента «Выкачен»"/>
+                  <w:listItem w:displayText="КА / ВЭ1: Промежуточное положение выкатного элемента" w:value="КА / ВЭ1: Промежуточное положение выкатного элемента"/>
+                  <w:listItem w:displayText="КА / ВЭ1: Ремонтное положение выкатного элемента" w:value="КА / ВЭ1: Ремонтное положение выкатного элемента"/>
+                  <w:listItem w:displayText="КА / ВЭ1: Функция введена в работу" w:value="КА / ВЭ1: Функция введена в работу"/>
+                  <w:listItem w:displayText="КА / ВЭ2: Команда «вкатить» выкатной элемент через выходное реле" w:value="КА / ВЭ2: Команда «вкатить» выкатной элемент через выходное реле"/>
+                  <w:listItem w:displayText="КА / ВЭ2: Команда «выкатить» выкатной элемент через выходное реле" w:value="КА / ВЭ2: Команда «выкатить» выкатной элемент через выходное реле"/>
+                  <w:listItem w:displayText="КА / ВЭ2: Неисправное положение выкатного элемента" w:value="КА / ВЭ2: Неисправное положение выкатного элемента"/>
+                  <w:listItem w:displayText="КА / ВЭ2: Положение выкатного элемента «Вкачен»" w:value="КА / ВЭ2: Положение выкатного элемента «Вкачен»"/>
+                  <w:listItem w:displayText="КА / ВЭ2: Положение выкатного элемента «Выкачен»" w:value="КА / ВЭ2: Положение выкатного элемента «Выкачен»"/>
+                  <w:listItem w:displayText="КА / ВЭ2: Промежуточное положение выкатного элемента" w:value="КА / ВЭ2: Промежуточное положение выкатного элемента"/>
+                  <w:listItem w:displayText="КА / ВЭ2: Ремонтное положение выкатного элемента" w:value="КА / ВЭ2: Ремонтное положение выкатного элемента"/>
+                  <w:listItem w:displayText="КА / ВЭ2: Функция введена в работу" w:value="КА / ВЭ2: Функция введена в работу"/>
+                  <w:listItem w:displayText="КА / ЗН: Заземляющий нож включен" w:value="КА / ЗН: Заземляющий нож включен"/>
+                  <w:listItem w:displayText="КА / ЗН: Заземляющий нож отключен" w:value="КА / ЗН: Заземляющий нож отключен"/>
+                  <w:listItem w:displayText="КА / ЗН: Команда «включить» заземляющий нож через выходное реле" w:value="КА / ЗН: Команда «включить» заземляющий нож через выходное реле"/>
+                  <w:listItem w:displayText="КА / ЗН: Команда «отключить» заземляющий нож через выходное реле" w:value="КА / ЗН: Команда «отключить» заземляющий нож через выходное реле"/>
+                  <w:listItem w:displayText="КА / ЗН: Неисправное положение заземляющего ножа" w:value="КА / ЗН: Неисправное положение заземляющего ножа"/>
+                  <w:listItem w:displayText="КА / ЗН: Промежуточное положение заземляющего ножа" w:value="КА / ЗН: Промежуточное положение заземляющего ножа"/>
+                  <w:listItem w:displayText="КА / ЗН: Функция введена в работу" w:value="КА / ЗН: Функция введена в работу"/>
+                  <w:listItem w:displayText="КА / КА: Функция введена в работу" w:value="КА / КА: Функция введена в работу"/>
+                  <w:listItem w:displayText="КА / КА: Функция оперативно выведена из работы" w:value="КА / КА: Функция оперативно выведена из работы"/>
                   <w:listItem w:displayText="КНН 1сш / КНН 1сш: Пуск" w:value="КНН 1сш / КНН 1сш: Пуск"/>
                   <w:listItem w:displayText="КНН 1сш / КНН 1сш: Пуск ИО напряжения" w:value="КНН 1сш / КНН 1сш: Пуск ИО напряжения"/>
                   <w:listItem w:displayText="КНН 1сш / КНН 1сш: Пуск ИО напряжения ОП" w:value="КНН 1сш / КНН 1сш: Пуск ИО напряжения ОП"/>
@@ -4456,6 +5530,68 @@
                   <w:listItem w:displayText="КОН 2сш / КОН 2сш: Пуск ИО напряжения ОП" w:value="КОН 2сш / КОН 2сш: Пуск ИО напряжения ОП"/>
                   <w:listItem w:displayText="КОН 2сш / КОН 2сш: Функция введена в работу" w:value="КОН 2сш / КОН 2сш: Функция введена в работу"/>
                   <w:listItem w:displayText="КОН 2сш / КОН 2сш: Функция оперативно выведена из работы" w:value="КОН 2сш / КОН 2сш: Функция оперативно выведена из работы"/>
+                  <w:listItem w:displayText="КП / КП: Идет переключение" w:value="КП / КП: Идет переключение"/>
+                  <w:listItem w:displayText="КП / КП: Функция введена в работу" w:value="КП / КП: Функция введена в работу"/>
+                  <w:listItem w:displayText="КП / КП: Функция оперативно выведена из работы" w:value="КП / КП: Функция оперативно выведена из работы"/>
+                  <w:listItem w:displayText="КП / ОБР В: Блокировка включения" w:value="КП / ОБР В: Блокировка включения"/>
+                  <w:listItem w:displayText="КП / ОБР В: Разрешить включение" w:value="КП / ОБР В: Разрешить включение"/>
+                  <w:listItem w:displayText="КП / ОБР ВЭ1: Разрешение управления первым выкатным элементом" w:value="КП / ОБР ВЭ1: Разрешение управления первым выкатным элементом"/>
+                  <w:listItem w:displayText="КП / ОБР ВЭ2: Разрешение управления вторым выкатным элементом" w:value="КП / ОБР ВЭ2: Разрешение управления вторым выкатным элементом"/>
+                  <w:listItem w:displayText="КП / ОБР ЗН: Разрешение управления заземляющим ножом" w:value="КП / ОБР ЗН: Разрешение управления заземляющим ножом"/>
+                  <w:listItem w:displayText="КП / УВ: Включение с контролем синхронизма" w:value="КП / УВ: Включение с контролем синхронизма"/>
+                  <w:listItem w:displayText="КП / УВ: Включить выключатель" w:value="КП / УВ: Включить выключатель"/>
+                  <w:listItem w:displayText="КП / УВ: Задержка включения с контролем синхронизма" w:value="КП / УВ: Задержка включения с контролем синхронизма"/>
+                  <w:listItem w:displayText="КП / УВ: Идет переключение" w:value="КП / УВ: Идет переключение"/>
+                  <w:listItem w:displayText="КП / УВ: Отключить выключатель" w:value="КП / УВ: Отключить выключатель"/>
+                  <w:listItem w:displayText="КП / УВ: Поведение местного управления" w:value="КП / УВ: Поведение местного управления"/>
+                  <w:listItem w:displayText="КП / УВ: Положение В (Включено)" w:value="КП / УВ: Положение В (Включено)"/>
+                  <w:listItem w:displayText="КП / УВ: Положение В (Не определено)" w:value="КП / УВ: Положение В (Не определено)"/>
+                  <w:listItem w:displayText="КП / УВ: Положение В (Неисправность)" w:value="КП / УВ: Положение В (Неисправность)"/>
+                  <w:listItem w:displayText="КП / УВ: Положение В (Отключено)" w:value="КП / УВ: Положение В (Отключено)"/>
+                  <w:listItem w:displayText="КП / УВ: Положение ключа режима управления" w:value="КП / УВ: Положение ключа режима управления"/>
+                  <w:listItem w:displayText="КП / УВ: Право переключения на уровне станции" w:value="КП / УВ: Право переключения на уровне станции"/>
+                  <w:listItem w:displayText="КП / УВ: Сигнал превышения допустимого времени переключения" w:value="КП / УВ: Сигнал превышения допустимого времени переключения"/>
+                  <w:listItem w:displayText="КП / УВ: Функция введена в работу" w:value="КП / УВ: Функция введена в работу"/>
+                  <w:listItem w:displayText="КП / УВЭ1: Вкатить первый выкатной элемент" w:value="КП / УВЭ1: Вкатить первый выкатной элемент"/>
+                  <w:listItem w:displayText="КП / УВЭ1: Выкатить первый выкатной элемент" w:value="КП / УВЭ1: Выкатить первый выкатной элемент"/>
+                  <w:listItem w:displayText="КП / УВЭ1: Идет переключение" w:value="КП / УВЭ1: Идет переключение"/>
+                  <w:listItem w:displayText="КП / УВЭ1: Поведение местного управления" w:value="КП / УВЭ1: Поведение местного управления"/>
+                  <w:listItem w:displayText="КП / УВЭ1: Положение ВЭ1 (Вкачен)" w:value="КП / УВЭ1: Положение ВЭ1 (Вкачен)"/>
+                  <w:listItem w:displayText="КП / УВЭ1: Положение ВЭ1 (Выкачен)" w:value="КП / УВЭ1: Положение ВЭ1 (Выкачен)"/>
+                  <w:listItem w:displayText="КП / УВЭ1: Положение ВЭ1 (Не определено)" w:value="КП / УВЭ1: Положение ВЭ1 (Не определено)"/>
+                  <w:listItem w:displayText="КП / УВЭ1: Положение ВЭ1 (Неисправность)" w:value="КП / УВЭ1: Положение ВЭ1 (Неисправность)"/>
+                  <w:listItem w:displayText="КП / УВЭ1: Положение ключа режима управления" w:value="КП / УВЭ1: Положение ключа режима управления"/>
+                  <w:listItem w:displayText="КП / УВЭ1: Право переключения на уровне станции" w:value="КП / УВЭ1: Право переключения на уровне станции"/>
+                  <w:listItem w:displayText="КП / УВЭ1: Сигнал превышения допустимого времени переключения" w:value="КП / УВЭ1: Сигнал превышения допустимого времени переключения"/>
+                  <w:listItem w:displayText="КП / УВЭ1: Функция введена в работу" w:value="КП / УВЭ1: Функция введена в работу"/>
+                  <w:listItem w:displayText="КП / УВЭ2: Вкатить второй выкатной элемент" w:value="КП / УВЭ2: Вкатить второй выкатной элемент"/>
+                  <w:listItem w:displayText="КП / УВЭ2: Выкатить второй выкатной элемент" w:value="КП / УВЭ2: Выкатить второй выкатной элемент"/>
+                  <w:listItem w:displayText="КП / УВЭ2: Идет переключение" w:value="КП / УВЭ2: Идет переключение"/>
+                  <w:listItem w:displayText="КП / УВЭ2: Поведение местного управления" w:value="КП / УВЭ2: Поведение местного управления"/>
+                  <w:listItem w:displayText="КП / УВЭ2: Положение ВЭ2 (Вкачен)" w:value="КП / УВЭ2: Положение ВЭ2 (Вкачен)"/>
+                  <w:listItem w:displayText="КП / УВЭ2: Положение ВЭ2 (Выкачен)" w:value="КП / УВЭ2: Положение ВЭ2 (Выкачен)"/>
+                  <w:listItem w:displayText="КП / УВЭ2: Положение ВЭ2 (Не определено)" w:value="КП / УВЭ2: Положение ВЭ2 (Не определено)"/>
+                  <w:listItem w:displayText="КП / УВЭ2: Положение ВЭ2 (Неисправность)" w:value="КП / УВЭ2: Положение ВЭ2 (Неисправность)"/>
+                  <w:listItem w:displayText="КП / УВЭ2: Положение ключа режима управления" w:value="КП / УВЭ2: Положение ключа режима управления"/>
+                  <w:listItem w:displayText="КП / УВЭ2: Право переключения на уровне станции" w:value="КП / УВЭ2: Право переключения на уровне станции"/>
+                  <w:listItem w:displayText="КП / УВЭ2: Сигнал превышения допустимого времени переключения" w:value="КП / УВЭ2: Сигнал превышения допустимого времени переключения"/>
+                  <w:listItem w:displayText="КП / УВЭ2: Функция введена в работу" w:value="КП / УВЭ2: Функция введена в работу"/>
+                  <w:listItem w:displayText="КП / УЗН: Включить заземляющий нож" w:value="КП / УЗН: Включить заземляющий нож"/>
+                  <w:listItem w:displayText="КП / УЗН: Идет переключение" w:value="КП / УЗН: Идет переключение"/>
+                  <w:listItem w:displayText="КП / УЗН: Отключить заземляющий нож" w:value="КП / УЗН: Отключить заземляющий нож"/>
+                  <w:listItem w:displayText="КП / УЗН: Поведение местного управления" w:value="КП / УЗН: Поведение местного управления"/>
+                  <w:listItem w:displayText="КП / УЗН: Положение ЗН (Включено)" w:value="КП / УЗН: Положение ЗН (Включено)"/>
+                  <w:listItem w:displayText="КП / УЗН: Положение ЗН (Не определено)" w:value="КП / УЗН: Положение ЗН (Не определено)"/>
+                  <w:listItem w:displayText="КП / УЗН: Положение ЗН (Неисправность)" w:value="КП / УЗН: Положение ЗН (Неисправность)"/>
+                  <w:listItem w:displayText="КП / УЗН: Положение ЗН (Отключено)" w:value="КП / УЗН: Положение ЗН (Отключено)"/>
+                  <w:listItem w:displayText="КП / УЗН: Положение ключа режима управления" w:value="КП / УЗН: Положение ключа режима управления"/>
+                  <w:listItem w:displayText="КП / УЗН: Право переключения на уровне станции" w:value="КП / УЗН: Право переключения на уровне станции"/>
+                  <w:listItem w:displayText="КП / УЗН: Сигнал превышения допустимого времени переключения" w:value="КП / УЗН: Сигнал превышения допустимого времени переключения"/>
+                  <w:listItem w:displayText="КП / УЗН: Функция введена в работу" w:value="КП / УЗН: Функция введена в работу"/>
+                  <w:listItem w:displayText="КРВ / КРВ: Превышен коммутационный ресурс выключателя" w:value="КРВ / КРВ: Превышен коммутационный ресурс выключателя"/>
+                  <w:listItem w:displayText="КРВ / КРВ: Превышен механический ресурс выключателя" w:value="КРВ / КРВ: Превышен механический ресурс выключателя"/>
+                  <w:listItem w:displayText="КРВ / КРВ: Превышен ресурс выключателя" w:value="КРВ / КРВ: Превышен ресурс выключателя"/>
+                  <w:listItem w:displayText="КРВ / КРВ: Функция введена в работу" w:value="КРВ / КРВ: Функция введена в работу"/>
                   <w:listItem w:displayText="КС / КС: Блокировка по скорости изменения частоты" w:value="КС / КС: Блокировка по скорости изменения частоты"/>
                   <w:listItem w:displayText="КС / КС: Нет условий по напряжению" w:value="КС / КС: Нет условий по напряжению"/>
                   <w:listItem w:displayText="КС / КС: Нет условий по углу" w:value="КС / КС: Нет условий по углу"/>
@@ -4468,6 +5604,18 @@
                   <w:listItem w:displayText="КС / КС: Разрешение оперативного включения" w:value="КС / КС: Разрешение оперативного включения"/>
                   <w:listItem w:displayText="КС / КС: Функция введена в работу" w:value="КС / КС: Функция введена в работу"/>
                   <w:listItem w:displayText="КС / КС: Функция оперативно выведена из работы" w:value="КС / КС: Функция оперативно выведена из работы"/>
+                  <w:listItem w:displayText="КСВ / КСВ: Блокировка включения В" w:value="КСВ / КСВ: Блокировка включения В"/>
+                  <w:listItem w:displayText="КСВ / КСВ: Блокировка отключения В" w:value="КСВ / КСВ: Блокировка отключения В"/>
+                  <w:listItem w:displayText="КСВ / КСВ: В аварийно отключен" w:value="КСВ / КСВ: В аварийно отключен"/>
+                  <w:listItem w:displayText="КСВ / КСВ: В самопроизвольно отключен" w:value="КСВ / КСВ: В самопроизвольно отключен"/>
+                  <w:listItem w:displayText="КСВ / КСВ: Защита ЭМВ" w:value="КСВ / КСВ: Защита ЭМВ"/>
+                  <w:listItem w:displayText="КСВ / КСВ: Защита ЭМО1" w:value="КСВ / КСВ: Защита ЭМО1"/>
+                  <w:listItem w:displayText="КСВ / КСВ: Защита ЭМО2" w:value="КСВ / КСВ: Защита ЭМО2"/>
+                  <w:listItem w:displayText="КСВ / КСВ: Неисправность В" w:value="КСВ / КСВ: Неисправность В"/>
+                  <w:listItem w:displayText="КСВ / КСВ: Неисправность цепей ЭМУ" w:value="КСВ / КСВ: Неисправность цепей ЭМУ"/>
+                  <w:listItem w:displayText="КСВ / КСВ: Реле фиксации команды" w:value="КСВ / КСВ: Реле фиксации команды"/>
+                  <w:listItem w:displayText="КСВ / КСВ: Функция введена в работу" w:value="КСВ / КСВ: Функция введена в работу"/>
+                  <w:listItem w:displayText="КСВ / КСВ: Функция оперативно выведена из работы" w:value="КСВ / КСВ: Функция оперативно выведена из работы"/>
                   <w:listItem w:displayText="ЛЗШ / ЛЗШ: Обнаружение неисправности" w:value="ЛЗШ / ЛЗШ: Обнаружение неисправности"/>
                   <w:listItem w:displayText="ЛЗШ / ЛЗШ: Пуск" w:value="ЛЗШ / ЛЗШ: Пуск"/>
                   <w:listItem w:displayText="ЛЗШ / ЛЗШ: Пуск ИО тока по фазе B" w:value="ЛЗШ / ЛЗШ: Пуск ИО тока по фазе B"/>
@@ -4560,6 +5708,57 @@
                   <w:listItem w:displayText="МТЗ / ОНМ: Пуск по фазе C" w:value="МТЗ / ОНМ: Пуск по фазе C"/>
                   <w:listItem w:displayText="МТЗ / ОНМ: Пуск по фазе А" w:value="МТЗ / ОНМ: Пуск по фазе А"/>
                   <w:listItem w:displayText="МТЗ / ОУ МТЗ: Срабатывание" w:value="МТЗ / ОУ МТЗ: Срабатывание"/>
+                  <w:listItem w:displayText="ПДС / В: Поведение местного управления" w:value="ПДС / В: Поведение местного управления"/>
+                  <w:listItem w:displayText="ПДС / В: Положение ключа режима управления" w:value="ПДС / В: Положение ключа режима управления"/>
+                  <w:listItem w:displayText="ПДС / В: Положение ключа режима управления привода В" w:value="ПДС / В: Положение ключа режима управления привода В"/>
+                  <w:listItem w:displayText="ПДС / В: Право переключения на уровне станции" w:value="ПДС / В: Право переключения на уровне станции"/>
+                  <w:listItem w:displayText="ПДС / ВЭ1: Поведение местного управления" w:value="ПДС / ВЭ1: Поведение местного управления"/>
+                  <w:listItem w:displayText="ПДС / ВЭ1: Положение ключа режима управления" w:value="ПДС / ВЭ1: Положение ключа режима управления"/>
+                  <w:listItem w:displayText="ПДС / ВЭ1: Право переключения на уровне станции" w:value="ПДС / ВЭ1: Право переключения на уровне станции"/>
+                  <w:listItem w:displayText="ПДС / ВЭ1: Ремонтное положение коммутационного аппарата" w:value="ПДС / ВЭ1: Ремонтное положение коммутационного аппарата"/>
+                  <w:listItem w:displayText="ПДС / ВЭ2: Поведение местного управления" w:value="ПДС / ВЭ2: Поведение местного управления"/>
+                  <w:listItem w:displayText="ПДС / ВЭ2: Положение ключа режима управления" w:value="ПДС / ВЭ2: Положение ключа режима управления"/>
+                  <w:listItem w:displayText="ПДС / ВЭ2: Право переключения на уровне станции" w:value="ПДС / ВЭ2: Право переключения на уровне станции"/>
+                  <w:listItem w:displayText="ПДС / ВЭ2: Ремонтное положение коммутационного аппарата" w:value="ПДС / ВЭ2: Ремонтное положение коммутационного аппарата"/>
+                  <w:listItem w:displayText="ПДС / ЗН: Поведение местного управления" w:value="ПДС / ЗН: Поведение местного управления"/>
+                  <w:listItem w:displayText="ПДС / ЗН: Положение ключа режима управления" w:value="ПДС / ЗН: Положение ключа режима управления"/>
+                  <w:listItem w:displayText="ПДС / ЗН: Право переключения на уровне станции" w:value="ПДС / ЗН: Право переключения на уровне станции"/>
+                  <w:listItem w:displayText="ПДС / КИ: Аварийный уровень изоляции" w:value="ПДС / КИ: Аварийный уровень изоляции"/>
+                  <w:listItem w:displayText="ПДС / КИ: Низкий уровень изоляции" w:value="ПДС / КИ: Низкий уровень изоляции"/>
+                  <w:listItem w:displayText="ПДС / КПруж: Пружина не заведена" w:value="ПДС / КПруж: Пружина не заведена"/>
+                  <w:listItem w:displayText="ПДС / КЦВ: Контроль цепи ЭМВ" w:value="ПДС / КЦВ: Контроль цепи ЭМВ"/>
+                  <w:listItem w:displayText="ПДС / КЦВ: Контроль цепи ЭМО1" w:value="ПДС / КЦВ: Контроль цепи ЭМО1"/>
+                  <w:listItem w:displayText="ПДС / КЦВ: Контроль цепи ЭМО2" w:value="ПДС / КЦВ: Контроль цепи ЭМО2"/>
+                  <w:listItem w:displayText="ПДС / КЦВ: Работа ЭМВ" w:value="ПДС / КЦВ: Работа ЭМВ"/>
+                  <w:listItem w:displayText="ПДС / КЦВ: Работа ЭМО1" w:value="ПДС / КЦВ: Работа ЭМО1"/>
+                  <w:listItem w:displayText="ПДС / КЦВ: Работа ЭМО2" w:value="ПДС / КЦВ: Работа ЭМО2"/>
+                  <w:listItem w:displayText="ПДС / ПДС: Функция введена в работу" w:value="ПДС / ПДС: Функция введена в работу"/>
+                  <w:listItem w:displayText="ПДС / ПДС: Функция оперативно выведена из работы" w:value="ПДС / ПДС: Функция оперативно выведена из работы"/>
+                  <w:listItem w:displayText="ПДС НКУ / SA1: Цепь управления введена" w:value="ПДС НКУ / SA1: Цепь управления введена"/>
+                  <w:listItem w:displayText="ПДС НКУ / SA2: Цепь управления введена" w:value="ПДС НКУ / SA2: Цепь управления введена"/>
+                  <w:listItem w:displayText="ПДС НКУ / SA3: Цепь управления введена" w:value="ПДС НКУ / SA3: Цепь управления введена"/>
+                  <w:listItem w:displayText="ПДС НКУ / SA4: Цепь управления введена" w:value="ПДС НКУ / SA4: Цепь управления введена"/>
+                  <w:listItem w:displayText="ПДС НКУ / SG1: Рабочее положение испытательного блока" w:value="ПДС НКУ / SG1: Рабочее положение испытательного блока"/>
+                  <w:listItem w:displayText="ПДС НКУ / SG2: Рабочее положение испытательного блока" w:value="ПДС НКУ / SG2: Рабочее положение испытательного блока"/>
+                  <w:listItem w:displayText="ПДС НКУ / SG3: Рабочее положение испытательного блока" w:value="ПДС НКУ / SG3: Рабочее положение испытательного блока"/>
+                  <w:listItem w:displayText="ПДС НКУ / Дверь: Дверь отсека/ шкафа закрыта" w:value="ПДС НКУ / Дверь: Дверь отсека/ шкафа закрыта"/>
+                  <w:listItem w:displayText="ПДС НКУ / Дверь: Дверь отсека/ шкафа открыта" w:value="ПДС НКУ / Дверь: Дверь отсека/ шкафа открыта"/>
+                  <w:listItem w:displayText="ПДС НКУ / ОТ ОБР 1: Неисправность оперативного тока цепей ОБР 1" w:value="ПДС НКУ / ОТ ОБР 1: Неисправность оперативного тока цепей ОБР 1"/>
+                  <w:listItem w:displayText="ПДС НКУ / ОТ ОБР 2: Неисправность оперативного тока цепей ОБР 2" w:value="ПДС НКУ / ОТ ОБР 2: Неисправность оперативного тока цепей ОБР 2"/>
+                  <w:listItem w:displayText="ПДС НКУ / ОТ ЦСВ: Неисправность ОТ цепей сигнализации В" w:value="ПДС НКУ / ОТ ЦСВ: Неисправность ОТ цепей сигнализации В"/>
+                  <w:listItem w:displayText="ПДС НКУ / ОТ ЭМО1, ЭМВ: Неисправность оперативного тока цепей ЭМВ, ЭМО1" w:value="ПДС НКУ / ОТ ЭМО1, ЭМВ: Неисправность оперативного тока цепей ЭМВ, ЭМО1"/>
+                  <w:listItem w:displayText="ПДС НКУ / ОТ ЭМО2: Неисправность оперативного тока цепей ЭМО2" w:value="ПДС НКУ / ОТ ЭМО2: Неисправность оперативного тока цепей ЭМО2"/>
+                  <w:listItem w:displayText="ПДС НКУ / ПДС НКУ: Функция введена в работу" w:value="ПДС НКУ / ПДС НКУ: Функция введена в работу"/>
+                  <w:listItem w:displayText="ПДС НКУ / ПДС НКУ: Функция оперативно выведена из работы" w:value="ПДС НКУ / ПДС НКУ: Функция оперативно выведена из работы"/>
+                  <w:listItem w:displayText="ПДС НКУ / Пер.ав.дебл.см.яч.: Цепи аварийной деблокировки ячейки выведены" w:value="ПДС НКУ / Пер.ав.дебл.см.яч.: Цепи аварийной деблокировки ячейки выведены"/>
+                  <w:listItem w:displayText="ПС / ПС: Пуск предупредительной сигнализации" w:value="ПС / ПС: Пуск предупредительной сигнализации"/>
+                  <w:listItem w:displayText="ПС / ПС: Пуск предупредительной сигнализации (импульс)" w:value="ПС / ПС: Пуск предупредительной сигнализации (импульс)"/>
+                  <w:listItem w:displayText="СС / СС: БИ выведены" w:value="СС / СС: БИ выведены"/>
+                  <w:listItem w:displayText="СС / СС: Выходные цепи разобраны" w:value="СС / СС: Выходные цепи разобраны"/>
+                  <w:listItem w:displayText="СС / СС: Неисправность КА" w:value="СС / СС: Неисправность КА"/>
+                  <w:listItem w:displayText="СС / СС: Общий внешний сигнал" w:value="СС / СС: Общий внешний сигнал"/>
+                  <w:listItem w:displayText="СС / СС: Превышение времени переключения КА" w:value="СС / СС: Превышение времени переключения КА"/>
+                  <w:listItem w:displayText="СС / СС: Сигнализация цепей опер.тока" w:value="СС / СС: Сигнализация цепей опер.тока"/>
                   <w:listItem w:displayText="ТЗНП / АУ ТЗНП: Пуск автоматического ускорения ТЗНП" w:value="ТЗНП / АУ ТЗНП: Пуск автоматического ускорения ТЗНП"/>
                   <w:listItem w:displayText="ТЗНП / БНТ НП: Пуск БНТ НП" w:value="ТЗНП / БНТ НП: Пуск БНТ НП"/>
                   <w:listItem w:displayText="ТЗНП / БЧС: Блокировка чувствительных ступеней" w:value="ТЗНП / БЧС: Блокировка чувствительных ступеней"/>
@@ -4599,6 +5798,11 @@
                   <w:listItem w:displayText="ТК ЗДЗ / ТК ЗДЗ: Пуск ИО тока" w:value="ТК ЗДЗ / ТК ЗДЗ: Пуск ИО тока"/>
                   <w:listItem w:displayText="ТК ЗДЗ / ТК ЗДЗ: Функция введена в работу" w:value="ТК ЗДЗ / ТК ЗДЗ: Функция введена в работу"/>
                   <w:listItem w:displayText="ТК ЗДЗ / ТК ЗДЗ: Функция оперативно выведена из работы" w:value="ТК ЗДЗ / ТК ЗДЗ: Функция оперативно выведена из работы"/>
+                  <w:listItem w:displayText="УВ / УВ: Включение с контролем синхронизма" w:value="УВ / УВ: Включение с контролем синхронизма"/>
+                  <w:listItem w:displayText="УВ / УВ: Включить выключатель" w:value="УВ / УВ: Включить выключатель"/>
+                  <w:listItem w:displayText="УВ / УВ: Задержка включения с контролем синхронизма" w:value="УВ / УВ: Задержка включения с контролем синхронизма"/>
+                  <w:listItem w:displayText="УВ / УВ: Функция введена в работу" w:value="УВ / УВ: Функция введена в работу"/>
+                  <w:listItem w:displayText="УВ / УВ: Функция оперативно выведена из работы" w:value="УВ / УВ: Функция оперативно выведена из работы"/>
                   <w:listItem w:displayText="УРОВ / УРОВ: Пуск" w:value="УРОВ / УРОВ: Пуск"/>
                   <w:listItem w:displayText="УРОВ / УРОВ: Пуск ИО максимального тока" w:value="УРОВ / УРОВ: Пуск ИО максимального тока"/>
                   <w:listItem w:displayText="УРОВ / УРОВ: Срабатывание" w:value="УРОВ / УРОВ: Срабатывание"/>
@@ -4914,6 +6118,38 @@
                   <w:listItem w:displayText="ЗОП / ЗОП: Срабатывание на сигнал" w:value="ЗОП / ЗОП: Срабатывание на сигнал"/>
                   <w:listItem w:displayText="ЗОП / ЗОП: Функция введена в работу" w:value="ЗОП / ЗОП: Функция введена в работу"/>
                   <w:listItem w:displayText="ЗОП / ЗОП: Функция оперативно выведена из работы" w:value="ЗОП / ЗОП: Функция оперативно выведена из работы"/>
+                  <w:listItem w:displayText="КА / В: Выключатель включен" w:value="КА / В: Выключатель включен"/>
+                  <w:listItem w:displayText="КА / В: Выключатель отключен" w:value="КА / В: Выключатель отключен"/>
+                  <w:listItem w:displayText="КА / В: Команда «включить» выключатель через выходное реле" w:value="КА / В: Команда «включить» выключатель через выходное реле"/>
+                  <w:listItem w:displayText="КА / В: Команда «отключить» выключатель через выходное реле" w:value="КА / В: Команда «отключить» выключатель через выходное реле"/>
+                  <w:listItem w:displayText="КА / В: Неисправное положение выключателя" w:value="КА / В: Неисправное положение выключателя"/>
+                  <w:listItem w:displayText="КА / В: Промежуточное положение выключателя" w:value="КА / В: Промежуточное положение выключателя"/>
+                  <w:listItem w:displayText="КА / В: Функция введена в работу" w:value="КА / В: Функция введена в работу"/>
+                  <w:listItem w:displayText="КА / ВЭ1: Команда «вкатить» выкатной элемент через выходное реле" w:value="КА / ВЭ1: Команда «вкатить» выкатной элемент через выходное реле"/>
+                  <w:listItem w:displayText="КА / ВЭ1: Команда «выкатить» выкатной элемент через выходное реле" w:value="КА / ВЭ1: Команда «выкатить» выкатной элемент через выходное реле"/>
+                  <w:listItem w:displayText="КА / ВЭ1: Неисправное положение выкатного элемента" w:value="КА / ВЭ1: Неисправное положение выкатного элемента"/>
+                  <w:listItem w:displayText="КА / ВЭ1: Положение выкатного элемента «Вкачен»" w:value="КА / ВЭ1: Положение выкатного элемента «Вкачен»"/>
+                  <w:listItem w:displayText="КА / ВЭ1: Положение выкатного элемента «Выкачен»" w:value="КА / ВЭ1: Положение выкатного элемента «Выкачен»"/>
+                  <w:listItem w:displayText="КА / ВЭ1: Промежуточное положение выкатного элемента" w:value="КА / ВЭ1: Промежуточное положение выкатного элемента"/>
+                  <w:listItem w:displayText="КА / ВЭ1: Ремонтное положение выкатного элемента" w:value="КА / ВЭ1: Ремонтное положение выкатного элемента"/>
+                  <w:listItem w:displayText="КА / ВЭ1: Функция введена в работу" w:value="КА / ВЭ1: Функция введена в работу"/>
+                  <w:listItem w:displayText="КА / ВЭ2: Команда «вкатить» выкатной элемент через выходное реле" w:value="КА / ВЭ2: Команда «вкатить» выкатной элемент через выходное реле"/>
+                  <w:listItem w:displayText="КА / ВЭ2: Команда «выкатить» выкатной элемент через выходное реле" w:value="КА / ВЭ2: Команда «выкатить» выкатной элемент через выходное реле"/>
+                  <w:listItem w:displayText="КА / ВЭ2: Неисправное положение выкатного элемента" w:value="КА / ВЭ2: Неисправное положение выкатного элемента"/>
+                  <w:listItem w:displayText="КА / ВЭ2: Положение выкатного элемента «Вкачен»" w:value="КА / ВЭ2: Положение выкатного элемента «Вкачен»"/>
+                  <w:listItem w:displayText="КА / ВЭ2: Положение выкатного элемента «Выкачен»" w:value="КА / ВЭ2: Положение выкатного элемента «Выкачен»"/>
+                  <w:listItem w:displayText="КА / ВЭ2: Промежуточное положение выкатного элемента" w:value="КА / ВЭ2: Промежуточное положение выкатного элемента"/>
+                  <w:listItem w:displayText="КА / ВЭ2: Ремонтное положение выкатного элемента" w:value="КА / ВЭ2: Ремонтное положение выкатного элемента"/>
+                  <w:listItem w:displayText="КА / ВЭ2: Функция введена в работу" w:value="КА / ВЭ2: Функция введена в работу"/>
+                  <w:listItem w:displayText="КА / ЗН: Заземляющий нож включен" w:value="КА / ЗН: Заземляющий нож включен"/>
+                  <w:listItem w:displayText="КА / ЗН: Заземляющий нож отключен" w:value="КА / ЗН: Заземляющий нож отключен"/>
+                  <w:listItem w:displayText="КА / ЗН: Команда «включить» заземляющий нож через выходное реле" w:value="КА / ЗН: Команда «включить» заземляющий нож через выходное реле"/>
+                  <w:listItem w:displayText="КА / ЗН: Команда «отключить» заземляющий нож через выходное реле" w:value="КА / ЗН: Команда «отключить» заземляющий нож через выходное реле"/>
+                  <w:listItem w:displayText="КА / ЗН: Неисправное положение заземляющего ножа" w:value="КА / ЗН: Неисправное положение заземляющего ножа"/>
+                  <w:listItem w:displayText="КА / ЗН: Промежуточное положение заземляющего ножа" w:value="КА / ЗН: Промежуточное положение заземляющего ножа"/>
+                  <w:listItem w:displayText="КА / ЗН: Функция введена в работу" w:value="КА / ЗН: Функция введена в работу"/>
+                  <w:listItem w:displayText="КА / КА: Функция введена в работу" w:value="КА / КА: Функция введена в работу"/>
+                  <w:listItem w:displayText="КА / КА: Функция оперативно выведена из работы" w:value="КА / КА: Функция оперативно выведена из работы"/>
                   <w:listItem w:displayText="КНН 1сш / КНН 1сш: Пуск" w:value="КНН 1сш / КНН 1сш: Пуск"/>
                   <w:listItem w:displayText="КНН 1сш / КНН 1сш: Пуск ИО напряжения" w:value="КНН 1сш / КНН 1сш: Пуск ИО напряжения"/>
                   <w:listItem w:displayText="КНН 1сш / КНН 1сш: Пуск ИО напряжения ОП" w:value="КНН 1сш / КНН 1сш: Пуск ИО напряжения ОП"/>
@@ -4934,6 +6170,68 @@
                   <w:listItem w:displayText="КОН 2сш / КОН 2сш: Пуск ИО напряжения ОП" w:value="КОН 2сш / КОН 2сш: Пуск ИО напряжения ОП"/>
                   <w:listItem w:displayText="КОН 2сш / КОН 2сш: Функция введена в работу" w:value="КОН 2сш / КОН 2сш: Функция введена в работу"/>
                   <w:listItem w:displayText="КОН 2сш / КОН 2сш: Функция оперативно выведена из работы" w:value="КОН 2сш / КОН 2сш: Функция оперативно выведена из работы"/>
+                  <w:listItem w:displayText="КП / КП: Идет переключение" w:value="КП / КП: Идет переключение"/>
+                  <w:listItem w:displayText="КП / КП: Функция введена в работу" w:value="КП / КП: Функция введена в работу"/>
+                  <w:listItem w:displayText="КП / КП: Функция оперативно выведена из работы" w:value="КП / КП: Функция оперативно выведена из работы"/>
+                  <w:listItem w:displayText="КП / ОБР В: Блокировка включения" w:value="КП / ОБР В: Блокировка включения"/>
+                  <w:listItem w:displayText="КП / ОБР В: Разрешить включение" w:value="КП / ОБР В: Разрешить включение"/>
+                  <w:listItem w:displayText="КП / ОБР ВЭ1: Разрешение управления первым выкатным элементом" w:value="КП / ОБР ВЭ1: Разрешение управления первым выкатным элементом"/>
+                  <w:listItem w:displayText="КП / ОБР ВЭ2: Разрешение управления вторым выкатным элементом" w:value="КП / ОБР ВЭ2: Разрешение управления вторым выкатным элементом"/>
+                  <w:listItem w:displayText="КП / ОБР ЗН: Разрешение управления заземляющим ножом" w:value="КП / ОБР ЗН: Разрешение управления заземляющим ножом"/>
+                  <w:listItem w:displayText="КП / УВ: Включение с контролем синхронизма" w:value="КП / УВ: Включение с контролем синхронизма"/>
+                  <w:listItem w:displayText="КП / УВ: Включить выключатель" w:value="КП / УВ: Включить выключатель"/>
+                  <w:listItem w:displayText="КП / УВ: Задержка включения с контролем синхронизма" w:value="КП / УВ: Задержка включения с контролем синхронизма"/>
+                  <w:listItem w:displayText="КП / УВ: Идет переключение" w:value="КП / УВ: Идет переключение"/>
+                  <w:listItem w:displayText="КП / УВ: Отключить выключатель" w:value="КП / УВ: Отключить выключатель"/>
+                  <w:listItem w:displayText="КП / УВ: Поведение местного управления" w:value="КП / УВ: Поведение местного управления"/>
+                  <w:listItem w:displayText="КП / УВ: Положение В (Включено)" w:value="КП / УВ: Положение В (Включено)"/>
+                  <w:listItem w:displayText="КП / УВ: Положение В (Не определено)" w:value="КП / УВ: Положение В (Не определено)"/>
+                  <w:listItem w:displayText="КП / УВ: Положение В (Неисправность)" w:value="КП / УВ: Положение В (Неисправность)"/>
+                  <w:listItem w:displayText="КП / УВ: Положение В (Отключено)" w:value="КП / УВ: Положение В (Отключено)"/>
+                  <w:listItem w:displayText="КП / УВ: Положение ключа режима управления" w:value="КП / УВ: Положение ключа режима управления"/>
+                  <w:listItem w:displayText="КП / УВ: Право переключения на уровне станции" w:value="КП / УВ: Право переключения на уровне станции"/>
+                  <w:listItem w:displayText="КП / УВ: Сигнал превышения допустимого времени переключения" w:value="КП / УВ: Сигнал превышения допустимого времени переключения"/>
+                  <w:listItem w:displayText="КП / УВ: Функция введена в работу" w:value="КП / УВ: Функция введена в работу"/>
+                  <w:listItem w:displayText="КП / УВЭ1: Вкатить первый выкатной элемент" w:value="КП / УВЭ1: Вкатить первый выкатной элемент"/>
+                  <w:listItem w:displayText="КП / УВЭ1: Выкатить первый выкатной элемент" w:value="КП / УВЭ1: Выкатить первый выкатной элемент"/>
+                  <w:listItem w:displayText="КП / УВЭ1: Идет переключение" w:value="КП / УВЭ1: Идет переключение"/>
+                  <w:listItem w:displayText="КП / УВЭ1: Поведение местного управления" w:value="КП / УВЭ1: Поведение местного управления"/>
+                  <w:listItem w:displayText="КП / УВЭ1: Положение ВЭ1 (Вкачен)" w:value="КП / УВЭ1: Положение ВЭ1 (Вкачен)"/>
+                  <w:listItem w:displayText="КП / УВЭ1: Положение ВЭ1 (Выкачен)" w:value="КП / УВЭ1: Положение ВЭ1 (Выкачен)"/>
+                  <w:listItem w:displayText="КП / УВЭ1: Положение ВЭ1 (Не определено)" w:value="КП / УВЭ1: Положение ВЭ1 (Не определено)"/>
+                  <w:listItem w:displayText="КП / УВЭ1: Положение ВЭ1 (Неисправность)" w:value="КП / УВЭ1: Положение ВЭ1 (Неисправность)"/>
+                  <w:listItem w:displayText="КП / УВЭ1: Положение ключа режима управления" w:value="КП / УВЭ1: Положение ключа режима управления"/>
+                  <w:listItem w:displayText="КП / УВЭ1: Право переключения на уровне станции" w:value="КП / УВЭ1: Право переключения на уровне станции"/>
+                  <w:listItem w:displayText="КП / УВЭ1: Сигнал превышения допустимого времени переключения" w:value="КП / УВЭ1: Сигнал превышения допустимого времени переключения"/>
+                  <w:listItem w:displayText="КП / УВЭ1: Функция введена в работу" w:value="КП / УВЭ1: Функция введена в работу"/>
+                  <w:listItem w:displayText="КП / УВЭ2: Вкатить второй выкатной элемент" w:value="КП / УВЭ2: Вкатить второй выкатной элемент"/>
+                  <w:listItem w:displayText="КП / УВЭ2: Выкатить второй выкатной элемент" w:value="КП / УВЭ2: Выкатить второй выкатной элемент"/>
+                  <w:listItem w:displayText="КП / УВЭ2: Идет переключение" w:value="КП / УВЭ2: Идет переключение"/>
+                  <w:listItem w:displayText="КП / УВЭ2: Поведение местного управления" w:value="КП / УВЭ2: Поведение местного управления"/>
+                  <w:listItem w:displayText="КП / УВЭ2: Положение ВЭ2 (Вкачен)" w:value="КП / УВЭ2: Положение ВЭ2 (Вкачен)"/>
+                  <w:listItem w:displayText="КП / УВЭ2: Положение ВЭ2 (Выкачен)" w:value="КП / УВЭ2: Положение ВЭ2 (Выкачен)"/>
+                  <w:listItem w:displayText="КП / УВЭ2: Положение ВЭ2 (Не определено)" w:value="КП / УВЭ2: Положение ВЭ2 (Не определено)"/>
+                  <w:listItem w:displayText="КП / УВЭ2: Положение ВЭ2 (Неисправность)" w:value="КП / УВЭ2: Положение ВЭ2 (Неисправность)"/>
+                  <w:listItem w:displayText="КП / УВЭ2: Положение ключа режима управления" w:value="КП / УВЭ2: Положение ключа режима управления"/>
+                  <w:listItem w:displayText="КП / УВЭ2: Право переключения на уровне станции" w:value="КП / УВЭ2: Право переключения на уровне станции"/>
+                  <w:listItem w:displayText="КП / УВЭ2: Сигнал превышения допустимого времени переключения" w:value="КП / УВЭ2: Сигнал превышения допустимого времени переключения"/>
+                  <w:listItem w:displayText="КП / УВЭ2: Функция введена в работу" w:value="КП / УВЭ2: Функция введена в работу"/>
+                  <w:listItem w:displayText="КП / УЗН: Включить заземляющий нож" w:value="КП / УЗН: Включить заземляющий нож"/>
+                  <w:listItem w:displayText="КП / УЗН: Идет переключение" w:value="КП / УЗН: Идет переключение"/>
+                  <w:listItem w:displayText="КП / УЗН: Отключить заземляющий нож" w:value="КП / УЗН: Отключить заземляющий нож"/>
+                  <w:listItem w:displayText="КП / УЗН: Поведение местного управления" w:value="КП / УЗН: Поведение местного управления"/>
+                  <w:listItem w:displayText="КП / УЗН: Положение ЗН (Включено)" w:value="КП / УЗН: Положение ЗН (Включено)"/>
+                  <w:listItem w:displayText="КП / УЗН: Положение ЗН (Не определено)" w:value="КП / УЗН: Положение ЗН (Не определено)"/>
+                  <w:listItem w:displayText="КП / УЗН: Положение ЗН (Неисправность)" w:value="КП / УЗН: Положение ЗН (Неисправность)"/>
+                  <w:listItem w:displayText="КП / УЗН: Положение ЗН (Отключено)" w:value="КП / УЗН: Положение ЗН (Отключено)"/>
+                  <w:listItem w:displayText="КП / УЗН: Положение ключа режима управления" w:value="КП / УЗН: Положение ключа режима управления"/>
+                  <w:listItem w:displayText="КП / УЗН: Право переключения на уровне станции" w:value="КП / УЗН: Право переключения на уровне станции"/>
+                  <w:listItem w:displayText="КП / УЗН: Сигнал превышения допустимого времени переключения" w:value="КП / УЗН: Сигнал превышения допустимого времени переключения"/>
+                  <w:listItem w:displayText="КП / УЗН: Функция введена в работу" w:value="КП / УЗН: Функция введена в работу"/>
+                  <w:listItem w:displayText="КРВ / КРВ: Превышен коммутационный ресурс выключателя" w:value="КРВ / КРВ: Превышен коммутационный ресурс выключателя"/>
+                  <w:listItem w:displayText="КРВ / КРВ: Превышен механический ресурс выключателя" w:value="КРВ / КРВ: Превышен механический ресурс выключателя"/>
+                  <w:listItem w:displayText="КРВ / КРВ: Превышен ресурс выключателя" w:value="КРВ / КРВ: Превышен ресурс выключателя"/>
+                  <w:listItem w:displayText="КРВ / КРВ: Функция введена в работу" w:value="КРВ / КРВ: Функция введена в работу"/>
                   <w:listItem w:displayText="КС / КС: Блокировка по скорости изменения частоты" w:value="КС / КС: Блокировка по скорости изменения частоты"/>
                   <w:listItem w:displayText="КС / КС: Нет условий по напряжению" w:value="КС / КС: Нет условий по напряжению"/>
                   <w:listItem w:displayText="КС / КС: Нет условий по углу" w:value="КС / КС: Нет условий по углу"/>
@@ -4946,6 +6244,18 @@
                   <w:listItem w:displayText="КС / КС: Разрешение оперативного включения" w:value="КС / КС: Разрешение оперативного включения"/>
                   <w:listItem w:displayText="КС / КС: Функция введена в работу" w:value="КС / КС: Функция введена в работу"/>
                   <w:listItem w:displayText="КС / КС: Функция оперативно выведена из работы" w:value="КС / КС: Функция оперативно выведена из работы"/>
+                  <w:listItem w:displayText="КСВ / КСВ: Блокировка включения В" w:value="КСВ / КСВ: Блокировка включения В"/>
+                  <w:listItem w:displayText="КСВ / КСВ: Блокировка отключения В" w:value="КСВ / КСВ: Блокировка отключения В"/>
+                  <w:listItem w:displayText="КСВ / КСВ: В аварийно отключен" w:value="КСВ / КСВ: В аварийно отключен"/>
+                  <w:listItem w:displayText="КСВ / КСВ: В самопроизвольно отключен" w:value="КСВ / КСВ: В самопроизвольно отключен"/>
+                  <w:listItem w:displayText="КСВ / КСВ: Защита ЭМВ" w:value="КСВ / КСВ: Защита ЭМВ"/>
+                  <w:listItem w:displayText="КСВ / КСВ: Защита ЭМО1" w:value="КСВ / КСВ: Защита ЭМО1"/>
+                  <w:listItem w:displayText="КСВ / КСВ: Защита ЭМО2" w:value="КСВ / КСВ: Защита ЭМО2"/>
+                  <w:listItem w:displayText="КСВ / КСВ: Неисправность В" w:value="КСВ / КСВ: Неисправность В"/>
+                  <w:listItem w:displayText="КСВ / КСВ: Неисправность цепей ЭМУ" w:value="КСВ / КСВ: Неисправность цепей ЭМУ"/>
+                  <w:listItem w:displayText="КСВ / КСВ: Реле фиксации команды" w:value="КСВ / КСВ: Реле фиксации команды"/>
+                  <w:listItem w:displayText="КСВ / КСВ: Функция введена в работу" w:value="КСВ / КСВ: Функция введена в работу"/>
+                  <w:listItem w:displayText="КСВ / КСВ: Функция оперативно выведена из работы" w:value="КСВ / КСВ: Функция оперативно выведена из работы"/>
                   <w:listItem w:displayText="ЛЗШ / ЛЗШ: Обнаружение неисправности" w:value="ЛЗШ / ЛЗШ: Обнаружение неисправности"/>
                   <w:listItem w:displayText="ЛЗШ / ЛЗШ: Пуск" w:value="ЛЗШ / ЛЗШ: Пуск"/>
                   <w:listItem w:displayText="ЛЗШ / ЛЗШ: Пуск ИО тока по фазе B" w:value="ЛЗШ / ЛЗШ: Пуск ИО тока по фазе B"/>
@@ -5038,6 +6348,57 @@
                   <w:listItem w:displayText="МТЗ / ОНМ: Пуск по фазе C" w:value="МТЗ / ОНМ: Пуск по фазе C"/>
                   <w:listItem w:displayText="МТЗ / ОНМ: Пуск по фазе А" w:value="МТЗ / ОНМ: Пуск по фазе А"/>
                   <w:listItem w:displayText="МТЗ / ОУ МТЗ: Срабатывание" w:value="МТЗ / ОУ МТЗ: Срабатывание"/>
+                  <w:listItem w:displayText="ПДС / В: Поведение местного управления" w:value="ПДС / В: Поведение местного управления"/>
+                  <w:listItem w:displayText="ПДС / В: Положение ключа режима управления" w:value="ПДС / В: Положение ключа режима управления"/>
+                  <w:listItem w:displayText="ПДС / В: Положение ключа режима управления привода В" w:value="ПДС / В: Положение ключа режима управления привода В"/>
+                  <w:listItem w:displayText="ПДС / В: Право переключения на уровне станции" w:value="ПДС / В: Право переключения на уровне станции"/>
+                  <w:listItem w:displayText="ПДС / ВЭ1: Поведение местного управления" w:value="ПДС / ВЭ1: Поведение местного управления"/>
+                  <w:listItem w:displayText="ПДС / ВЭ1: Положение ключа режима управления" w:value="ПДС / ВЭ1: Положение ключа режима управления"/>
+                  <w:listItem w:displayText="ПДС / ВЭ1: Право переключения на уровне станции" w:value="ПДС / ВЭ1: Право переключения на уровне станции"/>
+                  <w:listItem w:displayText="ПДС / ВЭ1: Ремонтное положение коммутационного аппарата" w:value="ПДС / ВЭ1: Ремонтное положение коммутационного аппарата"/>
+                  <w:listItem w:displayText="ПДС / ВЭ2: Поведение местного управления" w:value="ПДС / ВЭ2: Поведение местного управления"/>
+                  <w:listItem w:displayText="ПДС / ВЭ2: Положение ключа режима управления" w:value="ПДС / ВЭ2: Положение ключа режима управления"/>
+                  <w:listItem w:displayText="ПДС / ВЭ2: Право переключения на уровне станции" w:value="ПДС / ВЭ2: Право переключения на уровне станции"/>
+                  <w:listItem w:displayText="ПДС / ВЭ2: Ремонтное положение коммутационного аппарата" w:value="ПДС / ВЭ2: Ремонтное положение коммутационного аппарата"/>
+                  <w:listItem w:displayText="ПДС / ЗН: Поведение местного управления" w:value="ПДС / ЗН: Поведение местного управления"/>
+                  <w:listItem w:displayText="ПДС / ЗН: Положение ключа режима управления" w:value="ПДС / ЗН: Положение ключа режима управления"/>
+                  <w:listItem w:displayText="ПДС / ЗН: Право переключения на уровне станции" w:value="ПДС / ЗН: Право переключения на уровне станции"/>
+                  <w:listItem w:displayText="ПДС / КИ: Аварийный уровень изоляции" w:value="ПДС / КИ: Аварийный уровень изоляции"/>
+                  <w:listItem w:displayText="ПДС / КИ: Низкий уровень изоляции" w:value="ПДС / КИ: Низкий уровень изоляции"/>
+                  <w:listItem w:displayText="ПДС / КПруж: Пружина не заведена" w:value="ПДС / КПруж: Пружина не заведена"/>
+                  <w:listItem w:displayText="ПДС / КЦВ: Контроль цепи ЭМВ" w:value="ПДС / КЦВ: Контроль цепи ЭМВ"/>
+                  <w:listItem w:displayText="ПДС / КЦВ: Контроль цепи ЭМО1" w:value="ПДС / КЦВ: Контроль цепи ЭМО1"/>
+                  <w:listItem w:displayText="ПДС / КЦВ: Контроль цепи ЭМО2" w:value="ПДС / КЦВ: Контроль цепи ЭМО2"/>
+                  <w:listItem w:displayText="ПДС / КЦВ: Работа ЭМВ" w:value="ПДС / КЦВ: Работа ЭМВ"/>
+                  <w:listItem w:displayText="ПДС / КЦВ: Работа ЭМО1" w:value="ПДС / КЦВ: Работа ЭМО1"/>
+                  <w:listItem w:displayText="ПДС / КЦВ: Работа ЭМО2" w:value="ПДС / КЦВ: Работа ЭМО2"/>
+                  <w:listItem w:displayText="ПДС / ПДС: Функция введена в работу" w:value="ПДС / ПДС: Функция введена в работу"/>
+                  <w:listItem w:displayText="ПДС / ПДС: Функция оперативно выведена из работы" w:value="ПДС / ПДС: Функция оперативно выведена из работы"/>
+                  <w:listItem w:displayText="ПДС НКУ / SA1: Цепь управления введена" w:value="ПДС НКУ / SA1: Цепь управления введена"/>
+                  <w:listItem w:displayText="ПДС НКУ / SA2: Цепь управления введена" w:value="ПДС НКУ / SA2: Цепь управления введена"/>
+                  <w:listItem w:displayText="ПДС НКУ / SA3: Цепь управления введена" w:value="ПДС НКУ / SA3: Цепь управления введена"/>
+                  <w:listItem w:displayText="ПДС НКУ / SA4: Цепь управления введена" w:value="ПДС НКУ / SA4: Цепь управления введена"/>
+                  <w:listItem w:displayText="ПДС НКУ / SG1: Рабочее положение испытательного блока" w:value="ПДС НКУ / SG1: Рабочее положение испытательного блока"/>
+                  <w:listItem w:displayText="ПДС НКУ / SG2: Рабочее положение испытательного блока" w:value="ПДС НКУ / SG2: Рабочее положение испытательного блока"/>
+                  <w:listItem w:displayText="ПДС НКУ / SG3: Рабочее положение испытательного блока" w:value="ПДС НКУ / SG3: Рабочее положение испытательного блока"/>
+                  <w:listItem w:displayText="ПДС НКУ / Дверь: Дверь отсека/ шкафа закрыта" w:value="ПДС НКУ / Дверь: Дверь отсека/ шкафа закрыта"/>
+                  <w:listItem w:displayText="ПДС НКУ / Дверь: Дверь отсека/ шкафа открыта" w:value="ПДС НКУ / Дверь: Дверь отсека/ шкафа открыта"/>
+                  <w:listItem w:displayText="ПДС НКУ / ОТ ОБР 1: Неисправность оперативного тока цепей ОБР 1" w:value="ПДС НКУ / ОТ ОБР 1: Неисправность оперативного тока цепей ОБР 1"/>
+                  <w:listItem w:displayText="ПДС НКУ / ОТ ОБР 2: Неисправность оперативного тока цепей ОБР 2" w:value="ПДС НКУ / ОТ ОБР 2: Неисправность оперативного тока цепей ОБР 2"/>
+                  <w:listItem w:displayText="ПДС НКУ / ОТ ЦСВ: Неисправность ОТ цепей сигнализации В" w:value="ПДС НКУ / ОТ ЦСВ: Неисправность ОТ цепей сигнализации В"/>
+                  <w:listItem w:displayText="ПДС НКУ / ОТ ЭМО1, ЭМВ: Неисправность оперативного тока цепей ЭМВ, ЭМО1" w:value="ПДС НКУ / ОТ ЭМО1, ЭМВ: Неисправность оперативного тока цепей ЭМВ, ЭМО1"/>
+                  <w:listItem w:displayText="ПДС НКУ / ОТ ЭМО2: Неисправность оперативного тока цепей ЭМО2" w:value="ПДС НКУ / ОТ ЭМО2: Неисправность оперативного тока цепей ЭМО2"/>
+                  <w:listItem w:displayText="ПДС НКУ / ПДС НКУ: Функция введена в работу" w:value="ПДС НКУ / ПДС НКУ: Функция введена в работу"/>
+                  <w:listItem w:displayText="ПДС НКУ / ПДС НКУ: Функция оперативно выведена из работы" w:value="ПДС НКУ / ПДС НКУ: Функция оперативно выведена из работы"/>
+                  <w:listItem w:displayText="ПДС НКУ / Пер.ав.дебл.см.яч.: Цепи аварийной деблокировки ячейки выведены" w:value="ПДС НКУ / Пер.ав.дебл.см.яч.: Цепи аварийной деблокировки ячейки выведены"/>
+                  <w:listItem w:displayText="ПС / ПС: Пуск предупредительной сигнализации" w:value="ПС / ПС: Пуск предупредительной сигнализации"/>
+                  <w:listItem w:displayText="ПС / ПС: Пуск предупредительной сигнализации (импульс)" w:value="ПС / ПС: Пуск предупредительной сигнализации (импульс)"/>
+                  <w:listItem w:displayText="СС / СС: БИ выведены" w:value="СС / СС: БИ выведены"/>
+                  <w:listItem w:displayText="СС / СС: Выходные цепи разобраны" w:value="СС / СС: Выходные цепи разобраны"/>
+                  <w:listItem w:displayText="СС / СС: Неисправность КА" w:value="СС / СС: Неисправность КА"/>
+                  <w:listItem w:displayText="СС / СС: Общий внешний сигнал" w:value="СС / СС: Общий внешний сигнал"/>
+                  <w:listItem w:displayText="СС / СС: Превышение времени переключения КА" w:value="СС / СС: Превышение времени переключения КА"/>
+                  <w:listItem w:displayText="СС / СС: Сигнализация цепей опер.тока" w:value="СС / СС: Сигнализация цепей опер.тока"/>
                   <w:listItem w:displayText="ТЗНП / АУ ТЗНП: Пуск автоматического ускорения ТЗНП" w:value="ТЗНП / АУ ТЗНП: Пуск автоматического ускорения ТЗНП"/>
                   <w:listItem w:displayText="ТЗНП / БНТ НП: Пуск БНТ НП" w:value="ТЗНП / БНТ НП: Пуск БНТ НП"/>
                   <w:listItem w:displayText="ТЗНП / БЧС: Блокировка чувствительных ступеней" w:value="ТЗНП / БЧС: Блокировка чувствительных ступеней"/>
@@ -5077,6 +6438,11 @@
                   <w:listItem w:displayText="ТК ЗДЗ / ТК ЗДЗ: Пуск ИО тока" w:value="ТК ЗДЗ / ТК ЗДЗ: Пуск ИО тока"/>
                   <w:listItem w:displayText="ТК ЗДЗ / ТК ЗДЗ: Функция введена в работу" w:value="ТК ЗДЗ / ТК ЗДЗ: Функция введена в работу"/>
                   <w:listItem w:displayText="ТК ЗДЗ / ТК ЗДЗ: Функция оперативно выведена из работы" w:value="ТК ЗДЗ / ТК ЗДЗ: Функция оперативно выведена из работы"/>
+                  <w:listItem w:displayText="УВ / УВ: Включение с контролем синхронизма" w:value="УВ / УВ: Включение с контролем синхронизма"/>
+                  <w:listItem w:displayText="УВ / УВ: Включить выключатель" w:value="УВ / УВ: Включить выключатель"/>
+                  <w:listItem w:displayText="УВ / УВ: Задержка включения с контролем синхронизма" w:value="УВ / УВ: Задержка включения с контролем синхронизма"/>
+                  <w:listItem w:displayText="УВ / УВ: Функция введена в работу" w:value="УВ / УВ: Функция введена в работу"/>
+                  <w:listItem w:displayText="УВ / УВ: Функция оперативно выведена из работы" w:value="УВ / УВ: Функция оперативно выведена из работы"/>
                   <w:listItem w:displayText="УРОВ / УРОВ: Пуск" w:value="УРОВ / УРОВ: Пуск"/>
                   <w:listItem w:displayText="УРОВ / УРОВ: Пуск ИО максимального тока" w:value="УРОВ / УРОВ: Пуск ИО максимального тока"/>
                   <w:listItem w:displayText="УРОВ / УРОВ: Срабатывание" w:value="УРОВ / УРОВ: Срабатывание"/>
@@ -5392,6 +6758,38 @@
                   <w:listItem w:displayText="ЗОП / ЗОП: Срабатывание на сигнал" w:value="ЗОП / ЗОП: Срабатывание на сигнал"/>
                   <w:listItem w:displayText="ЗОП / ЗОП: Функция введена в работу" w:value="ЗОП / ЗОП: Функция введена в работу"/>
                   <w:listItem w:displayText="ЗОП / ЗОП: Функция оперативно выведена из работы" w:value="ЗОП / ЗОП: Функция оперативно выведена из работы"/>
+                  <w:listItem w:displayText="КА / В: Выключатель включен" w:value="КА / В: Выключатель включен"/>
+                  <w:listItem w:displayText="КА / В: Выключатель отключен" w:value="КА / В: Выключатель отключен"/>
+                  <w:listItem w:displayText="КА / В: Команда «включить» выключатель через выходное реле" w:value="КА / В: Команда «включить» выключатель через выходное реле"/>
+                  <w:listItem w:displayText="КА / В: Команда «отключить» выключатель через выходное реле" w:value="КА / В: Команда «отключить» выключатель через выходное реле"/>
+                  <w:listItem w:displayText="КА / В: Неисправное положение выключателя" w:value="КА / В: Неисправное положение выключателя"/>
+                  <w:listItem w:displayText="КА / В: Промежуточное положение выключателя" w:value="КА / В: Промежуточное положение выключателя"/>
+                  <w:listItem w:displayText="КА / В: Функция введена в работу" w:value="КА / В: Функция введена в работу"/>
+                  <w:listItem w:displayText="КА / ВЭ1: Команда «вкатить» выкатной элемент через выходное реле" w:value="КА / ВЭ1: Команда «вкатить» выкатной элемент через выходное реле"/>
+                  <w:listItem w:displayText="КА / ВЭ1: Команда «выкатить» выкатной элемент через выходное реле" w:value="КА / ВЭ1: Команда «выкатить» выкатной элемент через выходное реле"/>
+                  <w:listItem w:displayText="КА / ВЭ1: Неисправное положение выкатного элемента" w:value="КА / ВЭ1: Неисправное положение выкатного элемента"/>
+                  <w:listItem w:displayText="КА / ВЭ1: Положение выкатного элемента «Вкачен»" w:value="КА / ВЭ1: Положение выкатного элемента «Вкачен»"/>
+                  <w:listItem w:displayText="КА / ВЭ1: Положение выкатного элемента «Выкачен»" w:value="КА / ВЭ1: Положение выкатного элемента «Выкачен»"/>
+                  <w:listItem w:displayText="КА / ВЭ1: Промежуточное положение выкатного элемента" w:value="КА / ВЭ1: Промежуточное положение выкатного элемента"/>
+                  <w:listItem w:displayText="КА / ВЭ1: Ремонтное положение выкатного элемента" w:value="КА / ВЭ1: Ремонтное положение выкатного элемента"/>
+                  <w:listItem w:displayText="КА / ВЭ1: Функция введена в работу" w:value="КА / ВЭ1: Функция введена в работу"/>
+                  <w:listItem w:displayText="КА / ВЭ2: Команда «вкатить» выкатной элемент через выходное реле" w:value="КА / ВЭ2: Команда «вкатить» выкатной элемент через выходное реле"/>
+                  <w:listItem w:displayText="КА / ВЭ2: Команда «выкатить» выкатной элемент через выходное реле" w:value="КА / ВЭ2: Команда «выкатить» выкатной элемент через выходное реле"/>
+                  <w:listItem w:displayText="КА / ВЭ2: Неисправное положение выкатного элемента" w:value="КА / ВЭ2: Неисправное положение выкатного элемента"/>
+                  <w:listItem w:displayText="КА / ВЭ2: Положение выкатного элемента «Вкачен»" w:value="КА / ВЭ2: Положение выкатного элемента «Вкачен»"/>
+                  <w:listItem w:displayText="КА / ВЭ2: Положение выкатного элемента «Выкачен»" w:value="КА / ВЭ2: Положение выкатного элемента «Выкачен»"/>
+                  <w:listItem w:displayText="КА / ВЭ2: Промежуточное положение выкатного элемента" w:value="КА / ВЭ2: Промежуточное положение выкатного элемента"/>
+                  <w:listItem w:displayText="КА / ВЭ2: Ремонтное положение выкатного элемента" w:value="КА / ВЭ2: Ремонтное положение выкатного элемента"/>
+                  <w:listItem w:displayText="КА / ВЭ2: Функция введена в работу" w:value="КА / ВЭ2: Функция введена в работу"/>
+                  <w:listItem w:displayText="КА / ЗН: Заземляющий нож включен" w:value="КА / ЗН: Заземляющий нож включен"/>
+                  <w:listItem w:displayText="КА / ЗН: Заземляющий нож отключен" w:value="КА / ЗН: Заземляющий нож отключен"/>
+                  <w:listItem w:displayText="КА / ЗН: Команда «включить» заземляющий нож через выходное реле" w:value="КА / ЗН: Команда «включить» заземляющий нож через выходное реле"/>
+                  <w:listItem w:displayText="КА / ЗН: Команда «отключить» заземляющий нож через выходное реле" w:value="КА / ЗН: Команда «отключить» заземляющий нож через выходное реле"/>
+                  <w:listItem w:displayText="КА / ЗН: Неисправное положение заземляющего ножа" w:value="КА / ЗН: Неисправное положение заземляющего ножа"/>
+                  <w:listItem w:displayText="КА / ЗН: Промежуточное положение заземляющего ножа" w:value="КА / ЗН: Промежуточное положение заземляющего ножа"/>
+                  <w:listItem w:displayText="КА / ЗН: Функция введена в работу" w:value="КА / ЗН: Функция введена в работу"/>
+                  <w:listItem w:displayText="КА / КА: Функция введена в работу" w:value="КА / КА: Функция введена в работу"/>
+                  <w:listItem w:displayText="КА / КА: Функция оперативно выведена из работы" w:value="КА / КА: Функция оперативно выведена из работы"/>
                   <w:listItem w:displayText="КНН 1сш / КНН 1сш: Пуск" w:value="КНН 1сш / КНН 1сш: Пуск"/>
                   <w:listItem w:displayText="КНН 1сш / КНН 1сш: Пуск ИО напряжения" w:value="КНН 1сш / КНН 1сш: Пуск ИО напряжения"/>
                   <w:listItem w:displayText="КНН 1сш / КНН 1сш: Пуск ИО напряжения ОП" w:value="КНН 1сш / КНН 1сш: Пуск ИО напряжения ОП"/>
@@ -5412,6 +6810,68 @@
                   <w:listItem w:displayText="КОН 2сш / КОН 2сш: Пуск ИО напряжения ОП" w:value="КОН 2сш / КОН 2сш: Пуск ИО напряжения ОП"/>
                   <w:listItem w:displayText="КОН 2сш / КОН 2сш: Функция введена в работу" w:value="КОН 2сш / КОН 2сш: Функция введена в работу"/>
                   <w:listItem w:displayText="КОН 2сш / КОН 2сш: Функция оперативно выведена из работы" w:value="КОН 2сш / КОН 2сш: Функция оперативно выведена из работы"/>
+                  <w:listItem w:displayText="КП / КП: Идет переключение" w:value="КП / КП: Идет переключение"/>
+                  <w:listItem w:displayText="КП / КП: Функция введена в работу" w:value="КП / КП: Функция введена в работу"/>
+                  <w:listItem w:displayText="КП / КП: Функция оперативно выведена из работы" w:value="КП / КП: Функция оперативно выведена из работы"/>
+                  <w:listItem w:displayText="КП / ОБР В: Блокировка включения" w:value="КП / ОБР В: Блокировка включения"/>
+                  <w:listItem w:displayText="КП / ОБР В: Разрешить включение" w:value="КП / ОБР В: Разрешить включение"/>
+                  <w:listItem w:displayText="КП / ОБР ВЭ1: Разрешение управления первым выкатным элементом" w:value="КП / ОБР ВЭ1: Разрешение управления первым выкатным элементом"/>
+                  <w:listItem w:displayText="КП / ОБР ВЭ2: Разрешение управления вторым выкатным элементом" w:value="КП / ОБР ВЭ2: Разрешение управления вторым выкатным элементом"/>
+                  <w:listItem w:displayText="КП / ОБР ЗН: Разрешение управления заземляющим ножом" w:value="КП / ОБР ЗН: Разрешение управления заземляющим ножом"/>
+                  <w:listItem w:displayText="КП / УВ: Включение с контролем синхронизма" w:value="КП / УВ: Включение с контролем синхронизма"/>
+                  <w:listItem w:displayText="КП / УВ: Включить выключатель" w:value="КП / УВ: Включить выключатель"/>
+                  <w:listItem w:displayText="КП / УВ: Задержка включения с контролем синхронизма" w:value="КП / УВ: Задержка включения с контролем синхронизма"/>
+                  <w:listItem w:displayText="КП / УВ: Идет переключение" w:value="КП / УВ: Идет переключение"/>
+                  <w:listItem w:displayText="КП / УВ: Отключить выключатель" w:value="КП / УВ: Отключить выключатель"/>
+                  <w:listItem w:displayText="КП / УВ: Поведение местного управления" w:value="КП / УВ: Поведение местного управления"/>
+                  <w:listItem w:displayText="КП / УВ: Положение В (Включено)" w:value="КП / УВ: Положение В (Включено)"/>
+                  <w:listItem w:displayText="КП / УВ: Положение В (Не определено)" w:value="КП / УВ: Положение В (Не определено)"/>
+                  <w:listItem w:displayText="КП / УВ: Положение В (Неисправность)" w:value="КП / УВ: Положение В (Неисправность)"/>
+                  <w:listItem w:displayText="КП / УВ: Положение В (Отключено)" w:value="КП / УВ: Положение В (Отключено)"/>
+                  <w:listItem w:displayText="КП / УВ: Положение ключа режима управления" w:value="КП / УВ: Положение ключа режима управления"/>
+                  <w:listItem w:displayText="КП / УВ: Право переключения на уровне станции" w:value="КП / УВ: Право переключения на уровне станции"/>
+                  <w:listItem w:displayText="КП / УВ: Сигнал превышения допустимого времени переключения" w:value="КП / УВ: Сигнал превышения допустимого времени переключения"/>
+                  <w:listItem w:displayText="КП / УВ: Функция введена в работу" w:value="КП / УВ: Функция введена в работу"/>
+                  <w:listItem w:displayText="КП / УВЭ1: Вкатить первый выкатной элемент" w:value="КП / УВЭ1: Вкатить первый выкатной элемент"/>
+                  <w:listItem w:displayText="КП / УВЭ1: Выкатить первый выкатной элемент" w:value="КП / УВЭ1: Выкатить первый выкатной элемент"/>
+                  <w:listItem w:displayText="КП / УВЭ1: Идет переключение" w:value="КП / УВЭ1: Идет переключение"/>
+                  <w:listItem w:displayText="КП / УВЭ1: Поведение местного управления" w:value="КП / УВЭ1: Поведение местного управления"/>
+                  <w:listItem w:displayText="КП / УВЭ1: Положение ВЭ1 (Вкачен)" w:value="КП / УВЭ1: Положение ВЭ1 (Вкачен)"/>
+                  <w:listItem w:displayText="КП / УВЭ1: Положение ВЭ1 (Выкачен)" w:value="КП / УВЭ1: Положение ВЭ1 (Выкачен)"/>
+                  <w:listItem w:displayText="КП / УВЭ1: Положение ВЭ1 (Не определено)" w:value="КП / УВЭ1: Положение ВЭ1 (Не определено)"/>
+                  <w:listItem w:displayText="КП / УВЭ1: Положение ВЭ1 (Неисправность)" w:value="КП / УВЭ1: Положение ВЭ1 (Неисправность)"/>
+                  <w:listItem w:displayText="КП / УВЭ1: Положение ключа режима управления" w:value="КП / УВЭ1: Положение ключа режима управления"/>
+                  <w:listItem w:displayText="КП / УВЭ1: Право переключения на уровне станции" w:value="КП / УВЭ1: Право переключения на уровне станции"/>
+                  <w:listItem w:displayText="КП / УВЭ1: Сигнал превышения допустимого времени переключения" w:value="КП / УВЭ1: Сигнал превышения допустимого времени переключения"/>
+                  <w:listItem w:displayText="КП / УВЭ1: Функция введена в работу" w:value="КП / УВЭ1: Функция введена в работу"/>
+                  <w:listItem w:displayText="КП / УВЭ2: Вкатить второй выкатной элемент" w:value="КП / УВЭ2: Вкатить второй выкатной элемент"/>
+                  <w:listItem w:displayText="КП / УВЭ2: Выкатить второй выкатной элемент" w:value="КП / УВЭ2: Выкатить второй выкатной элемент"/>
+                  <w:listItem w:displayText="КП / УВЭ2: Идет переключение" w:value="КП / УВЭ2: Идет переключение"/>
+                  <w:listItem w:displayText="КП / УВЭ2: Поведение местного управления" w:value="КП / УВЭ2: Поведение местного управления"/>
+                  <w:listItem w:displayText="КП / УВЭ2: Положение ВЭ2 (Вкачен)" w:value="КП / УВЭ2: Положение ВЭ2 (Вкачен)"/>
+                  <w:listItem w:displayText="КП / УВЭ2: Положение ВЭ2 (Выкачен)" w:value="КП / УВЭ2: Положение ВЭ2 (Выкачен)"/>
+                  <w:listItem w:displayText="КП / УВЭ2: Положение ВЭ2 (Не определено)" w:value="КП / УВЭ2: Положение ВЭ2 (Не определено)"/>
+                  <w:listItem w:displayText="КП / УВЭ2: Положение ВЭ2 (Неисправность)" w:value="КП / УВЭ2: Положение ВЭ2 (Неисправность)"/>
+                  <w:listItem w:displayText="КП / УВЭ2: Положение ключа режима управления" w:value="КП / УВЭ2: Положение ключа режима управления"/>
+                  <w:listItem w:displayText="КП / УВЭ2: Право переключения на уровне станции" w:value="КП / УВЭ2: Право переключения на уровне станции"/>
+                  <w:listItem w:displayText="КП / УВЭ2: Сигнал превышения допустимого времени переключения" w:value="КП / УВЭ2: Сигнал превышения допустимого времени переключения"/>
+                  <w:listItem w:displayText="КП / УВЭ2: Функция введена в работу" w:value="КП / УВЭ2: Функция введена в работу"/>
+                  <w:listItem w:displayText="КП / УЗН: Включить заземляющий нож" w:value="КП / УЗН: Включить заземляющий нож"/>
+                  <w:listItem w:displayText="КП / УЗН: Идет переключение" w:value="КП / УЗН: Идет переключение"/>
+                  <w:listItem w:displayText="КП / УЗН: Отключить заземляющий нож" w:value="КП / УЗН: Отключить заземляющий нож"/>
+                  <w:listItem w:displayText="КП / УЗН: Поведение местного управления" w:value="КП / УЗН: Поведение местного управления"/>
+                  <w:listItem w:displayText="КП / УЗН: Положение ЗН (Включено)" w:value="КП / УЗН: Положение ЗН (Включено)"/>
+                  <w:listItem w:displayText="КП / УЗН: Положение ЗН (Не определено)" w:value="КП / УЗН: Положение ЗН (Не определено)"/>
+                  <w:listItem w:displayText="КП / УЗН: Положение ЗН (Неисправность)" w:value="КП / УЗН: Положение ЗН (Неисправность)"/>
+                  <w:listItem w:displayText="КП / УЗН: Положение ЗН (Отключено)" w:value="КП / УЗН: Положение ЗН (Отключено)"/>
+                  <w:listItem w:displayText="КП / УЗН: Положение ключа режима управления" w:value="КП / УЗН: Положение ключа режима управления"/>
+                  <w:listItem w:displayText="КП / УЗН: Право переключения на уровне станции" w:value="КП / УЗН: Право переключения на уровне станции"/>
+                  <w:listItem w:displayText="КП / УЗН: Сигнал превышения допустимого времени переключения" w:value="КП / УЗН: Сигнал превышения допустимого времени переключения"/>
+                  <w:listItem w:displayText="КП / УЗН: Функция введена в работу" w:value="КП / УЗН: Функция введена в работу"/>
+                  <w:listItem w:displayText="КРВ / КРВ: Превышен коммутационный ресурс выключателя" w:value="КРВ / КРВ: Превышен коммутационный ресурс выключателя"/>
+                  <w:listItem w:displayText="КРВ / КРВ: Превышен механический ресурс выключателя" w:value="КРВ / КРВ: Превышен механический ресурс выключателя"/>
+                  <w:listItem w:displayText="КРВ / КРВ: Превышен ресурс выключателя" w:value="КРВ / КРВ: Превышен ресурс выключателя"/>
+                  <w:listItem w:displayText="КРВ / КРВ: Функция введена в работу" w:value="КРВ / КРВ: Функция введена в работу"/>
                   <w:listItem w:displayText="КС / КС: Блокировка по скорости изменения частоты" w:value="КС / КС: Блокировка по скорости изменения частоты"/>
                   <w:listItem w:displayText="КС / КС: Нет условий по напряжению" w:value="КС / КС: Нет условий по напряжению"/>
                   <w:listItem w:displayText="КС / КС: Нет условий по углу" w:value="КС / КС: Нет условий по углу"/>
@@ -5424,6 +6884,18 @@
                   <w:listItem w:displayText="КС / КС: Разрешение оперативного включения" w:value="КС / КС: Разрешение оперативного включения"/>
                   <w:listItem w:displayText="КС / КС: Функция введена в работу" w:value="КС / КС: Функция введена в работу"/>
                   <w:listItem w:displayText="КС / КС: Функция оперативно выведена из работы" w:value="КС / КС: Функция оперативно выведена из работы"/>
+                  <w:listItem w:displayText="КСВ / КСВ: Блокировка включения В" w:value="КСВ / КСВ: Блокировка включения В"/>
+                  <w:listItem w:displayText="КСВ / КСВ: Блокировка отключения В" w:value="КСВ / КСВ: Блокировка отключения В"/>
+                  <w:listItem w:displayText="КСВ / КСВ: В аварийно отключен" w:value="КСВ / КСВ: В аварийно отключен"/>
+                  <w:listItem w:displayText="КСВ / КСВ: В самопроизвольно отключен" w:value="КСВ / КСВ: В самопроизвольно отключен"/>
+                  <w:listItem w:displayText="КСВ / КСВ: Защита ЭМВ" w:value="КСВ / КСВ: Защита ЭМВ"/>
+                  <w:listItem w:displayText="КСВ / КСВ: Защита ЭМО1" w:value="КСВ / КСВ: Защита ЭМО1"/>
+                  <w:listItem w:displayText="КСВ / КСВ: Защита ЭМО2" w:value="КСВ / КСВ: Защита ЭМО2"/>
+                  <w:listItem w:displayText="КСВ / КСВ: Неисправность В" w:value="КСВ / КСВ: Неисправность В"/>
+                  <w:listItem w:displayText="КСВ / КСВ: Неисправность цепей ЭМУ" w:value="КСВ / КСВ: Неисправность цепей ЭМУ"/>
+                  <w:listItem w:displayText="КСВ / КСВ: Реле фиксации команды" w:value="КСВ / КСВ: Реле фиксации команды"/>
+                  <w:listItem w:displayText="КСВ / КСВ: Функция введена в работу" w:value="КСВ / КСВ: Функция введена в работу"/>
+                  <w:listItem w:displayText="КСВ / КСВ: Функция оперативно выведена из работы" w:value="КСВ / КСВ: Функция оперативно выведена из работы"/>
                   <w:listItem w:displayText="ЛЗШ / ЛЗШ: Обнаружение неисправности" w:value="ЛЗШ / ЛЗШ: Обнаружение неисправности"/>
                   <w:listItem w:displayText="ЛЗШ / ЛЗШ: Пуск" w:value="ЛЗШ / ЛЗШ: Пуск"/>
                   <w:listItem w:displayText="ЛЗШ / ЛЗШ: Пуск ИО тока по фазе B" w:value="ЛЗШ / ЛЗШ: Пуск ИО тока по фазе B"/>
@@ -5516,6 +6988,57 @@
                   <w:listItem w:displayText="МТЗ / ОНМ: Пуск по фазе C" w:value="МТЗ / ОНМ: Пуск по фазе C"/>
                   <w:listItem w:displayText="МТЗ / ОНМ: Пуск по фазе А" w:value="МТЗ / ОНМ: Пуск по фазе А"/>
                   <w:listItem w:displayText="МТЗ / ОУ МТЗ: Срабатывание" w:value="МТЗ / ОУ МТЗ: Срабатывание"/>
+                  <w:listItem w:displayText="ПДС / В: Поведение местного управления" w:value="ПДС / В: Поведение местного управления"/>
+                  <w:listItem w:displayText="ПДС / В: Положение ключа режима управления" w:value="ПДС / В: Положение ключа режима управления"/>
+                  <w:listItem w:displayText="ПДС / В: Положение ключа режима управления привода В" w:value="ПДС / В: Положение ключа режима управления привода В"/>
+                  <w:listItem w:displayText="ПДС / В: Право переключения на уровне станции" w:value="ПДС / В: Право переключения на уровне станции"/>
+                  <w:listItem w:displayText="ПДС / ВЭ1: Поведение местного управления" w:value="ПДС / ВЭ1: Поведение местного управления"/>
+                  <w:listItem w:displayText="ПДС / ВЭ1: Положение ключа режима управления" w:value="ПДС / ВЭ1: Положение ключа режима управления"/>
+                  <w:listItem w:displayText="ПДС / ВЭ1: Право переключения на уровне станции" w:value="ПДС / ВЭ1: Право переключения на уровне станции"/>
+                  <w:listItem w:displayText="ПДС / ВЭ1: Ремонтное положение коммутационного аппарата" w:value="ПДС / ВЭ1: Ремонтное положение коммутационного аппарата"/>
+                  <w:listItem w:displayText="ПДС / ВЭ2: Поведение местного управления" w:value="ПДС / ВЭ2: Поведение местного управления"/>
+                  <w:listItem w:displayText="ПДС / ВЭ2: Положение ключа режима управления" w:value="ПДС / ВЭ2: Положение ключа режима управления"/>
+                  <w:listItem w:displayText="ПДС / ВЭ2: Право переключения на уровне станции" w:value="ПДС / ВЭ2: Право переключения на уровне станции"/>
+                  <w:listItem w:displayText="ПДС / ВЭ2: Ремонтное положение коммутационного аппарата" w:value="ПДС / ВЭ2: Ремонтное положение коммутационного аппарата"/>
+                  <w:listItem w:displayText="ПДС / ЗН: Поведение местного управления" w:value="ПДС / ЗН: Поведение местного управления"/>
+                  <w:listItem w:displayText="ПДС / ЗН: Положение ключа режима управления" w:value="ПДС / ЗН: Положение ключа режима управления"/>
+                  <w:listItem w:displayText="ПДС / ЗН: Право переключения на уровне станции" w:value="ПДС / ЗН: Право переключения на уровне станции"/>
+                  <w:listItem w:displayText="ПДС / КИ: Аварийный уровень изоляции" w:value="ПДС / КИ: Аварийный уровень изоляции"/>
+                  <w:listItem w:displayText="ПДС / КИ: Низкий уровень изоляции" w:value="ПДС / КИ: Низкий уровень изоляции"/>
+                  <w:listItem w:displayText="ПДС / КПруж: Пружина не заведена" w:value="ПДС / КПруж: Пружина не заведена"/>
+                  <w:listItem w:displayText="ПДС / КЦВ: Контроль цепи ЭМВ" w:value="ПДС / КЦВ: Контроль цепи ЭМВ"/>
+                  <w:listItem w:displayText="ПДС / КЦВ: Контроль цепи ЭМО1" w:value="ПДС / КЦВ: Контроль цепи ЭМО1"/>
+                  <w:listItem w:displayText="ПДС / КЦВ: Контроль цепи ЭМО2" w:value="ПДС / КЦВ: Контроль цепи ЭМО2"/>
+                  <w:listItem w:displayText="ПДС / КЦВ: Работа ЭМВ" w:value="ПДС / КЦВ: Работа ЭМВ"/>
+                  <w:listItem w:displayText="ПДС / КЦВ: Работа ЭМО1" w:value="ПДС / КЦВ: Работа ЭМО1"/>
+                  <w:listItem w:displayText="ПДС / КЦВ: Работа ЭМО2" w:value="ПДС / КЦВ: Работа ЭМО2"/>
+                  <w:listItem w:displayText="ПДС / ПДС: Функция введена в работу" w:value="ПДС / ПДС: Функция введена в работу"/>
+                  <w:listItem w:displayText="ПДС / ПДС: Функция оперативно выведена из работы" w:value="ПДС / ПДС: Функция оперативно выведена из работы"/>
+                  <w:listItem w:displayText="ПДС НКУ / SA1: Цепь управления введена" w:value="ПДС НКУ / SA1: Цепь управления введена"/>
+                  <w:listItem w:displayText="ПДС НКУ / SA2: Цепь управления введена" w:value="ПДС НКУ / SA2: Цепь управления введена"/>
+                  <w:listItem w:displayText="ПДС НКУ / SA3: Цепь управления введена" w:value="ПДС НКУ / SA3: Цепь управления введена"/>
+                  <w:listItem w:displayText="ПДС НКУ / SA4: Цепь управления введена" w:value="ПДС НКУ / SA4: Цепь управления введена"/>
+                  <w:listItem w:displayText="ПДС НКУ / SG1: Рабочее положение испытательного блока" w:value="ПДС НКУ / SG1: Рабочее положение испытательного блока"/>
+                  <w:listItem w:displayText="ПДС НКУ / SG2: Рабочее положение испытательного блока" w:value="ПДС НКУ / SG2: Рабочее положение испытательного блока"/>
+                  <w:listItem w:displayText="ПДС НКУ / SG3: Рабочее положение испытательного блока" w:value="ПДС НКУ / SG3: Рабочее положение испытательного блока"/>
+                  <w:listItem w:displayText="ПДС НКУ / Дверь: Дверь отсека/ шкафа закрыта" w:value="ПДС НКУ / Дверь: Дверь отсека/ шкафа закрыта"/>
+                  <w:listItem w:displayText="ПДС НКУ / Дверь: Дверь отсека/ шкафа открыта" w:value="ПДС НКУ / Дверь: Дверь отсека/ шкафа открыта"/>
+                  <w:listItem w:displayText="ПДС НКУ / ОТ ОБР 1: Неисправность оперативного тока цепей ОБР 1" w:value="ПДС НКУ / ОТ ОБР 1: Неисправность оперативного тока цепей ОБР 1"/>
+                  <w:listItem w:displayText="ПДС НКУ / ОТ ОБР 2: Неисправность оперативного тока цепей ОБР 2" w:value="ПДС НКУ / ОТ ОБР 2: Неисправность оперативного тока цепей ОБР 2"/>
+                  <w:listItem w:displayText="ПДС НКУ / ОТ ЦСВ: Неисправность ОТ цепей сигнализации В" w:value="ПДС НКУ / ОТ ЦСВ: Неисправность ОТ цепей сигнализации В"/>
+                  <w:listItem w:displayText="ПДС НКУ / ОТ ЭМО1, ЭМВ: Неисправность оперативного тока цепей ЭМВ, ЭМО1" w:value="ПДС НКУ / ОТ ЭМО1, ЭМВ: Неисправность оперативного тока цепей ЭМВ, ЭМО1"/>
+                  <w:listItem w:displayText="ПДС НКУ / ОТ ЭМО2: Неисправность оперативного тока цепей ЭМО2" w:value="ПДС НКУ / ОТ ЭМО2: Неисправность оперативного тока цепей ЭМО2"/>
+                  <w:listItem w:displayText="ПДС НКУ / ПДС НКУ: Функция введена в работу" w:value="ПДС НКУ / ПДС НКУ: Функция введена в работу"/>
+                  <w:listItem w:displayText="ПДС НКУ / ПДС НКУ: Функция оперативно выведена из работы" w:value="ПДС НКУ / ПДС НКУ: Функция оперативно выведена из работы"/>
+                  <w:listItem w:displayText="ПДС НКУ / Пер.ав.дебл.см.яч.: Цепи аварийной деблокировки ячейки выведены" w:value="ПДС НКУ / Пер.ав.дебл.см.яч.: Цепи аварийной деблокировки ячейки выведены"/>
+                  <w:listItem w:displayText="ПС / ПС: Пуск предупредительной сигнализации" w:value="ПС / ПС: Пуск предупредительной сигнализации"/>
+                  <w:listItem w:displayText="ПС / ПС: Пуск предупредительной сигнализации (импульс)" w:value="ПС / ПС: Пуск предупредительной сигнализации (импульс)"/>
+                  <w:listItem w:displayText="СС / СС: БИ выведены" w:value="СС / СС: БИ выведены"/>
+                  <w:listItem w:displayText="СС / СС: Выходные цепи разобраны" w:value="СС / СС: Выходные цепи разобраны"/>
+                  <w:listItem w:displayText="СС / СС: Неисправность КА" w:value="СС / СС: Неисправность КА"/>
+                  <w:listItem w:displayText="СС / СС: Общий внешний сигнал" w:value="СС / СС: Общий внешний сигнал"/>
+                  <w:listItem w:displayText="СС / СС: Превышение времени переключения КА" w:value="СС / СС: Превышение времени переключения КА"/>
+                  <w:listItem w:displayText="СС / СС: Сигнализация цепей опер.тока" w:value="СС / СС: Сигнализация цепей опер.тока"/>
                   <w:listItem w:displayText="ТЗНП / АУ ТЗНП: Пуск автоматического ускорения ТЗНП" w:value="ТЗНП / АУ ТЗНП: Пуск автоматического ускорения ТЗНП"/>
                   <w:listItem w:displayText="ТЗНП / БНТ НП: Пуск БНТ НП" w:value="ТЗНП / БНТ НП: Пуск БНТ НП"/>
                   <w:listItem w:displayText="ТЗНП / БЧС: Блокировка чувствительных ступеней" w:value="ТЗНП / БЧС: Блокировка чувствительных ступеней"/>
@@ -5555,6 +7078,11 @@
                   <w:listItem w:displayText="ТК ЗДЗ / ТК ЗДЗ: Пуск ИО тока" w:value="ТК ЗДЗ / ТК ЗДЗ: Пуск ИО тока"/>
                   <w:listItem w:displayText="ТК ЗДЗ / ТК ЗДЗ: Функция введена в работу" w:value="ТК ЗДЗ / ТК ЗДЗ: Функция введена в работу"/>
                   <w:listItem w:displayText="ТК ЗДЗ / ТК ЗДЗ: Функция оперативно выведена из работы" w:value="ТК ЗДЗ / ТК ЗДЗ: Функция оперативно выведена из работы"/>
+                  <w:listItem w:displayText="УВ / УВ: Включение с контролем синхронизма" w:value="УВ / УВ: Включение с контролем синхронизма"/>
+                  <w:listItem w:displayText="УВ / УВ: Включить выключатель" w:value="УВ / УВ: Включить выключатель"/>
+                  <w:listItem w:displayText="УВ / УВ: Задержка включения с контролем синхронизма" w:value="УВ / УВ: Задержка включения с контролем синхронизма"/>
+                  <w:listItem w:displayText="УВ / УВ: Функция введена в работу" w:value="УВ / УВ: Функция введена в работу"/>
+                  <w:listItem w:displayText="УВ / УВ: Функция оперативно выведена из работы" w:value="УВ / УВ: Функция оперативно выведена из работы"/>
                   <w:listItem w:displayText="УРОВ / УРОВ: Пуск" w:value="УРОВ / УРОВ: Пуск"/>
                   <w:listItem w:displayText="УРОВ / УРОВ: Пуск ИО максимального тока" w:value="УРОВ / УРОВ: Пуск ИО максимального тока"/>
                   <w:listItem w:displayText="УРОВ / УРОВ: Срабатывание" w:value="УРОВ / УРОВ: Срабатывание"/>
@@ -5870,6 +7398,38 @@
                   <w:listItem w:displayText="ЗОП / ЗОП: Срабатывание на сигнал" w:value="ЗОП / ЗОП: Срабатывание на сигнал"/>
                   <w:listItem w:displayText="ЗОП / ЗОП: Функция введена в работу" w:value="ЗОП / ЗОП: Функция введена в работу"/>
                   <w:listItem w:displayText="ЗОП / ЗОП: Функция оперативно выведена из работы" w:value="ЗОП / ЗОП: Функция оперативно выведена из работы"/>
+                  <w:listItem w:displayText="КА / В: Выключатель включен" w:value="КА / В: Выключатель включен"/>
+                  <w:listItem w:displayText="КА / В: Выключатель отключен" w:value="КА / В: Выключатель отключен"/>
+                  <w:listItem w:displayText="КА / В: Команда «включить» выключатель через выходное реле" w:value="КА / В: Команда «включить» выключатель через выходное реле"/>
+                  <w:listItem w:displayText="КА / В: Команда «отключить» выключатель через выходное реле" w:value="КА / В: Команда «отключить» выключатель через выходное реле"/>
+                  <w:listItem w:displayText="КА / В: Неисправное положение выключателя" w:value="КА / В: Неисправное положение выключателя"/>
+                  <w:listItem w:displayText="КА / В: Промежуточное положение выключателя" w:value="КА / В: Промежуточное положение выключателя"/>
+                  <w:listItem w:displayText="КА / В: Функция введена в работу" w:value="КА / В: Функция введена в работу"/>
+                  <w:listItem w:displayText="КА / ВЭ1: Команда «вкатить» выкатной элемент через выходное реле" w:value="КА / ВЭ1: Команда «вкатить» выкатной элемент через выходное реле"/>
+                  <w:listItem w:displayText="КА / ВЭ1: Команда «выкатить» выкатной элемент через выходное реле" w:value="КА / ВЭ1: Команда «выкатить» выкатной элемент через выходное реле"/>
+                  <w:listItem w:displayText="КА / ВЭ1: Неисправное положение выкатного элемента" w:value="КА / ВЭ1: Неисправное положение выкатного элемента"/>
+                  <w:listItem w:displayText="КА / ВЭ1: Положение выкатного элемента «Вкачен»" w:value="КА / ВЭ1: Положение выкатного элемента «Вкачен»"/>
+                  <w:listItem w:displayText="КА / ВЭ1: Положение выкатного элемента «Выкачен»" w:value="КА / ВЭ1: Положение выкатного элемента «Выкачен»"/>
+                  <w:listItem w:displayText="КА / ВЭ1: Промежуточное положение выкатного элемента" w:value="КА / ВЭ1: Промежуточное положение выкатного элемента"/>
+                  <w:listItem w:displayText="КА / ВЭ1: Ремонтное положение выкатного элемента" w:value="КА / ВЭ1: Ремонтное положение выкатного элемента"/>
+                  <w:listItem w:displayText="КА / ВЭ1: Функция введена в работу" w:value="КА / ВЭ1: Функция введена в работу"/>
+                  <w:listItem w:displayText="КА / ВЭ2: Команда «вкатить» выкатной элемент через выходное реле" w:value="КА / ВЭ2: Команда «вкатить» выкатной элемент через выходное реле"/>
+                  <w:listItem w:displayText="КА / ВЭ2: Команда «выкатить» выкатной элемент через выходное реле" w:value="КА / ВЭ2: Команда «выкатить» выкатной элемент через выходное реле"/>
+                  <w:listItem w:displayText="КА / ВЭ2: Неисправное положение выкатного элемента" w:value="КА / ВЭ2: Неисправное положение выкатного элемента"/>
+                  <w:listItem w:displayText="КА / ВЭ2: Положение выкатного элемента «Вкачен»" w:value="КА / ВЭ2: Положение выкатного элемента «Вкачен»"/>
+                  <w:listItem w:displayText="КА / ВЭ2: Положение выкатного элемента «Выкачен»" w:value="КА / ВЭ2: Положение выкатного элемента «Выкачен»"/>
+                  <w:listItem w:displayText="КА / ВЭ2: Промежуточное положение выкатного элемента" w:value="КА / ВЭ2: Промежуточное положение выкатного элемента"/>
+                  <w:listItem w:displayText="КА / ВЭ2: Ремонтное положение выкатного элемента" w:value="КА / ВЭ2: Ремонтное положение выкатного элемента"/>
+                  <w:listItem w:displayText="КА / ВЭ2: Функция введена в работу" w:value="КА / ВЭ2: Функция введена в работу"/>
+                  <w:listItem w:displayText="КА / ЗН: Заземляющий нож включен" w:value="КА / ЗН: Заземляющий нож включен"/>
+                  <w:listItem w:displayText="КА / ЗН: Заземляющий нож отключен" w:value="КА / ЗН: Заземляющий нож отключен"/>
+                  <w:listItem w:displayText="КА / ЗН: Команда «включить» заземляющий нож через выходное реле" w:value="КА / ЗН: Команда «включить» заземляющий нож через выходное реле"/>
+                  <w:listItem w:displayText="КА / ЗН: Команда «отключить» заземляющий нож через выходное реле" w:value="КА / ЗН: Команда «отключить» заземляющий нож через выходное реле"/>
+                  <w:listItem w:displayText="КА / ЗН: Неисправное положение заземляющего ножа" w:value="КА / ЗН: Неисправное положение заземляющего ножа"/>
+                  <w:listItem w:displayText="КА / ЗН: Промежуточное положение заземляющего ножа" w:value="КА / ЗН: Промежуточное положение заземляющего ножа"/>
+                  <w:listItem w:displayText="КА / ЗН: Функция введена в работу" w:value="КА / ЗН: Функция введена в работу"/>
+                  <w:listItem w:displayText="КА / КА: Функция введена в работу" w:value="КА / КА: Функция введена в работу"/>
+                  <w:listItem w:displayText="КА / КА: Функция оперативно выведена из работы" w:value="КА / КА: Функция оперативно выведена из работы"/>
                   <w:listItem w:displayText="КНН 1сш / КНН 1сш: Пуск" w:value="КНН 1сш / КНН 1сш: Пуск"/>
                   <w:listItem w:displayText="КНН 1сш / КНН 1сш: Пуск ИО напряжения" w:value="КНН 1сш / КНН 1сш: Пуск ИО напряжения"/>
                   <w:listItem w:displayText="КНН 1сш / КНН 1сш: Пуск ИО напряжения ОП" w:value="КНН 1сш / КНН 1сш: Пуск ИО напряжения ОП"/>
@@ -5890,6 +7450,68 @@
                   <w:listItem w:displayText="КОН 2сш / КОН 2сш: Пуск ИО напряжения ОП" w:value="КОН 2сш / КОН 2сш: Пуск ИО напряжения ОП"/>
                   <w:listItem w:displayText="КОН 2сш / КОН 2сш: Функция введена в работу" w:value="КОН 2сш / КОН 2сш: Функция введена в работу"/>
                   <w:listItem w:displayText="КОН 2сш / КОН 2сш: Функция оперативно выведена из работы" w:value="КОН 2сш / КОН 2сш: Функция оперативно выведена из работы"/>
+                  <w:listItem w:displayText="КП / КП: Идет переключение" w:value="КП / КП: Идет переключение"/>
+                  <w:listItem w:displayText="КП / КП: Функция введена в работу" w:value="КП / КП: Функция введена в работу"/>
+                  <w:listItem w:displayText="КП / КП: Функция оперативно выведена из работы" w:value="КП / КП: Функция оперативно выведена из работы"/>
+                  <w:listItem w:displayText="КП / ОБР В: Блокировка включения" w:value="КП / ОБР В: Блокировка включения"/>
+                  <w:listItem w:displayText="КП / ОБР В: Разрешить включение" w:value="КП / ОБР В: Разрешить включение"/>
+                  <w:listItem w:displayText="КП / ОБР ВЭ1: Разрешение управления первым выкатным элементом" w:value="КП / ОБР ВЭ1: Разрешение управления первым выкатным элементом"/>
+                  <w:listItem w:displayText="КП / ОБР ВЭ2: Разрешение управления вторым выкатным элементом" w:value="КП / ОБР ВЭ2: Разрешение управления вторым выкатным элементом"/>
+                  <w:listItem w:displayText="КП / ОБР ЗН: Разрешение управления заземляющим ножом" w:value="КП / ОБР ЗН: Разрешение управления заземляющим ножом"/>
+                  <w:listItem w:displayText="КП / УВ: Включение с контролем синхронизма" w:value="КП / УВ: Включение с контролем синхронизма"/>
+                  <w:listItem w:displayText="КП / УВ: Включить выключатель" w:value="КП / УВ: Включить выключатель"/>
+                  <w:listItem w:displayText="КП / УВ: Задержка включения с контролем синхронизма" w:value="КП / УВ: Задержка включения с контролем синхронизма"/>
+                  <w:listItem w:displayText="КП / УВ: Идет переключение" w:value="КП / УВ: Идет переключение"/>
+                  <w:listItem w:displayText="КП / УВ: Отключить выключатель" w:value="КП / УВ: Отключить выключатель"/>
+                  <w:listItem w:displayText="КП / УВ: Поведение местного управления" w:value="КП / УВ: Поведение местного управления"/>
+                  <w:listItem w:displayText="КП / УВ: Положение В (Включено)" w:value="КП / УВ: Положение В (Включено)"/>
+                  <w:listItem w:displayText="КП / УВ: Положение В (Не определено)" w:value="КП / УВ: Положение В (Не определено)"/>
+                  <w:listItem w:displayText="КП / УВ: Положение В (Неисправность)" w:value="КП / УВ: Положение В (Неисправность)"/>
+                  <w:listItem w:displayText="КП / УВ: Положение В (Отключено)" w:value="КП / УВ: Положение В (Отключено)"/>
+                  <w:listItem w:displayText="КП / УВ: Положение ключа режима управления" w:value="КП / УВ: Положение ключа режима управления"/>
+                  <w:listItem w:displayText="КП / УВ: Право переключения на уровне станции" w:value="КП / УВ: Право переключения на уровне станции"/>
+                  <w:listItem w:displayText="КП / УВ: Сигнал превышения допустимого времени переключения" w:value="КП / УВ: Сигнал превышения допустимого времени переключения"/>
+                  <w:listItem w:displayText="КП / УВ: Функция введена в работу" w:value="КП / УВ: Функция введена в работу"/>
+                  <w:listItem w:displayText="КП / УВЭ1: Вкатить первый выкатной элемент" w:value="КП / УВЭ1: Вкатить первый выкатной элемент"/>
+                  <w:listItem w:displayText="КП / УВЭ1: Выкатить первый выкатной элемент" w:value="КП / УВЭ1: Выкатить первый выкатной элемент"/>
+                  <w:listItem w:displayText="КП / УВЭ1: Идет переключение" w:value="КП / УВЭ1: Идет переключение"/>
+                  <w:listItem w:displayText="КП / УВЭ1: Поведение местного управления" w:value="КП / УВЭ1: Поведение местного управления"/>
+                  <w:listItem w:displayText="КП / УВЭ1: Положение ВЭ1 (Вкачен)" w:value="КП / УВЭ1: Положение ВЭ1 (Вкачен)"/>
+                  <w:listItem w:displayText="КП / УВЭ1: Положение ВЭ1 (Выкачен)" w:value="КП / УВЭ1: Положение ВЭ1 (Выкачен)"/>
+                  <w:listItem w:displayText="КП / УВЭ1: Положение ВЭ1 (Не определено)" w:value="КП / УВЭ1: Положение ВЭ1 (Не определено)"/>
+                  <w:listItem w:displayText="КП / УВЭ1: Положение ВЭ1 (Неисправность)" w:value="КП / УВЭ1: Положение ВЭ1 (Неисправность)"/>
+                  <w:listItem w:displayText="КП / УВЭ1: Положение ключа режима управления" w:value="КП / УВЭ1: Положение ключа режима управления"/>
+                  <w:listItem w:displayText="КП / УВЭ1: Право переключения на уровне станции" w:value="КП / УВЭ1: Право переключения на уровне станции"/>
+                  <w:listItem w:displayText="КП / УВЭ1: Сигнал превышения допустимого времени переключения" w:value="КП / УВЭ1: Сигнал превышения допустимого времени переключения"/>
+                  <w:listItem w:displayText="КП / УВЭ1: Функция введена в работу" w:value="КП / УВЭ1: Функция введена в работу"/>
+                  <w:listItem w:displayText="КП / УВЭ2: Вкатить второй выкатной элемент" w:value="КП / УВЭ2: Вкатить второй выкатной элемент"/>
+                  <w:listItem w:displayText="КП / УВЭ2: Выкатить второй выкатной элемент" w:value="КП / УВЭ2: Выкатить второй выкатной элемент"/>
+                  <w:listItem w:displayText="КП / УВЭ2: Идет переключение" w:value="КП / УВЭ2: Идет переключение"/>
+                  <w:listItem w:displayText="КП / УВЭ2: Поведение местного управления" w:value="КП / УВЭ2: Поведение местного управления"/>
+                  <w:listItem w:displayText="КП / УВЭ2: Положение ВЭ2 (Вкачен)" w:value="КП / УВЭ2: Положение ВЭ2 (Вкачен)"/>
+                  <w:listItem w:displayText="КП / УВЭ2: Положение ВЭ2 (Выкачен)" w:value="КП / УВЭ2: Положение ВЭ2 (Выкачен)"/>
+                  <w:listItem w:displayText="КП / УВЭ2: Положение ВЭ2 (Не определено)" w:value="КП / УВЭ2: Положение ВЭ2 (Не определено)"/>
+                  <w:listItem w:displayText="КП / УВЭ2: Положение ВЭ2 (Неисправность)" w:value="КП / УВЭ2: Положение ВЭ2 (Неисправность)"/>
+                  <w:listItem w:displayText="КП / УВЭ2: Положение ключа режима управления" w:value="КП / УВЭ2: Положение ключа режима управления"/>
+                  <w:listItem w:displayText="КП / УВЭ2: Право переключения на уровне станции" w:value="КП / УВЭ2: Право переключения на уровне станции"/>
+                  <w:listItem w:displayText="КП / УВЭ2: Сигнал превышения допустимого времени переключения" w:value="КП / УВЭ2: Сигнал превышения допустимого времени переключения"/>
+                  <w:listItem w:displayText="КП / УВЭ2: Функция введена в работу" w:value="КП / УВЭ2: Функция введена в работу"/>
+                  <w:listItem w:displayText="КП / УЗН: Включить заземляющий нож" w:value="КП / УЗН: Включить заземляющий нож"/>
+                  <w:listItem w:displayText="КП / УЗН: Идет переключение" w:value="КП / УЗН: Идет переключение"/>
+                  <w:listItem w:displayText="КП / УЗН: Отключить заземляющий нож" w:value="КП / УЗН: Отключить заземляющий нож"/>
+                  <w:listItem w:displayText="КП / УЗН: Поведение местного управления" w:value="КП / УЗН: Поведение местного управления"/>
+                  <w:listItem w:displayText="КП / УЗН: Положение ЗН (Включено)" w:value="КП / УЗН: Положение ЗН (Включено)"/>
+                  <w:listItem w:displayText="КП / УЗН: Положение ЗН (Не определено)" w:value="КП / УЗН: Положение ЗН (Не определено)"/>
+                  <w:listItem w:displayText="КП / УЗН: Положение ЗН (Неисправность)" w:value="КП / УЗН: Положение ЗН (Неисправность)"/>
+                  <w:listItem w:displayText="КП / УЗН: Положение ЗН (Отключено)" w:value="КП / УЗН: Положение ЗН (Отключено)"/>
+                  <w:listItem w:displayText="КП / УЗН: Положение ключа режима управления" w:value="КП / УЗН: Положение ключа режима управления"/>
+                  <w:listItem w:displayText="КП / УЗН: Право переключения на уровне станции" w:value="КП / УЗН: Право переключения на уровне станции"/>
+                  <w:listItem w:displayText="КП / УЗН: Сигнал превышения допустимого времени переключения" w:value="КП / УЗН: Сигнал превышения допустимого времени переключения"/>
+                  <w:listItem w:displayText="КП / УЗН: Функция введена в работу" w:value="КП / УЗН: Функция введена в работу"/>
+                  <w:listItem w:displayText="КРВ / КРВ: Превышен коммутационный ресурс выключателя" w:value="КРВ / КРВ: Превышен коммутационный ресурс выключателя"/>
+                  <w:listItem w:displayText="КРВ / КРВ: Превышен механический ресурс выключателя" w:value="КРВ / КРВ: Превышен механический ресурс выключателя"/>
+                  <w:listItem w:displayText="КРВ / КРВ: Превышен ресурс выключателя" w:value="КРВ / КРВ: Превышен ресурс выключателя"/>
+                  <w:listItem w:displayText="КРВ / КРВ: Функция введена в работу" w:value="КРВ / КРВ: Функция введена в работу"/>
                   <w:listItem w:displayText="КС / КС: Блокировка по скорости изменения частоты" w:value="КС / КС: Блокировка по скорости изменения частоты"/>
                   <w:listItem w:displayText="КС / КС: Нет условий по напряжению" w:value="КС / КС: Нет условий по напряжению"/>
                   <w:listItem w:displayText="КС / КС: Нет условий по углу" w:value="КС / КС: Нет условий по углу"/>
@@ -5902,6 +7524,18 @@
                   <w:listItem w:displayText="КС / КС: Разрешение оперативного включения" w:value="КС / КС: Разрешение оперативного включения"/>
                   <w:listItem w:displayText="КС / КС: Функция введена в работу" w:value="КС / КС: Функция введена в работу"/>
                   <w:listItem w:displayText="КС / КС: Функция оперативно выведена из работы" w:value="КС / КС: Функция оперативно выведена из работы"/>
+                  <w:listItem w:displayText="КСВ / КСВ: Блокировка включения В" w:value="КСВ / КСВ: Блокировка включения В"/>
+                  <w:listItem w:displayText="КСВ / КСВ: Блокировка отключения В" w:value="КСВ / КСВ: Блокировка отключения В"/>
+                  <w:listItem w:displayText="КСВ / КСВ: В аварийно отключен" w:value="КСВ / КСВ: В аварийно отключен"/>
+                  <w:listItem w:displayText="КСВ / КСВ: В самопроизвольно отключен" w:value="КСВ / КСВ: В самопроизвольно отключен"/>
+                  <w:listItem w:displayText="КСВ / КСВ: Защита ЭМВ" w:value="КСВ / КСВ: Защита ЭМВ"/>
+                  <w:listItem w:displayText="КСВ / КСВ: Защита ЭМО1" w:value="КСВ / КСВ: Защита ЭМО1"/>
+                  <w:listItem w:displayText="КСВ / КСВ: Защита ЭМО2" w:value="КСВ / КСВ: Защита ЭМО2"/>
+                  <w:listItem w:displayText="КСВ / КСВ: Неисправность В" w:value="КСВ / КСВ: Неисправность В"/>
+                  <w:listItem w:displayText="КСВ / КСВ: Неисправность цепей ЭМУ" w:value="КСВ / КСВ: Неисправность цепей ЭМУ"/>
+                  <w:listItem w:displayText="КСВ / КСВ: Реле фиксации команды" w:value="КСВ / КСВ: Реле фиксации команды"/>
+                  <w:listItem w:displayText="КСВ / КСВ: Функция введена в работу" w:value="КСВ / КСВ: Функция введена в работу"/>
+                  <w:listItem w:displayText="КСВ / КСВ: Функция оперативно выведена из работы" w:value="КСВ / КСВ: Функция оперативно выведена из работы"/>
                   <w:listItem w:displayText="ЛЗШ / ЛЗШ: Обнаружение неисправности" w:value="ЛЗШ / ЛЗШ: Обнаружение неисправности"/>
                   <w:listItem w:displayText="ЛЗШ / ЛЗШ: Пуск" w:value="ЛЗШ / ЛЗШ: Пуск"/>
                   <w:listItem w:displayText="ЛЗШ / ЛЗШ: Пуск ИО тока по фазе B" w:value="ЛЗШ / ЛЗШ: Пуск ИО тока по фазе B"/>
@@ -5994,6 +7628,57 @@
                   <w:listItem w:displayText="МТЗ / ОНМ: Пуск по фазе C" w:value="МТЗ / ОНМ: Пуск по фазе C"/>
                   <w:listItem w:displayText="МТЗ / ОНМ: Пуск по фазе А" w:value="МТЗ / ОНМ: Пуск по фазе А"/>
                   <w:listItem w:displayText="МТЗ / ОУ МТЗ: Срабатывание" w:value="МТЗ / ОУ МТЗ: Срабатывание"/>
+                  <w:listItem w:displayText="ПДС / В: Поведение местного управления" w:value="ПДС / В: Поведение местного управления"/>
+                  <w:listItem w:displayText="ПДС / В: Положение ключа режима управления" w:value="ПДС / В: Положение ключа режима управления"/>
+                  <w:listItem w:displayText="ПДС / В: Положение ключа режима управления привода В" w:value="ПДС / В: Положение ключа режима управления привода В"/>
+                  <w:listItem w:displayText="ПДС / В: Право переключения на уровне станции" w:value="ПДС / В: Право переключения на уровне станции"/>
+                  <w:listItem w:displayText="ПДС / ВЭ1: Поведение местного управления" w:value="ПДС / ВЭ1: Поведение местного управления"/>
+                  <w:listItem w:displayText="ПДС / ВЭ1: Положение ключа режима управления" w:value="ПДС / ВЭ1: Положение ключа режима управления"/>
+                  <w:listItem w:displayText="ПДС / ВЭ1: Право переключения на уровне станции" w:value="ПДС / ВЭ1: Право переключения на уровне станции"/>
+                  <w:listItem w:displayText="ПДС / ВЭ1: Ремонтное положение коммутационного аппарата" w:value="ПДС / ВЭ1: Ремонтное положение коммутационного аппарата"/>
+                  <w:listItem w:displayText="ПДС / ВЭ2: Поведение местного управления" w:value="ПДС / ВЭ2: Поведение местного управления"/>
+                  <w:listItem w:displayText="ПДС / ВЭ2: Положение ключа режима управления" w:value="ПДС / ВЭ2: Положение ключа режима управления"/>
+                  <w:listItem w:displayText="ПДС / ВЭ2: Право переключения на уровне станции" w:value="ПДС / ВЭ2: Право переключения на уровне станции"/>
+                  <w:listItem w:displayText="ПДС / ВЭ2: Ремонтное положение коммутационного аппарата" w:value="ПДС / ВЭ2: Ремонтное положение коммутационного аппарата"/>
+                  <w:listItem w:displayText="ПДС / ЗН: Поведение местного управления" w:value="ПДС / ЗН: Поведение местного управления"/>
+                  <w:listItem w:displayText="ПДС / ЗН: Положение ключа режима управления" w:value="ПДС / ЗН: Положение ключа режима управления"/>
+                  <w:listItem w:displayText="ПДС / ЗН: Право переключения на уровне станции" w:value="ПДС / ЗН: Право переключения на уровне станции"/>
+                  <w:listItem w:displayText="ПДС / КИ: Аварийный уровень изоляции" w:value="ПДС / КИ: Аварийный уровень изоляции"/>
+                  <w:listItem w:displayText="ПДС / КИ: Низкий уровень изоляции" w:value="ПДС / КИ: Низкий уровень изоляции"/>
+                  <w:listItem w:displayText="ПДС / КПруж: Пружина не заведена" w:value="ПДС / КПруж: Пружина не заведена"/>
+                  <w:listItem w:displayText="ПДС / КЦВ: Контроль цепи ЭМВ" w:value="ПДС / КЦВ: Контроль цепи ЭМВ"/>
+                  <w:listItem w:displayText="ПДС / КЦВ: Контроль цепи ЭМО1" w:value="ПДС / КЦВ: Контроль цепи ЭМО1"/>
+                  <w:listItem w:displayText="ПДС / КЦВ: Контроль цепи ЭМО2" w:value="ПДС / КЦВ: Контроль цепи ЭМО2"/>
+                  <w:listItem w:displayText="ПДС / КЦВ: Работа ЭМВ" w:value="ПДС / КЦВ: Работа ЭМВ"/>
+                  <w:listItem w:displayText="ПДС / КЦВ: Работа ЭМО1" w:value="ПДС / КЦВ: Работа ЭМО1"/>
+                  <w:listItem w:displayText="ПДС / КЦВ: Работа ЭМО2" w:value="ПДС / КЦВ: Работа ЭМО2"/>
+                  <w:listItem w:displayText="ПДС / ПДС: Функция введена в работу" w:value="ПДС / ПДС: Функция введена в работу"/>
+                  <w:listItem w:displayText="ПДС / ПДС: Функция оперативно выведена из работы" w:value="ПДС / ПДС: Функция оперативно выведена из работы"/>
+                  <w:listItem w:displayText="ПДС НКУ / SA1: Цепь управления введена" w:value="ПДС НКУ / SA1: Цепь управления введена"/>
+                  <w:listItem w:displayText="ПДС НКУ / SA2: Цепь управления введена" w:value="ПДС НКУ / SA2: Цепь управления введена"/>
+                  <w:listItem w:displayText="ПДС НКУ / SA3: Цепь управления введена" w:value="ПДС НКУ / SA3: Цепь управления введена"/>
+                  <w:listItem w:displayText="ПДС НКУ / SA4: Цепь управления введена" w:value="ПДС НКУ / SA4: Цепь управления введена"/>
+                  <w:listItem w:displayText="ПДС НКУ / SG1: Рабочее положение испытательного блока" w:value="ПДС НКУ / SG1: Рабочее положение испытательного блока"/>
+                  <w:listItem w:displayText="ПДС НКУ / SG2: Рабочее положение испытательного блока" w:value="ПДС НКУ / SG2: Рабочее положение испытательного блока"/>
+                  <w:listItem w:displayText="ПДС НКУ / SG3: Рабочее положение испытательного блока" w:value="ПДС НКУ / SG3: Рабочее положение испытательного блока"/>
+                  <w:listItem w:displayText="ПДС НКУ / Дверь: Дверь отсека/ шкафа закрыта" w:value="ПДС НКУ / Дверь: Дверь отсека/ шкафа закрыта"/>
+                  <w:listItem w:displayText="ПДС НКУ / Дверь: Дверь отсека/ шкафа открыта" w:value="ПДС НКУ / Дверь: Дверь отсека/ шкафа открыта"/>
+                  <w:listItem w:displayText="ПДС НКУ / ОТ ОБР 1: Неисправность оперативного тока цепей ОБР 1" w:value="ПДС НКУ / ОТ ОБР 1: Неисправность оперативного тока цепей ОБР 1"/>
+                  <w:listItem w:displayText="ПДС НКУ / ОТ ОБР 2: Неисправность оперативного тока цепей ОБР 2" w:value="ПДС НКУ / ОТ ОБР 2: Неисправность оперативного тока цепей ОБР 2"/>
+                  <w:listItem w:displayText="ПДС НКУ / ОТ ЦСВ: Неисправность ОТ цепей сигнализации В" w:value="ПДС НКУ / ОТ ЦСВ: Неисправность ОТ цепей сигнализации В"/>
+                  <w:listItem w:displayText="ПДС НКУ / ОТ ЭМО1, ЭМВ: Неисправность оперативного тока цепей ЭМВ, ЭМО1" w:value="ПДС НКУ / ОТ ЭМО1, ЭМВ: Неисправность оперативного тока цепей ЭМВ, ЭМО1"/>
+                  <w:listItem w:displayText="ПДС НКУ / ОТ ЭМО2: Неисправность оперативного тока цепей ЭМО2" w:value="ПДС НКУ / ОТ ЭМО2: Неисправность оперативного тока цепей ЭМО2"/>
+                  <w:listItem w:displayText="ПДС НКУ / ПДС НКУ: Функция введена в работу" w:value="ПДС НКУ / ПДС НКУ: Функция введена в работу"/>
+                  <w:listItem w:displayText="ПДС НКУ / ПДС НКУ: Функция оперативно выведена из работы" w:value="ПДС НКУ / ПДС НКУ: Функция оперативно выведена из работы"/>
+                  <w:listItem w:displayText="ПДС НКУ / Пер.ав.дебл.см.яч.: Цепи аварийной деблокировки ячейки выведены" w:value="ПДС НКУ / Пер.ав.дебл.см.яч.: Цепи аварийной деблокировки ячейки выведены"/>
+                  <w:listItem w:displayText="ПС / ПС: Пуск предупредительной сигнализации" w:value="ПС / ПС: Пуск предупредительной сигнализации"/>
+                  <w:listItem w:displayText="ПС / ПС: Пуск предупредительной сигнализации (импульс)" w:value="ПС / ПС: Пуск предупредительной сигнализации (импульс)"/>
+                  <w:listItem w:displayText="СС / СС: БИ выведены" w:value="СС / СС: БИ выведены"/>
+                  <w:listItem w:displayText="СС / СС: Выходные цепи разобраны" w:value="СС / СС: Выходные цепи разобраны"/>
+                  <w:listItem w:displayText="СС / СС: Неисправность КА" w:value="СС / СС: Неисправность КА"/>
+                  <w:listItem w:displayText="СС / СС: Общий внешний сигнал" w:value="СС / СС: Общий внешний сигнал"/>
+                  <w:listItem w:displayText="СС / СС: Превышение времени переключения КА" w:value="СС / СС: Превышение времени переключения КА"/>
+                  <w:listItem w:displayText="СС / СС: Сигнализация цепей опер.тока" w:value="СС / СС: Сигнализация цепей опер.тока"/>
                   <w:listItem w:displayText="ТЗНП / АУ ТЗНП: Пуск автоматического ускорения ТЗНП" w:value="ТЗНП / АУ ТЗНП: Пуск автоматического ускорения ТЗНП"/>
                   <w:listItem w:displayText="ТЗНП / БНТ НП: Пуск БНТ НП" w:value="ТЗНП / БНТ НП: Пуск БНТ НП"/>
                   <w:listItem w:displayText="ТЗНП / БЧС: Блокировка чувствительных ступеней" w:value="ТЗНП / БЧС: Блокировка чувствительных ступеней"/>
@@ -6033,6 +7718,11 @@
                   <w:listItem w:displayText="ТК ЗДЗ / ТК ЗДЗ: Пуск ИО тока" w:value="ТК ЗДЗ / ТК ЗДЗ: Пуск ИО тока"/>
                   <w:listItem w:displayText="ТК ЗДЗ / ТК ЗДЗ: Функция введена в работу" w:value="ТК ЗДЗ / ТК ЗДЗ: Функция введена в работу"/>
                   <w:listItem w:displayText="ТК ЗДЗ / ТК ЗДЗ: Функция оперативно выведена из работы" w:value="ТК ЗДЗ / ТК ЗДЗ: Функция оперативно выведена из работы"/>
+                  <w:listItem w:displayText="УВ / УВ: Включение с контролем синхронизма" w:value="УВ / УВ: Включение с контролем синхронизма"/>
+                  <w:listItem w:displayText="УВ / УВ: Включить выключатель" w:value="УВ / УВ: Включить выключатель"/>
+                  <w:listItem w:displayText="УВ / УВ: Задержка включения с контролем синхронизма" w:value="УВ / УВ: Задержка включения с контролем синхронизма"/>
+                  <w:listItem w:displayText="УВ / УВ: Функция введена в работу" w:value="УВ / УВ: Функция введена в работу"/>
+                  <w:listItem w:displayText="УВ / УВ: Функция оперативно выведена из работы" w:value="УВ / УВ: Функция оперативно выведена из работы"/>
                   <w:listItem w:displayText="УРОВ / УРОВ: Пуск" w:value="УРОВ / УРОВ: Пуск"/>
                   <w:listItem w:displayText="УРОВ / УРОВ: Пуск ИО максимального тока" w:value="УРОВ / УРОВ: Пуск ИО максимального тока"/>
                   <w:listItem w:displayText="УРОВ / УРОВ: Срабатывание" w:value="УРОВ / УРОВ: Срабатывание"/>
@@ -6399,6 +8089,38 @@
                   <w:listItem w:displayText="ЗОП / ЗОП: Срабатывание на сигнал" w:value="ЗОП / ЗОП: Срабатывание на сигнал"/>
                   <w:listItem w:displayText="ЗОП / ЗОП: Функция введена в работу" w:value="ЗОП / ЗОП: Функция введена в работу"/>
                   <w:listItem w:displayText="ЗОП / ЗОП: Функция оперативно выведена из работы" w:value="ЗОП / ЗОП: Функция оперативно выведена из работы"/>
+                  <w:listItem w:displayText="КА / В: Выключатель включен" w:value="КА / В: Выключатель включен"/>
+                  <w:listItem w:displayText="КА / В: Выключатель отключен" w:value="КА / В: Выключатель отключен"/>
+                  <w:listItem w:displayText="КА / В: Команда «включить» выключатель через выходное реле" w:value="КА / В: Команда «включить» выключатель через выходное реле"/>
+                  <w:listItem w:displayText="КА / В: Команда «отключить» выключатель через выходное реле" w:value="КА / В: Команда «отключить» выключатель через выходное реле"/>
+                  <w:listItem w:displayText="КА / В: Неисправное положение выключателя" w:value="КА / В: Неисправное положение выключателя"/>
+                  <w:listItem w:displayText="КА / В: Промежуточное положение выключателя" w:value="КА / В: Промежуточное положение выключателя"/>
+                  <w:listItem w:displayText="КА / В: Функция введена в работу" w:value="КА / В: Функция введена в работу"/>
+                  <w:listItem w:displayText="КА / ВЭ1: Команда «вкатить» выкатной элемент через выходное реле" w:value="КА / ВЭ1: Команда «вкатить» выкатной элемент через выходное реле"/>
+                  <w:listItem w:displayText="КА / ВЭ1: Команда «выкатить» выкатной элемент через выходное реле" w:value="КА / ВЭ1: Команда «выкатить» выкатной элемент через выходное реле"/>
+                  <w:listItem w:displayText="КА / ВЭ1: Неисправное положение выкатного элемента" w:value="КА / ВЭ1: Неисправное положение выкатного элемента"/>
+                  <w:listItem w:displayText="КА / ВЭ1: Положение выкатного элемента «Вкачен»" w:value="КА / ВЭ1: Положение выкатного элемента «Вкачен»"/>
+                  <w:listItem w:displayText="КА / ВЭ1: Положение выкатного элемента «Выкачен»" w:value="КА / ВЭ1: Положение выкатного элемента «Выкачен»"/>
+                  <w:listItem w:displayText="КА / ВЭ1: Промежуточное положение выкатного элемента" w:value="КА / ВЭ1: Промежуточное положение выкатного элемента"/>
+                  <w:listItem w:displayText="КА / ВЭ1: Ремонтное положение выкатного элемента" w:value="КА / ВЭ1: Ремонтное положение выкатного элемента"/>
+                  <w:listItem w:displayText="КА / ВЭ1: Функция введена в работу" w:value="КА / ВЭ1: Функция введена в работу"/>
+                  <w:listItem w:displayText="КА / ВЭ2: Команда «вкатить» выкатной элемент через выходное реле" w:value="КА / ВЭ2: Команда «вкатить» выкатной элемент через выходное реле"/>
+                  <w:listItem w:displayText="КА / ВЭ2: Команда «выкатить» выкатной элемент через выходное реле" w:value="КА / ВЭ2: Команда «выкатить» выкатной элемент через выходное реле"/>
+                  <w:listItem w:displayText="КА / ВЭ2: Неисправное положение выкатного элемента" w:value="КА / ВЭ2: Неисправное положение выкатного элемента"/>
+                  <w:listItem w:displayText="КА / ВЭ2: Положение выкатного элемента «Вкачен»" w:value="КА / ВЭ2: Положение выкатного элемента «Вкачен»"/>
+                  <w:listItem w:displayText="КА / ВЭ2: Положение выкатного элемента «Выкачен»" w:value="КА / ВЭ2: Положение выкатного элемента «Выкачен»"/>
+                  <w:listItem w:displayText="КА / ВЭ2: Промежуточное положение выкатного элемента" w:value="КА / ВЭ2: Промежуточное положение выкатного элемента"/>
+                  <w:listItem w:displayText="КА / ВЭ2: Ремонтное положение выкатного элемента" w:value="КА / ВЭ2: Ремонтное положение выкатного элемента"/>
+                  <w:listItem w:displayText="КА / ВЭ2: Функция введена в работу" w:value="КА / ВЭ2: Функция введена в работу"/>
+                  <w:listItem w:displayText="КА / ЗН: Заземляющий нож включен" w:value="КА / ЗН: Заземляющий нож включен"/>
+                  <w:listItem w:displayText="КА / ЗН: Заземляющий нож отключен" w:value="КА / ЗН: Заземляющий нож отключен"/>
+                  <w:listItem w:displayText="КА / ЗН: Команда «включить» заземляющий нож через выходное реле" w:value="КА / ЗН: Команда «включить» заземляющий нож через выходное реле"/>
+                  <w:listItem w:displayText="КА / ЗН: Команда «отключить» заземляющий нож через выходное реле" w:value="КА / ЗН: Команда «отключить» заземляющий нож через выходное реле"/>
+                  <w:listItem w:displayText="КА / ЗН: Неисправное положение заземляющего ножа" w:value="КА / ЗН: Неисправное положение заземляющего ножа"/>
+                  <w:listItem w:displayText="КА / ЗН: Промежуточное положение заземляющего ножа" w:value="КА / ЗН: Промежуточное положение заземляющего ножа"/>
+                  <w:listItem w:displayText="КА / ЗН: Функция введена в работу" w:value="КА / ЗН: Функция введена в работу"/>
+                  <w:listItem w:displayText="КА / КА: Функция введена в работу" w:value="КА / КА: Функция введена в работу"/>
+                  <w:listItem w:displayText="КА / КА: Функция оперативно выведена из работы" w:value="КА / КА: Функция оперативно выведена из работы"/>
                   <w:listItem w:displayText="КНН 1сш / КНН 1сш: Пуск" w:value="КНН 1сш / КНН 1сш: Пуск"/>
                   <w:listItem w:displayText="КНН 1сш / КНН 1сш: Пуск ИО напряжения" w:value="КНН 1сш / КНН 1сш: Пуск ИО напряжения"/>
                   <w:listItem w:displayText="КНН 1сш / КНН 1сш: Пуск ИО напряжения ОП" w:value="КНН 1сш / КНН 1сш: Пуск ИО напряжения ОП"/>
@@ -6419,6 +8141,68 @@
                   <w:listItem w:displayText="КОН 2сш / КОН 2сш: Пуск ИО напряжения ОП" w:value="КОН 2сш / КОН 2сш: Пуск ИО напряжения ОП"/>
                   <w:listItem w:displayText="КОН 2сш / КОН 2сш: Функция введена в работу" w:value="КОН 2сш / КОН 2сш: Функция введена в работу"/>
                   <w:listItem w:displayText="КОН 2сш / КОН 2сш: Функция оперативно выведена из работы" w:value="КОН 2сш / КОН 2сш: Функция оперативно выведена из работы"/>
+                  <w:listItem w:displayText="КП / КП: Идет переключение" w:value="КП / КП: Идет переключение"/>
+                  <w:listItem w:displayText="КП / КП: Функция введена в работу" w:value="КП / КП: Функция введена в работу"/>
+                  <w:listItem w:displayText="КП / КП: Функция оперативно выведена из работы" w:value="КП / КП: Функция оперативно выведена из работы"/>
+                  <w:listItem w:displayText="КП / ОБР В: Блокировка включения" w:value="КП / ОБР В: Блокировка включения"/>
+                  <w:listItem w:displayText="КП / ОБР В: Разрешить включение" w:value="КП / ОБР В: Разрешить включение"/>
+                  <w:listItem w:displayText="КП / ОБР ВЭ1: Разрешение управления первым выкатным элементом" w:value="КП / ОБР ВЭ1: Разрешение управления первым выкатным элементом"/>
+                  <w:listItem w:displayText="КП / ОБР ВЭ2: Разрешение управления вторым выкатным элементом" w:value="КП / ОБР ВЭ2: Разрешение управления вторым выкатным элементом"/>
+                  <w:listItem w:displayText="КП / ОБР ЗН: Разрешение управления заземляющим ножом" w:value="КП / ОБР ЗН: Разрешение управления заземляющим ножом"/>
+                  <w:listItem w:displayText="КП / УВ: Включение с контролем синхронизма" w:value="КП / УВ: Включение с контролем синхронизма"/>
+                  <w:listItem w:displayText="КП / УВ: Включить выключатель" w:value="КП / УВ: Включить выключатель"/>
+                  <w:listItem w:displayText="КП / УВ: Задержка включения с контролем синхронизма" w:value="КП / УВ: Задержка включения с контролем синхронизма"/>
+                  <w:listItem w:displayText="КП / УВ: Идет переключение" w:value="КП / УВ: Идет переключение"/>
+                  <w:listItem w:displayText="КП / УВ: Отключить выключатель" w:value="КП / УВ: Отключить выключатель"/>
+                  <w:listItem w:displayText="КП / УВ: Поведение местного управления" w:value="КП / УВ: Поведение местного управления"/>
+                  <w:listItem w:displayText="КП / УВ: Положение В (Включено)" w:value="КП / УВ: Положение В (Включено)"/>
+                  <w:listItem w:displayText="КП / УВ: Положение В (Не определено)" w:value="КП / УВ: Положение В (Не определено)"/>
+                  <w:listItem w:displayText="КП / УВ: Положение В (Неисправность)" w:value="КП / УВ: Положение В (Неисправность)"/>
+                  <w:listItem w:displayText="КП / УВ: Положение В (Отключено)" w:value="КП / УВ: Положение В (Отключено)"/>
+                  <w:listItem w:displayText="КП / УВ: Положение ключа режима управления" w:value="КП / УВ: Положение ключа режима управления"/>
+                  <w:listItem w:displayText="КП / УВ: Право переключения на уровне станции" w:value="КП / УВ: Право переключения на уровне станции"/>
+                  <w:listItem w:displayText="КП / УВ: Сигнал превышения допустимого времени переключения" w:value="КП / УВ: Сигнал превышения допустимого времени переключения"/>
+                  <w:listItem w:displayText="КП / УВ: Функция введена в работу" w:value="КП / УВ: Функция введена в работу"/>
+                  <w:listItem w:displayText="КП / УВЭ1: Вкатить первый выкатной элемент" w:value="КП / УВЭ1: Вкатить первый выкатной элемент"/>
+                  <w:listItem w:displayText="КП / УВЭ1: Выкатить первый выкатной элемент" w:value="КП / УВЭ1: Выкатить первый выкатной элемент"/>
+                  <w:listItem w:displayText="КП / УВЭ1: Идет переключение" w:value="КП / УВЭ1: Идет переключение"/>
+                  <w:listItem w:displayText="КП / УВЭ1: Поведение местного управления" w:value="КП / УВЭ1: Поведение местного управления"/>
+                  <w:listItem w:displayText="КП / УВЭ1: Положение ВЭ1 (Вкачен)" w:value="КП / УВЭ1: Положение ВЭ1 (Вкачен)"/>
+                  <w:listItem w:displayText="КП / УВЭ1: Положение ВЭ1 (Выкачен)" w:value="КП / УВЭ1: Положение ВЭ1 (Выкачен)"/>
+                  <w:listItem w:displayText="КП / УВЭ1: Положение ВЭ1 (Не определено)" w:value="КП / УВЭ1: Положение ВЭ1 (Не определено)"/>
+                  <w:listItem w:displayText="КП / УВЭ1: Положение ВЭ1 (Неисправность)" w:value="КП / УВЭ1: Положение ВЭ1 (Неисправность)"/>
+                  <w:listItem w:displayText="КП / УВЭ1: Положение ключа режима управления" w:value="КП / УВЭ1: Положение ключа режима управления"/>
+                  <w:listItem w:displayText="КП / УВЭ1: Право переключения на уровне станции" w:value="КП / УВЭ1: Право переключения на уровне станции"/>
+                  <w:listItem w:displayText="КП / УВЭ1: Сигнал превышения допустимого времени переключения" w:value="КП / УВЭ1: Сигнал превышения допустимого времени переключения"/>
+                  <w:listItem w:displayText="КП / УВЭ1: Функция введена в работу" w:value="КП / УВЭ1: Функция введена в работу"/>
+                  <w:listItem w:displayText="КП / УВЭ2: Вкатить второй выкатной элемент" w:value="КП / УВЭ2: Вкатить второй выкатной элемент"/>
+                  <w:listItem w:displayText="КП / УВЭ2: Выкатить второй выкатной элемент" w:value="КП / УВЭ2: Выкатить второй выкатной элемент"/>
+                  <w:listItem w:displayText="КП / УВЭ2: Идет переключение" w:value="КП / УВЭ2: Идет переключение"/>
+                  <w:listItem w:displayText="КП / УВЭ2: Поведение местного управления" w:value="КП / УВЭ2: Поведение местного управления"/>
+                  <w:listItem w:displayText="КП / УВЭ2: Положение ВЭ2 (Вкачен)" w:value="КП / УВЭ2: Положение ВЭ2 (Вкачен)"/>
+                  <w:listItem w:displayText="КП / УВЭ2: Положение ВЭ2 (Выкачен)" w:value="КП / УВЭ2: Положение ВЭ2 (Выкачен)"/>
+                  <w:listItem w:displayText="КП / УВЭ2: Положение ВЭ2 (Не определено)" w:value="КП / УВЭ2: Положение ВЭ2 (Не определено)"/>
+                  <w:listItem w:displayText="КП / УВЭ2: Положение ВЭ2 (Неисправность)" w:value="КП / УВЭ2: Положение ВЭ2 (Неисправность)"/>
+                  <w:listItem w:displayText="КП / УВЭ2: Положение ключа режима управления" w:value="КП / УВЭ2: Положение ключа режима управления"/>
+                  <w:listItem w:displayText="КП / УВЭ2: Право переключения на уровне станции" w:value="КП / УВЭ2: Право переключения на уровне станции"/>
+                  <w:listItem w:displayText="КП / УВЭ2: Сигнал превышения допустимого времени переключения" w:value="КП / УВЭ2: Сигнал превышения допустимого времени переключения"/>
+                  <w:listItem w:displayText="КП / УВЭ2: Функция введена в работу" w:value="КП / УВЭ2: Функция введена в работу"/>
+                  <w:listItem w:displayText="КП / УЗН: Включить заземляющий нож" w:value="КП / УЗН: Включить заземляющий нож"/>
+                  <w:listItem w:displayText="КП / УЗН: Идет переключение" w:value="КП / УЗН: Идет переключение"/>
+                  <w:listItem w:displayText="КП / УЗН: Отключить заземляющий нож" w:value="КП / УЗН: Отключить заземляющий нож"/>
+                  <w:listItem w:displayText="КП / УЗН: Поведение местного управления" w:value="КП / УЗН: Поведение местного управления"/>
+                  <w:listItem w:displayText="КП / УЗН: Положение ЗН (Включено)" w:value="КП / УЗН: Положение ЗН (Включено)"/>
+                  <w:listItem w:displayText="КП / УЗН: Положение ЗН (Не определено)" w:value="КП / УЗН: Положение ЗН (Не определено)"/>
+                  <w:listItem w:displayText="КП / УЗН: Положение ЗН (Неисправность)" w:value="КП / УЗН: Положение ЗН (Неисправность)"/>
+                  <w:listItem w:displayText="КП / УЗН: Положение ЗН (Отключено)" w:value="КП / УЗН: Положение ЗН (Отключено)"/>
+                  <w:listItem w:displayText="КП / УЗН: Положение ключа режима управления" w:value="КП / УЗН: Положение ключа режима управления"/>
+                  <w:listItem w:displayText="КП / УЗН: Право переключения на уровне станции" w:value="КП / УЗН: Право переключения на уровне станции"/>
+                  <w:listItem w:displayText="КП / УЗН: Сигнал превышения допустимого времени переключения" w:value="КП / УЗН: Сигнал превышения допустимого времени переключения"/>
+                  <w:listItem w:displayText="КП / УЗН: Функция введена в работу" w:value="КП / УЗН: Функция введена в работу"/>
+                  <w:listItem w:displayText="КРВ / КРВ: Превышен коммутационный ресурс выключателя" w:value="КРВ / КРВ: Превышен коммутационный ресурс выключателя"/>
+                  <w:listItem w:displayText="КРВ / КРВ: Превышен механический ресурс выключателя" w:value="КРВ / КРВ: Превышен механический ресурс выключателя"/>
+                  <w:listItem w:displayText="КРВ / КРВ: Превышен ресурс выключателя" w:value="КРВ / КРВ: Превышен ресурс выключателя"/>
+                  <w:listItem w:displayText="КРВ / КРВ: Функция введена в работу" w:value="КРВ / КРВ: Функция введена в работу"/>
                   <w:listItem w:displayText="КС / КС: Блокировка по скорости изменения частоты" w:value="КС / КС: Блокировка по скорости изменения частоты"/>
                   <w:listItem w:displayText="КС / КС: Нет условий по напряжению" w:value="КС / КС: Нет условий по напряжению"/>
                   <w:listItem w:displayText="КС / КС: Нет условий по углу" w:value="КС / КС: Нет условий по углу"/>
@@ -6431,6 +8215,18 @@
                   <w:listItem w:displayText="КС / КС: Разрешение оперативного включения" w:value="КС / КС: Разрешение оперативного включения"/>
                   <w:listItem w:displayText="КС / КС: Функция введена в работу" w:value="КС / КС: Функция введена в работу"/>
                   <w:listItem w:displayText="КС / КС: Функция оперативно выведена из работы" w:value="КС / КС: Функция оперативно выведена из работы"/>
+                  <w:listItem w:displayText="КСВ / КСВ: Блокировка включения В" w:value="КСВ / КСВ: Блокировка включения В"/>
+                  <w:listItem w:displayText="КСВ / КСВ: Блокировка отключения В" w:value="КСВ / КСВ: Блокировка отключения В"/>
+                  <w:listItem w:displayText="КСВ / КСВ: В аварийно отключен" w:value="КСВ / КСВ: В аварийно отключен"/>
+                  <w:listItem w:displayText="КСВ / КСВ: В самопроизвольно отключен" w:value="КСВ / КСВ: В самопроизвольно отключен"/>
+                  <w:listItem w:displayText="КСВ / КСВ: Защита ЭМВ" w:value="КСВ / КСВ: Защита ЭМВ"/>
+                  <w:listItem w:displayText="КСВ / КСВ: Защита ЭМО1" w:value="КСВ / КСВ: Защита ЭМО1"/>
+                  <w:listItem w:displayText="КСВ / КСВ: Защита ЭМО2" w:value="КСВ / КСВ: Защита ЭМО2"/>
+                  <w:listItem w:displayText="КСВ / КСВ: Неисправность В" w:value="КСВ / КСВ: Неисправность В"/>
+                  <w:listItem w:displayText="КСВ / КСВ: Неисправность цепей ЭМУ" w:value="КСВ / КСВ: Неисправность цепей ЭМУ"/>
+                  <w:listItem w:displayText="КСВ / КСВ: Реле фиксации команды" w:value="КСВ / КСВ: Реле фиксации команды"/>
+                  <w:listItem w:displayText="КСВ / КСВ: Функция введена в работу" w:value="КСВ / КСВ: Функция введена в работу"/>
+                  <w:listItem w:displayText="КСВ / КСВ: Функция оперативно выведена из работы" w:value="КСВ / КСВ: Функция оперативно выведена из работы"/>
                   <w:listItem w:displayText="ЛЗШ / ЛЗШ: Обнаружение неисправности" w:value="ЛЗШ / ЛЗШ: Обнаружение неисправности"/>
                   <w:listItem w:displayText="ЛЗШ / ЛЗШ: Пуск" w:value="ЛЗШ / ЛЗШ: Пуск"/>
                   <w:listItem w:displayText="ЛЗШ / ЛЗШ: Пуск ИО тока по фазе B" w:value="ЛЗШ / ЛЗШ: Пуск ИО тока по фазе B"/>
@@ -6523,6 +8319,57 @@
                   <w:listItem w:displayText="МТЗ / ОНМ: Пуск по фазе C" w:value="МТЗ / ОНМ: Пуск по фазе C"/>
                   <w:listItem w:displayText="МТЗ / ОНМ: Пуск по фазе А" w:value="МТЗ / ОНМ: Пуск по фазе А"/>
                   <w:listItem w:displayText="МТЗ / ОУ МТЗ: Срабатывание" w:value="МТЗ / ОУ МТЗ: Срабатывание"/>
+                  <w:listItem w:displayText="ПДС / В: Поведение местного управления" w:value="ПДС / В: Поведение местного управления"/>
+                  <w:listItem w:displayText="ПДС / В: Положение ключа режима управления" w:value="ПДС / В: Положение ключа режима управления"/>
+                  <w:listItem w:displayText="ПДС / В: Положение ключа режима управления привода В" w:value="ПДС / В: Положение ключа режима управления привода В"/>
+                  <w:listItem w:displayText="ПДС / В: Право переключения на уровне станции" w:value="ПДС / В: Право переключения на уровне станции"/>
+                  <w:listItem w:displayText="ПДС / ВЭ1: Поведение местного управления" w:value="ПДС / ВЭ1: Поведение местного управления"/>
+                  <w:listItem w:displayText="ПДС / ВЭ1: Положение ключа режима управления" w:value="ПДС / ВЭ1: Положение ключа режима управления"/>
+                  <w:listItem w:displayText="ПДС / ВЭ1: Право переключения на уровне станции" w:value="ПДС / ВЭ1: Право переключения на уровне станции"/>
+                  <w:listItem w:displayText="ПДС / ВЭ1: Ремонтное положение коммутационного аппарата" w:value="ПДС / ВЭ1: Ремонтное положение коммутационного аппарата"/>
+                  <w:listItem w:displayText="ПДС / ВЭ2: Поведение местного управления" w:value="ПДС / ВЭ2: Поведение местного управления"/>
+                  <w:listItem w:displayText="ПДС / ВЭ2: Положение ключа режима управления" w:value="ПДС / ВЭ2: Положение ключа режима управления"/>
+                  <w:listItem w:displayText="ПДС / ВЭ2: Право переключения на уровне станции" w:value="ПДС / ВЭ2: Право переключения на уровне станции"/>
+                  <w:listItem w:displayText="ПДС / ВЭ2: Ремонтное положение коммутационного аппарата" w:value="ПДС / ВЭ2: Ремонтное положение коммутационного аппарата"/>
+                  <w:listItem w:displayText="ПДС / ЗН: Поведение местного управления" w:value="ПДС / ЗН: Поведение местного управления"/>
+                  <w:listItem w:displayText="ПДС / ЗН: Положение ключа режима управления" w:value="ПДС / ЗН: Положение ключа режима управления"/>
+                  <w:listItem w:displayText="ПДС / ЗН: Право переключения на уровне станции" w:value="ПДС / ЗН: Право переключения на уровне станции"/>
+                  <w:listItem w:displayText="ПДС / КИ: Аварийный уровень изоляции" w:value="ПДС / КИ: Аварийный уровень изоляции"/>
+                  <w:listItem w:displayText="ПДС / КИ: Низкий уровень изоляции" w:value="ПДС / КИ: Низкий уровень изоляции"/>
+                  <w:listItem w:displayText="ПДС / КПруж: Пружина не заведена" w:value="ПДС / КПруж: Пружина не заведена"/>
+                  <w:listItem w:displayText="ПДС / КЦВ: Контроль цепи ЭМВ" w:value="ПДС / КЦВ: Контроль цепи ЭМВ"/>
+                  <w:listItem w:displayText="ПДС / КЦВ: Контроль цепи ЭМО1" w:value="ПДС / КЦВ: Контроль цепи ЭМО1"/>
+                  <w:listItem w:displayText="ПДС / КЦВ: Контроль цепи ЭМО2" w:value="ПДС / КЦВ: Контроль цепи ЭМО2"/>
+                  <w:listItem w:displayText="ПДС / КЦВ: Работа ЭМВ" w:value="ПДС / КЦВ: Работа ЭМВ"/>
+                  <w:listItem w:displayText="ПДС / КЦВ: Работа ЭМО1" w:value="ПДС / КЦВ: Работа ЭМО1"/>
+                  <w:listItem w:displayText="ПДС / КЦВ: Работа ЭМО2" w:value="ПДС / КЦВ: Работа ЭМО2"/>
+                  <w:listItem w:displayText="ПДС / ПДС: Функция введена в работу" w:value="ПДС / ПДС: Функция введена в работу"/>
+                  <w:listItem w:displayText="ПДС / ПДС: Функция оперативно выведена из работы" w:value="ПДС / ПДС: Функция оперативно выведена из работы"/>
+                  <w:listItem w:displayText="ПДС НКУ / SA1: Цепь управления введена" w:value="ПДС НКУ / SA1: Цепь управления введена"/>
+                  <w:listItem w:displayText="ПДС НКУ / SA2: Цепь управления введена" w:value="ПДС НКУ / SA2: Цепь управления введена"/>
+                  <w:listItem w:displayText="ПДС НКУ / SA3: Цепь управления введена" w:value="ПДС НКУ / SA3: Цепь управления введена"/>
+                  <w:listItem w:displayText="ПДС НКУ / SA4: Цепь управления введена" w:value="ПДС НКУ / SA4: Цепь управления введена"/>
+                  <w:listItem w:displayText="ПДС НКУ / SG1: Рабочее положение испытательного блока" w:value="ПДС НКУ / SG1: Рабочее положение испытательного блока"/>
+                  <w:listItem w:displayText="ПДС НКУ / SG2: Рабочее положение испытательного блока" w:value="ПДС НКУ / SG2: Рабочее положение испытательного блока"/>
+                  <w:listItem w:displayText="ПДС НКУ / SG3: Рабочее положение испытательного блока" w:value="ПДС НКУ / SG3: Рабочее положение испытательного блока"/>
+                  <w:listItem w:displayText="ПДС НКУ / Дверь: Дверь отсека/ шкафа закрыта" w:value="ПДС НКУ / Дверь: Дверь отсека/ шкафа закрыта"/>
+                  <w:listItem w:displayText="ПДС НКУ / Дверь: Дверь отсека/ шкафа открыта" w:value="ПДС НКУ / Дверь: Дверь отсека/ шкафа открыта"/>
+                  <w:listItem w:displayText="ПДС НКУ / ОТ ОБР 1: Неисправность оперативного тока цепей ОБР 1" w:value="ПДС НКУ / ОТ ОБР 1: Неисправность оперативного тока цепей ОБР 1"/>
+                  <w:listItem w:displayText="ПДС НКУ / ОТ ОБР 2: Неисправность оперативного тока цепей ОБР 2" w:value="ПДС НКУ / ОТ ОБР 2: Неисправность оперативного тока цепей ОБР 2"/>
+                  <w:listItem w:displayText="ПДС НКУ / ОТ ЦСВ: Неисправность ОТ цепей сигнализации В" w:value="ПДС НКУ / ОТ ЦСВ: Неисправность ОТ цепей сигнализации В"/>
+                  <w:listItem w:displayText="ПДС НКУ / ОТ ЭМО1, ЭМВ: Неисправность оперативного тока цепей ЭМВ, ЭМО1" w:value="ПДС НКУ / ОТ ЭМО1, ЭМВ: Неисправность оперативного тока цепей ЭМВ, ЭМО1"/>
+                  <w:listItem w:displayText="ПДС НКУ / ОТ ЭМО2: Неисправность оперативного тока цепей ЭМО2" w:value="ПДС НКУ / ОТ ЭМО2: Неисправность оперативного тока цепей ЭМО2"/>
+                  <w:listItem w:displayText="ПДС НКУ / ПДС НКУ: Функция введена в работу" w:value="ПДС НКУ / ПДС НКУ: Функция введена в работу"/>
+                  <w:listItem w:displayText="ПДС НКУ / ПДС НКУ: Функция оперативно выведена из работы" w:value="ПДС НКУ / ПДС НКУ: Функция оперативно выведена из работы"/>
+                  <w:listItem w:displayText="ПДС НКУ / Пер.ав.дебл.см.яч.: Цепи аварийной деблокировки ячейки выведены" w:value="ПДС НКУ / Пер.ав.дебл.см.яч.: Цепи аварийной деблокировки ячейки выведены"/>
+                  <w:listItem w:displayText="ПС / ПС: Пуск предупредительной сигнализации" w:value="ПС / ПС: Пуск предупредительной сигнализации"/>
+                  <w:listItem w:displayText="ПС / ПС: Пуск предупредительной сигнализации (импульс)" w:value="ПС / ПС: Пуск предупредительной сигнализации (импульс)"/>
+                  <w:listItem w:displayText="СС / СС: БИ выведены" w:value="СС / СС: БИ выведены"/>
+                  <w:listItem w:displayText="СС / СС: Выходные цепи разобраны" w:value="СС / СС: Выходные цепи разобраны"/>
+                  <w:listItem w:displayText="СС / СС: Неисправность КА" w:value="СС / СС: Неисправность КА"/>
+                  <w:listItem w:displayText="СС / СС: Общий внешний сигнал" w:value="СС / СС: Общий внешний сигнал"/>
+                  <w:listItem w:displayText="СС / СС: Превышение времени переключения КА" w:value="СС / СС: Превышение времени переключения КА"/>
+                  <w:listItem w:displayText="СС / СС: Сигнализация цепей опер.тока" w:value="СС / СС: Сигнализация цепей опер.тока"/>
                   <w:listItem w:displayText="ТЗНП / АУ ТЗНП: Пуск автоматического ускорения ТЗНП" w:value="ТЗНП / АУ ТЗНП: Пуск автоматического ускорения ТЗНП"/>
                   <w:listItem w:displayText="ТЗНП / БНТ НП: Пуск БНТ НП" w:value="ТЗНП / БНТ НП: Пуск БНТ НП"/>
                   <w:listItem w:displayText="ТЗНП / БЧС: Блокировка чувствительных ступеней" w:value="ТЗНП / БЧС: Блокировка чувствительных ступеней"/>
@@ -6562,6 +8409,11 @@
                   <w:listItem w:displayText="ТК ЗДЗ / ТК ЗДЗ: Пуск ИО тока" w:value="ТК ЗДЗ / ТК ЗДЗ: Пуск ИО тока"/>
                   <w:listItem w:displayText="ТК ЗДЗ / ТК ЗДЗ: Функция введена в работу" w:value="ТК ЗДЗ / ТК ЗДЗ: Функция введена в работу"/>
                   <w:listItem w:displayText="ТК ЗДЗ / ТК ЗДЗ: Функция оперативно выведена из работы" w:value="ТК ЗДЗ / ТК ЗДЗ: Функция оперативно выведена из работы"/>
+                  <w:listItem w:displayText="УВ / УВ: Включение с контролем синхронизма" w:value="УВ / УВ: Включение с контролем синхронизма"/>
+                  <w:listItem w:displayText="УВ / УВ: Включить выключатель" w:value="УВ / УВ: Включить выключатель"/>
+                  <w:listItem w:displayText="УВ / УВ: Задержка включения с контролем синхронизма" w:value="УВ / УВ: Задержка включения с контролем синхронизма"/>
+                  <w:listItem w:displayText="УВ / УВ: Функция введена в работу" w:value="УВ / УВ: Функция введена в работу"/>
+                  <w:listItem w:displayText="УВ / УВ: Функция оперативно выведена из работы" w:value="УВ / УВ: Функция оперативно выведена из работы"/>
                   <w:listItem w:displayText="УРОВ / УРОВ: Пуск" w:value="УРОВ / УРОВ: Пуск"/>
                   <w:listItem w:displayText="УРОВ / УРОВ: Пуск ИО максимального тока" w:value="УРОВ / УРОВ: Пуск ИО максимального тока"/>
                   <w:listItem w:displayText="УРОВ / УРОВ: Срабатывание" w:value="УРОВ / УРОВ: Срабатывание"/>
@@ -6877,6 +8729,38 @@
                   <w:listItem w:displayText="ЗОП / ЗОП: Срабатывание на сигнал" w:value="ЗОП / ЗОП: Срабатывание на сигнал"/>
                   <w:listItem w:displayText="ЗОП / ЗОП: Функция введена в работу" w:value="ЗОП / ЗОП: Функция введена в работу"/>
                   <w:listItem w:displayText="ЗОП / ЗОП: Функция оперативно выведена из работы" w:value="ЗОП / ЗОП: Функция оперативно выведена из работы"/>
+                  <w:listItem w:displayText="КА / В: Выключатель включен" w:value="КА / В: Выключатель включен"/>
+                  <w:listItem w:displayText="КА / В: Выключатель отключен" w:value="КА / В: Выключатель отключен"/>
+                  <w:listItem w:displayText="КА / В: Команда «включить» выключатель через выходное реле" w:value="КА / В: Команда «включить» выключатель через выходное реле"/>
+                  <w:listItem w:displayText="КА / В: Команда «отключить» выключатель через выходное реле" w:value="КА / В: Команда «отключить» выключатель через выходное реле"/>
+                  <w:listItem w:displayText="КА / В: Неисправное положение выключателя" w:value="КА / В: Неисправное положение выключателя"/>
+                  <w:listItem w:displayText="КА / В: Промежуточное положение выключателя" w:value="КА / В: Промежуточное положение выключателя"/>
+                  <w:listItem w:displayText="КА / В: Функция введена в работу" w:value="КА / В: Функция введена в работу"/>
+                  <w:listItem w:displayText="КА / ВЭ1: Команда «вкатить» выкатной элемент через выходное реле" w:value="КА / ВЭ1: Команда «вкатить» выкатной элемент через выходное реле"/>
+                  <w:listItem w:displayText="КА / ВЭ1: Команда «выкатить» выкатной элемент через выходное реле" w:value="КА / ВЭ1: Команда «выкатить» выкатной элемент через выходное реле"/>
+                  <w:listItem w:displayText="КА / ВЭ1: Неисправное положение выкатного элемента" w:value="КА / ВЭ1: Неисправное положение выкатного элемента"/>
+                  <w:listItem w:displayText="КА / ВЭ1: Положение выкатного элемента «Вкачен»" w:value="КА / ВЭ1: Положение выкатного элемента «Вкачен»"/>
+                  <w:listItem w:displayText="КА / ВЭ1: Положение выкатного элемента «Выкачен»" w:value="КА / ВЭ1: Положение выкатного элемента «Выкачен»"/>
+                  <w:listItem w:displayText="КА / ВЭ1: Промежуточное положение выкатного элемента" w:value="КА / ВЭ1: Промежуточное положение выкатного элемента"/>
+                  <w:listItem w:displayText="КА / ВЭ1: Ремонтное положение выкатного элемента" w:value="КА / ВЭ1: Ремонтное положение выкатного элемента"/>
+                  <w:listItem w:displayText="КА / ВЭ1: Функция введена в работу" w:value="КА / ВЭ1: Функция введена в работу"/>
+                  <w:listItem w:displayText="КА / ВЭ2: Команда «вкатить» выкатной элемент через выходное реле" w:value="КА / ВЭ2: Команда «вкатить» выкатной элемент через выходное реле"/>
+                  <w:listItem w:displayText="КА / ВЭ2: Команда «выкатить» выкатной элемент через выходное реле" w:value="КА / ВЭ2: Команда «выкатить» выкатной элемент через выходное реле"/>
+                  <w:listItem w:displayText="КА / ВЭ2: Неисправное положение выкатного элемента" w:value="КА / ВЭ2: Неисправное положение выкатного элемента"/>
+                  <w:listItem w:displayText="КА / ВЭ2: Положение выкатного элемента «Вкачен»" w:value="КА / ВЭ2: Положение выкатного элемента «Вкачен»"/>
+                  <w:listItem w:displayText="КА / ВЭ2: Положение выкатного элемента «Выкачен»" w:value="КА / ВЭ2: Положение выкатного элемента «Выкачен»"/>
+                  <w:listItem w:displayText="КА / ВЭ2: Промежуточное положение выкатного элемента" w:value="КА / ВЭ2: Промежуточное положение выкатного элемента"/>
+                  <w:listItem w:displayText="КА / ВЭ2: Ремонтное положение выкатного элемента" w:value="КА / ВЭ2: Ремонтное положение выкатного элемента"/>
+                  <w:listItem w:displayText="КА / ВЭ2: Функция введена в работу" w:value="КА / ВЭ2: Функция введена в работу"/>
+                  <w:listItem w:displayText="КА / ЗН: Заземляющий нож включен" w:value="КА / ЗН: Заземляющий нож включен"/>
+                  <w:listItem w:displayText="КА / ЗН: Заземляющий нож отключен" w:value="КА / ЗН: Заземляющий нож отключен"/>
+                  <w:listItem w:displayText="КА / ЗН: Команда «включить» заземляющий нож через выходное реле" w:value="КА / ЗН: Команда «включить» заземляющий нож через выходное реле"/>
+                  <w:listItem w:displayText="КА / ЗН: Команда «отключить» заземляющий нож через выходное реле" w:value="КА / ЗН: Команда «отключить» заземляющий нож через выходное реле"/>
+                  <w:listItem w:displayText="КА / ЗН: Неисправное положение заземляющего ножа" w:value="КА / ЗН: Неисправное положение заземляющего ножа"/>
+                  <w:listItem w:displayText="КА / ЗН: Промежуточное положение заземляющего ножа" w:value="КА / ЗН: Промежуточное положение заземляющего ножа"/>
+                  <w:listItem w:displayText="КА / ЗН: Функция введена в работу" w:value="КА / ЗН: Функция введена в работу"/>
+                  <w:listItem w:displayText="КА / КА: Функция введена в работу" w:value="КА / КА: Функция введена в работу"/>
+                  <w:listItem w:displayText="КА / КА: Функция оперативно выведена из работы" w:value="КА / КА: Функция оперативно выведена из работы"/>
                   <w:listItem w:displayText="КНН 1сш / КНН 1сш: Пуск" w:value="КНН 1сш / КНН 1сш: Пуск"/>
                   <w:listItem w:displayText="КНН 1сш / КНН 1сш: Пуск ИО напряжения" w:value="КНН 1сш / КНН 1сш: Пуск ИО напряжения"/>
                   <w:listItem w:displayText="КНН 1сш / КНН 1сш: Пуск ИО напряжения ОП" w:value="КНН 1сш / КНН 1сш: Пуск ИО напряжения ОП"/>
@@ -6897,6 +8781,68 @@
                   <w:listItem w:displayText="КОН 2сш / КОН 2сш: Пуск ИО напряжения ОП" w:value="КОН 2сш / КОН 2сш: Пуск ИО напряжения ОП"/>
                   <w:listItem w:displayText="КОН 2сш / КОН 2сш: Функция введена в работу" w:value="КОН 2сш / КОН 2сш: Функция введена в работу"/>
                   <w:listItem w:displayText="КОН 2сш / КОН 2сш: Функция оперативно выведена из работы" w:value="КОН 2сш / КОН 2сш: Функция оперативно выведена из работы"/>
+                  <w:listItem w:displayText="КП / КП: Идет переключение" w:value="КП / КП: Идет переключение"/>
+                  <w:listItem w:displayText="КП / КП: Функция введена в работу" w:value="КП / КП: Функция введена в работу"/>
+                  <w:listItem w:displayText="КП / КП: Функция оперативно выведена из работы" w:value="КП / КП: Функция оперативно выведена из работы"/>
+                  <w:listItem w:displayText="КП / ОБР В: Блокировка включения" w:value="КП / ОБР В: Блокировка включения"/>
+                  <w:listItem w:displayText="КП / ОБР В: Разрешить включение" w:value="КП / ОБР В: Разрешить включение"/>
+                  <w:listItem w:displayText="КП / ОБР ВЭ1: Разрешение управления первым выкатным элементом" w:value="КП / ОБР ВЭ1: Разрешение управления первым выкатным элементом"/>
+                  <w:listItem w:displayText="КП / ОБР ВЭ2: Разрешение управления вторым выкатным элементом" w:value="КП / ОБР ВЭ2: Разрешение управления вторым выкатным элементом"/>
+                  <w:listItem w:displayText="КП / ОБР ЗН: Разрешение управления заземляющим ножом" w:value="КП / ОБР ЗН: Разрешение управления заземляющим ножом"/>
+                  <w:listItem w:displayText="КП / УВ: Включение с контролем синхронизма" w:value="КП / УВ: Включение с контролем синхронизма"/>
+                  <w:listItem w:displayText="КП / УВ: Включить выключатель" w:value="КП / УВ: Включить выключатель"/>
+                  <w:listItem w:displayText="КП / УВ: Задержка включения с контролем синхронизма" w:value="КП / УВ: Задержка включения с контролем синхронизма"/>
+                  <w:listItem w:displayText="КП / УВ: Идет переключение" w:value="КП / УВ: Идет переключение"/>
+                  <w:listItem w:displayText="КП / УВ: Отключить выключатель" w:value="КП / УВ: Отключить выключатель"/>
+                  <w:listItem w:displayText="КП / УВ: Поведение местного управления" w:value="КП / УВ: Поведение местного управления"/>
+                  <w:listItem w:displayText="КП / УВ: Положение В (Включено)" w:value="КП / УВ: Положение В (Включено)"/>
+                  <w:listItem w:displayText="КП / УВ: Положение В (Не определено)" w:value="КП / УВ: Положение В (Не определено)"/>
+                  <w:listItem w:displayText="КП / УВ: Положение В (Неисправность)" w:value="КП / УВ: Положение В (Неисправность)"/>
+                  <w:listItem w:displayText="КП / УВ: Положение В (Отключено)" w:value="КП / УВ: Положение В (Отключено)"/>
+                  <w:listItem w:displayText="КП / УВ: Положение ключа режима управления" w:value="КП / УВ: Положение ключа режима управления"/>
+                  <w:listItem w:displayText="КП / УВ: Право переключения на уровне станции" w:value="КП / УВ: Право переключения на уровне станции"/>
+                  <w:listItem w:displayText="КП / УВ: Сигнал превышения допустимого времени переключения" w:value="КП / УВ: Сигнал превышения допустимого времени переключения"/>
+                  <w:listItem w:displayText="КП / УВ: Функция введена в работу" w:value="КП / УВ: Функция введена в работу"/>
+                  <w:listItem w:displayText="КП / УВЭ1: Вкатить первый выкатной элемент" w:value="КП / УВЭ1: Вкатить первый выкатной элемент"/>
+                  <w:listItem w:displayText="КП / УВЭ1: Выкатить первый выкатной элемент" w:value="КП / УВЭ1: Выкатить первый выкатной элемент"/>
+                  <w:listItem w:displayText="КП / УВЭ1: Идет переключение" w:value="КП / УВЭ1: Идет переключение"/>
+                  <w:listItem w:displayText="КП / УВЭ1: Поведение местного управления" w:value="КП / УВЭ1: Поведение местного управления"/>
+                  <w:listItem w:displayText="КП / УВЭ1: Положение ВЭ1 (Вкачен)" w:value="КП / УВЭ1: Положение ВЭ1 (Вкачен)"/>
+                  <w:listItem w:displayText="КП / УВЭ1: Положение ВЭ1 (Выкачен)" w:value="КП / УВЭ1: Положение ВЭ1 (Выкачен)"/>
+                  <w:listItem w:displayText="КП / УВЭ1: Положение ВЭ1 (Не определено)" w:value="КП / УВЭ1: Положение ВЭ1 (Не определено)"/>
+                  <w:listItem w:displayText="КП / УВЭ1: Положение ВЭ1 (Неисправность)" w:value="КП / УВЭ1: Положение ВЭ1 (Неисправность)"/>
+                  <w:listItem w:displayText="КП / УВЭ1: Положение ключа режима управления" w:value="КП / УВЭ1: Положение ключа режима управления"/>
+                  <w:listItem w:displayText="КП / УВЭ1: Право переключения на уровне станции" w:value="КП / УВЭ1: Право переключения на уровне станции"/>
+                  <w:listItem w:displayText="КП / УВЭ1: Сигнал превышения допустимого времени переключения" w:value="КП / УВЭ1: Сигнал превышения допустимого времени переключения"/>
+                  <w:listItem w:displayText="КП / УВЭ1: Функция введена в работу" w:value="КП / УВЭ1: Функция введена в работу"/>
+                  <w:listItem w:displayText="КП / УВЭ2: Вкатить второй выкатной элемент" w:value="КП / УВЭ2: Вкатить второй выкатной элемент"/>
+                  <w:listItem w:displayText="КП / УВЭ2: Выкатить второй выкатной элемент" w:value="КП / УВЭ2: Выкатить второй выкатной элемент"/>
+                  <w:listItem w:displayText="КП / УВЭ2: Идет переключение" w:value="КП / УВЭ2: Идет переключение"/>
+                  <w:listItem w:displayText="КП / УВЭ2: Поведение местного управления" w:value="КП / УВЭ2: Поведение местного управления"/>
+                  <w:listItem w:displayText="КП / УВЭ2: Положение ВЭ2 (Вкачен)" w:value="КП / УВЭ2: Положение ВЭ2 (Вкачен)"/>
+                  <w:listItem w:displayText="КП / УВЭ2: Положение ВЭ2 (Выкачен)" w:value="КП / УВЭ2: Положение ВЭ2 (Выкачен)"/>
+                  <w:listItem w:displayText="КП / УВЭ2: Положение ВЭ2 (Не определено)" w:value="КП / УВЭ2: Положение ВЭ2 (Не определено)"/>
+                  <w:listItem w:displayText="КП / УВЭ2: Положение ВЭ2 (Неисправность)" w:value="КП / УВЭ2: Положение ВЭ2 (Неисправность)"/>
+                  <w:listItem w:displayText="КП / УВЭ2: Положение ключа режима управления" w:value="КП / УВЭ2: Положение ключа режима управления"/>
+                  <w:listItem w:displayText="КП / УВЭ2: Право переключения на уровне станции" w:value="КП / УВЭ2: Право переключения на уровне станции"/>
+                  <w:listItem w:displayText="КП / УВЭ2: Сигнал превышения допустимого времени переключения" w:value="КП / УВЭ2: Сигнал превышения допустимого времени переключения"/>
+                  <w:listItem w:displayText="КП / УВЭ2: Функция введена в работу" w:value="КП / УВЭ2: Функция введена в работу"/>
+                  <w:listItem w:displayText="КП / УЗН: Включить заземляющий нож" w:value="КП / УЗН: Включить заземляющий нож"/>
+                  <w:listItem w:displayText="КП / УЗН: Идет переключение" w:value="КП / УЗН: Идет переключение"/>
+                  <w:listItem w:displayText="КП / УЗН: Отключить заземляющий нож" w:value="КП / УЗН: Отключить заземляющий нож"/>
+                  <w:listItem w:displayText="КП / УЗН: Поведение местного управления" w:value="КП / УЗН: Поведение местного управления"/>
+                  <w:listItem w:displayText="КП / УЗН: Положение ЗН (Включено)" w:value="КП / УЗН: Положение ЗН (Включено)"/>
+                  <w:listItem w:displayText="КП / УЗН: Положение ЗН (Не определено)" w:value="КП / УЗН: Положение ЗН (Не определено)"/>
+                  <w:listItem w:displayText="КП / УЗН: Положение ЗН (Неисправность)" w:value="КП / УЗН: Положение ЗН (Неисправность)"/>
+                  <w:listItem w:displayText="КП / УЗН: Положение ЗН (Отключено)" w:value="КП / УЗН: Положение ЗН (Отключено)"/>
+                  <w:listItem w:displayText="КП / УЗН: Положение ключа режима управления" w:value="КП / УЗН: Положение ключа режима управления"/>
+                  <w:listItem w:displayText="КП / УЗН: Право переключения на уровне станции" w:value="КП / УЗН: Право переключения на уровне станции"/>
+                  <w:listItem w:displayText="КП / УЗН: Сигнал превышения допустимого времени переключения" w:value="КП / УЗН: Сигнал превышения допустимого времени переключения"/>
+                  <w:listItem w:displayText="КП / УЗН: Функция введена в работу" w:value="КП / УЗН: Функция введена в работу"/>
+                  <w:listItem w:displayText="КРВ / КРВ: Превышен коммутационный ресурс выключателя" w:value="КРВ / КРВ: Превышен коммутационный ресурс выключателя"/>
+                  <w:listItem w:displayText="КРВ / КРВ: Превышен механический ресурс выключателя" w:value="КРВ / КРВ: Превышен механический ресурс выключателя"/>
+                  <w:listItem w:displayText="КРВ / КРВ: Превышен ресурс выключателя" w:value="КРВ / КРВ: Превышен ресурс выключателя"/>
+                  <w:listItem w:displayText="КРВ / КРВ: Функция введена в работу" w:value="КРВ / КРВ: Функция введена в работу"/>
                   <w:listItem w:displayText="КС / КС: Блокировка по скорости изменения частоты" w:value="КС / КС: Блокировка по скорости изменения частоты"/>
                   <w:listItem w:displayText="КС / КС: Нет условий по напряжению" w:value="КС / КС: Нет условий по напряжению"/>
                   <w:listItem w:displayText="КС / КС: Нет условий по углу" w:value="КС / КС: Нет условий по углу"/>
@@ -6909,6 +8855,18 @@
                   <w:listItem w:displayText="КС / КС: Разрешение оперативного включения" w:value="КС / КС: Разрешение оперативного включения"/>
                   <w:listItem w:displayText="КС / КС: Функция введена в работу" w:value="КС / КС: Функция введена в работу"/>
                   <w:listItem w:displayText="КС / КС: Функция оперативно выведена из работы" w:value="КС / КС: Функция оперативно выведена из работы"/>
+                  <w:listItem w:displayText="КСВ / КСВ: Блокировка включения В" w:value="КСВ / КСВ: Блокировка включения В"/>
+                  <w:listItem w:displayText="КСВ / КСВ: Блокировка отключения В" w:value="КСВ / КСВ: Блокировка отключения В"/>
+                  <w:listItem w:displayText="КСВ / КСВ: В аварийно отключен" w:value="КСВ / КСВ: В аварийно отключен"/>
+                  <w:listItem w:displayText="КСВ / КСВ: В самопроизвольно отключен" w:value="КСВ / КСВ: В самопроизвольно отключен"/>
+                  <w:listItem w:displayText="КСВ / КСВ: Защита ЭМВ" w:value="КСВ / КСВ: Защита ЭМВ"/>
+                  <w:listItem w:displayText="КСВ / КСВ: Защита ЭМО1" w:value="КСВ / КСВ: Защита ЭМО1"/>
+                  <w:listItem w:displayText="КСВ / КСВ: Защита ЭМО2" w:value="КСВ / КСВ: Защита ЭМО2"/>
+                  <w:listItem w:displayText="КСВ / КСВ: Неисправность В" w:value="КСВ / КСВ: Неисправность В"/>
+                  <w:listItem w:displayText="КСВ / КСВ: Неисправность цепей ЭМУ" w:value="КСВ / КСВ: Неисправность цепей ЭМУ"/>
+                  <w:listItem w:displayText="КСВ / КСВ: Реле фиксации команды" w:value="КСВ / КСВ: Реле фиксации команды"/>
+                  <w:listItem w:displayText="КСВ / КСВ: Функция введена в работу" w:value="КСВ / КСВ: Функция введена в работу"/>
+                  <w:listItem w:displayText="КСВ / КСВ: Функция оперативно выведена из работы" w:value="КСВ / КСВ: Функция оперативно выведена из работы"/>
                   <w:listItem w:displayText="ЛЗШ / ЛЗШ: Обнаружение неисправности" w:value="ЛЗШ / ЛЗШ: Обнаружение неисправности"/>
                   <w:listItem w:displayText="ЛЗШ / ЛЗШ: Пуск" w:value="ЛЗШ / ЛЗШ: Пуск"/>
                   <w:listItem w:displayText="ЛЗШ / ЛЗШ: Пуск ИО тока по фазе B" w:value="ЛЗШ / ЛЗШ: Пуск ИО тока по фазе B"/>
@@ -7001,6 +8959,57 @@
                   <w:listItem w:displayText="МТЗ / ОНМ: Пуск по фазе C" w:value="МТЗ / ОНМ: Пуск по фазе C"/>
                   <w:listItem w:displayText="МТЗ / ОНМ: Пуск по фазе А" w:value="МТЗ / ОНМ: Пуск по фазе А"/>
                   <w:listItem w:displayText="МТЗ / ОУ МТЗ: Срабатывание" w:value="МТЗ / ОУ МТЗ: Срабатывание"/>
+                  <w:listItem w:displayText="ПДС / В: Поведение местного управления" w:value="ПДС / В: Поведение местного управления"/>
+                  <w:listItem w:displayText="ПДС / В: Положение ключа режима управления" w:value="ПДС / В: Положение ключа режима управления"/>
+                  <w:listItem w:displayText="ПДС / В: Положение ключа режима управления привода В" w:value="ПДС / В: Положение ключа режима управления привода В"/>
+                  <w:listItem w:displayText="ПДС / В: Право переключения на уровне станции" w:value="ПДС / В: Право переключения на уровне станции"/>
+                  <w:listItem w:displayText="ПДС / ВЭ1: Поведение местного управления" w:value="ПДС / ВЭ1: Поведение местного управления"/>
+                  <w:listItem w:displayText="ПДС / ВЭ1: Положение ключа режима управления" w:value="ПДС / ВЭ1: Положение ключа режима управления"/>
+                  <w:listItem w:displayText="ПДС / ВЭ1: Право переключения на уровне станции" w:value="ПДС / ВЭ1: Право переключения на уровне станции"/>
+                  <w:listItem w:displayText="ПДС / ВЭ1: Ремонтное положение коммутационного аппарата" w:value="ПДС / ВЭ1: Ремонтное положение коммутационного аппарата"/>
+                  <w:listItem w:displayText="ПДС / ВЭ2: Поведение местного управления" w:value="ПДС / ВЭ2: Поведение местного управления"/>
+                  <w:listItem w:displayText="ПДС / ВЭ2: Положение ключа режима управления" w:value="ПДС / ВЭ2: Положение ключа режима управления"/>
+                  <w:listItem w:displayText="ПДС / ВЭ2: Право переключения на уровне станции" w:value="ПДС / ВЭ2: Право переключения на уровне станции"/>
+                  <w:listItem w:displayText="ПДС / ВЭ2: Ремонтное положение коммутационного аппарата" w:value="ПДС / ВЭ2: Ремонтное положение коммутационного аппарата"/>
+                  <w:listItem w:displayText="ПДС / ЗН: Поведение местного управления" w:value="ПДС / ЗН: Поведение местного управления"/>
+                  <w:listItem w:displayText="ПДС / ЗН: Положение ключа режима управления" w:value="ПДС / ЗН: Положение ключа режима управления"/>
+                  <w:listItem w:displayText="ПДС / ЗН: Право переключения на уровне станции" w:value="ПДС / ЗН: Право переключения на уровне станции"/>
+                  <w:listItem w:displayText="ПДС / КИ: Аварийный уровень изоляции" w:value="ПДС / КИ: Аварийный уровень изоляции"/>
+                  <w:listItem w:displayText="ПДС / КИ: Низкий уровень изоляции" w:value="ПДС / КИ: Низкий уровень изоляции"/>
+                  <w:listItem w:displayText="ПДС / КПруж: Пружина не заведена" w:value="ПДС / КПруж: Пружина не заведена"/>
+                  <w:listItem w:displayText="ПДС / КЦВ: Контроль цепи ЭМВ" w:value="ПДС / КЦВ: Контроль цепи ЭМВ"/>
+                  <w:listItem w:displayText="ПДС / КЦВ: Контроль цепи ЭМО1" w:value="ПДС / КЦВ: Контроль цепи ЭМО1"/>
+                  <w:listItem w:displayText="ПДС / КЦВ: Контроль цепи ЭМО2" w:value="ПДС / КЦВ: Контроль цепи ЭМО2"/>
+                  <w:listItem w:displayText="ПДС / КЦВ: Работа ЭМВ" w:value="ПДС / КЦВ: Работа ЭМВ"/>
+                  <w:listItem w:displayText="ПДС / КЦВ: Работа ЭМО1" w:value="ПДС / КЦВ: Работа ЭМО1"/>
+                  <w:listItem w:displayText="ПДС / КЦВ: Работа ЭМО2" w:value="ПДС / КЦВ: Работа ЭМО2"/>
+                  <w:listItem w:displayText="ПДС / ПДС: Функция введена в работу" w:value="ПДС / ПДС: Функция введена в работу"/>
+                  <w:listItem w:displayText="ПДС / ПДС: Функция оперативно выведена из работы" w:value="ПДС / ПДС: Функция оперативно выведена из работы"/>
+                  <w:listItem w:displayText="ПДС НКУ / SA1: Цепь управления введена" w:value="ПДС НКУ / SA1: Цепь управления введена"/>
+                  <w:listItem w:displayText="ПДС НКУ / SA2: Цепь управления введена" w:value="ПДС НКУ / SA2: Цепь управления введена"/>
+                  <w:listItem w:displayText="ПДС НКУ / SA3: Цепь управления введена" w:value="ПДС НКУ / SA3: Цепь управления введена"/>
+                  <w:listItem w:displayText="ПДС НКУ / SA4: Цепь управления введена" w:value="ПДС НКУ / SA4: Цепь управления введена"/>
+                  <w:listItem w:displayText="ПДС НКУ / SG1: Рабочее положение испытательного блока" w:value="ПДС НКУ / SG1: Рабочее положение испытательного блока"/>
+                  <w:listItem w:displayText="ПДС НКУ / SG2: Рабочее положение испытательного блока" w:value="ПДС НКУ / SG2: Рабочее положение испытательного блока"/>
+                  <w:listItem w:displayText="ПДС НКУ / SG3: Рабочее положение испытательного блока" w:value="ПДС НКУ / SG3: Рабочее положение испытательного блока"/>
+                  <w:listItem w:displayText="ПДС НКУ / Дверь: Дверь отсека/ шкафа закрыта" w:value="ПДС НКУ / Дверь: Дверь отсека/ шкафа закрыта"/>
+                  <w:listItem w:displayText="ПДС НКУ / Дверь: Дверь отсека/ шкафа открыта" w:value="ПДС НКУ / Дверь: Дверь отсека/ шкафа открыта"/>
+                  <w:listItem w:displayText="ПДС НКУ / ОТ ОБР 1: Неисправность оперативного тока цепей ОБР 1" w:value="ПДС НКУ / ОТ ОБР 1: Неисправность оперативного тока цепей ОБР 1"/>
+                  <w:listItem w:displayText="ПДС НКУ / ОТ ОБР 2: Неисправность оперативного тока цепей ОБР 2" w:value="ПДС НКУ / ОТ ОБР 2: Неисправность оперативного тока цепей ОБР 2"/>
+                  <w:listItem w:displayText="ПДС НКУ / ОТ ЦСВ: Неисправность ОТ цепей сигнализации В" w:value="ПДС НКУ / ОТ ЦСВ: Неисправность ОТ цепей сигнализации В"/>
+                  <w:listItem w:displayText="ПДС НКУ / ОТ ЭМО1, ЭМВ: Неисправность оперативного тока цепей ЭМВ, ЭМО1" w:value="ПДС НКУ / ОТ ЭМО1, ЭМВ: Неисправность оперативного тока цепей ЭМВ, ЭМО1"/>
+                  <w:listItem w:displayText="ПДС НКУ / ОТ ЭМО2: Неисправность оперативного тока цепей ЭМО2" w:value="ПДС НКУ / ОТ ЭМО2: Неисправность оперативного тока цепей ЭМО2"/>
+                  <w:listItem w:displayText="ПДС НКУ / ПДС НКУ: Функция введена в работу" w:value="ПДС НКУ / ПДС НКУ: Функция введена в работу"/>
+                  <w:listItem w:displayText="ПДС НКУ / ПДС НКУ: Функция оперативно выведена из работы" w:value="ПДС НКУ / ПДС НКУ: Функция оперативно выведена из работы"/>
+                  <w:listItem w:displayText="ПДС НКУ / Пер.ав.дебл.см.яч.: Цепи аварийной деблокировки ячейки выведены" w:value="ПДС НКУ / Пер.ав.дебл.см.яч.: Цепи аварийной деблокировки ячейки выведены"/>
+                  <w:listItem w:displayText="ПС / ПС: Пуск предупредительной сигнализации" w:value="ПС / ПС: Пуск предупредительной сигнализации"/>
+                  <w:listItem w:displayText="ПС / ПС: Пуск предупредительной сигнализации (импульс)" w:value="ПС / ПС: Пуск предупредительной сигнализации (импульс)"/>
+                  <w:listItem w:displayText="СС / СС: БИ выведены" w:value="СС / СС: БИ выведены"/>
+                  <w:listItem w:displayText="СС / СС: Выходные цепи разобраны" w:value="СС / СС: Выходные цепи разобраны"/>
+                  <w:listItem w:displayText="СС / СС: Неисправность КА" w:value="СС / СС: Неисправность КА"/>
+                  <w:listItem w:displayText="СС / СС: Общий внешний сигнал" w:value="СС / СС: Общий внешний сигнал"/>
+                  <w:listItem w:displayText="СС / СС: Превышение времени переключения КА" w:value="СС / СС: Превышение времени переключения КА"/>
+                  <w:listItem w:displayText="СС / СС: Сигнализация цепей опер.тока" w:value="СС / СС: Сигнализация цепей опер.тока"/>
                   <w:listItem w:displayText="ТЗНП / АУ ТЗНП: Пуск автоматического ускорения ТЗНП" w:value="ТЗНП / АУ ТЗНП: Пуск автоматического ускорения ТЗНП"/>
                   <w:listItem w:displayText="ТЗНП / БНТ НП: Пуск БНТ НП" w:value="ТЗНП / БНТ НП: Пуск БНТ НП"/>
                   <w:listItem w:displayText="ТЗНП / БЧС: Блокировка чувствительных ступеней" w:value="ТЗНП / БЧС: Блокировка чувствительных ступеней"/>
@@ -7040,6 +9049,11 @@
                   <w:listItem w:displayText="ТК ЗДЗ / ТК ЗДЗ: Пуск ИО тока" w:value="ТК ЗДЗ / ТК ЗДЗ: Пуск ИО тока"/>
                   <w:listItem w:displayText="ТК ЗДЗ / ТК ЗДЗ: Функция введена в работу" w:value="ТК ЗДЗ / ТК ЗДЗ: Функция введена в работу"/>
                   <w:listItem w:displayText="ТК ЗДЗ / ТК ЗДЗ: Функция оперативно выведена из работы" w:value="ТК ЗДЗ / ТК ЗДЗ: Функция оперативно выведена из работы"/>
+                  <w:listItem w:displayText="УВ / УВ: Включение с контролем синхронизма" w:value="УВ / УВ: Включение с контролем синхронизма"/>
+                  <w:listItem w:displayText="УВ / УВ: Включить выключатель" w:value="УВ / УВ: Включить выключатель"/>
+                  <w:listItem w:displayText="УВ / УВ: Задержка включения с контролем синхронизма" w:value="УВ / УВ: Задержка включения с контролем синхронизма"/>
+                  <w:listItem w:displayText="УВ / УВ: Функция введена в работу" w:value="УВ / УВ: Функция введена в работу"/>
+                  <w:listItem w:displayText="УВ / УВ: Функция оперативно выведена из работы" w:value="УВ / УВ: Функция оперативно выведена из работы"/>
                   <w:listItem w:displayText="УРОВ / УРОВ: Пуск" w:value="УРОВ / УРОВ: Пуск"/>
                   <w:listItem w:displayText="УРОВ / УРОВ: Пуск ИО максимального тока" w:value="УРОВ / УРОВ: Пуск ИО максимального тока"/>
                   <w:listItem w:displayText="УРОВ / УРОВ: Срабатывание" w:value="УРОВ / УРОВ: Срабатывание"/>
@@ -7355,6 +9369,38 @@
                   <w:listItem w:displayText="ЗОП / ЗОП: Срабатывание на сигнал" w:value="ЗОП / ЗОП: Срабатывание на сигнал"/>
                   <w:listItem w:displayText="ЗОП / ЗОП: Функция введена в работу" w:value="ЗОП / ЗОП: Функция введена в работу"/>
                   <w:listItem w:displayText="ЗОП / ЗОП: Функция оперативно выведена из работы" w:value="ЗОП / ЗОП: Функция оперативно выведена из работы"/>
+                  <w:listItem w:displayText="КА / В: Выключатель включен" w:value="КА / В: Выключатель включен"/>
+                  <w:listItem w:displayText="КА / В: Выключатель отключен" w:value="КА / В: Выключатель отключен"/>
+                  <w:listItem w:displayText="КА / В: Команда «включить» выключатель через выходное реле" w:value="КА / В: Команда «включить» выключатель через выходное реле"/>
+                  <w:listItem w:displayText="КА / В: Команда «отключить» выключатель через выходное реле" w:value="КА / В: Команда «отключить» выключатель через выходное реле"/>
+                  <w:listItem w:displayText="КА / В: Неисправное положение выключателя" w:value="КА / В: Неисправное положение выключателя"/>
+                  <w:listItem w:displayText="КА / В: Промежуточное положение выключателя" w:value="КА / В: Промежуточное положение выключателя"/>
+                  <w:listItem w:displayText="КА / В: Функция введена в работу" w:value="КА / В: Функция введена в работу"/>
+                  <w:listItem w:displayText="КА / ВЭ1: Команда «вкатить» выкатной элемент через выходное реле" w:value="КА / ВЭ1: Команда «вкатить» выкатной элемент через выходное реле"/>
+                  <w:listItem w:displayText="КА / ВЭ1: Команда «выкатить» выкатной элемент через выходное реле" w:value="КА / ВЭ1: Команда «выкатить» выкатной элемент через выходное реле"/>
+                  <w:listItem w:displayText="КА / ВЭ1: Неисправное положение выкатного элемента" w:value="КА / ВЭ1: Неисправное положение выкатного элемента"/>
+                  <w:listItem w:displayText="КА / ВЭ1: Положение выкатного элемента «Вкачен»" w:value="КА / ВЭ1: Положение выкатного элемента «Вкачен»"/>
+                  <w:listItem w:displayText="КА / ВЭ1: Положение выкатного элемента «Выкачен»" w:value="КА / ВЭ1: Положение выкатного элемента «Выкачен»"/>
+                  <w:listItem w:displayText="КА / ВЭ1: Промежуточное положение выкатного элемента" w:value="КА / ВЭ1: Промежуточное положение выкатного элемента"/>
+                  <w:listItem w:displayText="КА / ВЭ1: Ремонтное положение выкатного элемента" w:value="КА / ВЭ1: Ремонтное положение выкатного элемента"/>
+                  <w:listItem w:displayText="КА / ВЭ1: Функция введена в работу" w:value="КА / ВЭ1: Функция введена в работу"/>
+                  <w:listItem w:displayText="КА / ВЭ2: Команда «вкатить» выкатной элемент через выходное реле" w:value="КА / ВЭ2: Команда «вкатить» выкатной элемент через выходное реле"/>
+                  <w:listItem w:displayText="КА / ВЭ2: Команда «выкатить» выкатной элемент через выходное реле" w:value="КА / ВЭ2: Команда «выкатить» выкатной элемент через выходное реле"/>
+                  <w:listItem w:displayText="КА / ВЭ2: Неисправное положение выкатного элемента" w:value="КА / ВЭ2: Неисправное положение выкатного элемента"/>
+                  <w:listItem w:displayText="КА / ВЭ2: Положение выкатного элемента «Вкачен»" w:value="КА / ВЭ2: Положение выкатного элемента «Вкачен»"/>
+                  <w:listItem w:displayText="КА / ВЭ2: Положение выкатного элемента «Выкачен»" w:value="КА / ВЭ2: Положение выкатного элемента «Выкачен»"/>
+                  <w:listItem w:displayText="КА / ВЭ2: Промежуточное положение выкатного элемента" w:value="КА / ВЭ2: Промежуточное положение выкатного элемента"/>
+                  <w:listItem w:displayText="КА / ВЭ2: Ремонтное положение выкатного элемента" w:value="КА / ВЭ2: Ремонтное положение выкатного элемента"/>
+                  <w:listItem w:displayText="КА / ВЭ2: Функция введена в работу" w:value="КА / ВЭ2: Функция введена в работу"/>
+                  <w:listItem w:displayText="КА / ЗН: Заземляющий нож включен" w:value="КА / ЗН: Заземляющий нож включен"/>
+                  <w:listItem w:displayText="КА / ЗН: Заземляющий нож отключен" w:value="КА / ЗН: Заземляющий нож отключен"/>
+                  <w:listItem w:displayText="КА / ЗН: Команда «включить» заземляющий нож через выходное реле" w:value="КА / ЗН: Команда «включить» заземляющий нож через выходное реле"/>
+                  <w:listItem w:displayText="КА / ЗН: Команда «отключить» заземляющий нож через выходное реле" w:value="КА / ЗН: Команда «отключить» заземляющий нож через выходное реле"/>
+                  <w:listItem w:displayText="КА / ЗН: Неисправное положение заземляющего ножа" w:value="КА / ЗН: Неисправное положение заземляющего ножа"/>
+                  <w:listItem w:displayText="КА / ЗН: Промежуточное положение заземляющего ножа" w:value="КА / ЗН: Промежуточное положение заземляющего ножа"/>
+                  <w:listItem w:displayText="КА / ЗН: Функция введена в работу" w:value="КА / ЗН: Функция введена в работу"/>
+                  <w:listItem w:displayText="КА / КА: Функция введена в работу" w:value="КА / КА: Функция введена в работу"/>
+                  <w:listItem w:displayText="КА / КА: Функция оперативно выведена из работы" w:value="КА / КА: Функция оперативно выведена из работы"/>
                   <w:listItem w:displayText="КНН 1сш / КНН 1сш: Пуск" w:value="КНН 1сш / КНН 1сш: Пуск"/>
                   <w:listItem w:displayText="КНН 1сш / КНН 1сш: Пуск ИО напряжения" w:value="КНН 1сш / КНН 1сш: Пуск ИО напряжения"/>
                   <w:listItem w:displayText="КНН 1сш / КНН 1сш: Пуск ИО напряжения ОП" w:value="КНН 1сш / КНН 1сш: Пуск ИО напряжения ОП"/>
@@ -7375,6 +9421,68 @@
                   <w:listItem w:displayText="КОН 2сш / КОН 2сш: Пуск ИО напряжения ОП" w:value="КОН 2сш / КОН 2сш: Пуск ИО напряжения ОП"/>
                   <w:listItem w:displayText="КОН 2сш / КОН 2сш: Функция введена в работу" w:value="КОН 2сш / КОН 2сш: Функция введена в работу"/>
                   <w:listItem w:displayText="КОН 2сш / КОН 2сш: Функция оперативно выведена из работы" w:value="КОН 2сш / КОН 2сш: Функция оперативно выведена из работы"/>
+                  <w:listItem w:displayText="КП / КП: Идет переключение" w:value="КП / КП: Идет переключение"/>
+                  <w:listItem w:displayText="КП / КП: Функция введена в работу" w:value="КП / КП: Функция введена в работу"/>
+                  <w:listItem w:displayText="КП / КП: Функция оперативно выведена из работы" w:value="КП / КП: Функция оперативно выведена из работы"/>
+                  <w:listItem w:displayText="КП / ОБР В: Блокировка включения" w:value="КП / ОБР В: Блокировка включения"/>
+                  <w:listItem w:displayText="КП / ОБР В: Разрешить включение" w:value="КП / ОБР В: Разрешить включение"/>
+                  <w:listItem w:displayText="КП / ОБР ВЭ1: Разрешение управления первым выкатным элементом" w:value="КП / ОБР ВЭ1: Разрешение управления первым выкатным элементом"/>
+                  <w:listItem w:displayText="КП / ОБР ВЭ2: Разрешение управления вторым выкатным элементом" w:value="КП / ОБР ВЭ2: Разрешение управления вторым выкатным элементом"/>
+                  <w:listItem w:displayText="КП / ОБР ЗН: Разрешение управления заземляющим ножом" w:value="КП / ОБР ЗН: Разрешение управления заземляющим ножом"/>
+                  <w:listItem w:displayText="КП / УВ: Включение с контролем синхронизма" w:value="КП / УВ: Включение с контролем синхронизма"/>
+                  <w:listItem w:displayText="КП / УВ: Включить выключатель" w:value="КП / УВ: Включить выключатель"/>
+                  <w:listItem w:displayText="КП / УВ: Задержка включения с контролем синхронизма" w:value="КП / УВ: Задержка включения с контролем синхронизма"/>
+                  <w:listItem w:displayText="КП / УВ: Идет переключение" w:value="КП / УВ: Идет переключение"/>
+                  <w:listItem w:displayText="КП / УВ: Отключить выключатель" w:value="КП / УВ: Отключить выключатель"/>
+                  <w:listItem w:displayText="КП / УВ: Поведение местного управления" w:value="КП / УВ: Поведение местного управления"/>
+                  <w:listItem w:displayText="КП / УВ: Положение В (Включено)" w:value="КП / УВ: Положение В (Включено)"/>
+                  <w:listItem w:displayText="КП / УВ: Положение В (Не определено)" w:value="КП / УВ: Положение В (Не определено)"/>
+                  <w:listItem w:displayText="КП / УВ: Положение В (Неисправность)" w:value="КП / УВ: Положение В (Неисправность)"/>
+                  <w:listItem w:displayText="КП / УВ: Положение В (Отключено)" w:value="КП / УВ: Положение В (Отключено)"/>
+                  <w:listItem w:displayText="КП / УВ: Положение ключа режима управления" w:value="КП / УВ: Положение ключа режима управления"/>
+                  <w:listItem w:displayText="КП / УВ: Право переключения на уровне станции" w:value="КП / УВ: Право переключения на уровне станции"/>
+                  <w:listItem w:displayText="КП / УВ: Сигнал превышения допустимого времени переключения" w:value="КП / УВ: Сигнал превышения допустимого времени переключения"/>
+                  <w:listItem w:displayText="КП / УВ: Функция введена в работу" w:value="КП / УВ: Функция введена в работу"/>
+                  <w:listItem w:displayText="КП / УВЭ1: Вкатить первый выкатной элемент" w:value="КП / УВЭ1: Вкатить первый выкатной элемент"/>
+                  <w:listItem w:displayText="КП / УВЭ1: Выкатить первый выкатной элемент" w:value="КП / УВЭ1: Выкатить первый выкатной элемент"/>
+                  <w:listItem w:displayText="КП / УВЭ1: Идет переключение" w:value="КП / УВЭ1: Идет переключение"/>
+                  <w:listItem w:displayText="КП / УВЭ1: Поведение местного управления" w:value="КП / УВЭ1: Поведение местного управления"/>
+                  <w:listItem w:displayText="КП / УВЭ1: Положение ВЭ1 (Вкачен)" w:value="КП / УВЭ1: Положение ВЭ1 (Вкачен)"/>
+                  <w:listItem w:displayText="КП / УВЭ1: Положение ВЭ1 (Выкачен)" w:value="КП / УВЭ1: Положение ВЭ1 (Выкачен)"/>
+                  <w:listItem w:displayText="КП / УВЭ1: Положение ВЭ1 (Не определено)" w:value="КП / УВЭ1: Положение ВЭ1 (Не определено)"/>
+                  <w:listItem w:displayText="КП / УВЭ1: Положение ВЭ1 (Неисправность)" w:value="КП / УВЭ1: Положение ВЭ1 (Неисправность)"/>
+                  <w:listItem w:displayText="КП / УВЭ1: Положение ключа режима управления" w:value="КП / УВЭ1: Положение ключа режима управления"/>
+                  <w:listItem w:displayText="КП / УВЭ1: Право переключения на уровне станции" w:value="КП / УВЭ1: Право переключения на уровне станции"/>
+                  <w:listItem w:displayText="КП / УВЭ1: Сигнал превышения допустимого времени переключения" w:value="КП / УВЭ1: Сигнал превышения допустимого времени переключения"/>
+                  <w:listItem w:displayText="КП / УВЭ1: Функция введена в работу" w:value="КП / УВЭ1: Функция введена в работу"/>
+                  <w:listItem w:displayText="КП / УВЭ2: Вкатить второй выкатной элемент" w:value="КП / УВЭ2: Вкатить второй выкатной элемент"/>
+                  <w:listItem w:displayText="КП / УВЭ2: Выкатить второй выкатной элемент" w:value="КП / УВЭ2: Выкатить второй выкатной элемент"/>
+                  <w:listItem w:displayText="КП / УВЭ2: Идет переключение" w:value="КП / УВЭ2: Идет переключение"/>
+                  <w:listItem w:displayText="КП / УВЭ2: Поведение местного управления" w:value="КП / УВЭ2: Поведение местного управления"/>
+                  <w:listItem w:displayText="КП / УВЭ2: Положение ВЭ2 (Вкачен)" w:value="КП / УВЭ2: Положение ВЭ2 (Вкачен)"/>
+                  <w:listItem w:displayText="КП / УВЭ2: Положение ВЭ2 (Выкачен)" w:value="КП / УВЭ2: Положение ВЭ2 (Выкачен)"/>
+                  <w:listItem w:displayText="КП / УВЭ2: Положение ВЭ2 (Не определено)" w:value="КП / УВЭ2: Положение ВЭ2 (Не определено)"/>
+                  <w:listItem w:displayText="КП / УВЭ2: Положение ВЭ2 (Неисправность)" w:value="КП / УВЭ2: Положение ВЭ2 (Неисправность)"/>
+                  <w:listItem w:displayText="КП / УВЭ2: Положение ключа режима управления" w:value="КП / УВЭ2: Положение ключа режима управления"/>
+                  <w:listItem w:displayText="КП / УВЭ2: Право переключения на уровне станции" w:value="КП / УВЭ2: Право переключения на уровне станции"/>
+                  <w:listItem w:displayText="КП / УВЭ2: Сигнал превышения допустимого времени переключения" w:value="КП / УВЭ2: Сигнал превышения допустимого времени переключения"/>
+                  <w:listItem w:displayText="КП / УВЭ2: Функция введена в работу" w:value="КП / УВЭ2: Функция введена в работу"/>
+                  <w:listItem w:displayText="КП / УЗН: Включить заземляющий нож" w:value="КП / УЗН: Включить заземляющий нож"/>
+                  <w:listItem w:displayText="КП / УЗН: Идет переключение" w:value="КП / УЗН: Идет переключение"/>
+                  <w:listItem w:displayText="КП / УЗН: Отключить заземляющий нож" w:value="КП / УЗН: Отключить заземляющий нож"/>
+                  <w:listItem w:displayText="КП / УЗН: Поведение местного управления" w:value="КП / УЗН: Поведение местного управления"/>
+                  <w:listItem w:displayText="КП / УЗН: Положение ЗН (Включено)" w:value="КП / УЗН: Положение ЗН (Включено)"/>
+                  <w:listItem w:displayText="КП / УЗН: Положение ЗН (Не определено)" w:value="КП / УЗН: Положение ЗН (Не определено)"/>
+                  <w:listItem w:displayText="КП / УЗН: Положение ЗН (Неисправность)" w:value="КП / УЗН: Положение ЗН (Неисправность)"/>
+                  <w:listItem w:displayText="КП / УЗН: Положение ЗН (Отключено)" w:value="КП / УЗН: Положение ЗН (Отключено)"/>
+                  <w:listItem w:displayText="КП / УЗН: Положение ключа режима управления" w:value="КП / УЗН: Положение ключа режима управления"/>
+                  <w:listItem w:displayText="КП / УЗН: Право переключения на уровне станции" w:value="КП / УЗН: Право переключения на уровне станции"/>
+                  <w:listItem w:displayText="КП / УЗН: Сигнал превышения допустимого времени переключения" w:value="КП / УЗН: Сигнал превышения допустимого времени переключения"/>
+                  <w:listItem w:displayText="КП / УЗН: Функция введена в работу" w:value="КП / УЗН: Функция введена в работу"/>
+                  <w:listItem w:displayText="КРВ / КРВ: Превышен коммутационный ресурс выключателя" w:value="КРВ / КРВ: Превышен коммутационный ресурс выключателя"/>
+                  <w:listItem w:displayText="КРВ / КРВ: Превышен механический ресурс выключателя" w:value="КРВ / КРВ: Превышен механический ресурс выключателя"/>
+                  <w:listItem w:displayText="КРВ / КРВ: Превышен ресурс выключателя" w:value="КРВ / КРВ: Превышен ресурс выключателя"/>
+                  <w:listItem w:displayText="КРВ / КРВ: Функция введена в работу" w:value="КРВ / КРВ: Функция введена в работу"/>
                   <w:listItem w:displayText="КС / КС: Блокировка по скорости изменения частоты" w:value="КС / КС: Блокировка по скорости изменения частоты"/>
                   <w:listItem w:displayText="КС / КС: Нет условий по напряжению" w:value="КС / КС: Нет условий по напряжению"/>
                   <w:listItem w:displayText="КС / КС: Нет условий по углу" w:value="КС / КС: Нет условий по углу"/>
@@ -7387,6 +9495,18 @@
                   <w:listItem w:displayText="КС / КС: Разрешение оперативного включения" w:value="КС / КС: Разрешение оперативного включения"/>
                   <w:listItem w:displayText="КС / КС: Функция введена в работу" w:value="КС / КС: Функция введена в работу"/>
                   <w:listItem w:displayText="КС / КС: Функция оперативно выведена из работы" w:value="КС / КС: Функция оперативно выведена из работы"/>
+                  <w:listItem w:displayText="КСВ / КСВ: Блокировка включения В" w:value="КСВ / КСВ: Блокировка включения В"/>
+                  <w:listItem w:displayText="КСВ / КСВ: Блокировка отключения В" w:value="КСВ / КСВ: Блокировка отключения В"/>
+                  <w:listItem w:displayText="КСВ / КСВ: В аварийно отключен" w:value="КСВ / КСВ: В аварийно отключен"/>
+                  <w:listItem w:displayText="КСВ / КСВ: В самопроизвольно отключен" w:value="КСВ / КСВ: В самопроизвольно отключен"/>
+                  <w:listItem w:displayText="КСВ / КСВ: Защита ЭМВ" w:value="КСВ / КСВ: Защита ЭМВ"/>
+                  <w:listItem w:displayText="КСВ / КСВ: Защита ЭМО1" w:value="КСВ / КСВ: Защита ЭМО1"/>
+                  <w:listItem w:displayText="КСВ / КСВ: Защита ЭМО2" w:value="КСВ / КСВ: Защита ЭМО2"/>
+                  <w:listItem w:displayText="КСВ / КСВ: Неисправность В" w:value="КСВ / КСВ: Неисправность В"/>
+                  <w:listItem w:displayText="КСВ / КСВ: Неисправность цепей ЭМУ" w:value="КСВ / КСВ: Неисправность цепей ЭМУ"/>
+                  <w:listItem w:displayText="КСВ / КСВ: Реле фиксации команды" w:value="КСВ / КСВ: Реле фиксации команды"/>
+                  <w:listItem w:displayText="КСВ / КСВ: Функция введена в работу" w:value="КСВ / КСВ: Функция введена в работу"/>
+                  <w:listItem w:displayText="КСВ / КСВ: Функция оперативно выведена из работы" w:value="КСВ / КСВ: Функция оперативно выведена из работы"/>
                   <w:listItem w:displayText="ЛЗШ / ЛЗШ: Обнаружение неисправности" w:value="ЛЗШ / ЛЗШ: Обнаружение неисправности"/>
                   <w:listItem w:displayText="ЛЗШ / ЛЗШ: Пуск" w:value="ЛЗШ / ЛЗШ: Пуск"/>
                   <w:listItem w:displayText="ЛЗШ / ЛЗШ: Пуск ИО тока по фазе B" w:value="ЛЗШ / ЛЗШ: Пуск ИО тока по фазе B"/>
@@ -7479,6 +9599,57 @@
                   <w:listItem w:displayText="МТЗ / ОНМ: Пуск по фазе C" w:value="МТЗ / ОНМ: Пуск по фазе C"/>
                   <w:listItem w:displayText="МТЗ / ОНМ: Пуск по фазе А" w:value="МТЗ / ОНМ: Пуск по фазе А"/>
                   <w:listItem w:displayText="МТЗ / ОУ МТЗ: Срабатывание" w:value="МТЗ / ОУ МТЗ: Срабатывание"/>
+                  <w:listItem w:displayText="ПДС / В: Поведение местного управления" w:value="ПДС / В: Поведение местного управления"/>
+                  <w:listItem w:displayText="ПДС / В: Положение ключа режима управления" w:value="ПДС / В: Положение ключа режима управления"/>
+                  <w:listItem w:displayText="ПДС / В: Положение ключа режима управления привода В" w:value="ПДС / В: Положение ключа режима управления привода В"/>
+                  <w:listItem w:displayText="ПДС / В: Право переключения на уровне станции" w:value="ПДС / В: Право переключения на уровне станции"/>
+                  <w:listItem w:displayText="ПДС / ВЭ1: Поведение местного управления" w:value="ПДС / ВЭ1: Поведение местного управления"/>
+                  <w:listItem w:displayText="ПДС / ВЭ1: Положение ключа режима управления" w:value="ПДС / ВЭ1: Положение ключа режима управления"/>
+                  <w:listItem w:displayText="ПДС / ВЭ1: Право переключения на уровне станции" w:value="ПДС / ВЭ1: Право переключения на уровне станции"/>
+                  <w:listItem w:displayText="ПДС / ВЭ1: Ремонтное положение коммутационного аппарата" w:value="ПДС / ВЭ1: Ремонтное положение коммутационного аппарата"/>
+                  <w:listItem w:displayText="ПДС / ВЭ2: Поведение местного управления" w:value="ПДС / ВЭ2: Поведение местного управления"/>
+                  <w:listItem w:displayText="ПДС / ВЭ2: Положение ключа режима управления" w:value="ПДС / ВЭ2: Положение ключа режима управления"/>
+                  <w:listItem w:displayText="ПДС / ВЭ2: Право переключения на уровне станции" w:value="ПДС / ВЭ2: Право переключения на уровне станции"/>
+                  <w:listItem w:displayText="ПДС / ВЭ2: Ремонтное положение коммутационного аппарата" w:value="ПДС / ВЭ2: Ремонтное положение коммутационного аппарата"/>
+                  <w:listItem w:displayText="ПДС / ЗН: Поведение местного управления" w:value="ПДС / ЗН: Поведение местного управления"/>
+                  <w:listItem w:displayText="ПДС / ЗН: Положение ключа режима управления" w:value="ПДС / ЗН: Положение ключа режима управления"/>
+                  <w:listItem w:displayText="ПДС / ЗН: Право переключения на уровне станции" w:value="ПДС / ЗН: Право переключения на уровне станции"/>
+                  <w:listItem w:displayText="ПДС / КИ: Аварийный уровень изоляции" w:value="ПДС / КИ: Аварийный уровень изоляции"/>
+                  <w:listItem w:displayText="ПДС / КИ: Низкий уровень изоляции" w:value="ПДС / КИ: Низкий уровень изоляции"/>
+                  <w:listItem w:displayText="ПДС / КПруж: Пружина не заведена" w:value="ПДС / КПруж: Пружина не заведена"/>
+                  <w:listItem w:displayText="ПДС / КЦВ: Контроль цепи ЭМВ" w:value="ПДС / КЦВ: Контроль цепи ЭМВ"/>
+                  <w:listItem w:displayText="ПДС / КЦВ: Контроль цепи ЭМО1" w:value="ПДС / КЦВ: Контроль цепи ЭМО1"/>
+                  <w:listItem w:displayText="ПДС / КЦВ: Контроль цепи ЭМО2" w:value="ПДС / КЦВ: Контроль цепи ЭМО2"/>
+                  <w:listItem w:displayText="ПДС / КЦВ: Работа ЭМВ" w:value="ПДС / КЦВ: Работа ЭМВ"/>
+                  <w:listItem w:displayText="ПДС / КЦВ: Работа ЭМО1" w:value="ПДС / КЦВ: Работа ЭМО1"/>
+                  <w:listItem w:displayText="ПДС / КЦВ: Работа ЭМО2" w:value="ПДС / КЦВ: Работа ЭМО2"/>
+                  <w:listItem w:displayText="ПДС / ПДС: Функция введена в работу" w:value="ПДС / ПДС: Функция введена в работу"/>
+                  <w:listItem w:displayText="ПДС / ПДС: Функция оперативно выведена из работы" w:value="ПДС / ПДС: Функция оперативно выведена из работы"/>
+                  <w:listItem w:displayText="ПДС НКУ / SA1: Цепь управления введена" w:value="ПДС НКУ / SA1: Цепь управления введена"/>
+                  <w:listItem w:displayText="ПДС НКУ / SA2: Цепь управления введена" w:value="ПДС НКУ / SA2: Цепь управления введена"/>
+                  <w:listItem w:displayText="ПДС НКУ / SA3: Цепь управления введена" w:value="ПДС НКУ / SA3: Цепь управления введена"/>
+                  <w:listItem w:displayText="ПДС НКУ / SA4: Цепь управления введена" w:value="ПДС НКУ / SA4: Цепь управления введена"/>
+                  <w:listItem w:displayText="ПДС НКУ / SG1: Рабочее положение испытательного блока" w:value="ПДС НКУ / SG1: Рабочее положение испытательного блока"/>
+                  <w:listItem w:displayText="ПДС НКУ / SG2: Рабочее положение испытательного блока" w:value="ПДС НКУ / SG2: Рабочее положение испытательного блока"/>
+                  <w:listItem w:displayText="ПДС НКУ / SG3: Рабочее положение испытательного блока" w:value="ПДС НКУ / SG3: Рабочее положение испытательного блока"/>
+                  <w:listItem w:displayText="ПДС НКУ / Дверь: Дверь отсека/ шкафа закрыта" w:value="ПДС НКУ / Дверь: Дверь отсека/ шкафа закрыта"/>
+                  <w:listItem w:displayText="ПДС НКУ / Дверь: Дверь отсека/ шкафа открыта" w:value="ПДС НКУ / Дверь: Дверь отсека/ шкафа открыта"/>
+                  <w:listItem w:displayText="ПДС НКУ / ОТ ОБР 1: Неисправность оперативного тока цепей ОБР 1" w:value="ПДС НКУ / ОТ ОБР 1: Неисправность оперативного тока цепей ОБР 1"/>
+                  <w:listItem w:displayText="ПДС НКУ / ОТ ОБР 2: Неисправность оперативного тока цепей ОБР 2" w:value="ПДС НКУ / ОТ ОБР 2: Неисправность оперативного тока цепей ОБР 2"/>
+                  <w:listItem w:displayText="ПДС НКУ / ОТ ЦСВ: Неисправность ОТ цепей сигнализации В" w:value="ПДС НКУ / ОТ ЦСВ: Неисправность ОТ цепей сигнализации В"/>
+                  <w:listItem w:displayText="ПДС НКУ / ОТ ЭМО1, ЭМВ: Неисправность оперативного тока цепей ЭМВ, ЭМО1" w:value="ПДС НКУ / ОТ ЭМО1, ЭМВ: Неисправность оперативного тока цепей ЭМВ, ЭМО1"/>
+                  <w:listItem w:displayText="ПДС НКУ / ОТ ЭМО2: Неисправность оперативного тока цепей ЭМО2" w:value="ПДС НКУ / ОТ ЭМО2: Неисправность оперативного тока цепей ЭМО2"/>
+                  <w:listItem w:displayText="ПДС НКУ / ПДС НКУ: Функция введена в работу" w:value="ПДС НКУ / ПДС НКУ: Функция введена в работу"/>
+                  <w:listItem w:displayText="ПДС НКУ / ПДС НКУ: Функция оперативно выведена из работы" w:value="ПДС НКУ / ПДС НКУ: Функция оперативно выведена из работы"/>
+                  <w:listItem w:displayText="ПДС НКУ / Пер.ав.дебл.см.яч.: Цепи аварийной деблокировки ячейки выведены" w:value="ПДС НКУ / Пер.ав.дебл.см.яч.: Цепи аварийной деблокировки ячейки выведены"/>
+                  <w:listItem w:displayText="ПС / ПС: Пуск предупредительной сигнализации" w:value="ПС / ПС: Пуск предупредительной сигнализации"/>
+                  <w:listItem w:displayText="ПС / ПС: Пуск предупредительной сигнализации (импульс)" w:value="ПС / ПС: Пуск предупредительной сигнализации (импульс)"/>
+                  <w:listItem w:displayText="СС / СС: БИ выведены" w:value="СС / СС: БИ выведены"/>
+                  <w:listItem w:displayText="СС / СС: Выходные цепи разобраны" w:value="СС / СС: Выходные цепи разобраны"/>
+                  <w:listItem w:displayText="СС / СС: Неисправность КА" w:value="СС / СС: Неисправность КА"/>
+                  <w:listItem w:displayText="СС / СС: Общий внешний сигнал" w:value="СС / СС: Общий внешний сигнал"/>
+                  <w:listItem w:displayText="СС / СС: Превышение времени переключения КА" w:value="СС / СС: Превышение времени переключения КА"/>
+                  <w:listItem w:displayText="СС / СС: Сигнализация цепей опер.тока" w:value="СС / СС: Сигнализация цепей опер.тока"/>
                   <w:listItem w:displayText="ТЗНП / АУ ТЗНП: Пуск автоматического ускорения ТЗНП" w:value="ТЗНП / АУ ТЗНП: Пуск автоматического ускорения ТЗНП"/>
                   <w:listItem w:displayText="ТЗНП / БНТ НП: Пуск БНТ НП" w:value="ТЗНП / БНТ НП: Пуск БНТ НП"/>
                   <w:listItem w:displayText="ТЗНП / БЧС: Блокировка чувствительных ступеней" w:value="ТЗНП / БЧС: Блокировка чувствительных ступеней"/>
@@ -7518,6 +9689,11 @@
                   <w:listItem w:displayText="ТК ЗДЗ / ТК ЗДЗ: Пуск ИО тока" w:value="ТК ЗДЗ / ТК ЗДЗ: Пуск ИО тока"/>
                   <w:listItem w:displayText="ТК ЗДЗ / ТК ЗДЗ: Функция введена в работу" w:value="ТК ЗДЗ / ТК ЗДЗ: Функция введена в работу"/>
                   <w:listItem w:displayText="ТК ЗДЗ / ТК ЗДЗ: Функция оперативно выведена из работы" w:value="ТК ЗДЗ / ТК ЗДЗ: Функция оперативно выведена из работы"/>
+                  <w:listItem w:displayText="УВ / УВ: Включение с контролем синхронизма" w:value="УВ / УВ: Включение с контролем синхронизма"/>
+                  <w:listItem w:displayText="УВ / УВ: Включить выключатель" w:value="УВ / УВ: Включить выключатель"/>
+                  <w:listItem w:displayText="УВ / УВ: Задержка включения с контролем синхронизма" w:value="УВ / УВ: Задержка включения с контролем синхронизма"/>
+                  <w:listItem w:displayText="УВ / УВ: Функция введена в работу" w:value="УВ / УВ: Функция введена в работу"/>
+                  <w:listItem w:displayText="УВ / УВ: Функция оперативно выведена из работы" w:value="УВ / УВ: Функция оперативно выведена из работы"/>
                   <w:listItem w:displayText="УРОВ / УРОВ: Пуск" w:value="УРОВ / УРОВ: Пуск"/>
                   <w:listItem w:displayText="УРОВ / УРОВ: Пуск ИО максимального тока" w:value="УРОВ / УРОВ: Пуск ИО максимального тока"/>
                   <w:listItem w:displayText="УРОВ / УРОВ: Срабатывание" w:value="УРОВ / УРОВ: Срабатывание"/>
@@ -7833,6 +10009,38 @@
                   <w:listItem w:displayText="ЗОП / ЗОП: Срабатывание на сигнал" w:value="ЗОП / ЗОП: Срабатывание на сигнал"/>
                   <w:listItem w:displayText="ЗОП / ЗОП: Функция введена в работу" w:value="ЗОП / ЗОП: Функция введена в работу"/>
                   <w:listItem w:displayText="ЗОП / ЗОП: Функция оперативно выведена из работы" w:value="ЗОП / ЗОП: Функция оперативно выведена из работы"/>
+                  <w:listItem w:displayText="КА / В: Выключатель включен" w:value="КА / В: Выключатель включен"/>
+                  <w:listItem w:displayText="КА / В: Выключатель отключен" w:value="КА / В: Выключатель отключен"/>
+                  <w:listItem w:displayText="КА / В: Команда «включить» выключатель через выходное реле" w:value="КА / В: Команда «включить» выключатель через выходное реле"/>
+                  <w:listItem w:displayText="КА / В: Команда «отключить» выключатель через выходное реле" w:value="КА / В: Команда «отключить» выключатель через выходное реле"/>
+                  <w:listItem w:displayText="КА / В: Неисправное положение выключателя" w:value="КА / В: Неисправное положение выключателя"/>
+                  <w:listItem w:displayText="КА / В: Промежуточное положение выключателя" w:value="КА / В: Промежуточное положение выключателя"/>
+                  <w:listItem w:displayText="КА / В: Функция введена в работу" w:value="КА / В: Функция введена в работу"/>
+                  <w:listItem w:displayText="КА / ВЭ1: Команда «вкатить» выкатной элемент через выходное реле" w:value="КА / ВЭ1: Команда «вкатить» выкатной элемент через выходное реле"/>
+                  <w:listItem w:displayText="КА / ВЭ1: Команда «выкатить» выкатной элемент через выходное реле" w:value="КА / ВЭ1: Команда «выкатить» выкатной элемент через выходное реле"/>
+                  <w:listItem w:displayText="КА / ВЭ1: Неисправное положение выкатного элемента" w:value="КА / ВЭ1: Неисправное положение выкатного элемента"/>
+                  <w:listItem w:displayText="КА / ВЭ1: Положение выкатного элемента «Вкачен»" w:value="КА / ВЭ1: Положение выкатного элемента «Вкачен»"/>
+                  <w:listItem w:displayText="КА / ВЭ1: Положение выкатного элемента «Выкачен»" w:value="КА / ВЭ1: Положение выкатного элемента «Выкачен»"/>
+                  <w:listItem w:displayText="КА / ВЭ1: Промежуточное положение выкатного элемента" w:value="КА / ВЭ1: Промежуточное положение выкатного элемента"/>
+                  <w:listItem w:displayText="КА / ВЭ1: Ремонтное положение выкатного элемента" w:value="КА / ВЭ1: Ремонтное положение выкатного элемента"/>
+                  <w:listItem w:displayText="КА / ВЭ1: Функция введена в работу" w:value="КА / ВЭ1: Функция введена в работу"/>
+                  <w:listItem w:displayText="КА / ВЭ2: Команда «вкатить» выкатной элемент через выходное реле" w:value="КА / ВЭ2: Команда «вкатить» выкатной элемент через выходное реле"/>
+                  <w:listItem w:displayText="КА / ВЭ2: Команда «выкатить» выкатной элемент через выходное реле" w:value="КА / ВЭ2: Команда «выкатить» выкатной элемент через выходное реле"/>
+                  <w:listItem w:displayText="КА / ВЭ2: Неисправное положение выкатного элемента" w:value="КА / ВЭ2: Неисправное положение выкатного элемента"/>
+                  <w:listItem w:displayText="КА / ВЭ2: Положение выкатного элемента «Вкачен»" w:value="КА / ВЭ2: Положение выкатного элемента «Вкачен»"/>
+                  <w:listItem w:displayText="КА / ВЭ2: Положение выкатного элемента «Выкачен»" w:value="КА / ВЭ2: Положение выкатного элемента «Выкачен»"/>
+                  <w:listItem w:displayText="КА / ВЭ2: Промежуточное положение выкатного элемента" w:value="КА / ВЭ2: Промежуточное положение выкатного элемента"/>
+                  <w:listItem w:displayText="КА / ВЭ2: Ремонтное положение выкатного элемента" w:value="КА / ВЭ2: Ремонтное положение выкатного элемента"/>
+                  <w:listItem w:displayText="КА / ВЭ2: Функция введена в работу" w:value="КА / ВЭ2: Функция введена в работу"/>
+                  <w:listItem w:displayText="КА / ЗН: Заземляющий нож включен" w:value="КА / ЗН: Заземляющий нож включен"/>
+                  <w:listItem w:displayText="КА / ЗН: Заземляющий нож отключен" w:value="КА / ЗН: Заземляющий нож отключен"/>
+                  <w:listItem w:displayText="КА / ЗН: Команда «включить» заземляющий нож через выходное реле" w:value="КА / ЗН: Команда «включить» заземляющий нож через выходное реле"/>
+                  <w:listItem w:displayText="КА / ЗН: Команда «отключить» заземляющий нож через выходное реле" w:value="КА / ЗН: Команда «отключить» заземляющий нож через выходное реле"/>
+                  <w:listItem w:displayText="КА / ЗН: Неисправное положение заземляющего ножа" w:value="КА / ЗН: Неисправное положение заземляющего ножа"/>
+                  <w:listItem w:displayText="КА / ЗН: Промежуточное положение заземляющего ножа" w:value="КА / ЗН: Промежуточное положение заземляющего ножа"/>
+                  <w:listItem w:displayText="КА / ЗН: Функция введена в работу" w:value="КА / ЗН: Функция введена в работу"/>
+                  <w:listItem w:displayText="КА / КА: Функция введена в работу" w:value="КА / КА: Функция введена в работу"/>
+                  <w:listItem w:displayText="КА / КА: Функция оперативно выведена из работы" w:value="КА / КА: Функция оперативно выведена из работы"/>
                   <w:listItem w:displayText="КНН 1сш / КНН 1сш: Пуск" w:value="КНН 1сш / КНН 1сш: Пуск"/>
                   <w:listItem w:displayText="КНН 1сш / КНН 1сш: Пуск ИО напряжения" w:value="КНН 1сш / КНН 1сш: Пуск ИО напряжения"/>
                   <w:listItem w:displayText="КНН 1сш / КНН 1сш: Пуск ИО напряжения ОП" w:value="КНН 1сш / КНН 1сш: Пуск ИО напряжения ОП"/>
@@ -7853,6 +10061,68 @@
                   <w:listItem w:displayText="КОН 2сш / КОН 2сш: Пуск ИО напряжения ОП" w:value="КОН 2сш / КОН 2сш: Пуск ИО напряжения ОП"/>
                   <w:listItem w:displayText="КОН 2сш / КОН 2сш: Функция введена в работу" w:value="КОН 2сш / КОН 2сш: Функция введена в работу"/>
                   <w:listItem w:displayText="КОН 2сш / КОН 2сш: Функция оперативно выведена из работы" w:value="КОН 2сш / КОН 2сш: Функция оперативно выведена из работы"/>
+                  <w:listItem w:displayText="КП / КП: Идет переключение" w:value="КП / КП: Идет переключение"/>
+                  <w:listItem w:displayText="КП / КП: Функция введена в работу" w:value="КП / КП: Функция введена в работу"/>
+                  <w:listItem w:displayText="КП / КП: Функция оперативно выведена из работы" w:value="КП / КП: Функция оперативно выведена из работы"/>
+                  <w:listItem w:displayText="КП / ОБР В: Блокировка включения" w:value="КП / ОБР В: Блокировка включения"/>
+                  <w:listItem w:displayText="КП / ОБР В: Разрешить включение" w:value="КП / ОБР В: Разрешить включение"/>
+                  <w:listItem w:displayText="КП / ОБР ВЭ1: Разрешение управления первым выкатным элементом" w:value="КП / ОБР ВЭ1: Разрешение управления первым выкатным элементом"/>
+                  <w:listItem w:displayText="КП / ОБР ВЭ2: Разрешение управления вторым выкатным элементом" w:value="КП / ОБР ВЭ2: Разрешение управления вторым выкатным элементом"/>
+                  <w:listItem w:displayText="КП / ОБР ЗН: Разрешение управления заземляющим ножом" w:value="КП / ОБР ЗН: Разрешение управления заземляющим ножом"/>
+                  <w:listItem w:displayText="КП / УВ: Включение с контролем синхронизма" w:value="КП / УВ: Включение с контролем синхронизма"/>
+                  <w:listItem w:displayText="КП / УВ: Включить выключатель" w:value="КП / УВ: Включить выключатель"/>
+                  <w:listItem w:displayText="КП / УВ: Задержка включения с контролем синхронизма" w:value="КП / УВ: Задержка включения с контролем синхронизма"/>
+                  <w:listItem w:displayText="КП / УВ: Идет переключение" w:value="КП / УВ: Идет переключение"/>
+                  <w:listItem w:displayText="КП / УВ: Отключить выключатель" w:value="КП / УВ: Отключить выключатель"/>
+                  <w:listItem w:displayText="КП / УВ: Поведение местного управления" w:value="КП / УВ: Поведение местного управления"/>
+                  <w:listItem w:displayText="КП / УВ: Положение В (Включено)" w:value="КП / УВ: Положение В (Включено)"/>
+                  <w:listItem w:displayText="КП / УВ: Положение В (Не определено)" w:value="КП / УВ: Положение В (Не определено)"/>
+                  <w:listItem w:displayText="КП / УВ: Положение В (Неисправность)" w:value="КП / УВ: Положение В (Неисправность)"/>
+                  <w:listItem w:displayText="КП / УВ: Положение В (Отключено)" w:value="КП / УВ: Положение В (Отключено)"/>
+                  <w:listItem w:displayText="КП / УВ: Положение ключа режима управления" w:value="КП / УВ: Положение ключа режима управления"/>
+                  <w:listItem w:displayText="КП / УВ: Право переключения на уровне станции" w:value="КП / УВ: Право переключения на уровне станции"/>
+                  <w:listItem w:displayText="КП / УВ: Сигнал превышения допустимого времени переключения" w:value="КП / УВ: Сигнал превышения допустимого времени переключения"/>
+                  <w:listItem w:displayText="КП / УВ: Функция введена в работу" w:value="КП / УВ: Функция введена в работу"/>
+                  <w:listItem w:displayText="КП / УВЭ1: Вкатить первый выкатной элемент" w:value="КП / УВЭ1: Вкатить первый выкатной элемент"/>
+                  <w:listItem w:displayText="КП / УВЭ1: Выкатить первый выкатной элемент" w:value="КП / УВЭ1: Выкатить первый выкатной элемент"/>
+                  <w:listItem w:displayText="КП / УВЭ1: Идет переключение" w:value="КП / УВЭ1: Идет переключение"/>
+                  <w:listItem w:displayText="КП / УВЭ1: Поведение местного управления" w:value="КП / УВЭ1: Поведение местного управления"/>
+                  <w:listItem w:displayText="КП / УВЭ1: Положение ВЭ1 (Вкачен)" w:value="КП / УВЭ1: Положение ВЭ1 (Вкачен)"/>
+                  <w:listItem w:displayText="КП / УВЭ1: Положение ВЭ1 (Выкачен)" w:value="КП / УВЭ1: Положение ВЭ1 (Выкачен)"/>
+                  <w:listItem w:displayText="КП / УВЭ1: Положение ВЭ1 (Не определено)" w:value="КП / УВЭ1: Положение ВЭ1 (Не определено)"/>
+                  <w:listItem w:displayText="КП / УВЭ1: Положение ВЭ1 (Неисправность)" w:value="КП / УВЭ1: Положение ВЭ1 (Неисправность)"/>
+                  <w:listItem w:displayText="КП / УВЭ1: Положение ключа режима управления" w:value="КП / УВЭ1: Положение ключа режима управления"/>
+                  <w:listItem w:displayText="КП / УВЭ1: Право переключения на уровне станции" w:value="КП / УВЭ1: Право переключения на уровне станции"/>
+                  <w:listItem w:displayText="КП / УВЭ1: Сигнал превышения допустимого времени переключения" w:value="КП / УВЭ1: Сигнал превышения допустимого времени переключения"/>
+                  <w:listItem w:displayText="КП / УВЭ1: Функция введена в работу" w:value="КП / УВЭ1: Функция введена в работу"/>
+                  <w:listItem w:displayText="КП / УВЭ2: Вкатить второй выкатной элемент" w:value="КП / УВЭ2: Вкатить второй выкатной элемент"/>
+                  <w:listItem w:displayText="КП / УВЭ2: Выкатить второй выкатной элемент" w:value="КП / УВЭ2: Выкатить второй выкатной элемент"/>
+                  <w:listItem w:displayText="КП / УВЭ2: Идет переключение" w:value="КП / УВЭ2: Идет переключение"/>
+                  <w:listItem w:displayText="КП / УВЭ2: Поведение местного управления" w:value="КП / УВЭ2: Поведение местного управления"/>
+                  <w:listItem w:displayText="КП / УВЭ2: Положение ВЭ2 (Вкачен)" w:value="КП / УВЭ2: Положение ВЭ2 (Вкачен)"/>
+                  <w:listItem w:displayText="КП / УВЭ2: Положение ВЭ2 (Выкачен)" w:value="КП / УВЭ2: Положение ВЭ2 (Выкачен)"/>
+                  <w:listItem w:displayText="КП / УВЭ2: Положение ВЭ2 (Не определено)" w:value="КП / УВЭ2: Положение ВЭ2 (Не определено)"/>
+                  <w:listItem w:displayText="КП / УВЭ2: Положение ВЭ2 (Неисправность)" w:value="КП / УВЭ2: Положение ВЭ2 (Неисправность)"/>
+                  <w:listItem w:displayText="КП / УВЭ2: Положение ключа режима управления" w:value="КП / УВЭ2: Положение ключа режима управления"/>
+                  <w:listItem w:displayText="КП / УВЭ2: Право переключения на уровне станции" w:value="КП / УВЭ2: Право переключения на уровне станции"/>
+                  <w:listItem w:displayText="КП / УВЭ2: Сигнал превышения допустимого времени переключения" w:value="КП / УВЭ2: Сигнал превышения допустимого времени переключения"/>
+                  <w:listItem w:displayText="КП / УВЭ2: Функция введена в работу" w:value="КП / УВЭ2: Функция введена в работу"/>
+                  <w:listItem w:displayText="КП / УЗН: Включить заземляющий нож" w:value="КП / УЗН: Включить заземляющий нож"/>
+                  <w:listItem w:displayText="КП / УЗН: Идет переключение" w:value="КП / УЗН: Идет переключение"/>
+                  <w:listItem w:displayText="КП / УЗН: Отключить заземляющий нож" w:value="КП / УЗН: Отключить заземляющий нож"/>
+                  <w:listItem w:displayText="КП / УЗН: Поведение местного управления" w:value="КП / УЗН: Поведение местного управления"/>
+                  <w:listItem w:displayText="КП / УЗН: Положение ЗН (Включено)" w:value="КП / УЗН: Положение ЗН (Включено)"/>
+                  <w:listItem w:displayText="КП / УЗН: Положение ЗН (Не определено)" w:value="КП / УЗН: Положение ЗН (Не определено)"/>
+                  <w:listItem w:displayText="КП / УЗН: Положение ЗН (Неисправность)" w:value="КП / УЗН: Положение ЗН (Неисправность)"/>
+                  <w:listItem w:displayText="КП / УЗН: Положение ЗН (Отключено)" w:value="КП / УЗН: Положение ЗН (Отключено)"/>
+                  <w:listItem w:displayText="КП / УЗН: Положение ключа режима управления" w:value="КП / УЗН: Положение ключа режима управления"/>
+                  <w:listItem w:displayText="КП / УЗН: Право переключения на уровне станции" w:value="КП / УЗН: Право переключения на уровне станции"/>
+                  <w:listItem w:displayText="КП / УЗН: Сигнал превышения допустимого времени переключения" w:value="КП / УЗН: Сигнал превышения допустимого времени переключения"/>
+                  <w:listItem w:displayText="КП / УЗН: Функция введена в работу" w:value="КП / УЗН: Функция введена в работу"/>
+                  <w:listItem w:displayText="КРВ / КРВ: Превышен коммутационный ресурс выключателя" w:value="КРВ / КРВ: Превышен коммутационный ресурс выключателя"/>
+                  <w:listItem w:displayText="КРВ / КРВ: Превышен механический ресурс выключателя" w:value="КРВ / КРВ: Превышен механический ресурс выключателя"/>
+                  <w:listItem w:displayText="КРВ / КРВ: Превышен ресурс выключателя" w:value="КРВ / КРВ: Превышен ресурс выключателя"/>
+                  <w:listItem w:displayText="КРВ / КРВ: Функция введена в работу" w:value="КРВ / КРВ: Функция введена в работу"/>
                   <w:listItem w:displayText="КС / КС: Блокировка по скорости изменения частоты" w:value="КС / КС: Блокировка по скорости изменения частоты"/>
                   <w:listItem w:displayText="КС / КС: Нет условий по напряжению" w:value="КС / КС: Нет условий по напряжению"/>
                   <w:listItem w:displayText="КС / КС: Нет условий по углу" w:value="КС / КС: Нет условий по углу"/>
@@ -7865,6 +10135,18 @@
                   <w:listItem w:displayText="КС / КС: Разрешение оперативного включения" w:value="КС / КС: Разрешение оперативного включения"/>
                   <w:listItem w:displayText="КС / КС: Функция введена в работу" w:value="КС / КС: Функция введена в работу"/>
                   <w:listItem w:displayText="КС / КС: Функция оперативно выведена из работы" w:value="КС / КС: Функция оперативно выведена из работы"/>
+                  <w:listItem w:displayText="КСВ / КСВ: Блокировка включения В" w:value="КСВ / КСВ: Блокировка включения В"/>
+                  <w:listItem w:displayText="КСВ / КСВ: Блокировка отключения В" w:value="КСВ / КСВ: Блокировка отключения В"/>
+                  <w:listItem w:displayText="КСВ / КСВ: В аварийно отключен" w:value="КСВ / КСВ: В аварийно отключен"/>
+                  <w:listItem w:displayText="КСВ / КСВ: В самопроизвольно отключен" w:value="КСВ / КСВ: В самопроизвольно отключен"/>
+                  <w:listItem w:displayText="КСВ / КСВ: Защита ЭМВ" w:value="КСВ / КСВ: Защита ЭМВ"/>
+                  <w:listItem w:displayText="КСВ / КСВ: Защита ЭМО1" w:value="КСВ / КСВ: Защита ЭМО1"/>
+                  <w:listItem w:displayText="КСВ / КСВ: Защита ЭМО2" w:value="КСВ / КСВ: Защита ЭМО2"/>
+                  <w:listItem w:displayText="КСВ / КСВ: Неисправность В" w:value="КСВ / КСВ: Неисправность В"/>
+                  <w:listItem w:displayText="КСВ / КСВ: Неисправность цепей ЭМУ" w:value="КСВ / КСВ: Неисправность цепей ЭМУ"/>
+                  <w:listItem w:displayText="КСВ / КСВ: Реле фиксации команды" w:value="КСВ / КСВ: Реле фиксации команды"/>
+                  <w:listItem w:displayText="КСВ / КСВ: Функция введена в работу" w:value="КСВ / КСВ: Функция введена в работу"/>
+                  <w:listItem w:displayText="КСВ / КСВ: Функция оперативно выведена из работы" w:value="КСВ / КСВ: Функция оперативно выведена из работы"/>
                   <w:listItem w:displayText="ЛЗШ / ЛЗШ: Обнаружение неисправности" w:value="ЛЗШ / ЛЗШ: Обнаружение неисправности"/>
                   <w:listItem w:displayText="ЛЗШ / ЛЗШ: Пуск" w:value="ЛЗШ / ЛЗШ: Пуск"/>
                   <w:listItem w:displayText="ЛЗШ / ЛЗШ: Пуск ИО тока по фазе B" w:value="ЛЗШ / ЛЗШ: Пуск ИО тока по фазе B"/>
@@ -7957,6 +10239,57 @@
                   <w:listItem w:displayText="МТЗ / ОНМ: Пуск по фазе C" w:value="МТЗ / ОНМ: Пуск по фазе C"/>
                   <w:listItem w:displayText="МТЗ / ОНМ: Пуск по фазе А" w:value="МТЗ / ОНМ: Пуск по фазе А"/>
                   <w:listItem w:displayText="МТЗ / ОУ МТЗ: Срабатывание" w:value="МТЗ / ОУ МТЗ: Срабатывание"/>
+                  <w:listItem w:displayText="ПДС / В: Поведение местного управления" w:value="ПДС / В: Поведение местного управления"/>
+                  <w:listItem w:displayText="ПДС / В: Положение ключа режима управления" w:value="ПДС / В: Положение ключа режима управления"/>
+                  <w:listItem w:displayText="ПДС / В: Положение ключа режима управления привода В" w:value="ПДС / В: Положение ключа режима управления привода В"/>
+                  <w:listItem w:displayText="ПДС / В: Право переключения на уровне станции" w:value="ПДС / В: Право переключения на уровне станции"/>
+                  <w:listItem w:displayText="ПДС / ВЭ1: Поведение местного управления" w:value="ПДС / ВЭ1: Поведение местного управления"/>
+                  <w:listItem w:displayText="ПДС / ВЭ1: Положение ключа режима управления" w:value="ПДС / ВЭ1: Положение ключа режима управления"/>
+                  <w:listItem w:displayText="ПДС / ВЭ1: Право переключения на уровне станции" w:value="ПДС / ВЭ1: Право переключения на уровне станции"/>
+                  <w:listItem w:displayText="ПДС / ВЭ1: Ремонтное положение коммутационного аппарата" w:value="ПДС / ВЭ1: Ремонтное положение коммутационного аппарата"/>
+                  <w:listItem w:displayText="ПДС / ВЭ2: Поведение местного управления" w:value="ПДС / ВЭ2: Поведение местного управления"/>
+                  <w:listItem w:displayText="ПДС / ВЭ2: Положение ключа режима управления" w:value="ПДС / ВЭ2: Положение ключа режима управления"/>
+                  <w:listItem w:displayText="ПДС / ВЭ2: Право переключения на уровне станции" w:value="ПДС / ВЭ2: Право переключения на уровне станции"/>
+                  <w:listItem w:displayText="ПДС / ВЭ2: Ремонтное положение коммутационного аппарата" w:value="ПДС / ВЭ2: Ремонтное положение коммутационного аппарата"/>
+                  <w:listItem w:displayText="ПДС / ЗН: Поведение местного управления" w:value="ПДС / ЗН: Поведение местного управления"/>
+                  <w:listItem w:displayText="ПДС / ЗН: Положение ключа режима управления" w:value="ПДС / ЗН: Положение ключа режима управления"/>
+                  <w:listItem w:displayText="ПДС / ЗН: Право переключения на уровне станции" w:value="ПДС / ЗН: Право переключения на уровне станции"/>
+                  <w:listItem w:displayText="ПДС / КИ: Аварийный уровень изоляции" w:value="ПДС / КИ: Аварийный уровень изоляции"/>
+                  <w:listItem w:displayText="ПДС / КИ: Низкий уровень изоляции" w:value="ПДС / КИ: Низкий уровень изоляции"/>
+                  <w:listItem w:displayText="ПДС / КПруж: Пружина не заведена" w:value="ПДС / КПруж: Пружина не заведена"/>
+                  <w:listItem w:displayText="ПДС / КЦВ: Контроль цепи ЭМВ" w:value="ПДС / КЦВ: Контроль цепи ЭМВ"/>
+                  <w:listItem w:displayText="ПДС / КЦВ: Контроль цепи ЭМО1" w:value="ПДС / КЦВ: Контроль цепи ЭМО1"/>
+                  <w:listItem w:displayText="ПДС / КЦВ: Контроль цепи ЭМО2" w:value="ПДС / КЦВ: Контроль цепи ЭМО2"/>
+                  <w:listItem w:displayText="ПДС / КЦВ: Работа ЭМВ" w:value="ПДС / КЦВ: Работа ЭМВ"/>
+                  <w:listItem w:displayText="ПДС / КЦВ: Работа ЭМО1" w:value="ПДС / КЦВ: Работа ЭМО1"/>
+                  <w:listItem w:displayText="ПДС / КЦВ: Работа ЭМО2" w:value="ПДС / КЦВ: Работа ЭМО2"/>
+                  <w:listItem w:displayText="ПДС / ПДС: Функция введена в работу" w:value="ПДС / ПДС: Функция введена в работу"/>
+                  <w:listItem w:displayText="ПДС / ПДС: Функция оперативно выведена из работы" w:value="ПДС / ПДС: Функция оперативно выведена из работы"/>
+                  <w:listItem w:displayText="ПДС НКУ / SA1: Цепь управления введена" w:value="ПДС НКУ / SA1: Цепь управления введена"/>
+                  <w:listItem w:displayText="ПДС НКУ / SA2: Цепь управления введена" w:value="ПДС НКУ / SA2: Цепь управления введена"/>
+                  <w:listItem w:displayText="ПДС НКУ / SA3: Цепь управления введена" w:value="ПДС НКУ / SA3: Цепь управления введена"/>
+                  <w:listItem w:displayText="ПДС НКУ / SA4: Цепь управления введена" w:value="ПДС НКУ / SA4: Цепь управления введена"/>
+                  <w:listItem w:displayText="ПДС НКУ / SG1: Рабочее положение испытательного блока" w:value="ПДС НКУ / SG1: Рабочее положение испытательного блока"/>
+                  <w:listItem w:displayText="ПДС НКУ / SG2: Рабочее положение испытательного блока" w:value="ПДС НКУ / SG2: Рабочее положение испытательного блока"/>
+                  <w:listItem w:displayText="ПДС НКУ / SG3: Рабочее положение испытательного блока" w:value="ПДС НКУ / SG3: Рабочее положение испытательного блока"/>
+                  <w:listItem w:displayText="ПДС НКУ / Дверь: Дверь отсека/ шкафа закрыта" w:value="ПДС НКУ / Дверь: Дверь отсека/ шкафа закрыта"/>
+                  <w:listItem w:displayText="ПДС НКУ / Дверь: Дверь отсека/ шкафа открыта" w:value="ПДС НКУ / Дверь: Дверь отсека/ шкафа открыта"/>
+                  <w:listItem w:displayText="ПДС НКУ / ОТ ОБР 1: Неисправность оперативного тока цепей ОБР 1" w:value="ПДС НКУ / ОТ ОБР 1: Неисправность оперативного тока цепей ОБР 1"/>
+                  <w:listItem w:displayText="ПДС НКУ / ОТ ОБР 2: Неисправность оперативного тока цепей ОБР 2" w:value="ПДС НКУ / ОТ ОБР 2: Неисправность оперативного тока цепей ОБР 2"/>
+                  <w:listItem w:displayText="ПДС НКУ / ОТ ЦСВ: Неисправность ОТ цепей сигнализации В" w:value="ПДС НКУ / ОТ ЦСВ: Неисправность ОТ цепей сигнализации В"/>
+                  <w:listItem w:displayText="ПДС НКУ / ОТ ЭМО1, ЭМВ: Неисправность оперативного тока цепей ЭМВ, ЭМО1" w:value="ПДС НКУ / ОТ ЭМО1, ЭМВ: Неисправность оперативного тока цепей ЭМВ, ЭМО1"/>
+                  <w:listItem w:displayText="ПДС НКУ / ОТ ЭМО2: Неисправность оперативного тока цепей ЭМО2" w:value="ПДС НКУ / ОТ ЭМО2: Неисправность оперативного тока цепей ЭМО2"/>
+                  <w:listItem w:displayText="ПДС НКУ / ПДС НКУ: Функция введена в работу" w:value="ПДС НКУ / ПДС НКУ: Функция введена в работу"/>
+                  <w:listItem w:displayText="ПДС НКУ / ПДС НКУ: Функция оперативно выведена из работы" w:value="ПДС НКУ / ПДС НКУ: Функция оперативно выведена из работы"/>
+                  <w:listItem w:displayText="ПДС НКУ / Пер.ав.дебл.см.яч.: Цепи аварийной деблокировки ячейки выведены" w:value="ПДС НКУ / Пер.ав.дебл.см.яч.: Цепи аварийной деблокировки ячейки выведены"/>
+                  <w:listItem w:displayText="ПС / ПС: Пуск предупредительной сигнализации" w:value="ПС / ПС: Пуск предупредительной сигнализации"/>
+                  <w:listItem w:displayText="ПС / ПС: Пуск предупредительной сигнализации (импульс)" w:value="ПС / ПС: Пуск предупредительной сигнализации (импульс)"/>
+                  <w:listItem w:displayText="СС / СС: БИ выведены" w:value="СС / СС: БИ выведены"/>
+                  <w:listItem w:displayText="СС / СС: Выходные цепи разобраны" w:value="СС / СС: Выходные цепи разобраны"/>
+                  <w:listItem w:displayText="СС / СС: Неисправность КА" w:value="СС / СС: Неисправность КА"/>
+                  <w:listItem w:displayText="СС / СС: Общий внешний сигнал" w:value="СС / СС: Общий внешний сигнал"/>
+                  <w:listItem w:displayText="СС / СС: Превышение времени переключения КА" w:value="СС / СС: Превышение времени переключения КА"/>
+                  <w:listItem w:displayText="СС / СС: Сигнализация цепей опер.тока" w:value="СС / СС: Сигнализация цепей опер.тока"/>
                   <w:listItem w:displayText="ТЗНП / АУ ТЗНП: Пуск автоматического ускорения ТЗНП" w:value="ТЗНП / АУ ТЗНП: Пуск автоматического ускорения ТЗНП"/>
                   <w:listItem w:displayText="ТЗНП / БНТ НП: Пуск БНТ НП" w:value="ТЗНП / БНТ НП: Пуск БНТ НП"/>
                   <w:listItem w:displayText="ТЗНП / БЧС: Блокировка чувствительных ступеней" w:value="ТЗНП / БЧС: Блокировка чувствительных ступеней"/>
@@ -7996,6 +10329,11 @@
                   <w:listItem w:displayText="ТК ЗДЗ / ТК ЗДЗ: Пуск ИО тока" w:value="ТК ЗДЗ / ТК ЗДЗ: Пуск ИО тока"/>
                   <w:listItem w:displayText="ТК ЗДЗ / ТК ЗДЗ: Функция введена в работу" w:value="ТК ЗДЗ / ТК ЗДЗ: Функция введена в работу"/>
                   <w:listItem w:displayText="ТК ЗДЗ / ТК ЗДЗ: Функция оперативно выведена из работы" w:value="ТК ЗДЗ / ТК ЗДЗ: Функция оперативно выведена из работы"/>
+                  <w:listItem w:displayText="УВ / УВ: Включение с контролем синхронизма" w:value="УВ / УВ: Включение с контролем синхронизма"/>
+                  <w:listItem w:displayText="УВ / УВ: Включить выключатель" w:value="УВ / УВ: Включить выключатель"/>
+                  <w:listItem w:displayText="УВ / УВ: Задержка включения с контролем синхронизма" w:value="УВ / УВ: Задержка включения с контролем синхронизма"/>
+                  <w:listItem w:displayText="УВ / УВ: Функция введена в работу" w:value="УВ / УВ: Функция введена в работу"/>
+                  <w:listItem w:displayText="УВ / УВ: Функция оперативно выведена из работы" w:value="УВ / УВ: Функция оперативно выведена из работы"/>
                   <w:listItem w:displayText="УРОВ / УРОВ: Пуск" w:value="УРОВ / УРОВ: Пуск"/>
                   <w:listItem w:displayText="УРОВ / УРОВ: Пуск ИО максимального тока" w:value="УРОВ / УРОВ: Пуск ИО максимального тока"/>
                   <w:listItem w:displayText="УРОВ / УРОВ: Срабатывание" w:value="УРОВ / УРОВ: Срабатывание"/>
@@ -8311,6 +10649,38 @@
                   <w:listItem w:displayText="ЗОП / ЗОП: Срабатывание на сигнал" w:value="ЗОП / ЗОП: Срабатывание на сигнал"/>
                   <w:listItem w:displayText="ЗОП / ЗОП: Функция введена в работу" w:value="ЗОП / ЗОП: Функция введена в работу"/>
                   <w:listItem w:displayText="ЗОП / ЗОП: Функция оперативно выведена из работы" w:value="ЗОП / ЗОП: Функция оперативно выведена из работы"/>
+                  <w:listItem w:displayText="КА / В: Выключатель включен" w:value="КА / В: Выключатель включен"/>
+                  <w:listItem w:displayText="КА / В: Выключатель отключен" w:value="КА / В: Выключатель отключен"/>
+                  <w:listItem w:displayText="КА / В: Команда «включить» выключатель через выходное реле" w:value="КА / В: Команда «включить» выключатель через выходное реле"/>
+                  <w:listItem w:displayText="КА / В: Команда «отключить» выключатель через выходное реле" w:value="КА / В: Команда «отключить» выключатель через выходное реле"/>
+                  <w:listItem w:displayText="КА / В: Неисправное положение выключателя" w:value="КА / В: Неисправное положение выключателя"/>
+                  <w:listItem w:displayText="КА / В: Промежуточное положение выключателя" w:value="КА / В: Промежуточное положение выключателя"/>
+                  <w:listItem w:displayText="КА / В: Функция введена в работу" w:value="КА / В: Функция введена в работу"/>
+                  <w:listItem w:displayText="КА / ВЭ1: Команда «вкатить» выкатной элемент через выходное реле" w:value="КА / ВЭ1: Команда «вкатить» выкатной элемент через выходное реле"/>
+                  <w:listItem w:displayText="КА / ВЭ1: Команда «выкатить» выкатной элемент через выходное реле" w:value="КА / ВЭ1: Команда «выкатить» выкатной элемент через выходное реле"/>
+                  <w:listItem w:displayText="КА / ВЭ1: Неисправное положение выкатного элемента" w:value="КА / ВЭ1: Неисправное положение выкатного элемента"/>
+                  <w:listItem w:displayText="КА / ВЭ1: Положение выкатного элемента «Вкачен»" w:value="КА / ВЭ1: Положение выкатного элемента «Вкачен»"/>
+                  <w:listItem w:displayText="КА / ВЭ1: Положение выкатного элемента «Выкачен»" w:value="КА / ВЭ1: Положение выкатного элемента «Выкачен»"/>
+                  <w:listItem w:displayText="КА / ВЭ1: Промежуточное положение выкатного элемента" w:value="КА / ВЭ1: Промежуточное положение выкатного элемента"/>
+                  <w:listItem w:displayText="КА / ВЭ1: Ремонтное положение выкатного элемента" w:value="КА / ВЭ1: Ремонтное положение выкатного элемента"/>
+                  <w:listItem w:displayText="КА / ВЭ1: Функция введена в работу" w:value="КА / ВЭ1: Функция введена в работу"/>
+                  <w:listItem w:displayText="КА / ВЭ2: Команда «вкатить» выкатной элемент через выходное реле" w:value="КА / ВЭ2: Команда «вкатить» выкатной элемент через выходное реле"/>
+                  <w:listItem w:displayText="КА / ВЭ2: Команда «выкатить» выкатной элемент через выходное реле" w:value="КА / ВЭ2: Команда «выкатить» выкатной элемент через выходное реле"/>
+                  <w:listItem w:displayText="КА / ВЭ2: Неисправное положение выкатного элемента" w:value="КА / ВЭ2: Неисправное положение выкатного элемента"/>
+                  <w:listItem w:displayText="КА / ВЭ2: Положение выкатного элемента «Вкачен»" w:value="КА / ВЭ2: Положение выкатного элемента «Вкачен»"/>
+                  <w:listItem w:displayText="КА / ВЭ2: Положение выкатного элемента «Выкачен»" w:value="КА / ВЭ2: Положение выкатного элемента «Выкачен»"/>
+                  <w:listItem w:displayText="КА / ВЭ2: Промежуточное положение выкатного элемента" w:value="КА / ВЭ2: Промежуточное положение выкатного элемента"/>
+                  <w:listItem w:displayText="КА / ВЭ2: Ремонтное положение выкатного элемента" w:value="КА / ВЭ2: Ремонтное положение выкатного элемента"/>
+                  <w:listItem w:displayText="КА / ВЭ2: Функция введена в работу" w:value="КА / ВЭ2: Функция введена в работу"/>
+                  <w:listItem w:displayText="КА / ЗН: Заземляющий нож включен" w:value="КА / ЗН: Заземляющий нож включен"/>
+                  <w:listItem w:displayText="КА / ЗН: Заземляющий нож отключен" w:value="КА / ЗН: Заземляющий нож отключен"/>
+                  <w:listItem w:displayText="КА / ЗН: Команда «включить» заземляющий нож через выходное реле" w:value="КА / ЗН: Команда «включить» заземляющий нож через выходное реле"/>
+                  <w:listItem w:displayText="КА / ЗН: Команда «отключить» заземляющий нож через выходное реле" w:value="КА / ЗН: Команда «отключить» заземляющий нож через выходное реле"/>
+                  <w:listItem w:displayText="КА / ЗН: Неисправное положение заземляющего ножа" w:value="КА / ЗН: Неисправное положение заземляющего ножа"/>
+                  <w:listItem w:displayText="КА / ЗН: Промежуточное положение заземляющего ножа" w:value="КА / ЗН: Промежуточное положение заземляющего ножа"/>
+                  <w:listItem w:displayText="КА / ЗН: Функция введена в работу" w:value="КА / ЗН: Функция введена в работу"/>
+                  <w:listItem w:displayText="КА / КА: Функция введена в работу" w:value="КА / КА: Функция введена в работу"/>
+                  <w:listItem w:displayText="КА / КА: Функция оперативно выведена из работы" w:value="КА / КА: Функция оперативно выведена из работы"/>
                   <w:listItem w:displayText="КНН 1сш / КНН 1сш: Пуск" w:value="КНН 1сш / КНН 1сш: Пуск"/>
                   <w:listItem w:displayText="КНН 1сш / КНН 1сш: Пуск ИО напряжения" w:value="КНН 1сш / КНН 1сш: Пуск ИО напряжения"/>
                   <w:listItem w:displayText="КНН 1сш / КНН 1сш: Пуск ИО напряжения ОП" w:value="КНН 1сш / КНН 1сш: Пуск ИО напряжения ОП"/>
@@ -8331,6 +10701,68 @@
                   <w:listItem w:displayText="КОН 2сш / КОН 2сш: Пуск ИО напряжения ОП" w:value="КОН 2сш / КОН 2сш: Пуск ИО напряжения ОП"/>
                   <w:listItem w:displayText="КОН 2сш / КОН 2сш: Функция введена в работу" w:value="КОН 2сш / КОН 2сш: Функция введена в работу"/>
                   <w:listItem w:displayText="КОН 2сш / КОН 2сш: Функция оперативно выведена из работы" w:value="КОН 2сш / КОН 2сш: Функция оперативно выведена из работы"/>
+                  <w:listItem w:displayText="КП / КП: Идет переключение" w:value="КП / КП: Идет переключение"/>
+                  <w:listItem w:displayText="КП / КП: Функция введена в работу" w:value="КП / КП: Функция введена в работу"/>
+                  <w:listItem w:displayText="КП / КП: Функция оперативно выведена из работы" w:value="КП / КП: Функция оперативно выведена из работы"/>
+                  <w:listItem w:displayText="КП / ОБР В: Блокировка включения" w:value="КП / ОБР В: Блокировка включения"/>
+                  <w:listItem w:displayText="КП / ОБР В: Разрешить включение" w:value="КП / ОБР В: Разрешить включение"/>
+                  <w:listItem w:displayText="КП / ОБР ВЭ1: Разрешение управления первым выкатным элементом" w:value="КП / ОБР ВЭ1: Разрешение управления первым выкатным элементом"/>
+                  <w:listItem w:displayText="КП / ОБР ВЭ2: Разрешение управления вторым выкатным элементом" w:value="КП / ОБР ВЭ2: Разрешение управления вторым выкатным элементом"/>
+                  <w:listItem w:displayText="КП / ОБР ЗН: Разрешение управления заземляющим ножом" w:value="КП / ОБР ЗН: Разрешение управления заземляющим ножом"/>
+                  <w:listItem w:displayText="КП / УВ: Включение с контролем синхронизма" w:value="КП / УВ: Включение с контролем синхронизма"/>
+                  <w:listItem w:displayText="КП / УВ: Включить выключатель" w:value="КП / УВ: Включить выключатель"/>
+                  <w:listItem w:displayText="КП / УВ: Задержка включения с контролем синхронизма" w:value="КП / УВ: Задержка включения с контролем синхронизма"/>
+                  <w:listItem w:displayText="КП / УВ: Идет переключение" w:value="КП / УВ: Идет переключение"/>
+                  <w:listItem w:displayText="КП / УВ: Отключить выключатель" w:value="КП / УВ: Отключить выключатель"/>
+                  <w:listItem w:displayText="КП / УВ: Поведение местного управления" w:value="КП / УВ: Поведение местного управления"/>
+                  <w:listItem w:displayText="КП / УВ: Положение В (Включено)" w:value="КП / УВ: Положение В (Включено)"/>
+                  <w:listItem w:displayText="КП / УВ: Положение В (Не определено)" w:value="КП / УВ: Положение В (Не определено)"/>
+                  <w:listItem w:displayText="КП / УВ: Положение В (Неисправность)" w:value="КП / УВ: Положение В (Неисправность)"/>
+                  <w:listItem w:displayText="КП / УВ: Положение В (Отключено)" w:value="КП / УВ: Положение В (Отключено)"/>
+                  <w:listItem w:displayText="КП / УВ: Положение ключа режима управления" w:value="КП / УВ: Положение ключа режима управления"/>
+                  <w:listItem w:displayText="КП / УВ: Право переключения на уровне станции" w:value="КП / УВ: Право переключения на уровне станции"/>
+                  <w:listItem w:displayText="КП / УВ: Сигнал превышения допустимого времени переключения" w:value="КП / УВ: Сигнал превышения допустимого времени переключения"/>
+                  <w:listItem w:displayText="КП / УВ: Функция введена в работу" w:value="КП / УВ: Функция введена в работу"/>
+                  <w:listItem w:displayText="КП / УВЭ1: Вкатить первый выкатной элемент" w:value="КП / УВЭ1: Вкатить первый выкатной элемент"/>
+                  <w:listItem w:displayText="КП / УВЭ1: Выкатить первый выкатной элемент" w:value="КП / УВЭ1: Выкатить первый выкатной элемент"/>
+                  <w:listItem w:displayText="КП / УВЭ1: Идет переключение" w:value="КП / УВЭ1: Идет переключение"/>
+                  <w:listItem w:displayText="КП / УВЭ1: Поведение местного управления" w:value="КП / УВЭ1: Поведение местного управления"/>
+                  <w:listItem w:displayText="КП / УВЭ1: Положение ВЭ1 (Вкачен)" w:value="КП / УВЭ1: Положение ВЭ1 (Вкачен)"/>
+                  <w:listItem w:displayText="КП / УВЭ1: Положение ВЭ1 (Выкачен)" w:value="КП / УВЭ1: Положение ВЭ1 (Выкачен)"/>
+                  <w:listItem w:displayText="КП / УВЭ1: Положение ВЭ1 (Не определено)" w:value="КП / УВЭ1: Положение ВЭ1 (Не определено)"/>
+                  <w:listItem w:displayText="КП / УВЭ1: Положение ВЭ1 (Неисправность)" w:value="КП / УВЭ1: Положение ВЭ1 (Неисправность)"/>
+                  <w:listItem w:displayText="КП / УВЭ1: Положение ключа режима управления" w:value="КП / УВЭ1: Положение ключа режима управления"/>
+                  <w:listItem w:displayText="КП / УВЭ1: Право переключения на уровне станции" w:value="КП / УВЭ1: Право переключения на уровне станции"/>
+                  <w:listItem w:displayText="КП / УВЭ1: Сигнал превышения допустимого времени переключения" w:value="КП / УВЭ1: Сигнал превышения допустимого времени переключения"/>
+                  <w:listItem w:displayText="КП / УВЭ1: Функция введена в работу" w:value="КП / УВЭ1: Функция введена в работу"/>
+                  <w:listItem w:displayText="КП / УВЭ2: Вкатить второй выкатной элемент" w:value="КП / УВЭ2: Вкатить второй выкатной элемент"/>
+                  <w:listItem w:displayText="КП / УВЭ2: Выкатить второй выкатной элемент" w:value="КП / УВЭ2: Выкатить второй выкатной элемент"/>
+                  <w:listItem w:displayText="КП / УВЭ2: Идет переключение" w:value="КП / УВЭ2: Идет переключение"/>
+                  <w:listItem w:displayText="КП / УВЭ2: Поведение местного управления" w:value="КП / УВЭ2: Поведение местного управления"/>
+                  <w:listItem w:displayText="КП / УВЭ2: Положение ВЭ2 (Вкачен)" w:value="КП / УВЭ2: Положение ВЭ2 (Вкачен)"/>
+                  <w:listItem w:displayText="КП / УВЭ2: Положение ВЭ2 (Выкачен)" w:value="КП / УВЭ2: Положение ВЭ2 (Выкачен)"/>
+                  <w:listItem w:displayText="КП / УВЭ2: Положение ВЭ2 (Не определено)" w:value="КП / УВЭ2: Положение ВЭ2 (Не определено)"/>
+                  <w:listItem w:displayText="КП / УВЭ2: Положение ВЭ2 (Неисправность)" w:value="КП / УВЭ2: Положение ВЭ2 (Неисправность)"/>
+                  <w:listItem w:displayText="КП / УВЭ2: Положение ключа режима управления" w:value="КП / УВЭ2: Положение ключа режима управления"/>
+                  <w:listItem w:displayText="КП / УВЭ2: Право переключения на уровне станции" w:value="КП / УВЭ2: Право переключения на уровне станции"/>
+                  <w:listItem w:displayText="КП / УВЭ2: Сигнал превышения допустимого времени переключения" w:value="КП / УВЭ2: Сигнал превышения допустимого времени переключения"/>
+                  <w:listItem w:displayText="КП / УВЭ2: Функция введена в работу" w:value="КП / УВЭ2: Функция введена в работу"/>
+                  <w:listItem w:displayText="КП / УЗН: Включить заземляющий нож" w:value="КП / УЗН: Включить заземляющий нож"/>
+                  <w:listItem w:displayText="КП / УЗН: Идет переключение" w:value="КП / УЗН: Идет переключение"/>
+                  <w:listItem w:displayText="КП / УЗН: Отключить заземляющий нож" w:value="КП / УЗН: Отключить заземляющий нож"/>
+                  <w:listItem w:displayText="КП / УЗН: Поведение местного управления" w:value="КП / УЗН: Поведение местного управления"/>
+                  <w:listItem w:displayText="КП / УЗН: Положение ЗН (Включено)" w:value="КП / УЗН: Положение ЗН (Включено)"/>
+                  <w:listItem w:displayText="КП / УЗН: Положение ЗН (Не определено)" w:value="КП / УЗН: Положение ЗН (Не определено)"/>
+                  <w:listItem w:displayText="КП / УЗН: Положение ЗН (Неисправность)" w:value="КП / УЗН: Положение ЗН (Неисправность)"/>
+                  <w:listItem w:displayText="КП / УЗН: Положение ЗН (Отключено)" w:value="КП / УЗН: Положение ЗН (Отключено)"/>
+                  <w:listItem w:displayText="КП / УЗН: Положение ключа режима управления" w:value="КП / УЗН: Положение ключа режима управления"/>
+                  <w:listItem w:displayText="КП / УЗН: Право переключения на уровне станции" w:value="КП / УЗН: Право переключения на уровне станции"/>
+                  <w:listItem w:displayText="КП / УЗН: Сигнал превышения допустимого времени переключения" w:value="КП / УЗН: Сигнал превышения допустимого времени переключения"/>
+                  <w:listItem w:displayText="КП / УЗН: Функция введена в работу" w:value="КП / УЗН: Функция введена в работу"/>
+                  <w:listItem w:displayText="КРВ / КРВ: Превышен коммутационный ресурс выключателя" w:value="КРВ / КРВ: Превышен коммутационный ресурс выключателя"/>
+                  <w:listItem w:displayText="КРВ / КРВ: Превышен механический ресурс выключателя" w:value="КРВ / КРВ: Превышен механический ресурс выключателя"/>
+                  <w:listItem w:displayText="КРВ / КРВ: Превышен ресурс выключателя" w:value="КРВ / КРВ: Превышен ресурс выключателя"/>
+                  <w:listItem w:displayText="КРВ / КРВ: Функция введена в работу" w:value="КРВ / КРВ: Функция введена в работу"/>
                   <w:listItem w:displayText="КС / КС: Блокировка по скорости изменения частоты" w:value="КС / КС: Блокировка по скорости изменения частоты"/>
                   <w:listItem w:displayText="КС / КС: Нет условий по напряжению" w:value="КС / КС: Нет условий по напряжению"/>
                   <w:listItem w:displayText="КС / КС: Нет условий по углу" w:value="КС / КС: Нет условий по углу"/>
@@ -8343,6 +10775,18 @@
                   <w:listItem w:displayText="КС / КС: Разрешение оперативного включения" w:value="КС / КС: Разрешение оперативного включения"/>
                   <w:listItem w:displayText="КС / КС: Функция введена в работу" w:value="КС / КС: Функция введена в работу"/>
                   <w:listItem w:displayText="КС / КС: Функция оперативно выведена из работы" w:value="КС / КС: Функция оперативно выведена из работы"/>
+                  <w:listItem w:displayText="КСВ / КСВ: Блокировка включения В" w:value="КСВ / КСВ: Блокировка включения В"/>
+                  <w:listItem w:displayText="КСВ / КСВ: Блокировка отключения В" w:value="КСВ / КСВ: Блокировка отключения В"/>
+                  <w:listItem w:displayText="КСВ / КСВ: В аварийно отключен" w:value="КСВ / КСВ: В аварийно отключен"/>
+                  <w:listItem w:displayText="КСВ / КСВ: В самопроизвольно отключен" w:value="КСВ / КСВ: В самопроизвольно отключен"/>
+                  <w:listItem w:displayText="КСВ / КСВ: Защита ЭМВ" w:value="КСВ / КСВ: Защита ЭМВ"/>
+                  <w:listItem w:displayText="КСВ / КСВ: Защита ЭМО1" w:value="КСВ / КСВ: Защита ЭМО1"/>
+                  <w:listItem w:displayText="КСВ / КСВ: Защита ЭМО2" w:value="КСВ / КСВ: Защита ЭМО2"/>
+                  <w:listItem w:displayText="КСВ / КСВ: Неисправность В" w:value="КСВ / КСВ: Неисправность В"/>
+                  <w:listItem w:displayText="КСВ / КСВ: Неисправность цепей ЭМУ" w:value="КСВ / КСВ: Неисправность цепей ЭМУ"/>
+                  <w:listItem w:displayText="КСВ / КСВ: Реле фиксации команды" w:value="КСВ / КСВ: Реле фиксации команды"/>
+                  <w:listItem w:displayText="КСВ / КСВ: Функция введена в работу" w:value="КСВ / КСВ: Функция введена в работу"/>
+                  <w:listItem w:displayText="КСВ / КСВ: Функция оперативно выведена из работы" w:value="КСВ / КСВ: Функция оперативно выведена из работы"/>
                   <w:listItem w:displayText="ЛЗШ / ЛЗШ: Обнаружение неисправности" w:value="ЛЗШ / ЛЗШ: Обнаружение неисправности"/>
                   <w:listItem w:displayText="ЛЗШ / ЛЗШ: Пуск" w:value="ЛЗШ / ЛЗШ: Пуск"/>
                   <w:listItem w:displayText="ЛЗШ / ЛЗШ: Пуск ИО тока по фазе B" w:value="ЛЗШ / ЛЗШ: Пуск ИО тока по фазе B"/>
@@ -8435,6 +10879,57 @@
                   <w:listItem w:displayText="МТЗ / ОНМ: Пуск по фазе C" w:value="МТЗ / ОНМ: Пуск по фазе C"/>
                   <w:listItem w:displayText="МТЗ / ОНМ: Пуск по фазе А" w:value="МТЗ / ОНМ: Пуск по фазе А"/>
                   <w:listItem w:displayText="МТЗ / ОУ МТЗ: Срабатывание" w:value="МТЗ / ОУ МТЗ: Срабатывание"/>
+                  <w:listItem w:displayText="ПДС / В: Поведение местного управления" w:value="ПДС / В: Поведение местного управления"/>
+                  <w:listItem w:displayText="ПДС / В: Положение ключа режима управления" w:value="ПДС / В: Положение ключа режима управления"/>
+                  <w:listItem w:displayText="ПДС / В: Положение ключа режима управления привода В" w:value="ПДС / В: Положение ключа режима управления привода В"/>
+                  <w:listItem w:displayText="ПДС / В: Право переключения на уровне станции" w:value="ПДС / В: Право переключения на уровне станции"/>
+                  <w:listItem w:displayText="ПДС / ВЭ1: Поведение местного управления" w:value="ПДС / ВЭ1: Поведение местного управления"/>
+                  <w:listItem w:displayText="ПДС / ВЭ1: Положение ключа режима управления" w:value="ПДС / ВЭ1: Положение ключа режима управления"/>
+                  <w:listItem w:displayText="ПДС / ВЭ1: Право переключения на уровне станции" w:value="ПДС / ВЭ1: Право переключения на уровне станции"/>
+                  <w:listItem w:displayText="ПДС / ВЭ1: Ремонтное положение коммутационного аппарата" w:value="ПДС / ВЭ1: Ремонтное положение коммутационного аппарата"/>
+                  <w:listItem w:displayText="ПДС / ВЭ2: Поведение местного управления" w:value="ПДС / ВЭ2: Поведение местного управления"/>
+                  <w:listItem w:displayText="ПДС / ВЭ2: Положение ключа режима управления" w:value="ПДС / ВЭ2: Положение ключа режима управления"/>
+                  <w:listItem w:displayText="ПДС / ВЭ2: Право переключения на уровне станции" w:value="ПДС / ВЭ2: Право переключения на уровне станции"/>
+                  <w:listItem w:displayText="ПДС / ВЭ2: Ремонтное положение коммутационного аппарата" w:value="ПДС / ВЭ2: Ремонтное положение коммутационного аппарата"/>
+                  <w:listItem w:displayText="ПДС / ЗН: Поведение местного управления" w:value="ПДС / ЗН: Поведение местного управления"/>
+                  <w:listItem w:displayText="ПДС / ЗН: Положение ключа режима управления" w:value="ПДС / ЗН: Положение ключа режима управления"/>
+                  <w:listItem w:displayText="ПДС / ЗН: Право переключения на уровне станции" w:value="ПДС / ЗН: Право переключения на уровне станции"/>
+                  <w:listItem w:displayText="ПДС / КИ: Аварийный уровень изоляции" w:value="ПДС / КИ: Аварийный уровень изоляции"/>
+                  <w:listItem w:displayText="ПДС / КИ: Низкий уровень изоляции" w:value="ПДС / КИ: Низкий уровень изоляции"/>
+                  <w:listItem w:displayText="ПДС / КПруж: Пружина не заведена" w:value="ПДС / КПруж: Пружина не заведена"/>
+                  <w:listItem w:displayText="ПДС / КЦВ: Контроль цепи ЭМВ" w:value="ПДС / КЦВ: Контроль цепи ЭМВ"/>
+                  <w:listItem w:displayText="ПДС / КЦВ: Контроль цепи ЭМО1" w:value="ПДС / КЦВ: Контроль цепи ЭМО1"/>
+                  <w:listItem w:displayText="ПДС / КЦВ: Контроль цепи ЭМО2" w:value="ПДС / КЦВ: Контроль цепи ЭМО2"/>
+                  <w:listItem w:displayText="ПДС / КЦВ: Работа ЭМВ" w:value="ПДС / КЦВ: Работа ЭМВ"/>
+                  <w:listItem w:displayText="ПДС / КЦВ: Работа ЭМО1" w:value="ПДС / КЦВ: Работа ЭМО1"/>
+                  <w:listItem w:displayText="ПДС / КЦВ: Работа ЭМО2" w:value="ПДС / КЦВ: Работа ЭМО2"/>
+                  <w:listItem w:displayText="ПДС / ПДС: Функция введена в работу" w:value="ПДС / ПДС: Функция введена в работу"/>
+                  <w:listItem w:displayText="ПДС / ПДС: Функция оперативно выведена из работы" w:value="ПДС / ПДС: Функция оперативно выведена из работы"/>
+                  <w:listItem w:displayText="ПДС НКУ / SA1: Цепь управления введена" w:value="ПДС НКУ / SA1: Цепь управления введена"/>
+                  <w:listItem w:displayText="ПДС НКУ / SA2: Цепь управления введена" w:value="ПДС НКУ / SA2: Цепь управления введена"/>
+                  <w:listItem w:displayText="ПДС НКУ / SA3: Цепь управления введена" w:value="ПДС НКУ / SA3: Цепь управления введена"/>
+                  <w:listItem w:displayText="ПДС НКУ / SA4: Цепь управления введена" w:value="ПДС НКУ / SA4: Цепь управления введена"/>
+                  <w:listItem w:displayText="ПДС НКУ / SG1: Рабочее положение испытательного блока" w:value="ПДС НКУ / SG1: Рабочее положение испытательного блока"/>
+                  <w:listItem w:displayText="ПДС НКУ / SG2: Рабочее положение испытательного блока" w:value="ПДС НКУ / SG2: Рабочее положение испытательного блока"/>
+                  <w:listItem w:displayText="ПДС НКУ / SG3: Рабочее положение испытательного блока" w:value="ПДС НКУ / SG3: Рабочее положение испытательного блока"/>
+                  <w:listItem w:displayText="ПДС НКУ / Дверь: Дверь отсека/ шкафа закрыта" w:value="ПДС НКУ / Дверь: Дверь отсека/ шкафа закрыта"/>
+                  <w:listItem w:displayText="ПДС НКУ / Дверь: Дверь отсека/ шкафа открыта" w:value="ПДС НКУ / Дверь: Дверь отсека/ шкафа открыта"/>
+                  <w:listItem w:displayText="ПДС НКУ / ОТ ОБР 1: Неисправность оперативного тока цепей ОБР 1" w:value="ПДС НКУ / ОТ ОБР 1: Неисправность оперативного тока цепей ОБР 1"/>
+                  <w:listItem w:displayText="ПДС НКУ / ОТ ОБР 2: Неисправность оперативного тока цепей ОБР 2" w:value="ПДС НКУ / ОТ ОБР 2: Неисправность оперативного тока цепей ОБР 2"/>
+                  <w:listItem w:displayText="ПДС НКУ / ОТ ЦСВ: Неисправность ОТ цепей сигнализации В" w:value="ПДС НКУ / ОТ ЦСВ: Неисправность ОТ цепей сигнализации В"/>
+                  <w:listItem w:displayText="ПДС НКУ / ОТ ЭМО1, ЭМВ: Неисправность оперативного тока цепей ЭМВ, ЭМО1" w:value="ПДС НКУ / ОТ ЭМО1, ЭМВ: Неисправность оперативного тока цепей ЭМВ, ЭМО1"/>
+                  <w:listItem w:displayText="ПДС НКУ / ОТ ЭМО2: Неисправность оперативного тока цепей ЭМО2" w:value="ПДС НКУ / ОТ ЭМО2: Неисправность оперативного тока цепей ЭМО2"/>
+                  <w:listItem w:displayText="ПДС НКУ / ПДС НКУ: Функция введена в работу" w:value="ПДС НКУ / ПДС НКУ: Функция введена в работу"/>
+                  <w:listItem w:displayText="ПДС НКУ / ПДС НКУ: Функция оперативно выведена из работы" w:value="ПДС НКУ / ПДС НКУ: Функция оперативно выведена из работы"/>
+                  <w:listItem w:displayText="ПДС НКУ / Пер.ав.дебл.см.яч.: Цепи аварийной деблокировки ячейки выведены" w:value="ПДС НКУ / Пер.ав.дебл.см.яч.: Цепи аварийной деблокировки ячейки выведены"/>
+                  <w:listItem w:displayText="ПС / ПС: Пуск предупредительной сигнализации" w:value="ПС / ПС: Пуск предупредительной сигнализации"/>
+                  <w:listItem w:displayText="ПС / ПС: Пуск предупредительной сигнализации (импульс)" w:value="ПС / ПС: Пуск предупредительной сигнализации (импульс)"/>
+                  <w:listItem w:displayText="СС / СС: БИ выведены" w:value="СС / СС: БИ выведены"/>
+                  <w:listItem w:displayText="СС / СС: Выходные цепи разобраны" w:value="СС / СС: Выходные цепи разобраны"/>
+                  <w:listItem w:displayText="СС / СС: Неисправность КА" w:value="СС / СС: Неисправность КА"/>
+                  <w:listItem w:displayText="СС / СС: Общий внешний сигнал" w:value="СС / СС: Общий внешний сигнал"/>
+                  <w:listItem w:displayText="СС / СС: Превышение времени переключения КА" w:value="СС / СС: Превышение времени переключения КА"/>
+                  <w:listItem w:displayText="СС / СС: Сигнализация цепей опер.тока" w:value="СС / СС: Сигнализация цепей опер.тока"/>
                   <w:listItem w:displayText="ТЗНП / АУ ТЗНП: Пуск автоматического ускорения ТЗНП" w:value="ТЗНП / АУ ТЗНП: Пуск автоматического ускорения ТЗНП"/>
                   <w:listItem w:displayText="ТЗНП / БНТ НП: Пуск БНТ НП" w:value="ТЗНП / БНТ НП: Пуск БНТ НП"/>
                   <w:listItem w:displayText="ТЗНП / БЧС: Блокировка чувствительных ступеней" w:value="ТЗНП / БЧС: Блокировка чувствительных ступеней"/>
@@ -8474,6 +10969,11 @@
                   <w:listItem w:displayText="ТК ЗДЗ / ТК ЗДЗ: Пуск ИО тока" w:value="ТК ЗДЗ / ТК ЗДЗ: Пуск ИО тока"/>
                   <w:listItem w:displayText="ТК ЗДЗ / ТК ЗДЗ: Функция введена в работу" w:value="ТК ЗДЗ / ТК ЗДЗ: Функция введена в работу"/>
                   <w:listItem w:displayText="ТК ЗДЗ / ТК ЗДЗ: Функция оперативно выведена из работы" w:value="ТК ЗДЗ / ТК ЗДЗ: Функция оперативно выведена из работы"/>
+                  <w:listItem w:displayText="УВ / УВ: Включение с контролем синхронизма" w:value="УВ / УВ: Включение с контролем синхронизма"/>
+                  <w:listItem w:displayText="УВ / УВ: Включить выключатель" w:value="УВ / УВ: Включить выключатель"/>
+                  <w:listItem w:displayText="УВ / УВ: Задержка включения с контролем синхронизма" w:value="УВ / УВ: Задержка включения с контролем синхронизма"/>
+                  <w:listItem w:displayText="УВ / УВ: Функция введена в работу" w:value="УВ / УВ: Функция введена в работу"/>
+                  <w:listItem w:displayText="УВ / УВ: Функция оперативно выведена из работы" w:value="УВ / УВ: Функция оперативно выведена из работы"/>
                   <w:listItem w:displayText="УРОВ / УРОВ: Пуск" w:value="УРОВ / УРОВ: Пуск"/>
                   <w:listItem w:displayText="УРОВ / УРОВ: Пуск ИО максимального тока" w:value="УРОВ / УРОВ: Пуск ИО максимального тока"/>
                   <w:listItem w:displayText="УРОВ / УРОВ: Срабатывание" w:value="УРОВ / УРОВ: Срабатывание"/>
@@ -8870,11 +11370,14 @@
                   <w:listItem w:displayText="ОВ ДЗ-фф 4ст." w:value="ОВ ДЗ-фф 4ст."/>
                   <w:listItem w:displayText="ОВ ЗДЗ" w:value="ОВ ЗДЗ"/>
                   <w:listItem w:displayText="ОВ ЗОП" w:value="ОВ ЗОП"/>
+                  <w:listItem w:displayText="ОВ КА" w:value="ОВ КА"/>
                   <w:listItem w:displayText="ОВ КНН 1сш" w:value="ОВ КНН 1сш"/>
                   <w:listItem w:displayText="ОВ КНН 2сш" w:value="ОВ КНН 2сш"/>
                   <w:listItem w:displayText="ОВ КОН 1сш" w:value="ОВ КОН 1сш"/>
                   <w:listItem w:displayText="ОВ КОН 2сш" w:value="ОВ КОН 2сш"/>
+                  <w:listItem w:displayText="ОВ КП" w:value="ОВ КП"/>
                   <w:listItem w:displayText="ОВ КС" w:value="ОВ КС"/>
+                  <w:listItem w:displayText="ОВ КСВ" w:value="ОВ КСВ"/>
                   <w:listItem w:displayText="ОВ ЛЗШ" w:value="ОВ ЛЗШ"/>
                   <w:listItem w:displayText="ОВ ЛО" w:value="ОВ ЛО"/>
                   <w:listItem w:displayText="ОВ ЛО ВНР" w:value="ОВ ЛО ВНР"/>
@@ -8884,10 +11387,17 @@
                   <w:listItem w:displayText="ОВ МТЗ 2 ст." w:value="ОВ МТЗ 2 ст."/>
                   <w:listItem w:displayText="ОВ МТЗ 3 ст." w:value="ОВ МТЗ 3 ст."/>
                   <w:listItem w:displayText="ОВ МТЗ 4 ст." w:value="ОВ МТЗ 4 ст."/>
+                  <w:listItem w:displayText="ОВ ПДС НКУ" w:value="ОВ ПДС НКУ"/>
                   <w:listItem w:displayText="ОВ ТЗНП" w:value="ОВ ТЗНП"/>
                   <w:listItem w:displayText="ОВ ТК ЗДЗ" w:value="ОВ ТК ЗДЗ"/>
+                  <w:listItem w:displayText="ОВ УВ" w:value="ОВ УВ"/>
                   <w:listItem w:displayText="ОВ УРОВ" w:value="ОВ УРОВ"/>
+                  <w:listItem w:displayText="Програм.деблок. ВЭ1" w:value="Програм.деблок. ВЭ1"/>
+                  <w:listItem w:displayText="Програм.деблок. ВЭ2" w:value="Програм.деблок. ВЭ2"/>
+                  <w:listItem w:displayText="Програм.деблок. ЗН" w:value="Програм.деблок. ЗН"/>
                   <w:listItem w:displayText="Режим работы ЧС" w:value="Режим работы ЧС"/>
+                  <w:listItem w:displayText="Сброс" w:value="Сброс"/>
+                  <w:listItem w:displayText="Сброс КРВ" w:value="Сброс КРВ"/>
                   <w:listItem w:displayText="ТЗНП 1ст. на сигн" w:value="ТЗНП 1ст. на сигн"/>
                   <w:listItem w:displayText="ТЗНП 2ст. на сигн" w:value="ТЗНП 2ст. на сигн"/>
                   <w:listItem w:displayText="ТЗНП 3ст. на сигн" w:value="ТЗНП 3ст. на сигн"/>

</xml_diff>

<commit_message>
arbeit blanc new SV
</commit_message>
<xml_diff>
--- a/temp.docx
+++ b/temp.docx
@@ -86,7 +86,7 @@
               <w:rPr>
                 <w:lang w:val="en-US"/>
               </w:rPr>
-              <w:t xml:space="preserve">МИКРОПРОЦЕССОРНОЕ УСТРОЙСТВО ЗАЩИТЫ И АВТОМАТИКИ ОТХОДЯЩЕЙ ЛИНИИ</w:t>
+              <w:t xml:space="preserve">МИКРОПРОЦЕССОРНОЕ УСТРОЙСТВО АВТОМАТИЧЕСКОГО РЕГУЛИРОВАНИЯ НАПРЯЖЕНИЯ</w:t>
             </w:r>
             <w:r>
               <w:t xml:space="preserve"> </w:t>
@@ -104,7 +104,7 @@
               <w:rPr>
                 <w:lang w:val="en-US"/>
               </w:rPr>
-              <w:t xml:space="preserve">ЮНИТ-М300-ОЛ</w:t>
+              <w:t xml:space="preserve">ЮНИТ-М300-ТЕСТ</w:t>
             </w:r>
             <w:r>
               <w:t>»</w:t>
@@ -213,7 +213,7 @@
                 <w:szCs w:val="22"/>
                 <w:lang w:val="en-US"/>
               </w:rPr>
-              <w:t xml:space="preserve">ЮНИТ-М319-ОЛ-Р02с-х-К002-К002-К002-К002-К002-В021-В021-В021-В021-М046.3001-х-С01.00-1-1</w:t>
+              <w:t xml:space="preserve">ЮНИТ-М510-СВ-Р02-К101-В101-х-М179.0700-х-С01.00-1-08</w:t>
             </w:r>
           </w:p>
         </w:tc>
@@ -298,7 +298,7 @@
           <w:szCs w:val="40"/>
           <w:lang w:val="en-US"/>
         </w:rPr>
-        <w:t xml:space="preserve">ЮТКБ.656122.609 БУ2</w:t>
+        <w:t xml:space="preserve">ЮТКБ.656122.609 БУ9</w:t>
       </w:r>
     </w:p>
     <w:tbl>
@@ -831,7 +831,7 @@
       </w:r>
       <w:proofErr w:type="gramStart"/>
       <w:r>
-        <w:t xml:space="preserve">ЮНИТ-М300-ОЛ</w:t>
+        <w:t xml:space="preserve">ЮНИТ-М300-ТЕСТ</w:t>
       </w:r>
       <w:r>
         <w:t>.</w:t>
@@ -1667,7 +1667,7 @@
         <w:rStyle w:val="afff1"/>
         <w:lang w:val="en-US"/>
       </w:rPr>
-      <w:t xml:space="preserve">ЮТКБ.656122.609 БУ2</w:t>
+      <w:t xml:space="preserve">ЮТКБ.656122.609 БУ9</w:t>
     </w:r>
     <w:r>
       <w:rPr>
@@ -1688,7 +1688,7 @@
         <w:rStyle w:val="afff1"/>
         <w:lang w:val="en-US"/>
       </w:rPr>
-      <w:t xml:space="preserve">ЮНИТ-М300-ОЛ</w:t>
+      <w:t xml:space="preserve">ЮНИТ-М300-ТЕСТ</w:t>
     </w:r>
   </w:p>
   <w:p>
@@ -1896,7 +1896,7 @@
         <w:rStyle w:val="afff1"/>
         <w:lang w:val="en-US"/>
       </w:rPr>
-      <w:t xml:space="preserve">ЮТКБ.656122.609 БУ2</w:t>
+      <w:t xml:space="preserve">ЮТКБ.656122.609 БУ9</w:t>
     </w:r>
     <w:r>
       <w:rPr>
@@ -1917,7 +1917,7 @@
         <w:rStyle w:val="afff1"/>
         <w:lang w:val="en-US"/>
       </w:rPr>
-      <w:t xml:space="preserve">ЮНИТ-М300-ОЛ</w:t>
+      <w:t xml:space="preserve">ЮНИТ-М300-ТЕСТ</w:t>
     </w:r>
   </w:p>
 </w:hdr>

</xml_diff>